<commit_message>
conversão para html corrigida
</commit_message>
<xml_diff>
--- a/Dissert.docx
+++ b/Dissert.docx
@@ -16390,7 +16390,7 @@
         <w:t xml:space="preserve"> </w:t>
       </w:r>
       <w:r>
-        <w:t xml:space="preserve">91 (2). S. Hirzel Verlag:289–98.</w:t>
+        <w:t xml:space="preserve">91 (2). S. Hirzel Verlag: 289–98.</w:t>
       </w:r>
     </w:p>
     <w:bookmarkEnd w:id="100"/>
@@ -16415,7 +16415,7 @@
         <w:t xml:space="preserve"> </w:t>
       </w:r>
       <w:r>
-        <w:t xml:space="preserve">114 (2). ASA:1095–1107.</w:t>
+        <w:t xml:space="preserve">114 (2). ASA: 1095–1107.</w:t>
       </w:r>
     </w:p>
     <w:bookmarkEnd w:id="101"/>
@@ -16572,7 +16572,7 @@
         <w:t xml:space="preserve"> </w:t>
       </w:r>
       <w:r>
-        <w:t xml:space="preserve">52. Elsevier:28–38.</w:t>
+        <w:t xml:space="preserve">52. Elsevier: 28–38.</w:t>
       </w:r>
     </w:p>
     <w:bookmarkEnd w:id="108"/>
@@ -16597,7 +16597,7 @@
         <w:t xml:space="preserve"> </w:t>
       </w:r>
       <w:r>
-        <w:t xml:space="preserve">14 (2). Wiley Online Library:179–211.</w:t>
+        <w:t xml:space="preserve">14 (2). Wiley Online Library: 179–211.</w:t>
       </w:r>
     </w:p>
     <w:bookmarkEnd w:id="109"/>
@@ -16688,7 +16688,7 @@
         <w:t xml:space="preserve"> </w:t>
       </w:r>
       <w:r>
-        <w:t xml:space="preserve">57:345–420.</w:t>
+        <w:t xml:space="preserve">57: 345–420.</w:t>
       </w:r>
     </w:p>
     <w:bookmarkEnd w:id="113"/>
@@ -16859,7 +16859,7 @@
         <w:t xml:space="preserve"> </w:t>
       </w:r>
       <w:r>
-        <w:t xml:space="preserve">29 (6). IEEE:82–97.</w:t>
+        <w:t xml:space="preserve">29 (6). IEEE: 82–97.</w:t>
       </w:r>
     </w:p>
     <w:bookmarkEnd w:id="121"/>
@@ -16884,7 +16884,7 @@
         <w:t xml:space="preserve"> </w:t>
       </w:r>
       <w:r>
-        <w:t xml:space="preserve">4 (2). Elsevier:251–57.</w:t>
+        <w:t xml:space="preserve">4 (2). Elsevier: 251–57.</w:t>
       </w:r>
     </w:p>
     <w:bookmarkEnd w:id="122"/>
@@ -16909,7 +16909,7 @@
         <w:t xml:space="preserve"> </w:t>
       </w:r>
       <w:r>
-        <w:t xml:space="preserve">2 (5). Elsevier:359–66.</w:t>
+        <w:t xml:space="preserve">2 (5). Elsevier: 359–66.</w:t>
       </w:r>
     </w:p>
     <w:bookmarkEnd w:id="123"/>
@@ -16966,7 +16966,7 @@
         <w:t xml:space="preserve"> </w:t>
       </w:r>
       <w:r>
-        <w:t xml:space="preserve">35 (4). ACM:110.</w:t>
+        <w:t xml:space="preserve">35 (4). ACM: 110.</w:t>
       </w:r>
     </w:p>
     <w:bookmarkEnd w:id="126"/>
@@ -17013,7 +17013,7 @@
         <w:t xml:space="preserve"> </w:t>
       </w:r>
       <w:r>
-        <w:t xml:space="preserve">14 (9). Elsevier:737–60.</w:t>
+        <w:t xml:space="preserve">14 (9). Elsevier: 737–60.</w:t>
       </w:r>
     </w:p>
     <w:bookmarkEnd w:id="128"/>
@@ -17060,7 +17060,7 @@
         <w:t xml:space="preserve"> </w:t>
       </w:r>
       <w:r>
-        <w:t xml:space="preserve">2004. Hindawi Publishing Corp.:978–89.</w:t>
+        <w:t xml:space="preserve">2004. Hindawi Publishing Corp.: 978–89.</w:t>
       </w:r>
     </w:p>
     <w:bookmarkEnd w:id="130"/>
@@ -17173,7 +17173,7 @@
         <w:t xml:space="preserve"> </w:t>
       </w:r>
       <w:r>
-        <w:t xml:space="preserve">86 (11). IEEE:2278–2324.</w:t>
+        <w:t xml:space="preserve">86 (11). IEEE: 2278–2324.</w:t>
       </w:r>
     </w:p>
     <w:bookmarkEnd w:id="135"/>
@@ -17198,7 +17198,7 @@
         <w:t xml:space="preserve"> </w:t>
       </w:r>
       <w:r>
-        <w:t xml:space="preserve">6 (6). Elsevier:861–67.</w:t>
+        <w:t xml:space="preserve">6 (6). Elsevier: 861–67.</w:t>
       </w:r>
     </w:p>
     <w:bookmarkEnd w:id="136"/>
@@ -17267,7 +17267,7 @@
         <w:t xml:space="preserve"> </w:t>
       </w:r>
       <w:r>
-        <w:t xml:space="preserve">5 (4). Springer:115–33.</w:t>
+        <w:t xml:space="preserve">5 (4). Springer: 115–33.</w:t>
       </w:r>
     </w:p>
     <w:bookmarkEnd w:id="139"/>
@@ -17390,7 +17390,7 @@
         <w:t xml:space="preserve"> </w:t>
       </w:r>
       <w:r>
-        <w:t xml:space="preserve">7 (4). Maxwell Science Publishing:656–72.</w:t>
+        <w:t xml:space="preserve">7 (4). Maxwell Science Publishing: 656–72.</w:t>
       </w:r>
     </w:p>
     <w:bookmarkEnd w:id="145"/>
@@ -17415,7 +17415,7 @@
         <w:t xml:space="preserve"> </w:t>
       </w:r>
       <w:r>
-        <w:t xml:space="preserve">133 (5). ASA:3107–18.</w:t>
+        <w:t xml:space="preserve">133 (5). ASA: 3107–18.</w:t>
       </w:r>
     </w:p>
     <w:bookmarkEnd w:id="146"/>
@@ -17462,7 +17462,7 @@
         <w:t xml:space="preserve"> </w:t>
       </w:r>
       <w:r>
-        <w:t xml:space="preserve">65 (6). American Psychological Association:386.</w:t>
+        <w:t xml:space="preserve">65 (6). American Psychological Association: 386.</w:t>
       </w:r>
     </w:p>
     <w:bookmarkEnd w:id="148"/>
@@ -17497,7 +17497,7 @@
         <w:t xml:space="preserve"> </w:t>
       </w:r>
       <w:r>
-        <w:t xml:space="preserve">64. Elsevier:39–48.</w:t>
+        <w:t xml:space="preserve">64. Elsevier: 39–48.</w:t>
       </w:r>
     </w:p>
     <w:bookmarkEnd w:id="150"/>
@@ -17632,7 +17632,7 @@
         <w:t xml:space="preserve"> </w:t>
       </w:r>
       <w:r>
-        <w:t xml:space="preserve">24 (5). IEEE Press:927–39.</w:t>
+        <w:t xml:space="preserve">24 (5). IEEE Press: 927–39.</w:t>
       </w:r>
     </w:p>
     <w:bookmarkEnd w:id="156"/>
@@ -17679,7 +17679,7 @@
         <w:t xml:space="preserve"> </w:t>
       </w:r>
       <w:r>
-        <w:t xml:space="preserve">16 (4). JSTOR:74–91.</w:t>
+        <w:t xml:space="preserve">16 (4). JSTOR: 74–91.</w:t>
       </w:r>
     </w:p>
     <w:bookmarkEnd w:id="158"/>
@@ -17736,7 +17736,7 @@
         <w:t xml:space="preserve"> </w:t>
       </w:r>
       <w:r>
-        <w:t xml:space="preserve">8 (2). Springer:131–62.</w:t>
+        <w:t xml:space="preserve">8 (2). Springer: 131–62.</w:t>
       </w:r>
     </w:p>
     <w:bookmarkEnd w:id="161"/>
@@ -17903,7 +17903,7 @@
         <w:t xml:space="preserve"> </w:t>
       </w:r>
       <w:r>
-        <w:t xml:space="preserve">13 (1):137–45.</w:t>
+        <w:t xml:space="preserve">13 (1): 137–45.</w:t>
       </w:r>
     </w:p>
     <w:bookmarkEnd w:id="169"/>
@@ -17938,7 +17938,7 @@
         <w:t xml:space="preserve"> </w:t>
       </w:r>
       <w:r>
-        <w:t xml:space="preserve">78 (9). IEEE:1415–42.</w:t>
+        <w:t xml:space="preserve">78 (9). IEEE: 1415–42.</w:t>
       </w:r>
     </w:p>
     <w:bookmarkEnd w:id="171"/>

</xml_diff>

<commit_message>
index html atualizado para versão que linka com o mathml do cloudflare
</commit_message>
<xml_diff>
--- a/Dissert.docx
+++ b/Dissert.docx
@@ -181,7 +181,7 @@
         <w:pStyle w:val="FirstParagraph"/>
       </w:pPr>
       <w:r>
-        <w:t xml:space="preserve">O presente trabalho investiga, sob diferentes perspectivas, o potencial de aplicação dos recentes desenvolvimentos teóricos na área de redes neurais à modelagem de instrumentos acústicos, com vistas à sintese sonora em tempo real. Enfase é dada a intrumentos de caráter percussivo, no sentido de instrumentos em que o som é gerado por uma excitação inicial, aproximadamente impulsiva do ponto de vista físico, e a subsequente vibração livre do(s) componentes pertinentes do instrumento. Esse é o caso, por exemplo, das peças de um kit de bateria excitadas por uma baqueta, dos (conjuntos de) cordas de um piano acionadas pelo martelo alavancado pelo pressionar das teclas e, com um maior grau de aproximação, a excitação causada pelos dedos ou palheta em instrumentos de corda.</w:t>
+        <w:t xml:space="preserve">O presente trabalho investiga, sob diferentes perspectivas, o potencial de aplicação dos recentes desenvolvimentos teóricos na área de redes neurais à modelagem de instrumentos acústicos, com vistas à síntese sonora em tempo real. Ênfase é dada a instrumentos de caráter percussivo, no sentido de instrumentos em que o som é gerado por uma excitação inicial, aproximadamente impulsiva do ponto de vista físico, e a subsequente vibração livre do(s) componentes pertinentes do instrumento. Esse é o caso, por exemplo, das peças de um kit de bateria excitadas por uma baqueta, dos (conjuntos de) cordas de um piano acionadas pelo martelo alavancado pelo pressionar das teclas e, com um maior grau de aproximação, a excitação causada pelos dedos ou palheta em instrumentos de corda.</w:t>
       </w:r>
     </w:p>
     <w:p>
@@ -223,7 +223,16 @@
         <w:pStyle w:val="BodyText"/>
       </w:pPr>
       <w:r>
-        <w:t xml:space="preserve">O potencial de inovação desse campo é comprovado pelo papel central (muitas vezes representando o estado da arte) que as redes neurais artificiais vem desempenhando em áreas diretamente correlatas, com o campo de síntese de voz (text-to-speech), ou ainda em campos menos obviamente relacionados, à exemplo dos grandes avanços na área de</w:t>
+        <w:t xml:space="preserve">O potencial de inovação desse campo é comprovado pelo papel central (muitas vezes representando o estado da arte) que as redes neurais artificiais vem desempenhando em áreas diretamente correlatas, com o campo de síntese de voz (</w:t>
+      </w:r>
+      <w:r>
+        <w:rPr>
+          <w:i/>
+        </w:rPr>
+        <w:t xml:space="preserve">text-to-speech</w:t>
+      </w:r>
+      <w:r>
+        <w:t xml:space="preserve">), ou ainda em campos menos obviamente relacionados, à exemplo dos grandes avanços na área de</w:t>
       </w:r>
       <w:r>
         <w:t xml:space="preserve"> </w:t>
@@ -235,7 +244,7 @@
         <w:t xml:space="preserve">computer vision</w:t>
       </w:r>
       <w:r>
-        <w:t xml:space="preserve">, como a geração de imagens e videos, transferência de estilos (e até rostos) entre essas mídias, colorização automática ou semi-automática de imagens em preto e branco e a constante investigação e refinamento de novas arquiteturas e métodos aplicados à essas finalidades.</w:t>
+        <w:t xml:space="preserve">, como a geração de imagens e vídeos, transferência de estilos (e até rostos) entre essas mídias, colorização automática ou semi-automática de imagens em preto e branco e a constante investigação e refinamento de novas arquiteturas e métodos aplicados à essas finalidades.</w:t>
       </w:r>
     </w:p>
     <w:p>
@@ -357,7 +366,7 @@
         <w:pStyle w:val="FirstParagraph"/>
       </w:pPr>
       <w:r>
-        <w:t xml:space="preserve">Busca-se, desta forma, identificar metodologias que deem suporte à modelagem de instrumentos musicais acústicos, com a aplicação do estado da arte das redes neurais, dando origem a simulações mais realistas, principalmente do ponto de vista da percepção humana, e mais eficintes do ponto de vista computacional.</w:t>
+        <w:t xml:space="preserve">Busca-se, desta forma, identificar metodologias que deem suporte à modelagem de instrumentos musicais acústicos, com a aplicação do estado da arte das redes neurais, dando origem a simulações mais realistas, principalmente do ponto de vista da percepção humana, e mais eficientes do ponto de vista computacional.</w:t>
       </w:r>
     </w:p>
     <w:p>
@@ -542,7 +551,7 @@
         <w:t xml:space="preserve">(Minski and Papert 1969)</w:t>
       </w:r>
       <w:r>
-        <w:t xml:space="preserve">, é interessante notar que muitas das características contemporaneas já estavam presentes nos trabalho seminais de Rosenblatt e Widrow, notadamente o caráter estocástico das redes neurais, a necessidade de treiná-las com base em grandes conjuntos de dados e a característica de</w:t>
+        <w:t xml:space="preserve">, é interessante notar que muitas das características contemporâneas já estavam presentes nos trabalho seminais de Rosenblatt e Widrow, notadamente o caráter estocástico das redes neurais, a necessidade de treiná-las com base em grandes conjuntos de dados e a característica de</w:t>
       </w:r>
       <w:r>
         <w:t xml:space="preserve"> </w:t>
@@ -568,13 +577,10 @@
         <w:t xml:space="preserve">É interessante observar que Widrow introduziu, como forma de treinamento, uma caso restrito do algoritmo de descida em gradiente, que veio a ser amplamente responsável pelo ressurgimento do interesse em redes neurais décadas mais tarde, em conjunto com a técnica de</w:t>
       </w:r>
       <w:r>
-        <w:t xml:space="preserve"> </w:t>
-      </w:r>
-      <w:r>
         <w:rPr>
           <w:i/>
         </w:rPr>
-        <w:t xml:space="preserve">backpropagation</w:t>
+        <w:t xml:space="preserve">backpropagatio</w:t>
       </w:r>
       <w:r>
         <w:t xml:space="preserve">.</w:t>

</xml_diff>

<commit_message>
reescrita introdução, dradução de partes da revisão bibliográfica
</commit_message>
<xml_diff>
--- a/Dissert.docx
+++ b/Dissert.docx
@@ -181,7 +181,22 @@
         <w:pStyle w:val="FirstParagraph"/>
       </w:pPr>
       <w:r>
-        <w:t xml:space="preserve">O presente trabalho investiga, sob diferentes perspectivas, o potencial de aplicação dos recentes desenvolvimentos teóricos na área de redes neurais à modelagem de instrumentos acústicos, com vistas à síntese sonora em tempo real. Ênfase é dada a instrumentos de caráter percussivo, no sentido de instrumentos em que o som é gerado por uma excitação inicial, aproximadamente impulsiva do ponto de vista físico, e a subsequente vibração livre do(s) componentes pertinentes do instrumento. Esse é o caso, por exemplo, das peças de um kit de bateria excitadas por uma baqueta, dos (conjuntos de) cordas de um piano acionadas pelo martelo alavancado pelo pressionar das teclas e, com um maior grau de aproximação, a excitação causada pelos dedos ou palheta em instrumentos de corda.</w:t>
+        <w:t xml:space="preserve">O presente trabalho investiga, sob diferentes perspectivas, o potencial de aplicação dos recentes desenvolvimentos teóricos na área de redes neurais à modelagem de instrumentos acústicos, com vistas à síntese sonora em tempo real. Ênfase é dada a instrumentos de caráter percussivo, no sentido de sistemas em que o som é gerado por uma excitação inicial, aproximadamente impulsiva do ponto de vista físico, e a subsequente vibração livre do(s) componentes pertinentes do instrumento. Esse é o caso, por exemplo, das peças de um</w:t>
+      </w:r>
+      <w:r>
+        <w:t xml:space="preserve"> </w:t>
+      </w:r>
+      <w:r>
+        <w:rPr>
+          <w:i/>
+        </w:rPr>
+        <w:t xml:space="preserve">kit</w:t>
+      </w:r>
+      <w:r>
+        <w:t xml:space="preserve"> </w:t>
+      </w:r>
+      <w:r>
+        <w:t xml:space="preserve">de bateria excitadas por uma baqueta, das cordas ou conjuntos de cordas de um piano acionadas pelo martelo ao ser alavancado pelo pressionar das teclas e, com um maior grau de aproximação, a excitação causada pelos dedos ou palheta em instrumentos de corda.</w:t>
       </w:r>
     </w:p>
     <w:p>
@@ -215,7 +230,7 @@
         <w:pStyle w:val="BodyText"/>
       </w:pPr>
       <w:r>
-        <w:t xml:space="preserve">O comentário ilustra, excluídos superlativos midiáticos, a centralidade do tema no modelo de negócios de uma das maiores empresas do mundo, tendência acompanhada por outros gigantes da tecnologia, como Apple e Microsoft. Na contramão desse movimento, no entanto, observa-se uma escassa utilização dessa tecnologia por empresas do ramo de instrumentos virtuais, talvez motivada pelo baixo volume de pesquisas ne área; Um levantamento bibliográfico revela que trabalhos relacionados à utilização de redes neurais para a simulação de instrumentos musicais ainda são bastante escassos, a despeito do sucesso desta ferramenta em áreas afins.</w:t>
+        <w:t xml:space="preserve">O comentário ilustra, excluídos superlativos midiáticos, a centralidade do tema no modelo de negócios de uma das maiores empresas do mundo, tendência acompanhada por outros gigantes da tecnologia, como Apple e Microsoft. Na contramão desse movimento, no entanto, observa-se uma escassa penetração dessa tecnologia na área de instrumentos virtuais, talvez motivada pelo baixo volume de pesquisas ne área; Um levantamento bibliográfico revela que trabalhos relacionados à utilização de redes neurais para a simulação de instrumentos musicais ainda são bastante escassos, a despeito do sucesso desta ferramenta em áreas afins.</w:t>
       </w:r>
     </w:p>
     <w:p>
@@ -244,7 +259,7 @@
         <w:t xml:space="preserve">computer vision</w:t>
       </w:r>
       <w:r>
-        <w:t xml:space="preserve">, como a geração de imagens e vídeos, transferência de estilos (e até rostos) entre essas mídias, colorização automática ou semi-automática de imagens em preto e branco e a constante investigação e refinamento de novas arquiteturas e métodos aplicados à essas finalidades.</w:t>
+        <w:t xml:space="preserve">, como a geração de imagens e vídeos, transferência de estilos, e mais recentemente rostos, entre essas mídias, colorização automática ou semi-automática de imagens em preto e branco e a constante investigação e refinamento de novas arquiteturas e métodos aplicados à essas finalidades.</w:t>
       </w:r>
     </w:p>
     <w:p>
@@ -330,43 +345,185 @@
       <w:pPr>
         <w:pStyle w:val="Heading2"/>
       </w:pPr>
-      <w:bookmarkStart w:id="21" w:name="problema-simulação-em-tempo-real-de-instrumentos-acústicos-aplicação-bateria"/>
-      <w:r>
-        <w:t xml:space="preserve">Problema: simulação em tempo real de instrumentos</w:t>
-      </w:r>
-      <w:r>
-        <w:t xml:space="preserve"> </w:t>
+      <w:bookmarkStart w:id="21" w:name="questão-de-pesquisa"/>
+      <w:r>
+        <w:t xml:space="preserve">Questão de pesquisa</w:t>
+      </w:r>
+      <w:bookmarkEnd w:id="21"/>
+    </w:p>
+    <w:p>
+      <w:pPr>
+        <w:pStyle w:val="FirstParagraph"/>
+      </w:pPr>
+      <w:r>
+        <w:t xml:space="preserve">Busca-se, desta forma, identificar técnicas baseadas no estado da arte das redes neurais artificiais que, em conjunto com abordagens tradicionais, deem suporte à modelagem de instrumentos musicais acústicos, dando origem a simulações mais realistas, principalmente do ponto de vista da percepção humana, e sobretudo mais computacionalmente eficientes.</w:t>
+      </w:r>
+    </w:p>
+    <w:p>
+      <w:pPr>
+        <w:pStyle w:val="Heading2"/>
+      </w:pPr>
+      <w:bookmarkStart w:id="22" w:name="escopo"/>
+      <w:r>
+        <w:t xml:space="preserve">Escopo</w:t>
+      </w:r>
+      <w:bookmarkEnd w:id="22"/>
+    </w:p>
+    <w:p>
+      <w:pPr>
+        <w:pStyle w:val="FirstParagraph"/>
+      </w:pPr>
+      <w:r>
+        <w:t xml:space="preserve">Limitar o trabalho à investigação de instrumentos que possam ser aproximados por um modelo de excitação impulsivo, como é o caso, possibilita excluir da observação uma subárea significativa do processamento de sinais que lida com a evolução das frequências de uma onda sonora no domínio do tempo, trazendo o volume de pesquisa a níveis razoáveis, sem uma perda substancial em termos conceituais.</w:t>
+      </w:r>
+    </w:p>
+    <w:p>
+      <w:pPr>
+        <w:pStyle w:val="BodyText"/>
+      </w:pPr>
+      <w:r>
+        <w:t xml:space="preserve">Uma outra vantagem é de cunho técnico, já que essa escolha reduz a duração média das ondas investigadas, o que é uma escolha sensível quando alguns dos algoritmos utilizados, como a Transformada Discreta de Fourier, possuem complexidade</w:t>
+      </w:r>
+      <w:r>
+        <w:t xml:space="preserve"> </w:t>
+      </w:r>
+      <m:oMath>
+        <m:r>
+          <m:t>O</m:t>
+        </m:r>
+        <m:r>
+          <m:t>(</m:t>
+        </m:r>
+        <m:r>
+          <m:t>n</m:t>
+        </m:r>
+        <m:r>
+          <m:rPr>
+            <m:sty m:val="p"/>
+          </m:rPr>
+          <m:t>log</m:t>
+        </m:r>
+        <m:r>
+          <m:t>(</m:t>
+        </m:r>
+        <m:r>
+          <m:t>n</m:t>
+        </m:r>
+        <m:r>
+          <m:t>)</m:t>
+        </m:r>
+      </m:oMath>
+    </w:p>
+    <w:p>
+      <w:pPr>
+        <w:pStyle w:val="BodyText"/>
+      </w:pPr>
+      <w:r>
+        <w:t xml:space="preserve">Os algoritmos e técnicas convencionais, ainda que de forma muitas vezes ineficiente, prestam-se de maneira razoável à simulação</w:t>
+      </w:r>
+      <w:r>
+        <w:t xml:space="preserve"> </w:t>
+      </w:r>
+      <w:r>
+        <w:rPr>
+          <w:i/>
+        </w:rPr>
+        <w:t xml:space="preserve">off-line</w:t>
+      </w:r>
+      <w:r>
+        <w:t xml:space="preserve"> </w:t>
+      </w:r>
+      <w:r>
+        <w:t xml:space="preserve">de instrumentos acústicos, razão pela qual o foco deste trabalho é a síntese em tempo real, econômica do ponto de vista computacional. Desenvolvimentos nesse sentido podem, por exemplo, motivar implementações em plataformas mais compactas, como teclados, pianos e baterias eletrônicas, além de encontrarem aplicação em áreas em ascensão, como realidade virtual e aumentada.</w:t>
+      </w:r>
+    </w:p>
+    <w:p>
+      <w:pPr>
+        <w:pStyle w:val="BodyText"/>
+      </w:pPr>
+      <w:r>
+        <w:t xml:space="preserve">Em relação ao tratamento das redes neurais, prioridade foi dada às arquiteturas consolidadas na literatura, o que excluiu, por exemplo, uma investigação da promissora arquitetura Capsnet(</w:t>
       </w:r>
       <w:r>
         <w:rPr>
           <w:b/>
         </w:rPr>
-        <w:t xml:space="preserve">acústicos</w:t>
-      </w:r>
-      <w:r>
-        <w:t xml:space="preserve"> </w:t>
-      </w:r>
-      <w:r>
-        <w:t xml:space="preserve">(aplicação: bateria)</w:t>
-      </w:r>
-      <w:bookmarkEnd w:id="21"/>
+        <w:t xml:space="preserve">XXX</w:t>
+      </w:r>
+      <w:r>
+        <w:t xml:space="preserve">).</w:t>
+      </w:r>
+      <w:r>
+        <w:t xml:space="preserve"> </w:t>
+      </w:r>
+      <w:r>
+        <w:t xml:space="preserve">A escolha é necessária devido à limitações de tempo, frente ao grande volume de pesquisas envolvendo novas arquiteturas que pode-se observar.</w:t>
+      </w:r>
     </w:p>
     <w:p>
       <w:pPr>
         <w:pStyle w:val="Heading2"/>
       </w:pPr>
-      <w:bookmarkStart w:id="22" w:name="questão-de-pesquisa"/>
-      <w:r>
-        <w:t xml:space="preserve">Questão de pesquisa</w:t>
-      </w:r>
-      <w:bookmarkEnd w:id="22"/>
+      <w:bookmarkStart w:id="23" w:name="estrutura-do-trabalho-e-síntese-das-etapas-de-pesquisa"/>
+      <w:r>
+        <w:t xml:space="preserve">Estrutura do Trabalho e Síntese das Etapas de Pesquisa</w:t>
+      </w:r>
+      <w:bookmarkEnd w:id="23"/>
     </w:p>
     <w:p>
       <w:pPr>
         <w:pStyle w:val="FirstParagraph"/>
       </w:pPr>
       <w:r>
-        <w:t xml:space="preserve">Busca-se, desta forma, identificar metodologias que deem suporte à modelagem de instrumentos musicais acústicos, com a aplicação do estado da arte das redes neurais, dando origem a simulações mais realistas, principalmente do ponto de vista da percepção humana, e mais eficientes do ponto de vista computacional.</w:t>
+        <w:t xml:space="preserve">Durante a revisão bibliográfica, após um breve resumo da evolução das redes neurais do ponto de vista histórico, o trabalho apresenta as arquiteturas mais relevantes. O objetivo é introduzir o tema, inicialmente de maneira ampla, lançando as bases para as seções seguintes, que exploram o estado da arte das aplicações dessas arquiteturas à 3 áreas de interesse: Música, discurso (</w:t>
+      </w:r>
+      <w:r>
+        <w:rPr>
+          <w:i/>
+        </w:rPr>
+        <w:t xml:space="preserve">speech</w:t>
+      </w:r>
+      <w:r>
+        <w:t xml:space="preserve">) e imagens. Enquanto o interesse nas duas primeiras áreas é mais evidente, uma investigação dos desenvolvimentos em</w:t>
+      </w:r>
+      <w:r>
+        <w:t xml:space="preserve"> </w:t>
+      </w:r>
+      <w:r>
+        <w:rPr>
+          <w:i/>
+        </w:rPr>
+        <w:t xml:space="preserve">computer vision</w:t>
+      </w:r>
+      <w:r>
+        <w:t xml:space="preserve"> </w:t>
+      </w:r>
+      <w:r>
+        <w:t xml:space="preserve">oferece insights importantes; além de ser uma das áreas de</w:t>
+      </w:r>
+      <w:r>
+        <w:t xml:space="preserve"> </w:t>
+      </w:r>
+      <w:r>
+        <w:rPr>
+          <w:i/>
+        </w:rPr>
+        <w:t xml:space="preserve">machine learning</w:t>
+      </w:r>
+      <w:r>
+        <w:t xml:space="preserve"> </w:t>
+      </w:r>
+      <w:r>
+        <w:t xml:space="preserve">mais ativamente pesquisadas, alguns esforços de transposição dos desenvolvimentos nessa área para o campo da modelagem acústica tem alcançado resultados interessantes(</w:t>
+      </w:r>
+      <w:r>
+        <w:rPr>
+          <w:b/>
+        </w:rPr>
+        <w:t xml:space="preserve">XXX</w:t>
+      </w:r>
+      <w:r>
+        <w:t xml:space="preserve">).</w:t>
       </w:r>
     </w:p>
     <w:p>
@@ -374,61 +531,77 @@
         <w:pStyle w:val="BodyText"/>
       </w:pPr>
       <w:r>
-        <w:t xml:space="preserve">A proposta inclui a identificação da arquitetura mais apropriada, assim como seus parâmetros, incluindo o número de camadas, neurônios, a mais apropriada forma de atualização dos pesos e eventuais formas de tratamento dos dados utilizados no treinamento.</w:t>
+        <w:t xml:space="preserve">A seguir, alguns</w:t>
+      </w:r>
+      <w:r>
+        <w:t xml:space="preserve"> </w:t>
+      </w:r>
+      <w:r>
+        <w:rPr>
+          <w:i/>
+        </w:rPr>
+        <w:t xml:space="preserve">frameworks</w:t>
+      </w:r>
+      <w:r>
+        <w:t xml:space="preserve"> </w:t>
+      </w:r>
+      <w:r>
+        <w:t xml:space="preserve">disponíveis são discutidos e comparados; novamente, por limitações de tempo, ênfase foi dada aos com maior penetração tanto na indústria quanto na área acadêmica, e a escolha da plataforma utilizada nesse trabalho obedeceu mais à critérios de documentação, adoção na comunidade e flexibilidade, do que critérios relacionados diretamente à performance.</w:t>
+      </w:r>
+    </w:p>
+    <w:p>
+      <w:pPr>
+        <w:pStyle w:val="BodyText"/>
+      </w:pPr>
+      <w:r>
+        <w:t xml:space="preserve">A seção seguinte investiga a modelagem acústica convencional, com ênfase no estado da arte da síntese sonora em tempo real. Por tratar-se de uma área mais hermética, sobretudo quando comparada ao campo do machine learning e sua filosofia código aberto, alguns temas relevantes são apresentados com uma maior profundidade conceitual. Por esse mesmo motivo, implementações didáticas dos dois algoritmos mais utilizados são apresentadas.</w:t>
+      </w:r>
+    </w:p>
+    <w:p>
+      <w:pPr>
+        <w:pStyle w:val="BodyText"/>
+      </w:pPr>
+      <w:r>
+        <w:t xml:space="preserve">Em seguida é apresentado um referencial teórico, onde são formalizadas algumas das bases conceituais do trabalho, como a equação da onda e o funcionamento, do ponto de vista matemático, de uma rede neural; ademais, uma interpretação geométrica para a simetria da transformada discreta de Fourier, quando aplicada a sinais no domínio dos números reais, é introduzida.</w:t>
+      </w:r>
+    </w:p>
+    <w:p>
+      <w:pPr>
+        <w:pStyle w:val="BodyText"/>
+      </w:pPr>
+      <w:r>
+        <w:t xml:space="preserve">A seguir, no capítulo dedicado à metodologia, são apresentadas as etapas executadas, desde o processo de obtenção dos samples utilizados para o treinamento, passando pelas investigações no domínio do tempo e da frequência, até a apresentação em mais detalhes do modelo final proposto, que tem seus resultados comentados na seção seguinte. Na conclusão alguns encaminhamentos futuros são apresentados.</w:t>
       </w:r>
     </w:p>
     <w:p>
       <w:pPr>
         <w:pStyle w:val="Heading2"/>
       </w:pPr>
-      <w:bookmarkStart w:id="23" w:name="escopo"/>
-      <w:r>
-        <w:t xml:space="preserve">Escopo</w:t>
-      </w:r>
-      <w:bookmarkEnd w:id="23"/>
+      <w:bookmarkStart w:id="24" w:name="relevância-socio-econômica"/>
+      <w:r>
+        <w:t xml:space="preserve">Relevância socio-econômica</w:t>
+      </w:r>
+      <w:bookmarkEnd w:id="24"/>
+    </w:p>
+    <w:p>
+      <w:pPr>
+        <w:pStyle w:val="Heading1"/>
+      </w:pPr>
+      <w:bookmarkStart w:id="25" w:name="revisão-bibliográfica"/>
+      <w:r>
+        <w:t xml:space="preserve">Revisão Bibliográfica</w:t>
+      </w:r>
+      <w:bookmarkEnd w:id="25"/>
     </w:p>
     <w:p>
       <w:pPr>
         <w:pStyle w:val="Heading2"/>
       </w:pPr>
-      <w:bookmarkStart w:id="24" w:name="estrutura"/>
-      <w:r>
-        <w:t xml:space="preserve">Estrutura</w:t>
-      </w:r>
-      <w:bookmarkEnd w:id="24"/>
-    </w:p>
-    <w:p>
-      <w:pPr>
-        <w:pStyle w:val="Heading2"/>
-      </w:pPr>
-      <w:bookmarkStart w:id="25" w:name="relevância"/>
-      <w:r>
-        <w:t xml:space="preserve">Relevância</w:t>
-      </w:r>
-      <w:r>
-        <w:t xml:space="preserve"> </w:t>
-      </w:r>
-      <w:bookmarkEnd w:id="25"/>
-    </w:p>
-    <w:p>
-      <w:pPr>
-        <w:pStyle w:val="Heading1"/>
-      </w:pPr>
-      <w:bookmarkStart w:id="26" w:name="revisão-bibliográfica"/>
-      <w:r>
-        <w:t xml:space="preserve">Revisão Bibliográfica</w:t>
+      <w:bookmarkStart w:id="26" w:name="redes-neurais-artificiais"/>
+      <w:r>
+        <w:t xml:space="preserve">Redes Neurais Artificiais</w:t>
       </w:r>
       <w:bookmarkEnd w:id="26"/>
-    </w:p>
-    <w:p>
-      <w:pPr>
-        <w:pStyle w:val="Heading2"/>
-      </w:pPr>
-      <w:bookmarkStart w:id="27" w:name="redes-neurais-artificiais"/>
-      <w:r>
-        <w:t xml:space="preserve">Redes Neurais Artificiais</w:t>
-      </w:r>
-      <w:bookmarkEnd w:id="27"/>
     </w:p>
     <w:p>
       <w:pPr>
@@ -637,7 +810,7 @@
         <w:pStyle w:val="BodyText"/>
       </w:pPr>
       <w:r>
-        <w:t xml:space="preserve">Um outro impedimento práticos do trabalhos de Rosenblatt e Widrow foi a ausência de uma metodologia eficiente para a atualização dos pesos da rede, sobretudo envolvendo múltiplas camadas de neurônios - caso não coberto pelos algortimos iniciais tanto de Rosenblat quanto de Widrow; tal metodologia veio a ser proposta originalmente por Werbos em 1974</w:t>
+        <w:t xml:space="preserve">Um outro impedimento práticos do trabalhos de Rosenblatt e Widrow foi a ausência de uma metodologia eficiente para a atualização dos pesos da rede, sobretudo envolvendo múltiplas camadas de neurônios - caso não coberto pelos algoritmos iniciais tanto de Rosenblat quanto de Widrow; tal metodologia veio a ser proposta originalmente por Werbos em 1974</w:t>
       </w:r>
       <w:r>
         <w:t xml:space="preserve"> </w:t>
@@ -766,21 +939,21 @@
       <w:pPr>
         <w:pStyle w:val="Heading2"/>
       </w:pPr>
-      <w:bookmarkStart w:id="28" w:name="arquiteturas-proeminentes"/>
-      <w:r>
-        <w:t xml:space="preserve">Arquiteturas Proeminentes</w:t>
+      <w:bookmarkStart w:id="27" w:name="redes-neurais---principais-arquiteturas"/>
+      <w:r>
+        <w:t xml:space="preserve">Redes Neurais - Principais Arquiteturas</w:t>
+      </w:r>
+      <w:bookmarkEnd w:id="27"/>
+    </w:p>
+    <w:p>
+      <w:pPr>
+        <w:pStyle w:val="Heading3"/>
+      </w:pPr>
+      <w:bookmarkStart w:id="28" w:name="feed-forward"/>
+      <w:r>
+        <w:t xml:space="preserve">Feed-Forward</w:t>
       </w:r>
       <w:bookmarkEnd w:id="28"/>
-    </w:p>
-    <w:p>
-      <w:pPr>
-        <w:pStyle w:val="Heading3"/>
-      </w:pPr>
-      <w:bookmarkStart w:id="29" w:name="feed-forward"/>
-      <w:r>
-        <w:t xml:space="preserve">Feed-Forward</w:t>
-      </w:r>
-      <w:bookmarkEnd w:id="29"/>
     </w:p>
     <w:p>
       <w:pPr>
@@ -837,7 +1010,7 @@
         <w:t xml:space="preserve"> </w:t>
       </w:r>
       <w:r>
-        <w:t xml:space="preserve">and the hyperbolic tangent</w:t>
+        <w:t xml:space="preserve">e a tangente hiberbólica</w:t>
       </w:r>
       <w:r>
         <w:t xml:space="preserve"> </w:t>
@@ -942,10 +1115,42 @@
       <w:pPr>
         <w:pStyle w:val="Heading3"/>
       </w:pPr>
-      <w:bookmarkStart w:id="30" w:name="redes-neurais-profundas"/>
+      <w:bookmarkStart w:id="29" w:name="redes-neurais-profundas"/>
       <w:r>
         <w:t xml:space="preserve">Redes Neurais Profundas</w:t>
       </w:r>
+      <w:bookmarkEnd w:id="29"/>
+    </w:p>
+    <w:p>
+      <w:pPr>
+        <w:pStyle w:val="FirstParagraph"/>
+      </w:pPr>
+      <w:r>
+        <w:t xml:space="preserve">Com a melhoria do hardware, a topologia Feed-Forward foi recebendo um acréscimo de camadas, gerando as redes profundas (Deep Neural Networks). O aspecto mais importante dessa movimentação foi que as redes ganharam a habilidade de gerar representações sucessivas, abstraindo diferentes aspectos dos dados em cada uma de suas camadas.</w:t>
+      </w:r>
+    </w:p>
+    <w:p>
+      <w:pPr>
+        <w:pStyle w:val="BodyText"/>
+      </w:pPr>
+      <w:r>
+        <w:t xml:space="preserve">A grande vantagem desta topologia foi sua capacidade automática de extração de dos componentes descritivos dos dados, um trabalho que ficava a cargo dos pesquisadores anteriormente</w:t>
+      </w:r>
+      <w:r>
+        <w:t xml:space="preserve">(Socher 2014)</w:t>
+      </w:r>
+      <w:r>
+        <w:t xml:space="preserve">. Em contrapartida, a forma como os dados são interpretados pela rede pode não ser facilmente inferida pelo pesquisador, e as redes podem assumir uma forte característica de caixa-preta.</w:t>
+      </w:r>
+    </w:p>
+    <w:p>
+      <w:pPr>
+        <w:pStyle w:val="Heading3"/>
+      </w:pPr>
+      <w:bookmarkStart w:id="30" w:name="redes-recorrentes"/>
+      <w:r>
+        <w:t xml:space="preserve">Redes Recorrentes</w:t>
+      </w:r>
       <w:bookmarkEnd w:id="30"/>
     </w:p>
     <w:p>
@@ -953,7 +1158,16 @@
         <w:pStyle w:val="FirstParagraph"/>
       </w:pPr>
       <w:r>
-        <w:t xml:space="preserve">Com a melhoria do hardware, a topologia Feed-Forward foi ganhando um acréscimo de camadas, gerando as redes profundas (Deep Neural Networks). O aspecto mais importante dessa movimentação foi que as redes ganharam a habilidade de gerar representações sucessivas, abstraindo diferentes aspectos dos dados em cada uma de suas camadas.</w:t>
+        <w:t xml:space="preserve">Em redes recorrentes os neurons são parcialmente alimentados com seus próprios estados anteriores, emulando um efeito similar à utilização de ligações entre neurons de uma camada abaixo com neurons de uma camada acima não adjacente</w:t>
+      </w:r>
+      <w:r>
+        <w:t xml:space="preserve"> </w:t>
+      </w:r>
+      <w:r>
+        <w:t xml:space="preserve">(Veit, Wilber, and Belongie 2016)</w:t>
+      </w:r>
+      <w:r>
+        <w:t xml:space="preserve">.</w:t>
       </w:r>
     </w:p>
     <w:p>
@@ -961,37 +1175,40 @@
         <w:pStyle w:val="BodyText"/>
       </w:pPr>
       <w:r>
-        <w:t xml:space="preserve">A grande vantagem desta topologia foi sua capacidade automática de extração de</w:t>
-      </w:r>
-      <w:r>
-        <w:t xml:space="preserve"> </w:t>
-      </w:r>
-      <w:r>
-        <w:t xml:space="preserve">‘</w:t>
-      </w:r>
-      <w:r>
-        <w:t xml:space="preserve">features</w:t>
-      </w:r>
-      <w:r>
-        <w:t xml:space="preserve">’</w:t>
-      </w:r>
-      <w:r>
-        <w:t xml:space="preserve">, um trabalho que ficava a cargo dos pesquisadores anteriormente</w:t>
-      </w:r>
-      <w:r>
-        <w:t xml:space="preserve">(Socher 2014)</w:t>
-      </w:r>
-      <w:r>
-        <w:t xml:space="preserve">. Em contrapartida, já forma como os dados são interpretados pela rede pode não ser facilmente inferida pelo pesquisador, e as redes podem assumir uma forte característica de caixa-preta.</w:t>
+        <w:t xml:space="preserve">Essa arquitetura foi proposta por Elman</w:t>
+      </w:r>
+      <w:r>
+        <w:t xml:space="preserve"> </w:t>
+      </w:r>
+      <w:r>
+        <w:t xml:space="preserve">(Elman 1990)</w:t>
+      </w:r>
+      <w:r>
+        <w:t xml:space="preserve"> </w:t>
+      </w:r>
+      <w:r>
+        <w:t xml:space="preserve">em 1990 com o propósito de capturar</w:t>
+      </w:r>
+      <w:r>
+        <w:t xml:space="preserve"> </w:t>
+      </w:r>
+      <w:r>
+        <w:t xml:space="preserve">informações codificadas no encadeamento temporal os dados, e é bastante poderosa em várias aplicações, como modelos de previsão e classificação de informações</w:t>
+      </w:r>
+      <w:r>
+        <w:t xml:space="preserve">(Xu, Auli, and Clark 2015)</w:t>
+      </w:r>
+      <w:r>
+        <w:t xml:space="preserve">, por exemplo.</w:t>
       </w:r>
     </w:p>
     <w:p>
       <w:pPr>
         <w:pStyle w:val="Heading3"/>
       </w:pPr>
-      <w:bookmarkStart w:id="31" w:name="redes-recorrentes"/>
-      <w:r>
-        <w:t xml:space="preserve">Redes Recorrentes</w:t>
+      <w:bookmarkStart w:id="31" w:name="redes-convolucionais"/>
+      <w:r>
+        <w:t xml:space="preserve">Redes Convolucionais</w:t>
       </w:r>
       <w:bookmarkEnd w:id="31"/>
     </w:p>
@@ -1000,13 +1217,22 @@
         <w:pStyle w:val="FirstParagraph"/>
       </w:pPr>
       <w:r>
-        <w:t xml:space="preserve">Em redes recorrentes os neurons são parcialmente alimentados com seus próprios estados anteriores, emulando um efeito similar à utilização de ligações entre neurons de uma camada abaixo com neurons de uma camada acima não adjacente</w:t>
-      </w:r>
-      <w:r>
-        <w:t xml:space="preserve"> </w:t>
-      </w:r>
-      <w:r>
-        <w:t xml:space="preserve">(Veit, Wilber, and Belongie 2016)</w:t>
+        <w:t xml:space="preserve">Trata-se de um tipo de arquitetura, geralmente profunda, que é amplamente utilizado em problemas relacionados a imagens, atingindo resultados de ponta em várias áreas relacionadas à visão de computadores (</w:t>
+      </w:r>
+      <w:r>
+        <w:rPr>
+          <w:i/>
+        </w:rPr>
+        <w:t xml:space="preserve">computer vision</w:t>
+      </w:r>
+      <w:r>
+        <w:t xml:space="preserve">), como reconhecimento de objetos e rostos em imagens</w:t>
+      </w:r>
+      <w:r>
+        <w:t xml:space="preserve"> </w:t>
+      </w:r>
+      <w:r>
+        <w:t xml:space="preserve">(Pang et al. 2017)</w:t>
       </w:r>
       <w:r>
         <w:t xml:space="preserve">.</w:t>
@@ -1017,40 +1243,33 @@
         <w:pStyle w:val="BodyText"/>
       </w:pPr>
       <w:r>
-        <w:t xml:space="preserve">Essa arquitetura foi proposta por Elman</w:t>
-      </w:r>
-      <w:r>
-        <w:t xml:space="preserve"> </w:t>
-      </w:r>
-      <w:r>
-        <w:t xml:space="preserve">(Elman 1990)</w:t>
-      </w:r>
-      <w:r>
-        <w:t xml:space="preserve"> </w:t>
-      </w:r>
-      <w:r>
-        <w:t xml:space="preserve">em 1990 com o propósito de capturar</w:t>
-      </w:r>
-      <w:r>
-        <w:t xml:space="preserve"> </w:t>
-      </w:r>
-      <w:r>
-        <w:t xml:space="preserve">informações codificadas no encadeamento temporal os dados, e é bastante poderosa em várias aplicações, como modelos de previsão e classificação de informações</w:t>
-      </w:r>
-      <w:r>
-        <w:t xml:space="preserve">(Xu, Auli, and Clark 2015)</w:t>
-      </w:r>
-      <w:r>
-        <w:t xml:space="preserve">, por exemplo.</w:t>
-      </w:r>
-    </w:p>
-    <w:p>
-      <w:pPr>
-        <w:pStyle w:val="Heading3"/>
-      </w:pPr>
-      <w:bookmarkStart w:id="32" w:name="redes-convolucionais"/>
-      <w:r>
-        <w:t xml:space="preserve">Redes Convolucionais</w:t>
+        <w:t xml:space="preserve">Esse tipo de arquitetura lida com o problema da alta dimensão de uma imagem substituindo camadas totalmente conectadas por camadas convolucionais, que varrem a imagem, movimentando-se em uma de suas dimensões um passo por vez cada vez</w:t>
+      </w:r>
+      <w:r>
+        <w:t xml:space="preserve"> </w:t>
+      </w:r>
+      <w:r>
+        <w:t xml:space="preserve">(LeCun et al. 1998)</w:t>
+      </w:r>
+      <w:r>
+        <w:t xml:space="preserve">, e atualizando os pesos de acordo.</w:t>
+      </w:r>
+    </w:p>
+    <w:p>
+      <w:pPr>
+        <w:pStyle w:val="BodyText"/>
+      </w:pPr>
+      <w:r>
+        <w:t xml:space="preserve">Esse procedimento permite a geração, nas camadas convolucionais da rede, de uma só representação para padrões que aparecem em diferentes pontos da imagem; tais representações são geralmente interpretadas nas camadas finais da rede, totalmente conectadas, de forma a gerar o resultado final.</w:t>
+      </w:r>
+    </w:p>
+    <w:p>
+      <w:pPr>
+        <w:pStyle w:val="Heading2"/>
+      </w:pPr>
+      <w:bookmarkStart w:id="32" w:name="redes-neurais-aplicadas-à-musica"/>
+      <w:r>
+        <w:t xml:space="preserve">Redes Neurais Aplicadas à Musica</w:t>
       </w:r>
       <w:bookmarkEnd w:id="32"/>
     </w:p>
@@ -1059,13 +1278,535 @@
         <w:pStyle w:val="FirstParagraph"/>
       </w:pPr>
       <w:r>
-        <w:t xml:space="preserve">Trata-se de um tipo de arquitetura profunda, que é amplamente utilizado em problemas relacionados a imagens, atingindo resultados de ponta em várias áreas de visão de computadores (computer vision), como reconhecimento de objetos e rostos em imagens</w:t>
-      </w:r>
-      <w:r>
-        <w:t xml:space="preserve"> </w:t>
-      </w:r>
-      <w:r>
-        <w:t xml:space="preserve">(Pang et al. 2017)</w:t>
+        <w:t xml:space="preserve">A maioria dos trabalhos que investigam a aplicação de redes neurais à música, sobretudo envolvendo sua síntese, ocorrem em um nível de abstração mais alto do que a geração direta dos sons. Geralmente tomam como base a manipulação de representações musicais como partituras, por exemplo, ou representações sonoras compactas, como os espectrogramas.</w:t>
+      </w:r>
+    </w:p>
+    <w:p>
+      <w:pPr>
+        <w:pStyle w:val="BodyText"/>
+      </w:pPr>
+      <w:r>
+        <w:t xml:space="preserve">Classification</w:t>
+      </w:r>
+      <w:r>
+        <w:t xml:space="preserve"> </w:t>
+      </w:r>
+      <w:r>
+        <w:t xml:space="preserve">This task involves assigning tags, generally genre-related or emotion related, to musical pieces.</w:t>
+      </w:r>
+      <w:r>
+        <w:t xml:space="preserve"> </w:t>
+      </w:r>
+      <w:r>
+        <w:t xml:space="preserve">(Costa, Oliveira, and Silla 2017)</w:t>
+      </w:r>
+      <w:r>
+        <w:t xml:space="preserve"> </w:t>
+      </w:r>
+      <w:r>
+        <w:t xml:space="preserve">and</w:t>
+      </w:r>
+      <w:r>
+        <w:t xml:space="preserve"> </w:t>
+      </w:r>
+      <w:r>
+        <w:t xml:space="preserve">(Choi, Fazekas, and Sandler 2016)</w:t>
+      </w:r>
+      <w:r>
+        <w:t xml:space="preserve"> </w:t>
+      </w:r>
+      <w:r>
+        <w:t xml:space="preserve">tackles this task with a fully convolutional neural network fed, in the latter case, with music represented by a mel-spectrogram, while in</w:t>
+      </w:r>
+      <w:r>
+        <w:t xml:space="preserve"> </w:t>
+      </w:r>
+      <w:r>
+        <w:t xml:space="preserve">(Choi et al. 2017)</w:t>
+      </w:r>
+      <w:r>
+        <w:t xml:space="preserve"> </w:t>
+      </w:r>
+      <w:r>
+        <w:t xml:space="preserve">a recurrent architecture is also explored, to exploit the temporal correlation of the inputs.</w:t>
+      </w:r>
+    </w:p>
+    <w:p>
+      <w:pPr>
+        <w:pStyle w:val="BodyText"/>
+      </w:pPr>
+      <w:r>
+        <w:t xml:space="preserve">Transcription</w:t>
+      </w:r>
+      <w:r>
+        <w:t xml:space="preserve"> </w:t>
+      </w:r>
+      <w:r>
+        <w:t xml:space="preserve">the common task in this field is to translate music parts, generally specific instruments, into a symbolic representation, like tablatures or music scores, for example. One of the first contributions to this field is seen in</w:t>
+      </w:r>
+      <w:r>
+        <w:t xml:space="preserve"> </w:t>
+      </w:r>
+      <w:r>
+        <w:t xml:space="preserve">(Tuohy, Potter, and Center 2006)</w:t>
+      </w:r>
+      <w:r>
+        <w:t xml:space="preserve"> </w:t>
+      </w:r>
+      <w:r>
+        <w:t xml:space="preserve">via the coupling of a network and a local heuristic hill-climber applied over the results, to generate tablatures from music.</w:t>
+      </w:r>
+    </w:p>
+    <w:p>
+      <w:pPr>
+        <w:pStyle w:val="BodyText"/>
+      </w:pPr>
+      <w:r>
+        <w:t xml:space="preserve">With the use of a recurrent net,</w:t>
+      </w:r>
+      <w:r>
+        <w:t xml:space="preserve"> </w:t>
+      </w:r>
+      <w:r>
+        <w:t xml:space="preserve">(Boulanger-Lewandowski, Bengio, and Vincent 2013)</w:t>
+      </w:r>
+      <w:r>
+        <w:t xml:space="preserve"> </w:t>
+      </w:r>
+      <w:r>
+        <w:t xml:space="preserve">transcribes spectrograms of general musical parts into piano roll midi commands, while</w:t>
+      </w:r>
+      <w:r>
+        <w:t xml:space="preserve"> </w:t>
+      </w:r>
+      <w:r>
+        <w:t xml:space="preserve">(Böck and Schedl 2012)</w:t>
+      </w:r>
+      <w:r>
+        <w:t xml:space="preserve"> </w:t>
+      </w:r>
+      <w:r>
+        <w:t xml:space="preserve">offers a similar approach, restricted to polyphonic piano sound, as in the case of</w:t>
+      </w:r>
+      <w:r>
+        <w:t xml:space="preserve"> </w:t>
+      </w:r>
+      <w:r>
+        <w:t xml:space="preserve">(Sigtia, Benetos, and Dixon 2016)</w:t>
+      </w:r>
+      <w:r>
+        <w:t xml:space="preserve">. The last work, however, uses different architectures for the acoustic, a simple network and the language, a recurrent network model. With the use of a bidirectional recurrent net fed with spectral representations,</w:t>
+      </w:r>
+      <w:r>
+        <w:t xml:space="preserve"> </w:t>
+      </w:r>
+      <w:r>
+        <w:t xml:space="preserve">(Southall, Stables, and Hockman 2016)</w:t>
+      </w:r>
+      <w:r>
+        <w:t xml:space="preserve">, creates drum representations.</w:t>
+      </w:r>
+    </w:p>
+    <w:p>
+      <w:pPr>
+        <w:pStyle w:val="BodyText"/>
+      </w:pPr>
+      <w:r>
+        <w:t xml:space="preserve">Generation</w:t>
+      </w:r>
+      <w:r>
+        <w:t xml:space="preserve"> </w:t>
+      </w:r>
+      <w:r>
+        <w:t xml:space="preserve">Here the aim is the inverse of that in the music transcription: given a representation, audio output is generated. One of the first works in the field is seen in</w:t>
+      </w:r>
+      <w:r>
+        <w:t xml:space="preserve">(Stanley 2007)</w:t>
+      </w:r>
+      <w:r>
+        <w:t xml:space="preserve">, consisting of a compositional pattern producing network generating music on the fly based on user input.</w:t>
+      </w:r>
+      <w:r>
+        <w:t xml:space="preserve"> </w:t>
+      </w:r>
+      <w:r>
+        <w:t xml:space="preserve">(Hutchings 2017)</w:t>
+      </w:r>
+      <w:r>
+        <w:t xml:space="preserve"> </w:t>
+      </w:r>
+      <w:r>
+        <w:t xml:space="preserve">generates full drum parts based on a kick drum pattern, with a recurrent net, and investigates the quality of the results via an online survey.</w:t>
+      </w:r>
+    </w:p>
+    <w:p>
+      <w:pPr>
+        <w:pStyle w:val="Heading2"/>
+      </w:pPr>
+      <w:bookmarkStart w:id="33" w:name="redes-neurais-aplicadas-ao-discurso-falado"/>
+      <w:r>
+        <w:t xml:space="preserve">Redes Neurais Aplicadas ao Discurso Falado</w:t>
+      </w:r>
+      <w:bookmarkEnd w:id="33"/>
+    </w:p>
+    <w:p>
+      <w:pPr>
+        <w:pStyle w:val="FirstParagraph"/>
+      </w:pPr>
+      <w:r>
+        <w:t xml:space="preserve">Poucos trabalhos investigam a utilização de redes neurais para a síntese sonora direta. Não obstante, algumas das áreas correlatas são bastante exploradas, e podem oferecer insights interessantes.</w:t>
+      </w:r>
+    </w:p>
+    <w:p>
+      <w:pPr>
+        <w:pStyle w:val="BodyText"/>
+      </w:pPr>
+      <w:r>
+        <w:t xml:space="preserve">(Hinton et al. 2012)</w:t>
+      </w:r>
+      <w:r>
+        <w:t xml:space="preserve"> </w:t>
+      </w:r>
+      <w:r>
+        <w:t xml:space="preserve">apresenta uma revisão da literatura sobre o uso de modelagem acústica em abordagens baseadas em redes neurais na área de reconhecimento de voz. No mesmo ano</w:t>
+      </w:r>
+      <w:r>
+        <w:t xml:space="preserve"> </w:t>
+      </w:r>
+      <w:r>
+        <w:t xml:space="preserve">(Graves, Mohamed, and Hinton 2013)</w:t>
+      </w:r>
+      <w:r>
+        <w:t xml:space="preserve"> </w:t>
+      </w:r>
+      <w:r>
+        <w:t xml:space="preserve">alcança resultados no</w:t>
+      </w:r>
+      <w:r>
+        <w:t xml:space="preserve"> </w:t>
+      </w:r>
+      <w:r>
+        <w:rPr>
+          <w:i/>
+        </w:rPr>
+        <w:t xml:space="preserve">TIMIT phoneme recognition benchmark</w:t>
+      </w:r>
+      <w:r>
+        <w:t xml:space="preserve">, com a aplicação de redes recorrentes profundas, que estabelem o novo estado da arte,enquanto</w:t>
+      </w:r>
+      <w:r>
+        <w:t xml:space="preserve"> </w:t>
+      </w:r>
+      <w:r>
+        <w:t xml:space="preserve">(Maas, Hannun, and Ng 2013)</w:t>
+      </w:r>
+      <w:r>
+        <w:t xml:space="preserve"> </w:t>
+      </w:r>
+      <w:r>
+        <w:t xml:space="preserve">aponta a superioridade da função de ativação relu (</w:t>
+      </w:r>
+      <w:r>
+        <w:rPr>
+          <w:i/>
+        </w:rPr>
+        <w:t xml:space="preserve">rectifier nonlinearities</w:t>
+      </w:r>
+      <w:r>
+        <w:t xml:space="preserve">) sobre ativações de caráter sigmoidal em tarefas relacionadas ao reconhecimento contínuo da fala.</w:t>
+      </w:r>
+    </w:p>
+    <w:p>
+      <w:pPr>
+        <w:pStyle w:val="BodyText"/>
+      </w:pPr>
+      <w:r>
+        <w:t xml:space="preserve">A partir de uma arquitetura hibrica, combinando um modelo fonético recorrente com um classificador acústico baseado em uma rede neural profunda,</w:t>
+      </w:r>
+      <w:r>
+        <w:t xml:space="preserve"> </w:t>
+      </w:r>
+      <w:r>
+        <w:t xml:space="preserve">(Boulanger-Lewandowski et al. 2014)</w:t>
+      </w:r>
+      <w:r>
+        <w:t xml:space="preserve"> </w:t>
+      </w:r>
+      <w:r>
+        <w:t xml:space="preserve">aplica estratégias de sequenciamento telefonico para estabelecer um novo benchmark no</w:t>
+      </w:r>
+      <w:r>
+        <w:t xml:space="preserve"> </w:t>
+      </w:r>
+      <w:r>
+        <w:rPr>
+          <w:i/>
+        </w:rPr>
+        <w:t xml:space="preserve">TIMIT dataset</w:t>
+      </w:r>
+      <w:r>
+        <w:t xml:space="preserve">, uma técnica que foi comprovada por</w:t>
+      </w:r>
+      <w:r>
+        <w:t xml:space="preserve"> </w:t>
+      </w:r>
+      <w:r>
+        <w:t xml:space="preserve">(Sak et al. 2015)</w:t>
+      </w:r>
+      <w:r>
+        <w:t xml:space="preserve"> </w:t>
+      </w:r>
+      <w:r>
+        <w:t xml:space="preserve">como superior ao uso de arquiteturas como</w:t>
+      </w:r>
+      <w:r>
+        <w:t xml:space="preserve"> </w:t>
+      </w:r>
+      <w:r>
+        <w:rPr>
+          <w:i/>
+        </w:rPr>
+        <w:t xml:space="preserve">deep long short-Term memory recurrent neural networks</w:t>
+      </w:r>
+      <w:r>
+        <w:t xml:space="preserve"> </w:t>
+      </w:r>
+      <w:r>
+        <w:t xml:space="preserve">e as abordagens mais utilizadas à época baseadas no modelo oculto de Markov.</w:t>
+      </w:r>
+    </w:p>
+    <w:p>
+      <w:pPr>
+        <w:pStyle w:val="BodyText"/>
+      </w:pPr>
+      <w:r>
+        <w:t xml:space="preserve">Com relação à utilização de redes convolucionais,</w:t>
+      </w:r>
+      <w:r>
+        <w:t xml:space="preserve"> </w:t>
+      </w:r>
+      <w:r>
+        <w:t xml:space="preserve">(Sainath et al. 2015)</w:t>
+      </w:r>
+      <w:r>
+        <w:t xml:space="preserve"> </w:t>
+      </w:r>
+      <w:r>
+        <w:t xml:space="preserve">investiga a otimização dos hyperparametros dessas redes, além de estratégias de</w:t>
+      </w:r>
+      <w:r>
+        <w:t xml:space="preserve"> </w:t>
+      </w:r>
+      <w:r>
+        <w:rPr>
+          <w:i/>
+        </w:rPr>
+        <w:t xml:space="preserve">pooling</w:t>
+      </w:r>
+      <w:r>
+        <w:t xml:space="preserve"> </w:t>
+      </w:r>
+      <w:r>
+        <w:t xml:space="preserve">e treinamento para aplicações em reconhecimento de fala, enquanto</w:t>
+      </w:r>
+      <w:r>
+        <w:t xml:space="preserve"> </w:t>
+      </w:r>
+      <w:r>
+        <w:t xml:space="preserve">(Zweig et al. 2017)</w:t>
+      </w:r>
+      <w:r>
+        <w:t xml:space="preserve"> </w:t>
+      </w:r>
+      <w:r>
+        <w:t xml:space="preserve">e</w:t>
+      </w:r>
+      <w:r>
+        <w:t xml:space="preserve"> </w:t>
+      </w:r>
+      <w:r>
+        <w:t xml:space="preserve">(Ying Zhang et al. 2017)</w:t>
+      </w:r>
+      <w:r>
+        <w:t xml:space="preserve"> </w:t>
+      </w:r>
+      <w:r>
+        <w:t xml:space="preserve">exploram o desempenho de sistemas baseados somente em redes neurais (</w:t>
+      </w:r>
+      <w:r>
+        <w:rPr>
+          <w:i/>
+        </w:rPr>
+        <w:t xml:space="preserve">end-to-end</w:t>
+      </w:r>
+      <w:r>
+        <w:t xml:space="preserve">), com o último combinando redes convolucionais hierárquicas com classificação temporal coneccionista. Nessa mesma linha, o trabalho de</w:t>
+      </w:r>
+      <w:r>
+        <w:t xml:space="preserve"> </w:t>
+      </w:r>
+      <w:r>
+        <w:t xml:space="preserve">(Yu Zhang, Chan, and Jaitly 2017)</w:t>
+      </w:r>
+      <w:r>
+        <w:t xml:space="preserve">também investiga sistemas</w:t>
+      </w:r>
+      <w:r>
+        <w:t xml:space="preserve"> </w:t>
+      </w:r>
+      <w:r>
+        <w:rPr>
+          <w:i/>
+        </w:rPr>
+        <w:t xml:space="preserve">end-to-end</w:t>
+      </w:r>
+      <w:r>
+        <w:t xml:space="preserve"> </w:t>
+      </w:r>
+      <w:r>
+        <w:t xml:space="preserve">a partir de uma arquitetura combinando redes neurais convolucionais profundas com recorrência e princípios baseados no aninhamento de redes neurais (NIN, network in a network). Alguns desses princípios, notadamente a justaposição de convolução e recorrência, inspiraram a implementação apresentada no capítulo</w:t>
+      </w:r>
+      <w:r>
+        <w:t xml:space="preserve"> </w:t>
+      </w:r>
+      <w:r>
+        <w:rPr>
+          <w:b/>
+        </w:rPr>
+        <w:t xml:space="preserve">XXX</w:t>
+      </w:r>
+    </w:p>
+    <w:p>
+      <w:pPr>
+        <w:pStyle w:val="BodyText"/>
+      </w:pPr>
+      <w:r>
+        <w:t xml:space="preserve">O estado da arte da síntese sonora ainda não foi estabelecido por abordagens totalmente baseadas em redes neurais, embora pesquisas nesse sentido sejam abundantes, e estejam rapidamente aproximando-se da qualidade necessária para a implementação em produtos finais. O trabalho de</w:t>
+      </w:r>
+      <w:r>
+        <w:t xml:space="preserve"> </w:t>
+      </w:r>
+      <w:r>
+        <w:t xml:space="preserve">(Zen and Sak 2015)</w:t>
+      </w:r>
+      <w:r>
+        <w:t xml:space="preserve"> </w:t>
+      </w:r>
+      <w:r>
+        <w:t xml:space="preserve">aborda a tarefa a partir de uma rede recorrente com camadas LSTM (long short-term memory), enquanto</w:t>
+      </w:r>
+      <w:r>
+        <w:t xml:space="preserve"> </w:t>
+      </w:r>
+      <w:r>
+        <w:t xml:space="preserve">(Wu and King 2016)</w:t>
+      </w:r>
+      <w:r>
+        <w:t xml:space="preserve"> </w:t>
+      </w:r>
+      <w:r>
+        <w:t xml:space="preserve">investiga a influência de aspectos específicos dessa topologia em sua eficiência na tarefa de síntese da voz falada.</w:t>
+      </w:r>
+    </w:p>
+    <w:p>
+      <w:pPr>
+        <w:pStyle w:val="Heading2"/>
+      </w:pPr>
+      <w:bookmarkStart w:id="34" w:name="redes-neurais-aplicadas-à-imagem-computer-vision"/>
+      <w:r>
+        <w:t xml:space="preserve">Redes Neurais Aplicadas à Imagem (</w:t>
+      </w:r>
+      <w:r>
+        <w:rPr>
+          <w:i/>
+        </w:rPr>
+        <w:t xml:space="preserve">Computer Vision</w:t>
+      </w:r>
+      <w:r>
+        <w:t xml:space="preserve">)</w:t>
+      </w:r>
+      <w:bookmarkEnd w:id="34"/>
+    </w:p>
+    <w:p>
+      <w:pPr>
+        <w:pStyle w:val="FirstParagraph"/>
+      </w:pPr>
+      <w:r>
+        <w:t xml:space="preserve">Recentemente tem-se visto esforços para adaptar métodos utilizados com sucesso na área de</w:t>
+      </w:r>
+      <w:r>
+        <w:t xml:space="preserve"> </w:t>
+      </w:r>
+      <w:r>
+        <w:rPr>
+          <w:i/>
+        </w:rPr>
+        <w:t xml:space="preserve">computer vision</w:t>
+      </w:r>
+      <w:r>
+        <w:t xml:space="preserve"> </w:t>
+      </w:r>
+      <w:r>
+        <w:t xml:space="preserve">ao campo da modelagem acústica. O trabalho de</w:t>
+      </w:r>
+      <w:r>
+        <w:t xml:space="preserve"> </w:t>
+      </w:r>
+      <w:r>
+        <w:t xml:space="preserve">(Engel et al. 2017)</w:t>
+      </w:r>
+      <w:r>
+        <w:t xml:space="preserve">, por exemplo, busca inspiração na área de geração de imagens para elaborar uma arquitetura apropriada a síntese sonora.</w:t>
+      </w:r>
+      <w:r>
+        <w:t xml:space="preserve"> </w:t>
+      </w:r>
+      <w:r>
+        <w:t xml:space="preserve">Ainda em paralelo com a área de relacionada à imagens, o autor propõe um base de dados sonora, Nsynth, à luz de</w:t>
+      </w:r>
+      <w:r>
+        <w:t xml:space="preserve"> </w:t>
+      </w:r>
+      <w:r>
+        <w:rPr>
+          <w:i/>
+        </w:rPr>
+        <w:t xml:space="preserve">datasets</w:t>
+      </w:r>
+      <w:r>
+        <w:t xml:space="preserve"> </w:t>
+      </w:r>
+      <w:r>
+        <w:t xml:space="preserve">clássicos de imagens, como o MNIST, como uma forma de alavancar pesquisas nessa direção.</w:t>
+      </w:r>
+    </w:p>
+    <w:p>
+      <w:pPr>
+        <w:pStyle w:val="BodyText"/>
+      </w:pPr>
+      <w:r>
+        <w:t xml:space="preserve">Image Compression</w:t>
+      </w:r>
+      <w:r>
+        <w:t xml:space="preserve"> </w:t>
+      </w:r>
+      <w:r>
+        <w:t xml:space="preserve">Despite beeing an important field in face of the communication era demands</w:t>
+      </w:r>
+      <w:r>
+        <w:t xml:space="preserve">(Rehman, Sharif, and Raza 2014)</w:t>
+      </w:r>
+      <w:r>
+        <w:t xml:space="preserve">, the last review about the use of neural networks in image compression was made in 1999</w:t>
+      </w:r>
+      <w:r>
+        <w:t xml:space="preserve">(Jiang 1999)</w:t>
+      </w:r>
+      <w:r>
+        <w:t xml:space="preserve">, while the last general review about the area dates from 2014</w:t>
+      </w:r>
+      <w:r>
+        <w:t xml:space="preserve">(Rehman, Sharif, and Raza 2014)</w:t>
       </w:r>
       <w:r>
         <w:t xml:space="preserve">.</w:t>
@@ -1076,16 +1817,13 @@
         <w:pStyle w:val="BodyText"/>
       </w:pPr>
       <w:r>
-        <w:t xml:space="preserve">Esse tipo de arquitetura lida com o problema da alta dimensão de uma imagem substituindo camadas totalmente conectadas por camadas convolucionais, que varrem a imagem, movimentando-se em uma de suas dimensões um passo por vez cada vez</w:t>
-      </w:r>
-      <w:r>
-        <w:t xml:space="preserve"> </w:t>
-      </w:r>
-      <w:r>
-        <w:t xml:space="preserve">(LeCun et al. 1998)</w:t>
-      </w:r>
-      <w:r>
-        <w:t xml:space="preserve">, e atualizando os pesos de acordo.</w:t>
+        <w:t xml:space="preserve">(Ballé, Laparra, and Simoncelli 2016)</w:t>
+      </w:r>
+      <w:r>
+        <w:t xml:space="preserve"> </w:t>
+      </w:r>
+      <w:r>
+        <w:t xml:space="preserve">proposes the use of stages of linear convolutional filters and non-linear activation functions, improving the Multiscale Structural Similarity for Image Quality Assessment(MS-SSIM) measure in all bitrates.</w:t>
       </w:r>
     </w:p>
     <w:p>
@@ -1093,73 +1831,334 @@
         <w:pStyle w:val="BodyText"/>
       </w:pPr>
       <w:r>
-        <w:t xml:space="preserve">Esse procedimento permite a geração, nas camadas convolucionais da rede, de uma só representação para padrões que aparecem em diferentes pontos da imagem; tais representações são geralmente interpretadas nas camadas finais da rede, totalmente conectadas, de forma a gerar o resultado final.</w:t>
+        <w:t xml:space="preserve">Superior measurements, with the same metrics, to standard compression methods such as JPEG and WebP, were obtained by</w:t>
+      </w:r>
+      <w:r>
+        <w:t xml:space="preserve"> </w:t>
+      </w:r>
+      <w:r>
+        <w:t xml:space="preserve">(Johnston et al. 2017)</w:t>
+      </w:r>
+      <w:r>
+        <w:t xml:space="preserve">, using a recurrent architecture with SSIM loss function and adaptive bit allocation algorithm.</w:t>
+      </w:r>
+      <w:r>
+        <w:t xml:space="preserve"> </w:t>
+      </w:r>
+      <w:r>
+        <w:t xml:space="preserve">With a modified loss function,</w:t>
+      </w:r>
+      <w:r>
+        <w:t xml:space="preserve"> </w:t>
+      </w:r>
+      <w:r>
+        <w:t xml:space="preserve">(Theis et al. 2017)</w:t>
+      </w:r>
+      <w:r>
+        <w:t xml:space="preserve"> </w:t>
+      </w:r>
+      <w:r>
+        <w:t xml:space="preserve">shows that autoencoders can achieve compressing results comparable with JPEG 2000 format.</w:t>
+      </w:r>
+    </w:p>
+    <w:p>
+      <w:pPr>
+        <w:pStyle w:val="BodyText"/>
+      </w:pPr>
+      <w:r>
+        <w:t xml:space="preserve">(Toderici et al. 2016)</w:t>
+      </w:r>
+      <w:r>
+        <w:t xml:space="preserve"> </w:t>
+      </w:r>
+      <w:r>
+        <w:t xml:space="preserve">also produces results better than standard codecs via different architectures based on recurrent neural networks, a binarizer, and a neural network for entropy coding.</w:t>
+      </w:r>
+    </w:p>
+    <w:p>
+      <w:pPr>
+        <w:pStyle w:val="BodyText"/>
+      </w:pPr>
+      <w:r>
+        <w:t xml:space="preserve">Using a fuzzy neural network,</w:t>
+      </w:r>
+      <w:r>
+        <w:t xml:space="preserve"> </w:t>
+      </w:r>
+      <w:r>
+        <w:t xml:space="preserve">(Wang and Gao 2015)</w:t>
+      </w:r>
+      <w:r>
+        <w:t xml:space="preserve"> </w:t>
+      </w:r>
+      <w:r>
+        <w:t xml:space="preserve">achieves superior speed, robustness and quality in lossy image processing tasks.</w:t>
+      </w:r>
+      <w:r>
+        <w:t xml:space="preserve"> </w:t>
+      </w:r>
+      <w:r>
+        <w:t xml:space="preserve">(Toderici et al. 2015)</w:t>
+      </w:r>
+      <w:r>
+        <w:t xml:space="preserve"> </w:t>
+      </w:r>
+      <w:r>
+        <w:t xml:space="preserve">presents a progressive method, focused on reducing mobile phone data transfer, that allows arbitrary image quality depending on the quantity bits sent to the device.</w:t>
+      </w:r>
+      <w:r>
+        <w:t xml:space="preserve"> </w:t>
+      </w:r>
+      <w:r>
+        <w:t xml:space="preserve">(Santurkar, Budden, and Shavit 2017)</w:t>
+      </w:r>
+      <w:r>
+        <w:t xml:space="preserve"> </w:t>
+      </w:r>
+      <w:r>
+        <w:t xml:space="preserve">investigates the resilience of neural networks based compression, via a generative model capable of offering graceful degradation on the compressed images. Conceptual compressing is investigated by</w:t>
+      </w:r>
+      <w:r>
+        <w:t xml:space="preserve"> </w:t>
+      </w:r>
+      <w:r>
+        <w:t xml:space="preserve">(Gregor et al. 2016)</w:t>
+      </w:r>
+      <w:r>
+        <w:t xml:space="preserve">, a technique that allows images to be retrieved from symbols. All the literature investigate deals with lossy compression.</w:t>
+      </w:r>
+    </w:p>
+    <w:p>
+      <w:pPr>
+        <w:pStyle w:val="BodyText"/>
+      </w:pPr>
+      <w:r>
+        <w:t xml:space="preserve">Síntese</w:t>
+      </w:r>
+      <w:r>
+        <w:t xml:space="preserve"> </w:t>
+      </w:r>
+      <w:r>
+        <w:t xml:space="preserve">(Isola et al. 2016)</w:t>
+      </w:r>
+      <w:r>
+        <w:t xml:space="preserve"> </w:t>
+      </w:r>
+      <w:r>
+        <w:t xml:space="preserve">presents a method to translate images via an adversarial network, generating images from outlines, for example, or providing automatic image colorization</w:t>
+      </w:r>
+      <w:r>
+        <w:t xml:space="preserve"> </w:t>
+      </w:r>
+      <w:r>
+        <w:t xml:space="preserve">(Hwang and Zhou 2016)</w:t>
+      </w:r>
+      <w:r>
+        <w:t xml:space="preserve">,</w:t>
+      </w:r>
+      <w:r>
+        <w:t xml:space="preserve"> </w:t>
+      </w:r>
+      <w:r>
+        <w:t xml:space="preserve">(Zhang, Isola, and Efros 2016)</w:t>
+      </w:r>
+      <w:r>
+        <w:t xml:space="preserve">,</w:t>
+      </w:r>
+      <w:r>
+        <w:t xml:space="preserve"> </w:t>
+      </w:r>
+      <w:r>
+        <w:t xml:space="preserve">(Larsson, Maire, and Shakhnarovich 2016)</w:t>
+      </w:r>
+      <w:r>
+        <w:t xml:space="preserve"> </w:t>
+      </w:r>
+      <w:r>
+        <w:t xml:space="preserve">and</w:t>
+      </w:r>
+      <w:r>
+        <w:t xml:space="preserve"> </w:t>
+      </w:r>
+      <w:r>
+        <w:t xml:space="preserve">(Iizuka, Simo-Serra, and Ishikawa 2016)</w:t>
+      </w:r>
+      <w:r>
+        <w:t xml:space="preserve">, the last focusing on automatic image colorization via a convolutional network, based on the extraction of local and global features, learned in the supervised training process.</w:t>
+      </w:r>
+    </w:p>
+    <w:p>
+      <w:pPr>
+        <w:pStyle w:val="BodyText"/>
+      </w:pPr>
+      <w:r>
+        <w:t xml:space="preserve">Also using adversarial nets,</w:t>
+      </w:r>
+      <w:r>
+        <w:t xml:space="preserve"> </w:t>
+      </w:r>
+      <w:r>
+        <w:t xml:space="preserve">(Frans 2017)</w:t>
+      </w:r>
+      <w:r>
+        <w:t xml:space="preserve"> </w:t>
+      </w:r>
+      <w:r>
+        <w:t xml:space="preserve">introduces control to the process of generating coloured images from sketches, with the use of colour maps fed into the , a concept that is further explored in</w:t>
+      </w:r>
+      <w:r>
+        <w:t xml:space="preserve"> </w:t>
+      </w:r>
+      <w:r>
+        <w:t xml:space="preserve">(Sangkloy et al. 2016)</w:t>
+      </w:r>
+      <w:r>
+        <w:t xml:space="preserve">, where user interaction and a feed-forward architecture enables real-time colorization of images via the input of colour clues via scribbles in arbitrary areas of the image.</w:t>
+      </w:r>
+    </w:p>
+    <w:p>
+      <w:pPr>
+        <w:pStyle w:val="BodyText"/>
+      </w:pPr>
+      <w:r>
+        <w:t xml:space="preserve">(Gatys, Ecker, and Bethge 2016)</w:t>
+      </w:r>
+      <w:r>
+        <w:t xml:space="preserve"> </w:t>
+      </w:r>
+      <w:r>
+        <w:t xml:space="preserve">tackles the problem of style transfer: extracting features of an image and applying to another one, without changing the semantics of the latter, with the application of a convolutional network.</w:t>
+      </w:r>
+    </w:p>
+    <w:p>
+      <w:pPr>
+        <w:pStyle w:val="BodyText"/>
+      </w:pPr>
+      <w:r>
+        <w:t xml:space="preserve">(Kulkarni et al. 2015)</w:t>
+      </w:r>
+      <w:r>
+        <w:t xml:space="preserve">, on the other hand, proposes a method that enables a convolutional-deconvolutional network to disentangle the features extracted from images, allowing the manual generation of images in different positions and lighting conditions via the tweak of variables fed to the network. Also investigating image manipulation, by means of adversarial nets,</w:t>
+      </w:r>
+      <w:r>
+        <w:t xml:space="preserve"> </w:t>
+      </w:r>
+      <w:r>
+        <w:t xml:space="preserve">(Zhu et al. 2016)</w:t>
+      </w:r>
+      <w:r>
+        <w:t xml:space="preserve"> </w:t>
+      </w:r>
+      <w:r>
+        <w:t xml:space="preserve">attempts to learn features directly from raw data.</w:t>
+      </w:r>
+    </w:p>
+    <w:p>
+      <w:pPr>
+        <w:pStyle w:val="BodyText"/>
+      </w:pPr>
+      <w:r>
+        <w:t xml:space="preserve">(Oord, Kalchbrenner, and Kavukcuoglu 2016)</w:t>
+      </w:r>
+      <w:r>
+        <w:t xml:space="preserve"> </w:t>
+      </w:r>
+      <w:r>
+        <w:t xml:space="preserve">proposes a deep recurrent topology, with improved residual connections, capable of reconstructing occluded images, that could be also used in image compression tasks.</w:t>
+      </w:r>
+    </w:p>
+    <w:p>
+      <w:pPr>
+        <w:pStyle w:val="BodyText"/>
+      </w:pPr>
+      <w:r>
+        <w:t xml:space="preserve">(Theis and Bethge 2015)</w:t>
+      </w:r>
+      <w:r>
+        <w:t xml:space="preserve"> </w:t>
+      </w:r>
+      <w:r>
+        <w:t xml:space="preserve">investigates a recurrent architecture composed of multi-dimensional long short term memory units in the context of modelling image distributions.</w:t>
+      </w:r>
+    </w:p>
+    <w:p>
+      <w:pPr>
+        <w:pStyle w:val="BodyText"/>
+      </w:pPr>
+      <w:r>
+        <w:t xml:space="preserve">Video</w:t>
+      </w:r>
+      <w:r>
+        <w:t xml:space="preserve"> </w:t>
+      </w:r>
+      <w:r>
+        <w:t xml:space="preserve">Problems in this area can be understood as a general case of aforementioned image-related tasks, with the added complexity of taking advantage of temporal correlations and a much higher data dimensionality. Motivated by this,</w:t>
+      </w:r>
+      <w:r>
+        <w:t xml:space="preserve"> </w:t>
+      </w:r>
+      <w:r>
+        <w:t xml:space="preserve">(Karpathy et al. 2014)</w:t>
+      </w:r>
+      <w:r>
+        <w:t xml:space="preserve"> </w:t>
+      </w:r>
+      <w:r>
+        <w:t xml:space="preserve">investigates approaches capable of extending convolutional neural networks in order to enable them to take advantage of temporal information in the inputted data. In a similar attempt, extending facial expression recognition to videos,</w:t>
+      </w:r>
+      <w:r>
+        <w:t xml:space="preserve"> </w:t>
+      </w:r>
+      <w:r>
+        <w:t xml:space="preserve">(Khorrami et al. 2016)</w:t>
+      </w:r>
+      <w:r>
+        <w:t xml:space="preserve"> </w:t>
+      </w:r>
+      <w:r>
+        <w:t xml:space="preserve">merges convolutional and recurrent networks, measuring the relative relevance of each one in the final results. Tackling the curse of dimensionality,</w:t>
+      </w:r>
+      <w:r>
+        <w:t xml:space="preserve"> </w:t>
+      </w:r>
+      <w:r>
+        <w:t xml:space="preserve">(Yang, Krompass, and Tresp 2017)</w:t>
+      </w:r>
+      <w:r>
+        <w:t xml:space="preserve"> </w:t>
+      </w:r>
+      <w:r>
+        <w:t xml:space="preserve">presents the tensor-train concept, enabling the transfer of improvements of other architectures to high dimensional sequential data.</w:t>
+      </w:r>
+      <w:r>
+        <w:t xml:space="preserve"> </w:t>
+      </w:r>
+      <w:r>
+        <w:t xml:space="preserve">(He et al. 2015)</w:t>
+      </w:r>
+      <w:r>
+        <w:t xml:space="preserve"> </w:t>
+      </w:r>
+      <w:r>
+        <w:t xml:space="preserve">uses a deep bidirectional long short-term memory recurrent neural net to set benchmarks in the recognition of emotions, via audio and video processing.</w:t>
       </w:r>
     </w:p>
     <w:p>
       <w:pPr>
         <w:pStyle w:val="Heading2"/>
       </w:pPr>
-      <w:bookmarkStart w:id="33" w:name="utilização-de-anns-em-áreas-correlatas"/>
-      <w:r>
-        <w:t xml:space="preserve">Utilização de ANNs em áreas correlatas</w:t>
-      </w:r>
-      <w:bookmarkEnd w:id="33"/>
+      <w:bookmarkStart w:id="35" w:name="redes-neurais---ferramentas-e-frameworks"/>
+      <w:r>
+        <w:t xml:space="preserve">Redes Neurais - Ferramentas e Frameworks</w:t>
+      </w:r>
+      <w:bookmarkEnd w:id="35"/>
     </w:p>
     <w:p>
       <w:pPr>
         <w:pStyle w:val="FirstParagraph"/>
       </w:pPr>
       <w:r>
-        <w:t xml:space="preserve">Poucos trabalhos investigam a utilização de redes neurais para a síntese sonora direta. Não obstantes, algumas das áreas correlatas são bastante exploradas, e podem oferecer insights interessantes.</w:t>
-      </w:r>
-    </w:p>
-    <w:p>
-      <w:pPr>
-        <w:pStyle w:val="Heading3"/>
-      </w:pPr>
-      <w:bookmarkStart w:id="34" w:name="reconhecimento-e-síntese-de-voz"/>
-      <w:r>
-        <w:t xml:space="preserve">Reconhecimento e Síntese de Voz</w:t>
-      </w:r>
-      <w:bookmarkEnd w:id="34"/>
-    </w:p>
-    <w:p>
-      <w:pPr>
-        <w:pStyle w:val="FirstParagraph"/>
-      </w:pPr>
-      <w:r>
-        <w:t xml:space="preserve">(Hinton et al. 2012)</w:t>
-      </w:r>
-      <w:r>
-        <w:t xml:space="preserve"> </w:t>
-      </w:r>
-      <w:r>
-        <w:t xml:space="preserve">present an overview of the use of neural networks based approach in the field, while in this same year,</w:t>
-      </w:r>
-      <w:r>
-        <w:t xml:space="preserve"> </w:t>
-      </w:r>
-      <w:r>
-        <w:t xml:space="preserve">(Graves, Mohamed, and Hinton 2013)</w:t>
-      </w:r>
-      <w:r>
-        <w:t xml:space="preserve"> </w:t>
-      </w:r>
-      <w:r>
-        <w:t xml:space="preserve">produces state of the art results in the TIMIT phoneme recognition benchmark using a deep recurrent neural network, while</w:t>
-      </w:r>
-      <w:r>
-        <w:t xml:space="preserve"> </w:t>
-      </w:r>
-      <w:r>
-        <w:t xml:space="preserve">(Maas, Hannun, and Ng 2013)</w:t>
-      </w:r>
-      <w:r>
-        <w:t xml:space="preserve"> </w:t>
-      </w:r>
-      <w:r>
-        <w:t xml:space="preserve">points the superiority of rectifier nonlinearities over sigmodal activation functions in the task of continuous speech recognition.</w:t>
+        <w:t xml:space="preserve">A área de machine learning encontra-se muito ativa atualmente, tanto no âmbito da pesquisa quanto no empresarial, com várias grandes empresas de tecnologia incorporando essa tecnologia em suas competências essenciais. Dessa forma, assistimos à uma proliferação de ferramentas e frameworks focados em diferentes aspectos da área, muitos deles desenvolvidos ou endossados por essas empresas, como Microsoft, Google e Amazon. Somando-se a isso o fato de que, em maior ou menor grau, todos eles apresentam uma curva de aprendizado significativa, fica evidente que uma comparação direta de todos, ou mesmo da maioria das ferramentas disponíveis, torna-se impraticável em um horizonte de tempo razoável.</w:t>
       </w:r>
     </w:p>
     <w:p>
@@ -1167,726 +2166,18 @@
         <w:pStyle w:val="BodyText"/>
       </w:pPr>
       <w:r>
-        <w:t xml:space="preserve">With a hybrid architecture, combining a recurrent phonetic model and a deep neural network acoustic classifier,</w:t>
-      </w:r>
-      <w:r>
-        <w:t xml:space="preserve"> </w:t>
-      </w:r>
-      <w:r>
-        <w:t xml:space="preserve">(Boulanger-Lewandowski et al. 2014)</w:t>
-      </w:r>
-      <w:r>
-        <w:t xml:space="preserve"> </w:t>
-      </w:r>
-      <w:r>
-        <w:t xml:space="preserve">applies phone sequencing strategies to set new benchmarks in the TIMIT dataset, a technique that is proved by</w:t>
-      </w:r>
-      <w:r>
-        <w:t xml:space="preserve"> </w:t>
-      </w:r>
-      <w:r>
-        <w:t xml:space="preserve">(Sak et al. 2015)</w:t>
-      </w:r>
-      <w:r>
-        <w:t xml:space="preserve"> </w:t>
-      </w:r>
-      <w:r>
-        <w:t xml:space="preserve">to be superior to architectures like deep long short-Term memory recurrent neural networks and the widely used hidden Markov models.</w:t>
-      </w:r>
-    </w:p>
-    <w:p>
-      <w:pPr>
-        <w:pStyle w:val="BodyText"/>
-      </w:pPr>
-      <w:r>
-        <w:t xml:space="preserve">(Sainath et al. 2015)</w:t>
-      </w:r>
-      <w:r>
-        <w:t xml:space="preserve"> </w:t>
-      </w:r>
-      <w:r>
-        <w:t xml:space="preserve">investigates the optimization of convolutional nets hyperparameters, pooling and training strategies to applications in speech recognition tasks.</w:t>
-      </w:r>
-      <w:r>
-        <w:t xml:space="preserve"> </w:t>
-      </w:r>
-      <w:r>
-        <w:t xml:space="preserve">(Zweig et al. 2017)</w:t>
-      </w:r>
-      <w:r>
-        <w:t xml:space="preserve"> </w:t>
-      </w:r>
-      <w:r>
-        <w:t xml:space="preserve">and</w:t>
-      </w:r>
-      <w:r>
-        <w:t xml:space="preserve"> </w:t>
-      </w:r>
-      <w:r>
-        <w:t xml:space="preserve">(Ying Zhang et al. 2017)</w:t>
-      </w:r>
-      <w:r>
-        <w:t xml:space="preserve"> </w:t>
-      </w:r>
-      <w:r>
-        <w:t xml:space="preserve">investigates end-to-end systems, with the latter combining hierarchical convolutional nets with Connectionist Temporal Classification. In his work,</w:t>
-      </w:r>
-      <w:r>
-        <w:t xml:space="preserve"> </w:t>
-      </w:r>
-      <w:r>
-        <w:t xml:space="preserve">(Yu Zhang, Chan, and Jaitly 2017)</w:t>
-      </w:r>
-      <w:r>
-        <w:t xml:space="preserve"> </w:t>
-      </w:r>
-      <w:r>
-        <w:t xml:space="preserve">also explores end-to-end systems, via a very deep recurrent convolutional network employing NIN principles.</w:t>
-      </w:r>
-    </w:p>
-    <w:p>
-      <w:pPr>
-        <w:pStyle w:val="BodyText"/>
-      </w:pPr>
-      <w:r>
-        <w:t xml:space="preserve">Speech synthesis state of the art, as seen in text-to-speech applications, for instance, is not yet achieved via end-to-end neural network approaches. Nonetheless, this area is being actively researched, and approaching production quality rapidly.</w:t>
-      </w:r>
-      <w:r>
-        <w:t xml:space="preserve"> </w:t>
-      </w:r>
-      <w:r>
-        <w:t xml:space="preserve">(Zen and Sak 2015)</w:t>
-      </w:r>
-      <w:r>
-        <w:t xml:space="preserve"> </w:t>
-      </w:r>
-      <w:r>
-        <w:t xml:space="preserve">tackles this task using unidirectional long short-term memory recurrent neural networks with a recurrent output layer, while</w:t>
-      </w:r>
-      <w:r>
-        <w:t xml:space="preserve"> </w:t>
-      </w:r>
-      <w:r>
-        <w:t xml:space="preserve">(Wu and King 2016)</w:t>
-      </w:r>
-      <w:r>
-        <w:t xml:space="preserve"> </w:t>
-      </w:r>
-      <w:r>
-        <w:t xml:space="preserve">further investigates this architecture, trying to discover the reasons for its effectiveness, and pinpoint wich factor are more relevant to que quality of the task, with the goal of offering a simplified topology.</w:t>
-      </w:r>
-    </w:p>
-    <w:p>
-      <w:pPr>
-        <w:pStyle w:val="Heading3"/>
-      </w:pPr>
-      <w:bookmarkStart w:id="35" w:name="music"/>
-      <w:r>
-        <w:t xml:space="preserve">Music</w:t>
-      </w:r>
-      <w:bookmarkEnd w:id="35"/>
-    </w:p>
-    <w:p>
-      <w:pPr>
-        <w:pStyle w:val="FirstParagraph"/>
-      </w:pPr>
-      <w:r>
-        <w:t xml:space="preserve">Em geral os trabalhos relacionados à música ocorrem em um nível de abstração mais alto do que a geração direta dos sons, envolvendo a manipulação de representações musicais como partituras, por exemplo.</w:t>
-      </w:r>
-      <w:r>
-        <w:t xml:space="preserve"> </w:t>
-      </w:r>
-      <w:r>
-        <w:t xml:space="preserve">Many language processing techniques are used in the music field; similarly, many image tasks can be translated to music, given a suitable representation for the input data, like spectrograms.</w:t>
-      </w:r>
-    </w:p>
-    <w:p>
-      <w:pPr>
-        <w:pStyle w:val="Heading4"/>
-      </w:pPr>
-      <w:bookmarkStart w:id="36" w:name="classification"/>
-      <w:r>
-        <w:t xml:space="preserve">Classification</w:t>
+        <w:t xml:space="preserve">A literatura disponível sobre o tema é bastante escassa, talvez pela volatilidade do tema.</w:t>
+      </w:r>
+    </w:p>
+    <w:p>
+      <w:pPr>
+        <w:pStyle w:val="Heading2"/>
+      </w:pPr>
+      <w:bookmarkStart w:id="36" w:name="síntese-sonora-em-tempo-real"/>
+      <w:r>
+        <w:t xml:space="preserve">Síntese Sonora em Tempo Real</w:t>
       </w:r>
       <w:bookmarkEnd w:id="36"/>
-    </w:p>
-    <w:p>
-      <w:pPr>
-        <w:pStyle w:val="FirstParagraph"/>
-      </w:pPr>
-      <w:r>
-        <w:t xml:space="preserve">This task involves assigning tags, generally genre-related or emotion related, to musical pieces.</w:t>
-      </w:r>
-      <w:r>
-        <w:t xml:space="preserve"> </w:t>
-      </w:r>
-      <w:r>
-        <w:t xml:space="preserve">(Costa, Oliveira, and Silla 2017)</w:t>
-      </w:r>
-      <w:r>
-        <w:t xml:space="preserve"> </w:t>
-      </w:r>
-      <w:r>
-        <w:t xml:space="preserve">and</w:t>
-      </w:r>
-      <w:r>
-        <w:t xml:space="preserve"> </w:t>
-      </w:r>
-      <w:r>
-        <w:t xml:space="preserve">(Choi, Fazekas, and Sandler 2016)</w:t>
-      </w:r>
-      <w:r>
-        <w:t xml:space="preserve"> </w:t>
-      </w:r>
-      <w:r>
-        <w:t xml:space="preserve">tackles this task with a fully convolutional neural network fed, in the latter case, with music represented by a mel-spectrogram, while in</w:t>
-      </w:r>
-      <w:r>
-        <w:t xml:space="preserve"> </w:t>
-      </w:r>
-      <w:r>
-        <w:t xml:space="preserve">(Choi et al. 2017)</w:t>
-      </w:r>
-      <w:r>
-        <w:t xml:space="preserve"> </w:t>
-      </w:r>
-      <w:r>
-        <w:t xml:space="preserve">a recurrent architecture is also explored, to exploit the temporal correlation of the inputs.</w:t>
-      </w:r>
-    </w:p>
-    <w:p>
-      <w:pPr>
-        <w:pStyle w:val="Heading4"/>
-      </w:pPr>
-      <w:bookmarkStart w:id="37" w:name="transcription"/>
-      <w:r>
-        <w:t xml:space="preserve">Transcription</w:t>
-      </w:r>
-      <w:bookmarkEnd w:id="37"/>
-    </w:p>
-    <w:p>
-      <w:pPr>
-        <w:pStyle w:val="FirstParagraph"/>
-      </w:pPr>
-      <w:r>
-        <w:t xml:space="preserve">the common task in this field is to translate music parts, generally specific instruments, into a symbolic representation, like tablatures or music scores, for example. One of the first contributions to this field is seen in</w:t>
-      </w:r>
-      <w:r>
-        <w:t xml:space="preserve"> </w:t>
-      </w:r>
-      <w:r>
-        <w:t xml:space="preserve">(Tuohy, Potter, and Center 2006)</w:t>
-      </w:r>
-      <w:r>
-        <w:t xml:space="preserve"> </w:t>
-      </w:r>
-      <w:r>
-        <w:t xml:space="preserve">via the coupling of a network and a local heuristic hill-climber applied over the results, to generate tablatures from music.</w:t>
-      </w:r>
-    </w:p>
-    <w:p>
-      <w:pPr>
-        <w:pStyle w:val="BodyText"/>
-      </w:pPr>
-      <w:r>
-        <w:t xml:space="preserve">With the use of a recurrent net,</w:t>
-      </w:r>
-      <w:r>
-        <w:t xml:space="preserve"> </w:t>
-      </w:r>
-      <w:r>
-        <w:t xml:space="preserve">(Boulanger-Lewandowski, Bengio, and Vincent 2013)</w:t>
-      </w:r>
-      <w:r>
-        <w:t xml:space="preserve"> </w:t>
-      </w:r>
-      <w:r>
-        <w:t xml:space="preserve">transcribes spectrograms of general musical parts into piano roll midi commands, while</w:t>
-      </w:r>
-      <w:r>
-        <w:t xml:space="preserve"> </w:t>
-      </w:r>
-      <w:r>
-        <w:t xml:space="preserve">(Böck and Schedl 2012)</w:t>
-      </w:r>
-      <w:r>
-        <w:t xml:space="preserve"> </w:t>
-      </w:r>
-      <w:r>
-        <w:t xml:space="preserve">offers a similar approach, restricted to polyphonic piano sound, as in the case of</w:t>
-      </w:r>
-      <w:r>
-        <w:t xml:space="preserve"> </w:t>
-      </w:r>
-      <w:r>
-        <w:t xml:space="preserve">(Sigtia, Benetos, and Dixon 2016)</w:t>
-      </w:r>
-      <w:r>
-        <w:t xml:space="preserve">. The last work, however, uses different architectures for the acoustic, a simple network and the language, a recurrent network model. With the use of a bidirectional recurrent net fed with spectral representations,</w:t>
-      </w:r>
-      <w:r>
-        <w:t xml:space="preserve"> </w:t>
-      </w:r>
-      <w:r>
-        <w:t xml:space="preserve">(Southall, Stables, and Hockman 2016)</w:t>
-      </w:r>
-      <w:r>
-        <w:t xml:space="preserve">, creates drum representations.</w:t>
-      </w:r>
-    </w:p>
-    <w:p>
-      <w:pPr>
-        <w:pStyle w:val="Heading4"/>
-      </w:pPr>
-      <w:bookmarkStart w:id="38" w:name="generation"/>
-      <w:r>
-        <w:t xml:space="preserve">Generation</w:t>
-      </w:r>
-      <w:bookmarkEnd w:id="38"/>
-    </w:p>
-    <w:p>
-      <w:pPr>
-        <w:pStyle w:val="FirstParagraph"/>
-      </w:pPr>
-      <w:r>
-        <w:t xml:space="preserve">Here the aim is the inverse of that in the music transcription: given a representation, audio output is generated. One of the first works in the field is seen in</w:t>
-      </w:r>
-      <w:r>
-        <w:t xml:space="preserve">(Stanley 2007)</w:t>
-      </w:r>
-      <w:r>
-        <w:t xml:space="preserve">, consisting of a compositional pattern producing network generating music on the fly based on user input.</w:t>
-      </w:r>
-      <w:r>
-        <w:t xml:space="preserve"> </w:t>
-      </w:r>
-      <w:r>
-        <w:t xml:space="preserve">(Hutchings 2017)</w:t>
-      </w:r>
-      <w:r>
-        <w:t xml:space="preserve"> </w:t>
-      </w:r>
-      <w:r>
-        <w:t xml:space="preserve">generates full drum parts based on a kick drum pattern, with a recurrent net, and investigates the quality of the results via an online survey.</w:t>
-      </w:r>
-    </w:p>
-    <w:p>
-      <w:pPr>
-        <w:pStyle w:val="Heading4"/>
-      </w:pPr>
-      <w:bookmarkStart w:id="39" w:name="image-compression"/>
-      <w:r>
-        <w:t xml:space="preserve">Image Compression</w:t>
-      </w:r>
-      <w:bookmarkEnd w:id="39"/>
-    </w:p>
-    <w:p>
-      <w:pPr>
-        <w:pStyle w:val="FirstParagraph"/>
-      </w:pPr>
-      <w:r>
-        <w:t xml:space="preserve">Despite beeing an important field in face of the communication era demands</w:t>
-      </w:r>
-      <w:r>
-        <w:t xml:space="preserve">(Rehman, Sharif, and Raza 2014)</w:t>
-      </w:r>
-      <w:r>
-        <w:t xml:space="preserve">, the last review about the use of neural networks in image compression was made in 1999</w:t>
-      </w:r>
-      <w:r>
-        <w:t xml:space="preserve">(Jiang 1999)</w:t>
-      </w:r>
-      <w:r>
-        <w:t xml:space="preserve">, while the last general review about the area dates from 2014</w:t>
-      </w:r>
-      <w:r>
-        <w:t xml:space="preserve">(Rehman, Sharif, and Raza 2014)</w:t>
-      </w:r>
-      <w:r>
-        <w:t xml:space="preserve">.</w:t>
-      </w:r>
-    </w:p>
-    <w:p>
-      <w:pPr>
-        <w:pStyle w:val="BodyText"/>
-      </w:pPr>
-      <w:r>
-        <w:t xml:space="preserve">(Ballé, Laparra, and Simoncelli 2016)</w:t>
-      </w:r>
-      <w:r>
-        <w:t xml:space="preserve"> </w:t>
-      </w:r>
-      <w:r>
-        <w:t xml:space="preserve">proposes the use of stages of linear convolutional filters and non-linear activation functions, improving the Multiscale Structural Similarity for Image Quality Assessment(MS-SSIM) measure in all bitrates.</w:t>
-      </w:r>
-    </w:p>
-    <w:p>
-      <w:pPr>
-        <w:pStyle w:val="BodyText"/>
-      </w:pPr>
-      <w:r>
-        <w:t xml:space="preserve">Superior measurements, with the same metrics, to standard compression methods such as JPEG and WebP, were obtained by</w:t>
-      </w:r>
-      <w:r>
-        <w:t xml:space="preserve"> </w:t>
-      </w:r>
-      <w:r>
-        <w:t xml:space="preserve">(Johnston et al. 2017)</w:t>
-      </w:r>
-      <w:r>
-        <w:t xml:space="preserve">, using a recurrent architecture with SSIM loss function and adaptive bit allocation algorithm.</w:t>
-      </w:r>
-      <w:r>
-        <w:t xml:space="preserve"> </w:t>
-      </w:r>
-      <w:r>
-        <w:t xml:space="preserve">With a modified loss function,</w:t>
-      </w:r>
-      <w:r>
-        <w:t xml:space="preserve"> </w:t>
-      </w:r>
-      <w:r>
-        <w:t xml:space="preserve">(Theis et al. 2017)</w:t>
-      </w:r>
-      <w:r>
-        <w:t xml:space="preserve"> </w:t>
-      </w:r>
-      <w:r>
-        <w:t xml:space="preserve">shows that autoencoders can achieve compressing results comparable with JPEG 2000 format.</w:t>
-      </w:r>
-    </w:p>
-    <w:p>
-      <w:pPr>
-        <w:pStyle w:val="BodyText"/>
-      </w:pPr>
-      <w:r>
-        <w:t xml:space="preserve">(Toderici et al. 2016)</w:t>
-      </w:r>
-      <w:r>
-        <w:t xml:space="preserve"> </w:t>
-      </w:r>
-      <w:r>
-        <w:t xml:space="preserve">also produces results better than standard codecs via different architectures based on recurrent neural networks, a binarizer, and a neural network for entropy coding.</w:t>
-      </w:r>
-    </w:p>
-    <w:p>
-      <w:pPr>
-        <w:pStyle w:val="BodyText"/>
-      </w:pPr>
-      <w:r>
-        <w:t xml:space="preserve">Using a fuzzy neural network,</w:t>
-      </w:r>
-      <w:r>
-        <w:t xml:space="preserve"> </w:t>
-      </w:r>
-      <w:r>
-        <w:t xml:space="preserve">(Wang and Gao 2015)</w:t>
-      </w:r>
-      <w:r>
-        <w:t xml:space="preserve"> </w:t>
-      </w:r>
-      <w:r>
-        <w:t xml:space="preserve">achieves superior speed, robustness and quality in lossy image processing tasks.</w:t>
-      </w:r>
-      <w:r>
-        <w:t xml:space="preserve"> </w:t>
-      </w:r>
-      <w:r>
-        <w:t xml:space="preserve">(Toderici et al. 2015)</w:t>
-      </w:r>
-      <w:r>
-        <w:t xml:space="preserve"> </w:t>
-      </w:r>
-      <w:r>
-        <w:t xml:space="preserve">presents a progressive method, focused on reducing mobile phone data transfer, that allows arbitrary image quality depending on the quantity bits sent to the device.</w:t>
-      </w:r>
-      <w:r>
-        <w:t xml:space="preserve"> </w:t>
-      </w:r>
-      <w:r>
-        <w:t xml:space="preserve">(Santurkar, Budden, and Shavit 2017)</w:t>
-      </w:r>
-      <w:r>
-        <w:t xml:space="preserve"> </w:t>
-      </w:r>
-      <w:r>
-        <w:t xml:space="preserve">investigates the resilience of neural networks based compression, via a generative model capable of offering graceful degradation on the compressed images. Conceptual compressing is investigated by</w:t>
-      </w:r>
-      <w:r>
-        <w:t xml:space="preserve"> </w:t>
-      </w:r>
-      <w:r>
-        <w:t xml:space="preserve">(Gregor et al. 2016)</w:t>
-      </w:r>
-      <w:r>
-        <w:t xml:space="preserve">, a technique that allows images to be retrieved from symbols. All the literature investigate deals with lossy compression.</w:t>
-      </w:r>
-    </w:p>
-    <w:p>
-      <w:pPr>
-        <w:pStyle w:val="Heading3"/>
-      </w:pPr>
-      <w:bookmarkStart w:id="40" w:name="imagem"/>
-      <w:r>
-        <w:t xml:space="preserve">Imagem</w:t>
-      </w:r>
-      <w:bookmarkEnd w:id="40"/>
-    </w:p>
-    <w:p>
-      <w:pPr>
-        <w:pStyle w:val="FirstParagraph"/>
-      </w:pPr>
-      <w:r>
-        <w:t xml:space="preserve">Recentemente tem-se visto esforços para adaptar métodos utilizados com sucesso na área de computer vision ao campo sonoro. O trabalho de</w:t>
-      </w:r>
-      <w:r>
-        <w:t xml:space="preserve"> </w:t>
-      </w:r>
-      <w:r>
-        <w:t xml:space="preserve">(Engel et al. 2017)</w:t>
-      </w:r>
-      <w:r>
-        <w:t xml:space="preserve">, por exemplo, busca inspiração na área de geração de imagens para elaborar uma arquitetura apropriada a síntese sonora.</w:t>
-      </w:r>
-      <w:r>
-        <w:t xml:space="preserve"> </w:t>
-      </w:r>
-      <w:r>
-        <w:t xml:space="preserve">Ainda em paralelo com a área de relacionada à imagens, o autor propõe um base de dados sonora, Nsynth, à luz de datasets clássicos de imagens, como o MNIST.</w:t>
-      </w:r>
-    </w:p>
-    <w:p>
-      <w:pPr>
-        <w:pStyle w:val="Heading4"/>
-      </w:pPr>
-      <w:bookmarkStart w:id="41" w:name="síntese"/>
-      <w:r>
-        <w:t xml:space="preserve">Síntese</w:t>
-      </w:r>
-      <w:bookmarkEnd w:id="41"/>
-    </w:p>
-    <w:p>
-      <w:pPr>
-        <w:pStyle w:val="FirstParagraph"/>
-      </w:pPr>
-      <w:r>
-        <w:t xml:space="preserve">(Isola et al. 2016)</w:t>
-      </w:r>
-      <w:r>
-        <w:t xml:space="preserve"> </w:t>
-      </w:r>
-      <w:r>
-        <w:t xml:space="preserve">presents a method to translate images via an adversarial network, generating images from outlines, for example, or providing automatic image colorization</w:t>
-      </w:r>
-      <w:r>
-        <w:t xml:space="preserve"> </w:t>
-      </w:r>
-      <w:r>
-        <w:t xml:space="preserve">(Hwang and Zhou 2016)</w:t>
-      </w:r>
-      <w:r>
-        <w:t xml:space="preserve">,</w:t>
-      </w:r>
-      <w:r>
-        <w:t xml:space="preserve"> </w:t>
-      </w:r>
-      <w:r>
-        <w:t xml:space="preserve">(Zhang, Isola, and Efros 2016)</w:t>
-      </w:r>
-      <w:r>
-        <w:t xml:space="preserve">,</w:t>
-      </w:r>
-      <w:r>
-        <w:t xml:space="preserve"> </w:t>
-      </w:r>
-      <w:r>
-        <w:t xml:space="preserve">(Larsson, Maire, and Shakhnarovich 2016)</w:t>
-      </w:r>
-      <w:r>
-        <w:t xml:space="preserve"> </w:t>
-      </w:r>
-      <w:r>
-        <w:t xml:space="preserve">and</w:t>
-      </w:r>
-      <w:r>
-        <w:t xml:space="preserve"> </w:t>
-      </w:r>
-      <w:r>
-        <w:t xml:space="preserve">(Iizuka, Simo-Serra, and Ishikawa 2016)</w:t>
-      </w:r>
-      <w:r>
-        <w:t xml:space="preserve">, the last focusing on automatic image colorization via a convolutional network, based on the extraction of local and global features, learned in the supervised training process.</w:t>
-      </w:r>
-    </w:p>
-    <w:p>
-      <w:pPr>
-        <w:pStyle w:val="BodyText"/>
-      </w:pPr>
-      <w:r>
-        <w:t xml:space="preserve">Also using adversarial nets,</w:t>
-      </w:r>
-      <w:r>
-        <w:t xml:space="preserve"> </w:t>
-      </w:r>
-      <w:r>
-        <w:t xml:space="preserve">(Frans 2017)</w:t>
-      </w:r>
-      <w:r>
-        <w:t xml:space="preserve"> </w:t>
-      </w:r>
-      <w:r>
-        <w:t xml:space="preserve">introduces control to the process of generating coloured images from sketches, with the use of colour maps fed into the , a concept that is further explored in</w:t>
-      </w:r>
-      <w:r>
-        <w:t xml:space="preserve"> </w:t>
-      </w:r>
-      <w:r>
-        <w:t xml:space="preserve">(Sangkloy et al. 2016)</w:t>
-      </w:r>
-      <w:r>
-        <w:t xml:space="preserve">, where user interaction and a feed-forward architecture enables real-time colorization of images via the input of colour clues via scribbles in arbitrary areas of the image.</w:t>
-      </w:r>
-    </w:p>
-    <w:p>
-      <w:pPr>
-        <w:pStyle w:val="BodyText"/>
-      </w:pPr>
-      <w:r>
-        <w:t xml:space="preserve">(Gatys, Ecker, and Bethge 2016)</w:t>
-      </w:r>
-      <w:r>
-        <w:t xml:space="preserve"> </w:t>
-      </w:r>
-      <w:r>
-        <w:t xml:space="preserve">tackles the problem of style transfer: extracting features of an image and applying to another one, without changing the semantics of the latter, with the application of a convolutional network.</w:t>
-      </w:r>
-    </w:p>
-    <w:p>
-      <w:pPr>
-        <w:pStyle w:val="BodyText"/>
-      </w:pPr>
-      <w:r>
-        <w:t xml:space="preserve">(Kulkarni et al. 2015)</w:t>
-      </w:r>
-      <w:r>
-        <w:t xml:space="preserve">, on the other hand, proposes a method that enables a convolutional-deconvolutional network to disentangle the features extracted from images, allowing the manual generation of images in different positions and lighting conditions via the tweak of variables fed to the network. Also investigating image manipulation, by means of adversarial nets,</w:t>
-      </w:r>
-      <w:r>
-        <w:t xml:space="preserve"> </w:t>
-      </w:r>
-      <w:r>
-        <w:t xml:space="preserve">(Zhu et al. 2016)</w:t>
-      </w:r>
-      <w:r>
-        <w:t xml:space="preserve"> </w:t>
-      </w:r>
-      <w:r>
-        <w:t xml:space="preserve">attempts to learn features directly from raw data.</w:t>
-      </w:r>
-    </w:p>
-    <w:p>
-      <w:pPr>
-        <w:pStyle w:val="BodyText"/>
-      </w:pPr>
-      <w:r>
-        <w:t xml:space="preserve">(Oord, Kalchbrenner, and Kavukcuoglu 2016)</w:t>
-      </w:r>
-      <w:r>
-        <w:t xml:space="preserve"> </w:t>
-      </w:r>
-      <w:r>
-        <w:t xml:space="preserve">proposes a deep recurrent topology, with improved residual connections, capable of reconstructing occluded images, that could be also used in image compression tasks.</w:t>
-      </w:r>
-    </w:p>
-    <w:p>
-      <w:pPr>
-        <w:pStyle w:val="BodyText"/>
-      </w:pPr>
-      <w:r>
-        <w:t xml:space="preserve">(Theis and Bethge 2015)</w:t>
-      </w:r>
-      <w:r>
-        <w:t xml:space="preserve"> </w:t>
-      </w:r>
-      <w:r>
-        <w:t xml:space="preserve">investigates a recurrent architecture composed of multi-dimensional long short term memory units in the context of modelling image distributions.</w:t>
-      </w:r>
-    </w:p>
-    <w:p>
-      <w:pPr>
-        <w:pStyle w:val="Heading4"/>
-      </w:pPr>
-      <w:bookmarkStart w:id="42" w:name="video"/>
-      <w:r>
-        <w:t xml:space="preserve">Video</w:t>
-      </w:r>
-      <w:bookmarkEnd w:id="42"/>
-    </w:p>
-    <w:p>
-      <w:pPr>
-        <w:pStyle w:val="FirstParagraph"/>
-      </w:pPr>
-      <w:r>
-        <w:t xml:space="preserve">Problems in this area can be understood as a general case of aforementioned image-related tasks, with the added complexity of taking advantage of temporal correlations and a much higher data dimensionality. Motivated by this,</w:t>
-      </w:r>
-      <w:r>
-        <w:t xml:space="preserve"> </w:t>
-      </w:r>
-      <w:r>
-        <w:t xml:space="preserve">(Karpathy et al. 2014)</w:t>
-      </w:r>
-      <w:r>
-        <w:t xml:space="preserve"> </w:t>
-      </w:r>
-      <w:r>
-        <w:t xml:space="preserve">investigates approaches capable of extending convolutional neural networks in order to enable them to take advantage of temporal information in the inputted data. In a similar attempt, extending facial expression recognition to videos,</w:t>
-      </w:r>
-      <w:r>
-        <w:t xml:space="preserve"> </w:t>
-      </w:r>
-      <w:r>
-        <w:t xml:space="preserve">(Khorrami et al. 2016)</w:t>
-      </w:r>
-      <w:r>
-        <w:t xml:space="preserve"> </w:t>
-      </w:r>
-      <w:r>
-        <w:t xml:space="preserve">merges convolutional and recurrent networks, measuring the relative relevance of each one in the final results. Tackling the curse of dimensionality,</w:t>
-      </w:r>
-      <w:r>
-        <w:t xml:space="preserve"> </w:t>
-      </w:r>
-      <w:r>
-        <w:t xml:space="preserve">(Yang, Krompass, and Tresp 2017)</w:t>
-      </w:r>
-      <w:r>
-        <w:t xml:space="preserve"> </w:t>
-      </w:r>
-      <w:r>
-        <w:t xml:space="preserve">presents the tensor-train concept, enabling the transfer of improvements of other architectures to high dimensional sequential data.</w:t>
-      </w:r>
-      <w:r>
-        <w:t xml:space="preserve"> </w:t>
-      </w:r>
-      <w:r>
-        <w:t xml:space="preserve">(He et al. 2015)</w:t>
-      </w:r>
-      <w:r>
-        <w:t xml:space="preserve"> </w:t>
-      </w:r>
-      <w:r>
-        <w:t xml:space="preserve">uses a deep bidirectional long short-term memory recurrent neural net to set benchmarks in the recognition of emotions, via audio and video processing.</w:t>
-      </w:r>
-    </w:p>
-    <w:p>
-      <w:pPr>
-        <w:pStyle w:val="Heading2"/>
-      </w:pPr>
-      <w:bookmarkStart w:id="43" w:name="o-estado-da-arte-da-síntese-sonora-em-tempo-real"/>
-      <w:r>
-        <w:t xml:space="preserve">O Estado da Arte da Síntese Sonora em Tempo Real</w:t>
-      </w:r>
-      <w:bookmarkEnd w:id="43"/>
     </w:p>
     <w:p>
       <w:pPr>
@@ -1955,11 +2246,11 @@
       <w:pPr>
         <w:pStyle w:val="Heading3"/>
       </w:pPr>
-      <w:bookmarkStart w:id="44" w:name="método-das-diferenças-finitas-finite-difference"/>
+      <w:bookmarkStart w:id="37" w:name="método-das-diferenças-finitas-finite-difference"/>
       <w:r>
         <w:t xml:space="preserve">Método das Diferenças Finitas (Finite difference)</w:t>
       </w:r>
-      <w:bookmarkEnd w:id="44"/>
+      <w:bookmarkEnd w:id="37"/>
     </w:p>
     <w:p>
       <w:pPr>
@@ -3533,11 +3824,11 @@
       <w:pPr>
         <w:pStyle w:val="Heading3"/>
       </w:pPr>
-      <w:bookmarkStart w:id="45" w:name="digital-waveguides"/>
+      <w:bookmarkStart w:id="38" w:name="digital-waveguides"/>
       <w:r>
         <w:t xml:space="preserve">Digital Waveguides</w:t>
       </w:r>
-      <w:bookmarkEnd w:id="45"/>
+      <w:bookmarkEnd w:id="38"/>
     </w:p>
     <w:p>
       <w:pPr>
@@ -3844,59 +4135,33 @@
     </w:p>
     <w:p>
       <w:pPr>
+        <w:pStyle w:val="Heading2"/>
+      </w:pPr>
+      <w:bookmarkStart w:id="39" w:name="acústica-e-psicoacústica"/>
+      <w:r>
+        <w:t xml:space="preserve">Acústica e Psicoacústica</w:t>
+      </w:r>
+      <w:bookmarkEnd w:id="39"/>
+    </w:p>
+    <w:p>
+      <w:pPr>
         <w:pStyle w:val="Heading1"/>
       </w:pPr>
-      <w:bookmarkStart w:id="46" w:name="referencial-teórico"/>
+      <w:bookmarkStart w:id="40" w:name="referencial-teórico"/>
       <w:r>
         <w:t xml:space="preserve">Referencial Teórico</w:t>
       </w:r>
-      <w:bookmarkEnd w:id="46"/>
+      <w:bookmarkEnd w:id="40"/>
     </w:p>
     <w:p>
       <w:pPr>
         <w:pStyle w:val="Heading2"/>
       </w:pPr>
-      <w:bookmarkStart w:id="47" w:name="acústica-e-psicoacústica"/>
-      <w:r>
-        <w:t xml:space="preserve">Acústica e Psicoacústica</w:t>
-      </w:r>
-      <w:bookmarkEnd w:id="47"/>
-    </w:p>
-    <w:p>
-      <w:pPr>
-        <w:pStyle w:val="Heading2"/>
-      </w:pPr>
-      <w:bookmarkStart w:id="48" w:name="ferramentas-e-frameworks"/>
-      <w:r>
-        <w:t xml:space="preserve">Ferramentas e Frameworks</w:t>
-      </w:r>
-      <w:bookmarkEnd w:id="48"/>
-    </w:p>
-    <w:p>
-      <w:pPr>
-        <w:pStyle w:val="FirstParagraph"/>
-      </w:pPr>
-      <w:r>
-        <w:t xml:space="preserve">A área de machine learning encontra-se muito ativa atualmente, tanto no âmbito da pesquisa quanto no empresarial, com várias grandes empresas de tecnologia incorporando essa tecnologia em suas competências essenciais. Dessa forma, assistimos à uma proliferação de ferramentas e frameworks focados em diferentes aspectos da área, muitos deles desenvolvidos ou endossados por essas empresas, como Microsoft, Google e Amazon. Somando-se a isso o fato de que, em maior ou menor grau, todos eles apresentam uma curva de aprendizado significativa, fica evidente que uma comparação direta de todos, ou mesmo da maioria das ferramentas disponíveis, torna-se impraticável em um horizonte de tempo razoável.</w:t>
-      </w:r>
-    </w:p>
-    <w:p>
-      <w:pPr>
-        <w:pStyle w:val="BodyText"/>
-      </w:pPr>
-      <w:r>
-        <w:t xml:space="preserve">A literatura disponível sobre o tema é bastante escassa, talvez pela volatilidade do tema.</w:t>
-      </w:r>
-    </w:p>
-    <w:p>
-      <w:pPr>
-        <w:pStyle w:val="Heading2"/>
-      </w:pPr>
-      <w:bookmarkStart w:id="49" w:name="transformada-discreta-de-fourier"/>
+      <w:bookmarkStart w:id="41" w:name="transformada-discreta-de-fourier"/>
       <w:r>
         <w:t xml:space="preserve">Transformada Discreta de Fourier</w:t>
       </w:r>
-      <w:bookmarkEnd w:id="49"/>
+      <w:bookmarkEnd w:id="41"/>
     </w:p>
     <w:p>
       <w:pPr>
@@ -5257,7 +5522,7 @@
                     </pic:cNvPicPr>
                   </pic:nvPicPr>
                   <pic:blipFill>
-                    <a:blip r:embed="rId50"/>
+                    <a:blip r:embed="rId42"/>
                     <a:stretch>
                       <a:fillRect/>
                     </a:stretch>
@@ -5806,11 +6071,11 @@
       <w:pPr>
         <w:pStyle w:val="Heading2"/>
       </w:pPr>
-      <w:bookmarkStart w:id="51" w:name="a-equação-da-onda"/>
+      <w:bookmarkStart w:id="43" w:name="a-equação-da-onda"/>
       <w:r>
         <w:t xml:space="preserve">A Equação da Onda</w:t>
       </w:r>
-      <w:bookmarkEnd w:id="51"/>
+      <w:bookmarkEnd w:id="43"/>
     </w:p>
     <w:p>
       <w:pPr>
@@ -5840,7 +6105,7 @@
                     </pic:cNvPicPr>
                   </pic:nvPicPr>
                   <pic:blipFill>
-                    <a:blip r:embed="rId52"/>
+                    <a:blip r:embed="rId44"/>
                     <a:stretch>
                       <a:fillRect/>
                     </a:stretch>
@@ -8480,11 +8745,11 @@
       <w:pPr>
         <w:pStyle w:val="Heading2"/>
       </w:pPr>
-      <w:bookmarkStart w:id="53" w:name="formalização-de-uma-rede-neural---forward-pass"/>
+      <w:bookmarkStart w:id="45" w:name="formalização-de-uma-rede-neural---forward-pass"/>
       <w:r>
         <w:t xml:space="preserve">Formalização de uma Rede Neural - Forward Pass</w:t>
       </w:r>
-      <w:bookmarkEnd w:id="53"/>
+      <w:bookmarkEnd w:id="45"/>
     </w:p>
     <w:p>
       <w:pPr>
@@ -8514,7 +8779,7 @@
                     </pic:cNvPicPr>
                   </pic:nvPicPr>
                   <pic:blipFill>
-                    <a:blip r:embed="rId54"/>
+                    <a:blip r:embed="rId46"/>
                     <a:stretch>
                       <a:fillRect/>
                     </a:stretch>
@@ -9681,11 +9946,11 @@
       <w:pPr>
         <w:pStyle w:val="Heading2"/>
       </w:pPr>
-      <w:bookmarkStart w:id="55" w:name="formalização-de-uma-rede-neural---backpropagation"/>
+      <w:bookmarkStart w:id="47" w:name="formalização-de-uma-rede-neural---backpropagation"/>
       <w:r>
         <w:t xml:space="preserve">Formalização de uma Rede Neural - Backpropagation</w:t>
       </w:r>
-      <w:bookmarkEnd w:id="55"/>
+      <w:bookmarkEnd w:id="47"/>
     </w:p>
     <w:p>
       <w:pPr>
@@ -10302,7 +10567,7 @@
                     </pic:cNvPicPr>
                   </pic:nvPicPr>
                   <pic:blipFill>
-                    <a:blip r:embed="rId56"/>
+                    <a:blip r:embed="rId48"/>
                     <a:stretch>
                       <a:fillRect/>
                     </a:stretch>
@@ -11935,21 +12200,21 @@
       <w:pPr>
         <w:pStyle w:val="Heading1"/>
       </w:pPr>
-      <w:bookmarkStart w:id="57" w:name="metodologia"/>
+      <w:bookmarkStart w:id="49" w:name="metodologia"/>
       <w:r>
         <w:t xml:space="preserve">Metodologia</w:t>
       </w:r>
-      <w:bookmarkEnd w:id="57"/>
+      <w:bookmarkEnd w:id="49"/>
     </w:p>
     <w:p>
       <w:pPr>
         <w:pStyle w:val="Heading2"/>
       </w:pPr>
-      <w:bookmarkStart w:id="58" w:name="samples-utilizados"/>
+      <w:bookmarkStart w:id="50" w:name="samples-utilizados"/>
       <w:r>
         <w:t xml:space="preserve">Samples Utilizados</w:t>
       </w:r>
-      <w:bookmarkEnd w:id="58"/>
+      <w:bookmarkEnd w:id="50"/>
     </w:p>
     <w:p>
       <w:pPr>
@@ -11983,11 +12248,11 @@
       <w:pPr>
         <w:pStyle w:val="Heading2"/>
       </w:pPr>
-      <w:bookmarkStart w:id="59" w:name="redes-densas"/>
+      <w:bookmarkStart w:id="51" w:name="redes-densas"/>
       <w:r>
         <w:t xml:space="preserve">Redes Densas</w:t>
       </w:r>
-      <w:bookmarkEnd w:id="59"/>
+      <w:bookmarkEnd w:id="51"/>
     </w:p>
     <w:p>
       <w:pPr>
@@ -12515,11 +12780,11 @@
       <w:pPr>
         <w:pStyle w:val="Heading3"/>
       </w:pPr>
-      <w:bookmarkStart w:id="60" w:name="algoritmos-de-otimização"/>
+      <w:bookmarkStart w:id="52" w:name="algoritmos-de-otimização"/>
       <w:r>
         <w:t xml:space="preserve">Algoritmos de Otimização</w:t>
       </w:r>
-      <w:bookmarkEnd w:id="60"/>
+      <w:bookmarkEnd w:id="52"/>
     </w:p>
     <w:p>
       <w:pPr>
@@ -12565,11 +12830,11 @@
       <w:pPr>
         <w:pStyle w:val="Heading3"/>
       </w:pPr>
-      <w:bookmarkStart w:id="61" w:name="grid-search-para-topologia-e-parâmetros"/>
+      <w:bookmarkStart w:id="53" w:name="grid-search-para-topologia-e-parâmetros"/>
       <w:r>
         <w:t xml:space="preserve">Grid search para topologia e parâmetros</w:t>
       </w:r>
-      <w:bookmarkEnd w:id="61"/>
+      <w:bookmarkEnd w:id="53"/>
     </w:p>
     <w:p>
       <w:pPr>
@@ -12583,11 +12848,11 @@
       <w:pPr>
         <w:pStyle w:val="Heading4"/>
       </w:pPr>
-      <w:bookmarkStart w:id="62" w:name="adagrad"/>
+      <w:bookmarkStart w:id="54" w:name="adagrad"/>
       <w:r>
         <w:t xml:space="preserve">Adagrad</w:t>
       </w:r>
-      <w:bookmarkEnd w:id="62"/>
+      <w:bookmarkEnd w:id="54"/>
     </w:p>
     <w:p>
       <w:pPr>
@@ -12651,7 +12916,7 @@
                     </pic:cNvPicPr>
                   </pic:nvPicPr>
                   <pic:blipFill>
-                    <a:blip r:embed="rId63"/>
+                    <a:blip r:embed="rId55"/>
                     <a:stretch>
                       <a:fillRect/>
                     </a:stretch>
@@ -12706,7 +12971,7 @@
                     </pic:cNvPicPr>
                   </pic:nvPicPr>
                   <pic:blipFill>
-                    <a:blip r:embed="rId64"/>
+                    <a:blip r:embed="rId56"/>
                     <a:stretch>
                       <a:fillRect/>
                     </a:stretch>
@@ -13119,11 +13384,11 @@
       <w:pPr>
         <w:pStyle w:val="Heading4"/>
       </w:pPr>
-      <w:bookmarkStart w:id="65" w:name="nadam"/>
+      <w:bookmarkStart w:id="57" w:name="nadam"/>
       <w:r>
         <w:t xml:space="preserve">Nadam</w:t>
       </w:r>
-      <w:bookmarkEnd w:id="65"/>
+      <w:bookmarkEnd w:id="57"/>
     </w:p>
     <w:p>
       <w:pPr>
@@ -13153,7 +13418,7 @@
                     </pic:cNvPicPr>
                   </pic:nvPicPr>
                   <pic:blipFill>
-                    <a:blip r:embed="rId66"/>
+                    <a:blip r:embed="rId58"/>
                     <a:stretch>
                       <a:fillRect/>
                     </a:stretch>
@@ -13208,7 +13473,7 @@
                     </pic:cNvPicPr>
                   </pic:nvPicPr>
                   <pic:blipFill>
-                    <a:blip r:embed="rId67"/>
+                    <a:blip r:embed="rId59"/>
                     <a:stretch>
                       <a:fillRect/>
                     </a:stretch>
@@ -13621,11 +13886,11 @@
       <w:pPr>
         <w:pStyle w:val="Heading4"/>
       </w:pPr>
-      <w:bookmarkStart w:id="68" w:name="ativações-e-otimizadores"/>
+      <w:bookmarkStart w:id="60" w:name="ativações-e-otimizadores"/>
       <w:r>
         <w:t xml:space="preserve">Ativações e Otimizadores</w:t>
       </w:r>
-      <w:bookmarkEnd w:id="68"/>
+      <w:bookmarkEnd w:id="60"/>
     </w:p>
     <w:p>
       <w:pPr>
@@ -13655,7 +13920,7 @@
                     </pic:cNvPicPr>
                   </pic:nvPicPr>
                   <pic:blipFill>
-                    <a:blip r:embed="rId69"/>
+                    <a:blip r:embed="rId61"/>
                     <a:stretch>
                       <a:fillRect/>
                     </a:stretch>
@@ -13702,11 +13967,11 @@
       <w:pPr>
         <w:pStyle w:val="Heading3"/>
       </w:pPr>
-      <w:bookmarkStart w:id="70" w:name="análise-dos-resultados"/>
+      <w:bookmarkStart w:id="62" w:name="análise-dos-resultados"/>
       <w:r>
         <w:t xml:space="preserve">Análise dos resultados</w:t>
       </w:r>
-      <w:bookmarkEnd w:id="70"/>
+      <w:bookmarkEnd w:id="62"/>
     </w:p>
     <w:p>
       <w:pPr>
@@ -14070,7 +14335,7 @@
       <w:r>
         <w:t xml:space="preserve"> </w:t>
       </w:r>
-      <w:hyperlink r:id="rId71">
+      <w:hyperlink r:id="rId63">
         <w:r>
           <w:rPr>
             <w:rStyle w:val="Hyperlink"/>
@@ -14105,7 +14370,7 @@
                     </pic:cNvPicPr>
                   </pic:nvPicPr>
                   <pic:blipFill>
-                    <a:blip r:embed="rId72"/>
+                    <a:blip r:embed="rId64"/>
                     <a:stretch>
                       <a:fillRect/>
                     </a:stretch>
@@ -14168,11 +14433,11 @@
       <w:pPr>
         <w:pStyle w:val="Heading2"/>
       </w:pPr>
-      <w:bookmarkStart w:id="73" w:name="redes-recorrentes-1"/>
+      <w:bookmarkStart w:id="65" w:name="redes-recorrentes-1"/>
       <w:r>
         <w:t xml:space="preserve">Redes Recorrentes</w:t>
       </w:r>
-      <w:bookmarkEnd w:id="73"/>
+      <w:bookmarkEnd w:id="65"/>
     </w:p>
     <w:p>
       <w:pPr>
@@ -14202,7 +14467,7 @@
                     </pic:cNvPicPr>
                   </pic:nvPicPr>
                   <pic:blipFill>
-                    <a:blip r:embed="rId74"/>
+                    <a:blip r:embed="rId66"/>
                     <a:stretch>
                       <a:fillRect/>
                     </a:stretch>
@@ -14265,7 +14530,7 @@
                     </pic:cNvPicPr>
                   </pic:nvPicPr>
                   <pic:blipFill>
-                    <a:blip r:embed="rId75"/>
+                    <a:blip r:embed="rId67"/>
                     <a:stretch>
                       <a:fillRect/>
                     </a:stretch>
@@ -14387,7 +14652,7 @@
                     </pic:cNvPicPr>
                   </pic:nvPicPr>
                   <pic:blipFill>
-                    <a:blip r:embed="rId76"/>
+                    <a:blip r:embed="rId68"/>
                     <a:stretch>
                       <a:fillRect/>
                     </a:stretch>
@@ -14432,7 +14697,7 @@
       <w:r>
         <w:t xml:space="preserve"> </w:t>
       </w:r>
-      <w:hyperlink r:id="rId77">
+      <w:hyperlink r:id="rId69">
         <w:r>
           <w:rPr>
             <w:rStyle w:val="Hyperlink"/>
@@ -14454,7 +14719,7 @@
       <w:r>
         <w:t xml:space="preserve"> </w:t>
       </w:r>
-      <w:hyperlink r:id="rId77">
+      <w:hyperlink r:id="rId69">
         <w:r>
           <w:rPr>
             <w:rStyle w:val="Hyperlink"/>
@@ -14489,7 +14754,7 @@
                     </pic:cNvPicPr>
                   </pic:nvPicPr>
                   <pic:blipFill>
-                    <a:blip r:embed="rId78"/>
+                    <a:blip r:embed="rId70"/>
                     <a:stretch>
                       <a:fillRect/>
                     </a:stretch>
@@ -14536,21 +14801,21 @@
       <w:pPr>
         <w:pStyle w:val="Heading2"/>
       </w:pPr>
-      <w:bookmarkStart w:id="79" w:name="redes-convolucionais-e-convolucionais-recorrentes"/>
+      <w:bookmarkStart w:id="71" w:name="redes-convolucionais-e-convolucionais-recorrentes"/>
       <w:r>
         <w:t xml:space="preserve">Redes Convolucionais e Convolucionais-Recorrentes</w:t>
       </w:r>
-      <w:bookmarkEnd w:id="79"/>
+      <w:bookmarkEnd w:id="71"/>
     </w:p>
     <w:p>
       <w:pPr>
         <w:pStyle w:val="Heading2"/>
       </w:pPr>
-      <w:bookmarkStart w:id="80" w:name="domínio-da-frequência"/>
+      <w:bookmarkStart w:id="72" w:name="domínio-da-frequência"/>
       <w:r>
         <w:t xml:space="preserve">Domínio da Frequência</w:t>
       </w:r>
-      <w:bookmarkEnd w:id="80"/>
+      <w:bookmarkEnd w:id="72"/>
     </w:p>
     <w:p>
       <w:pPr>
@@ -14596,7 +14861,7 @@
                     </pic:cNvPicPr>
                   </pic:nvPicPr>
                   <pic:blipFill>
-                    <a:blip r:embed="rId81"/>
+                    <a:blip r:embed="rId73"/>
                     <a:stretch>
                       <a:fillRect/>
                     </a:stretch>
@@ -14686,7 +14951,7 @@
                     </pic:cNvPicPr>
                   </pic:nvPicPr>
                   <pic:blipFill>
-                    <a:blip r:embed="rId82"/>
+                    <a:blip r:embed="rId74"/>
                     <a:stretch>
                       <a:fillRect/>
                     </a:stretch>
@@ -14775,7 +15040,7 @@
                     </pic:cNvPicPr>
                   </pic:nvPicPr>
                   <pic:blipFill>
-                    <a:blip r:embed="rId83"/>
+                    <a:blip r:embed="rId75"/>
                     <a:stretch>
                       <a:fillRect/>
                     </a:stretch>
@@ -14822,11 +15087,11 @@
       <w:pPr>
         <w:pStyle w:val="Heading2"/>
       </w:pPr>
-      <w:bookmarkStart w:id="84" w:name="modelo-misto"/>
+      <w:bookmarkStart w:id="76" w:name="modelo-misto"/>
       <w:r>
         <w:t xml:space="preserve">Modelo Misto</w:t>
       </w:r>
-      <w:bookmarkEnd w:id="84"/>
+      <w:bookmarkEnd w:id="76"/>
     </w:p>
     <w:p>
       <w:pPr>
@@ -14874,7 +15139,7 @@
                     </pic:cNvPicPr>
                   </pic:nvPicPr>
                   <pic:blipFill>
-                    <a:blip r:embed="rId85"/>
+                    <a:blip r:embed="rId77"/>
                     <a:stretch>
                       <a:fillRect/>
                     </a:stretch>
@@ -14975,7 +15240,7 @@
                     </pic:cNvPicPr>
                   </pic:nvPicPr>
                   <pic:blipFill>
-                    <a:blip r:embed="rId86"/>
+                    <a:blip r:embed="rId78"/>
                     <a:stretch>
                       <a:fillRect/>
                     </a:stretch>
@@ -15022,11 +15287,11 @@
       <w:pPr>
         <w:pStyle w:val="Heading3"/>
       </w:pPr>
-      <w:bookmarkStart w:id="87" w:name="frequências"/>
+      <w:bookmarkStart w:id="79" w:name="frequências"/>
       <w:r>
         <w:t xml:space="preserve">Frequências</w:t>
       </w:r>
-      <w:bookmarkEnd w:id="87"/>
+      <w:bookmarkEnd w:id="79"/>
     </w:p>
     <w:p>
       <w:pPr>
@@ -15242,7 +15507,7 @@
                     </pic:cNvPicPr>
                   </pic:nvPicPr>
                   <pic:blipFill>
-                    <a:blip r:embed="rId88"/>
+                    <a:blip r:embed="rId80"/>
                     <a:stretch>
                       <a:fillRect/>
                     </a:stretch>
@@ -15309,11 +15574,11 @@
       <w:pPr>
         <w:pStyle w:val="Heading3"/>
       </w:pPr>
-      <w:bookmarkStart w:id="89" w:name="decaimentos-e-amplitudes"/>
+      <w:bookmarkStart w:id="81" w:name="decaimentos-e-amplitudes"/>
       <w:r>
         <w:t xml:space="preserve">Decaimentos e Amplitudes</w:t>
       </w:r>
-      <w:bookmarkEnd w:id="89"/>
+      <w:bookmarkEnd w:id="81"/>
     </w:p>
     <w:p>
       <w:pPr>
@@ -15605,7 +15870,7 @@
                     </pic:cNvPicPr>
                   </pic:nvPicPr>
                   <pic:blipFill>
-                    <a:blip r:embed="rId90"/>
+                    <a:blip r:embed="rId82"/>
                     <a:stretch>
                       <a:fillRect/>
                     </a:stretch>
@@ -15658,11 +15923,11 @@
       <w:pPr>
         <w:pStyle w:val="Heading3"/>
       </w:pPr>
-      <w:bookmarkStart w:id="91" w:name="formulação-final"/>
+      <w:bookmarkStart w:id="83" w:name="formulação-final"/>
       <w:r>
         <w:t xml:space="preserve">Formulação Final</w:t>
       </w:r>
-      <w:bookmarkEnd w:id="91"/>
+      <w:bookmarkEnd w:id="83"/>
     </w:p>
     <w:p>
       <w:pPr>
@@ -16004,7 +16269,7 @@
                     </pic:cNvPicPr>
                   </pic:nvPicPr>
                   <pic:blipFill>
-                    <a:blip r:embed="rId92"/>
+                    <a:blip r:embed="rId84"/>
                     <a:stretch>
                       <a:fillRect/>
                     </a:stretch>
@@ -16067,7 +16332,7 @@
                     </pic:cNvPicPr>
                   </pic:nvPicPr>
                   <pic:blipFill>
-                    <a:blip r:embed="rId93"/>
+                    <a:blip r:embed="rId85"/>
                     <a:stretch>
                       <a:fillRect/>
                     </a:stretch>
@@ -16122,7 +16387,7 @@
                     </pic:cNvPicPr>
                   </pic:nvPicPr>
                   <pic:blipFill>
-                    <a:blip r:embed="rId94"/>
+                    <a:blip r:embed="rId86"/>
                     <a:stretch>
                       <a:fillRect/>
                     </a:stretch>
@@ -16287,7 +16552,7 @@
                     </pic:cNvPicPr>
                   </pic:nvPicPr>
                   <pic:blipFill>
-                    <a:blip r:embed="rId95"/>
+                    <a:blip r:embed="rId87"/>
                     <a:stretch>
                       <a:fillRect/>
                     </a:stretch>
@@ -16326,34 +16591,34 @@
       <w:pPr>
         <w:pStyle w:val="Heading1"/>
       </w:pPr>
-      <w:bookmarkStart w:id="96" w:name="resultados"/>
+      <w:bookmarkStart w:id="88" w:name="resultados"/>
       <w:r>
         <w:t xml:space="preserve">Resultados</w:t>
       </w:r>
-      <w:bookmarkEnd w:id="96"/>
+      <w:bookmarkEnd w:id="88"/>
     </w:p>
     <w:p>
       <w:pPr>
         <w:pStyle w:val="Heading1"/>
       </w:pPr>
-      <w:bookmarkStart w:id="97" w:name="conclusão"/>
+      <w:bookmarkStart w:id="89" w:name="conclusão"/>
       <w:r>
         <w:t xml:space="preserve">Conclusão</w:t>
       </w:r>
-      <w:bookmarkEnd w:id="97"/>
+      <w:bookmarkEnd w:id="89"/>
     </w:p>
     <w:p>
       <w:pPr>
         <w:pStyle w:val="Heading1"/>
       </w:pPr>
-      <w:bookmarkStart w:id="98" w:name="referências"/>
+      <w:bookmarkStart w:id="90" w:name="referências"/>
       <w:r>
         <w:t xml:space="preserve">Referências</w:t>
       </w:r>
-      <w:bookmarkEnd w:id="98"/>
-    </w:p>
-    <w:bookmarkStart w:id="183" w:name="refs"/>
-    <w:bookmarkStart w:id="99" w:name="ref-balle2016end"/>
+      <w:bookmarkEnd w:id="90"/>
+    </w:p>
+    <w:bookmarkStart w:id="175" w:name="refs"/>
+    <w:bookmarkStart w:id="91" w:name="ref-balle2016end"/>
     <w:p>
       <w:pPr>
         <w:pStyle w:val="Bibliography"/>
@@ -16374,8 +16639,8 @@
         <w:t xml:space="preserve">.</w:t>
       </w:r>
     </w:p>
-    <w:bookmarkEnd w:id="99"/>
-    <w:bookmarkStart w:id="100" w:name="ref-bensa2005computational"/>
+    <w:bookmarkEnd w:id="91"/>
+    <w:bookmarkStart w:id="92" w:name="ref-bensa2005computational"/>
     <w:p>
       <w:pPr>
         <w:pStyle w:val="Bibliography"/>
@@ -16399,8 +16664,8 @@
         <w:t xml:space="preserve">91 (2). S. Hirzel Verlag: 289–98.</w:t>
       </w:r>
     </w:p>
-    <w:bookmarkEnd w:id="100"/>
-    <w:bookmarkStart w:id="101" w:name="ref-bensa2003simulation"/>
+    <w:bookmarkEnd w:id="92"/>
+    <w:bookmarkStart w:id="93" w:name="ref-bensa2003simulation"/>
     <w:p>
       <w:pPr>
         <w:pStyle w:val="Bibliography"/>
@@ -16424,8 +16689,8 @@
         <w:t xml:space="preserve">114 (2). ASA: 1095–1107.</w:t>
       </w:r>
     </w:p>
-    <w:bookmarkEnd w:id="101"/>
-    <w:bookmarkStart w:id="102" w:name="ref-bishop06"/>
+    <w:bookmarkEnd w:id="93"/>
+    <w:bookmarkStart w:id="94" w:name="ref-bishop06"/>
     <w:p>
       <w:pPr>
         <w:pStyle w:val="Bibliography"/>
@@ -16446,8 +16711,8 @@
         <w:t xml:space="preserve">. springer.</w:t>
       </w:r>
     </w:p>
-    <w:bookmarkEnd w:id="102"/>
-    <w:bookmarkStart w:id="103" w:name="ref-boulanger2013high"/>
+    <w:bookmarkEnd w:id="94"/>
+    <w:bookmarkStart w:id="95" w:name="ref-boulanger2013high"/>
     <w:p>
       <w:pPr>
         <w:pStyle w:val="Bibliography"/>
@@ -16468,8 +16733,8 @@
         <w:t xml:space="preserve">, 3178–82. IEEE.</w:t>
       </w:r>
     </w:p>
-    <w:bookmarkEnd w:id="103"/>
-    <w:bookmarkStart w:id="104" w:name="ref-boulanger2014phone"/>
+    <w:bookmarkEnd w:id="95"/>
+    <w:bookmarkStart w:id="96" w:name="ref-boulanger2014phone"/>
     <w:p>
       <w:pPr>
         <w:pStyle w:val="Bibliography"/>
@@ -16490,8 +16755,8 @@
         <w:t xml:space="preserve">, 5417–21. IEEE.</w:t>
       </w:r>
     </w:p>
-    <w:bookmarkEnd w:id="104"/>
-    <w:bookmarkStart w:id="105" w:name="ref-bock2012polyphonic"/>
+    <w:bookmarkEnd w:id="96"/>
+    <w:bookmarkStart w:id="97" w:name="ref-bock2012polyphonic"/>
     <w:p>
       <w:pPr>
         <w:pStyle w:val="Bibliography"/>
@@ -16512,8 +16777,8 @@
         <w:t xml:space="preserve">, 121–24. IEEE.</w:t>
       </w:r>
     </w:p>
-    <w:bookmarkEnd w:id="105"/>
-    <w:bookmarkStart w:id="106" w:name="ref-choi2016automatic"/>
+    <w:bookmarkEnd w:id="97"/>
+    <w:bookmarkStart w:id="98" w:name="ref-choi2016automatic"/>
     <w:p>
       <w:pPr>
         <w:pStyle w:val="Bibliography"/>
@@ -16534,8 +16799,8 @@
         <w:t xml:space="preserve">.</w:t>
       </w:r>
     </w:p>
-    <w:bookmarkEnd w:id="106"/>
-    <w:bookmarkStart w:id="107" w:name="ref-choi2017convolutional"/>
+    <w:bookmarkEnd w:id="98"/>
+    <w:bookmarkStart w:id="99" w:name="ref-choi2017convolutional"/>
     <w:p>
       <w:pPr>
         <w:pStyle w:val="Bibliography"/>
@@ -16556,8 +16821,8 @@
         <w:t xml:space="preserve">, 2392–6. IEEE.</w:t>
       </w:r>
     </w:p>
-    <w:bookmarkEnd w:id="107"/>
-    <w:bookmarkStart w:id="108" w:name="ref-costa2017evaluation"/>
+    <w:bookmarkEnd w:id="99"/>
+    <w:bookmarkStart w:id="100" w:name="ref-costa2017evaluation"/>
     <w:p>
       <w:pPr>
         <w:pStyle w:val="Bibliography"/>
@@ -16581,8 +16846,8 @@
         <w:t xml:space="preserve">52. Elsevier: 28–38.</w:t>
       </w:r>
     </w:p>
-    <w:bookmarkEnd w:id="108"/>
-    <w:bookmarkStart w:id="109" w:name="ref-elman1990finding"/>
+    <w:bookmarkEnd w:id="100"/>
+    <w:bookmarkStart w:id="101" w:name="ref-elman1990finding"/>
     <w:p>
       <w:pPr>
         <w:pStyle w:val="Bibliography"/>
@@ -16606,8 +16871,8 @@
         <w:t xml:space="preserve">14 (2). Wiley Online Library: 179–211.</w:t>
       </w:r>
     </w:p>
-    <w:bookmarkEnd w:id="109"/>
-    <w:bookmarkStart w:id="110" w:name="ref-engel2017neural"/>
+    <w:bookmarkEnd w:id="101"/>
+    <w:bookmarkStart w:id="102" w:name="ref-engel2017neural"/>
     <w:p>
       <w:pPr>
         <w:pStyle w:val="Bibliography"/>
@@ -16628,8 +16893,8 @@
         <w:t xml:space="preserve">.</w:t>
       </w:r>
     </w:p>
-    <w:bookmarkEnd w:id="110"/>
-    <w:bookmarkStart w:id="111" w:name="ref-frans2017outline"/>
+    <w:bookmarkEnd w:id="102"/>
+    <w:bookmarkStart w:id="103" w:name="ref-frans2017outline"/>
     <w:p>
       <w:pPr>
         <w:pStyle w:val="Bibliography"/>
@@ -16650,8 +16915,8 @@
         <w:t xml:space="preserve">.</w:t>
       </w:r>
     </w:p>
-    <w:bookmarkEnd w:id="111"/>
-    <w:bookmarkStart w:id="112" w:name="ref-gatys2016image"/>
+    <w:bookmarkEnd w:id="103"/>
+    <w:bookmarkStart w:id="104" w:name="ref-gatys2016image"/>
     <w:p>
       <w:pPr>
         <w:pStyle w:val="Bibliography"/>
@@ -16672,8 +16937,8 @@
         <w:t xml:space="preserve">, 2414–23.</w:t>
       </w:r>
     </w:p>
-    <w:bookmarkEnd w:id="112"/>
-    <w:bookmarkStart w:id="113" w:name="ref-goldberg2016primer"/>
+    <w:bookmarkEnd w:id="104"/>
+    <w:bookmarkStart w:id="105" w:name="ref-goldberg2016primer"/>
     <w:p>
       <w:pPr>
         <w:pStyle w:val="Bibliography"/>
@@ -16697,8 +16962,8 @@
         <w:t xml:space="preserve">57: 345–420.</w:t>
       </w:r>
     </w:p>
-    <w:bookmarkEnd w:id="113"/>
-    <w:bookmarkStart w:id="115" w:name="ref-cnnmoney"/>
+    <w:bookmarkEnd w:id="105"/>
+    <w:bookmarkStart w:id="107" w:name="ref-cnnmoney"/>
     <w:p>
       <w:pPr>
         <w:pStyle w:val="Bibliography"/>
@@ -16721,7 +16986,7 @@
       <w:r>
         <w:t xml:space="preserve"> </w:t>
       </w:r>
-      <w:hyperlink r:id="rId114">
+      <w:hyperlink r:id="rId106">
         <w:r>
           <w:rPr>
             <w:rStyle w:val="Hyperlink"/>
@@ -16733,8 +16998,8 @@
         <w:t xml:space="preserve">.</w:t>
       </w:r>
     </w:p>
-    <w:bookmarkEnd w:id="115"/>
-    <w:bookmarkStart w:id="116" w:name="ref-gracia2016wave"/>
+    <w:bookmarkEnd w:id="107"/>
+    <w:bookmarkStart w:id="108" w:name="ref-gracia2016wave"/>
     <w:p>
       <w:pPr>
         <w:pStyle w:val="Bibliography"/>
@@ -16755,8 +17020,8 @@
         <w:t xml:space="preserve">.</w:t>
       </w:r>
     </w:p>
-    <w:bookmarkEnd w:id="116"/>
-    <w:bookmarkStart w:id="117" w:name="ref-graves2013speech"/>
+    <w:bookmarkEnd w:id="108"/>
+    <w:bookmarkStart w:id="109" w:name="ref-graves2013speech"/>
     <w:p>
       <w:pPr>
         <w:pStyle w:val="Bibliography"/>
@@ -16777,8 +17042,8 @@
         <w:t xml:space="preserve">, 6645–9. IEEE.</w:t>
       </w:r>
     </w:p>
-    <w:bookmarkEnd w:id="117"/>
-    <w:bookmarkStart w:id="118" w:name="ref-gregor2016towards"/>
+    <w:bookmarkEnd w:id="109"/>
+    <w:bookmarkStart w:id="110" w:name="ref-gregor2016towards"/>
     <w:p>
       <w:pPr>
         <w:pStyle w:val="Bibliography"/>
@@ -16799,8 +17064,8 @@
         <w:t xml:space="preserve">, 3549–57.</w:t>
       </w:r>
     </w:p>
-    <w:bookmarkEnd w:id="118"/>
-    <w:bookmarkStart w:id="119" w:name="ref-hagan1996neural"/>
+    <w:bookmarkEnd w:id="110"/>
+    <w:bookmarkStart w:id="111" w:name="ref-hagan1996neural"/>
     <w:p>
       <w:pPr>
         <w:pStyle w:val="Bibliography"/>
@@ -16821,8 +17086,8 @@
         <w:t xml:space="preserve">. Vol. 20. Pws Pub. Boston.</w:t>
       </w:r>
     </w:p>
-    <w:bookmarkEnd w:id="119"/>
-    <w:bookmarkStart w:id="120" w:name="ref-he2015multimodal"/>
+    <w:bookmarkEnd w:id="111"/>
+    <w:bookmarkStart w:id="112" w:name="ref-he2015multimodal"/>
     <w:p>
       <w:pPr>
         <w:pStyle w:val="Bibliography"/>
@@ -16843,8 +17108,8 @@
         <w:t xml:space="preserve">, 73–80. ACM.</w:t>
       </w:r>
     </w:p>
-    <w:bookmarkEnd w:id="120"/>
-    <w:bookmarkStart w:id="121" w:name="ref-hinton2012deep"/>
+    <w:bookmarkEnd w:id="112"/>
+    <w:bookmarkStart w:id="113" w:name="ref-hinton2012deep"/>
     <w:p>
       <w:pPr>
         <w:pStyle w:val="Bibliography"/>
@@ -16868,8 +17133,8 @@
         <w:t xml:space="preserve">29 (6). IEEE: 82–97.</w:t>
       </w:r>
     </w:p>
-    <w:bookmarkEnd w:id="121"/>
-    <w:bookmarkStart w:id="122" w:name="ref-hornik91"/>
+    <w:bookmarkEnd w:id="113"/>
+    <w:bookmarkStart w:id="114" w:name="ref-hornik91"/>
     <w:p>
       <w:pPr>
         <w:pStyle w:val="Bibliography"/>
@@ -16893,8 +17158,8 @@
         <w:t xml:space="preserve">4 (2). Elsevier: 251–57.</w:t>
       </w:r>
     </w:p>
-    <w:bookmarkEnd w:id="122"/>
-    <w:bookmarkStart w:id="123" w:name="ref-hornik89"/>
+    <w:bookmarkEnd w:id="114"/>
+    <w:bookmarkStart w:id="115" w:name="ref-hornik89"/>
     <w:p>
       <w:pPr>
         <w:pStyle w:val="Bibliography"/>
@@ -16918,8 +17183,8 @@
         <w:t xml:space="preserve">2 (5). Elsevier: 359–66.</w:t>
       </w:r>
     </w:p>
-    <w:bookmarkEnd w:id="123"/>
-    <w:bookmarkStart w:id="124" w:name="ref-hutchings2017talking"/>
+    <w:bookmarkEnd w:id="115"/>
+    <w:bookmarkStart w:id="116" w:name="ref-hutchings2017talking"/>
     <w:p>
       <w:pPr>
         <w:pStyle w:val="Bibliography"/>
@@ -16940,8 +17205,8 @@
         <w:t xml:space="preserve">.</w:t>
       </w:r>
     </w:p>
-    <w:bookmarkEnd w:id="124"/>
-    <w:bookmarkStart w:id="125" w:name="ref-hwangimage"/>
+    <w:bookmarkEnd w:id="116"/>
+    <w:bookmarkStart w:id="117" w:name="ref-hwangimage"/>
     <w:p>
       <w:pPr>
         <w:pStyle w:val="Bibliography"/>
@@ -16950,8 +17215,8 @@
         <w:t xml:space="preserve">Hwang, Jeff, and You Zhou. 2016. “Image Colorization with Deep Convolutional Neural Networks.”</w:t>
       </w:r>
     </w:p>
-    <w:bookmarkEnd w:id="125"/>
-    <w:bookmarkStart w:id="126" w:name="ref-iizuka2016let"/>
+    <w:bookmarkEnd w:id="117"/>
+    <w:bookmarkStart w:id="118" w:name="ref-iizuka2016let"/>
     <w:p>
       <w:pPr>
         <w:pStyle w:val="Bibliography"/>
@@ -16975,8 +17240,8 @@
         <w:t xml:space="preserve">35 (4). ACM: 110.</w:t>
       </w:r>
     </w:p>
-    <w:bookmarkEnd w:id="126"/>
-    <w:bookmarkStart w:id="127" w:name="ref-isola2016image"/>
+    <w:bookmarkEnd w:id="118"/>
+    <w:bookmarkStart w:id="119" w:name="ref-isola2016image"/>
     <w:p>
       <w:pPr>
         <w:pStyle w:val="Bibliography"/>
@@ -16997,8 +17262,8 @@
         <w:t xml:space="preserve">.</w:t>
       </w:r>
     </w:p>
-    <w:bookmarkEnd w:id="127"/>
-    <w:bookmarkStart w:id="128" w:name="ref-jiang1999image"/>
+    <w:bookmarkEnd w:id="119"/>
+    <w:bookmarkStart w:id="120" w:name="ref-jiang1999image"/>
     <w:p>
       <w:pPr>
         <w:pStyle w:val="Bibliography"/>
@@ -17022,8 +17287,8 @@
         <w:t xml:space="preserve">14 (9). Elsevier: 737–60.</w:t>
       </w:r>
     </w:p>
-    <w:bookmarkEnd w:id="128"/>
-    <w:bookmarkStart w:id="129" w:name="ref-johnston2017improved"/>
+    <w:bookmarkEnd w:id="120"/>
+    <w:bookmarkStart w:id="121" w:name="ref-johnston2017improved"/>
     <w:p>
       <w:pPr>
         <w:pStyle w:val="Bibliography"/>
@@ -17044,8 +17309,8 @@
         <w:t xml:space="preserve">.</w:t>
       </w:r>
     </w:p>
-    <w:bookmarkEnd w:id="129"/>
-    <w:bookmarkStart w:id="130" w:name="ref-karjalainen2004digital"/>
+    <w:bookmarkEnd w:id="121"/>
+    <w:bookmarkStart w:id="122" w:name="ref-karjalainen2004digital"/>
     <w:p>
       <w:pPr>
         <w:pStyle w:val="Bibliography"/>
@@ -17069,8 +17334,8 @@
         <w:t xml:space="preserve">2004. Hindawi Publishing Corp.: 978–89.</w:t>
       </w:r>
     </w:p>
-    <w:bookmarkEnd w:id="130"/>
-    <w:bookmarkStart w:id="131" w:name="ref-karpathy2014large"/>
+    <w:bookmarkEnd w:id="122"/>
+    <w:bookmarkStart w:id="123" w:name="ref-karpathy2014large"/>
     <w:p>
       <w:pPr>
         <w:pStyle w:val="Bibliography"/>
@@ -17091,8 +17356,8 @@
         <w:t xml:space="preserve">, 1725–32.</w:t>
       </w:r>
     </w:p>
-    <w:bookmarkEnd w:id="131"/>
-    <w:bookmarkStart w:id="132" w:name="ref-khorrami2016deep"/>
+    <w:bookmarkEnd w:id="123"/>
+    <w:bookmarkStart w:id="124" w:name="ref-khorrami2016deep"/>
     <w:p>
       <w:pPr>
         <w:pStyle w:val="Bibliography"/>
@@ -17113,8 +17378,8 @@
         <w:t xml:space="preserve">, 619–23. IEEE.</w:t>
       </w:r>
     </w:p>
-    <w:bookmarkEnd w:id="132"/>
-    <w:bookmarkStart w:id="133" w:name="ref-kulkarni2015deep"/>
+    <w:bookmarkEnd w:id="124"/>
+    <w:bookmarkStart w:id="125" w:name="ref-kulkarni2015deep"/>
     <w:p>
       <w:pPr>
         <w:pStyle w:val="Bibliography"/>
@@ -17135,8 +17400,8 @@
         <w:t xml:space="preserve">, 2539–47.</w:t>
       </w:r>
     </w:p>
-    <w:bookmarkEnd w:id="133"/>
-    <w:bookmarkStart w:id="134" w:name="ref-larsson2016learning"/>
+    <w:bookmarkEnd w:id="125"/>
+    <w:bookmarkStart w:id="126" w:name="ref-larsson2016learning"/>
     <w:p>
       <w:pPr>
         <w:pStyle w:val="Bibliography"/>
@@ -17157,8 +17422,8 @@
         <w:t xml:space="preserve">, 577–93. Springer.</w:t>
       </w:r>
     </w:p>
-    <w:bookmarkEnd w:id="134"/>
-    <w:bookmarkStart w:id="135" w:name="ref-lecun1998gradient"/>
+    <w:bookmarkEnd w:id="126"/>
+    <w:bookmarkStart w:id="127" w:name="ref-lecun1998gradient"/>
     <w:p>
       <w:pPr>
         <w:pStyle w:val="Bibliography"/>
@@ -17182,8 +17447,8 @@
         <w:t xml:space="preserve">86 (11). IEEE: 2278–2324.</w:t>
       </w:r>
     </w:p>
-    <w:bookmarkEnd w:id="135"/>
-    <w:bookmarkStart w:id="136" w:name="ref-leshno93"/>
+    <w:bookmarkEnd w:id="127"/>
+    <w:bookmarkStart w:id="128" w:name="ref-leshno93"/>
     <w:p>
       <w:pPr>
         <w:pStyle w:val="Bibliography"/>
@@ -17207,8 +17472,8 @@
         <w:t xml:space="preserve">6 (6). Elsevier: 861–67.</w:t>
       </w:r>
     </w:p>
-    <w:bookmarkEnd w:id="136"/>
-    <w:bookmarkStart w:id="137" w:name="ref-lyons2011understanding"/>
+    <w:bookmarkEnd w:id="128"/>
+    <w:bookmarkStart w:id="129" w:name="ref-lyons2011understanding"/>
     <w:p>
       <w:pPr>
         <w:pStyle w:val="Bibliography"/>
@@ -17229,8 +17494,8 @@
         <w:t xml:space="preserve">. Pearson Education India.</w:t>
       </w:r>
     </w:p>
-    <w:bookmarkEnd w:id="137"/>
-    <w:bookmarkStart w:id="138" w:name="ref-maas2013rectifier"/>
+    <w:bookmarkEnd w:id="129"/>
+    <w:bookmarkStart w:id="130" w:name="ref-maas2013rectifier"/>
     <w:p>
       <w:pPr>
         <w:pStyle w:val="Bibliography"/>
@@ -17251,8 +17516,8 @@
         <w:t xml:space="preserve">. Vol. 30. 1.</w:t>
       </w:r>
     </w:p>
-    <w:bookmarkEnd w:id="138"/>
-    <w:bookmarkStart w:id="139" w:name="ref-mcculloch1943logical"/>
+    <w:bookmarkEnd w:id="130"/>
+    <w:bookmarkStart w:id="131" w:name="ref-mcculloch1943logical"/>
     <w:p>
       <w:pPr>
         <w:pStyle w:val="Bibliography"/>
@@ -17276,8 +17541,8 @@
         <w:t xml:space="preserve">5 (4). Springer: 115–33.</w:t>
       </w:r>
     </w:p>
-    <w:bookmarkEnd w:id="139"/>
-    <w:bookmarkStart w:id="140" w:name="ref-minski1969perceptrons"/>
+    <w:bookmarkEnd w:id="131"/>
+    <w:bookmarkStart w:id="132" w:name="ref-minski1969perceptrons"/>
     <w:p>
       <w:pPr>
         <w:pStyle w:val="Bibliography"/>
@@ -17298,8 +17563,8 @@
         <w:t xml:space="preserve">.</w:t>
       </w:r>
     </w:p>
-    <w:bookmarkEnd w:id="140"/>
-    <w:bookmarkStart w:id="141" w:name="ref-mizutani2000derivation"/>
+    <w:bookmarkEnd w:id="132"/>
+    <w:bookmarkStart w:id="133" w:name="ref-mizutani2000derivation"/>
     <w:p>
       <w:pPr>
         <w:pStyle w:val="Bibliography"/>
@@ -17320,8 +17585,8 @@
         <w:t xml:space="preserve">, 2:167–72. IEEE.</w:t>
       </w:r>
     </w:p>
-    <w:bookmarkEnd w:id="141"/>
-    <w:bookmarkStart w:id="142" w:name="ref-oord2016pixel"/>
+    <w:bookmarkEnd w:id="133"/>
+    <w:bookmarkStart w:id="134" w:name="ref-oord2016pixel"/>
     <w:p>
       <w:pPr>
         <w:pStyle w:val="Bibliography"/>
@@ -17342,8 +17607,8 @@
         <w:t xml:space="preserve">.</w:t>
       </w:r>
     </w:p>
-    <w:bookmarkEnd w:id="142"/>
-    <w:bookmarkStart w:id="143" w:name="ref-pang2017convolution"/>
+    <w:bookmarkEnd w:id="134"/>
+    <w:bookmarkStart w:id="135" w:name="ref-pang2017convolution"/>
     <w:p>
       <w:pPr>
         <w:pStyle w:val="Bibliography"/>
@@ -17364,8 +17629,8 @@
         <w:t xml:space="preserve">. IEEE.</w:t>
       </w:r>
     </w:p>
-    <w:bookmarkEnd w:id="143"/>
-    <w:bookmarkStart w:id="144" w:name="ref-parker1985learning"/>
+    <w:bookmarkEnd w:id="135"/>
+    <w:bookmarkStart w:id="136" w:name="ref-parker1985learning"/>
     <w:p>
       <w:pPr>
         <w:pStyle w:val="Bibliography"/>
@@ -17374,8 +17639,8 @@
         <w:t xml:space="preserve">Parker, David B. 1985. “Learning Logic.”</w:t>
       </w:r>
     </w:p>
-    <w:bookmarkEnd w:id="144"/>
-    <w:bookmarkStart w:id="145" w:name="ref-rehman2014image"/>
+    <w:bookmarkEnd w:id="136"/>
+    <w:bookmarkStart w:id="137" w:name="ref-rehman2014image"/>
     <w:p>
       <w:pPr>
         <w:pStyle w:val="Bibliography"/>
@@ -17399,8 +17664,8 @@
         <w:t xml:space="preserve">7 (4). Maxwell Science Publishing: 656–72.</w:t>
       </w:r>
     </w:p>
-    <w:bookmarkEnd w:id="145"/>
-    <w:bookmarkStart w:id="146" w:name="ref-rigaud2013parametric"/>
+    <w:bookmarkEnd w:id="137"/>
+    <w:bookmarkStart w:id="138" w:name="ref-rigaud2013parametric"/>
     <w:p>
       <w:pPr>
         <w:pStyle w:val="Bibliography"/>
@@ -17424,8 +17689,8 @@
         <w:t xml:space="preserve">133 (5). ASA: 3107–18.</w:t>
       </w:r>
     </w:p>
-    <w:bookmarkEnd w:id="146"/>
-    <w:bookmarkStart w:id="147" w:name="ref-Rosenblatt57"/>
+    <w:bookmarkEnd w:id="138"/>
+    <w:bookmarkStart w:id="139" w:name="ref-Rosenblatt57"/>
     <w:p>
       <w:pPr>
         <w:pStyle w:val="Bibliography"/>
@@ -17446,8 +17711,8 @@
         <w:t xml:space="preserve">. Cornell Aeronautical Laboratory.</w:t>
       </w:r>
     </w:p>
-    <w:bookmarkEnd w:id="147"/>
-    <w:bookmarkStart w:id="148" w:name="ref-rosenblatt1958perceptron"/>
+    <w:bookmarkEnd w:id="139"/>
+    <w:bookmarkStart w:id="140" w:name="ref-rosenblatt1958perceptron"/>
     <w:p>
       <w:pPr>
         <w:pStyle w:val="Bibliography"/>
@@ -17471,8 +17736,8 @@
         <w:t xml:space="preserve">65 (6). American Psychological Association: 386.</w:t>
       </w:r>
     </w:p>
-    <w:bookmarkEnd w:id="148"/>
-    <w:bookmarkStart w:id="149" w:name="ref-rumelhart1985learning"/>
+    <w:bookmarkEnd w:id="140"/>
+    <w:bookmarkStart w:id="141" w:name="ref-rumelhart1985learning"/>
     <w:p>
       <w:pPr>
         <w:pStyle w:val="Bibliography"/>
@@ -17481,8 +17746,8 @@
         <w:t xml:space="preserve">Rumelhart, David E, Geoffrey E Hinton, and Ronald J Williams. 1985. “Learning Internal Representations by Error Propagation.” California Univ San Diego La Jolla Inst for Cognitive Science.</w:t>
       </w:r>
     </w:p>
-    <w:bookmarkEnd w:id="149"/>
-    <w:bookmarkStart w:id="150" w:name="ref-sainath2015deep"/>
+    <w:bookmarkEnd w:id="141"/>
+    <w:bookmarkStart w:id="142" w:name="ref-sainath2015deep"/>
     <w:p>
       <w:pPr>
         <w:pStyle w:val="Bibliography"/>
@@ -17506,8 +17771,8 @@
         <w:t xml:space="preserve">64. Elsevier: 39–48.</w:t>
       </w:r>
     </w:p>
-    <w:bookmarkEnd w:id="150"/>
-    <w:bookmarkStart w:id="151" w:name="ref-sak2015fast"/>
+    <w:bookmarkEnd w:id="142"/>
+    <w:bookmarkStart w:id="143" w:name="ref-sak2015fast"/>
     <w:p>
       <w:pPr>
         <w:pStyle w:val="Bibliography"/>
@@ -17528,8 +17793,8 @@
         <w:t xml:space="preserve">.</w:t>
       </w:r>
     </w:p>
-    <w:bookmarkEnd w:id="151"/>
-    <w:bookmarkStart w:id="152" w:name="ref-salsa2016partial"/>
+    <w:bookmarkEnd w:id="143"/>
+    <w:bookmarkStart w:id="144" w:name="ref-salsa2016partial"/>
     <w:p>
       <w:pPr>
         <w:pStyle w:val="Bibliography"/>
@@ -17550,8 +17815,8 @@
         <w:t xml:space="preserve">. Vol. 99. Springer.</w:t>
       </w:r>
     </w:p>
-    <w:bookmarkEnd w:id="152"/>
-    <w:bookmarkStart w:id="153" w:name="ref-sangkloy2016scribbler"/>
+    <w:bookmarkEnd w:id="144"/>
+    <w:bookmarkStart w:id="145" w:name="ref-sangkloy2016scribbler"/>
     <w:p>
       <w:pPr>
         <w:pStyle w:val="Bibliography"/>
@@ -17572,8 +17837,8 @@
         <w:t xml:space="preserve">.</w:t>
       </w:r>
     </w:p>
-    <w:bookmarkEnd w:id="153"/>
-    <w:bookmarkStart w:id="154" w:name="ref-santurkar2017generative"/>
+    <w:bookmarkEnd w:id="145"/>
+    <w:bookmarkStart w:id="146" w:name="ref-santurkar2017generative"/>
     <w:p>
       <w:pPr>
         <w:pStyle w:val="Bibliography"/>
@@ -17594,8 +17859,8 @@
         <w:t xml:space="preserve">.</w:t>
       </w:r>
     </w:p>
-    <w:bookmarkEnd w:id="154"/>
-    <w:bookmarkStart w:id="155" w:name="ref-serra2007state"/>
+    <w:bookmarkEnd w:id="146"/>
+    <w:bookmarkStart w:id="147" w:name="ref-serra2007state"/>
     <w:p>
       <w:pPr>
         <w:pStyle w:val="Bibliography"/>
@@ -17616,8 +17881,8 @@
         <w:t xml:space="preserve">, 9–12. IEEE.</w:t>
       </w:r>
     </w:p>
-    <w:bookmarkEnd w:id="155"/>
-    <w:bookmarkStart w:id="156" w:name="ref-sigtia2016end"/>
+    <w:bookmarkEnd w:id="147"/>
+    <w:bookmarkStart w:id="148" w:name="ref-sigtia2016end"/>
     <w:p>
       <w:pPr>
         <w:pStyle w:val="Bibliography"/>
@@ -17641,8 +17906,8 @@
         <w:t xml:space="preserve">24 (5). IEEE Press: 927–39.</w:t>
       </w:r>
     </w:p>
-    <w:bookmarkEnd w:id="156"/>
-    <w:bookmarkStart w:id="157" w:name="ref-smith2006basic"/>
+    <w:bookmarkEnd w:id="148"/>
+    <w:bookmarkStart w:id="149" w:name="ref-smith2006basic"/>
     <w:p>
       <w:pPr>
         <w:pStyle w:val="Bibliography"/>
@@ -17663,8 +17928,8 @@
         <w:t xml:space="preserve">.</w:t>
       </w:r>
     </w:p>
-    <w:bookmarkEnd w:id="157"/>
-    <w:bookmarkStart w:id="158" w:name="ref-smith1992physical"/>
+    <w:bookmarkEnd w:id="149"/>
+    <w:bookmarkStart w:id="150" w:name="ref-smith1992physical"/>
     <w:p>
       <w:pPr>
         <w:pStyle w:val="Bibliography"/>
@@ -17688,8 +17953,8 @@
         <w:t xml:space="preserve">16 (4). JSTOR: 74–91.</w:t>
       </w:r>
     </w:p>
-    <w:bookmarkEnd w:id="158"/>
-    <w:bookmarkStart w:id="159" w:name="ref-socher2014recursive"/>
+    <w:bookmarkEnd w:id="150"/>
+    <w:bookmarkStart w:id="151" w:name="ref-socher2014recursive"/>
     <w:p>
       <w:pPr>
         <w:pStyle w:val="Bibliography"/>
@@ -17698,8 +17963,8 @@
         <w:t xml:space="preserve">Socher, Richard. 2014. “Recursive Deep Learning for Natural Language Processing and Computer Vision.” Citeseer.</w:t>
       </w:r>
     </w:p>
-    <w:bookmarkEnd w:id="159"/>
-    <w:bookmarkStart w:id="160" w:name="ref-southall2016automatic"/>
+    <w:bookmarkEnd w:id="151"/>
+    <w:bookmarkStart w:id="152" w:name="ref-southall2016automatic"/>
     <w:p>
       <w:pPr>
         <w:pStyle w:val="Bibliography"/>
@@ -17720,8 +17985,8 @@
         <w:t xml:space="preserve">, 591–97.</w:t>
       </w:r>
     </w:p>
-    <w:bookmarkEnd w:id="160"/>
-    <w:bookmarkStart w:id="161" w:name="ref-stanley2007compositional"/>
+    <w:bookmarkEnd w:id="152"/>
+    <w:bookmarkStart w:id="153" w:name="ref-stanley2007compositional"/>
     <w:p>
       <w:pPr>
         <w:pStyle w:val="Bibliography"/>
@@ -17745,8 +18010,8 @@
         <w:t xml:space="preserve">8 (2). Springer: 131–62.</w:t>
       </w:r>
     </w:p>
-    <w:bookmarkEnd w:id="161"/>
-    <w:bookmarkStart w:id="162" w:name="ref-staudt2016development"/>
+    <w:bookmarkEnd w:id="153"/>
+    <w:bookmarkStart w:id="154" w:name="ref-staudt2016development"/>
     <w:p>
       <w:pPr>
         <w:pStyle w:val="Bibliography"/>
@@ -17755,8 +18020,8 @@
         <w:t xml:space="preserve">Staudt, Pascal. 2016. “Development of a Digital Musical Instrument with Embedded Sound Synthesis.”</w:t>
       </w:r>
     </w:p>
-    <w:bookmarkEnd w:id="162"/>
-    <w:bookmarkStart w:id="163" w:name="ref-theis2015generative"/>
+    <w:bookmarkEnd w:id="154"/>
+    <w:bookmarkStart w:id="155" w:name="ref-theis2015generative"/>
     <w:p>
       <w:pPr>
         <w:pStyle w:val="Bibliography"/>
@@ -17777,8 +18042,8 @@
         <w:t xml:space="preserve">, 1927–35.</w:t>
       </w:r>
     </w:p>
-    <w:bookmarkEnd w:id="163"/>
-    <w:bookmarkStart w:id="164" w:name="ref-theis2017lossy"/>
+    <w:bookmarkEnd w:id="155"/>
+    <w:bookmarkStart w:id="156" w:name="ref-theis2017lossy"/>
     <w:p>
       <w:pPr>
         <w:pStyle w:val="Bibliography"/>
@@ -17799,8 +18064,8 @@
         <w:t xml:space="preserve">.</w:t>
       </w:r>
     </w:p>
-    <w:bookmarkEnd w:id="164"/>
-    <w:bookmarkStart w:id="165" w:name="ref-toderici2015variable"/>
+    <w:bookmarkEnd w:id="156"/>
+    <w:bookmarkStart w:id="157" w:name="ref-toderici2015variable"/>
     <w:p>
       <w:pPr>
         <w:pStyle w:val="Bibliography"/>
@@ -17821,8 +18086,8 @@
         <w:t xml:space="preserve">.</w:t>
       </w:r>
     </w:p>
-    <w:bookmarkEnd w:id="165"/>
-    <w:bookmarkStart w:id="166" w:name="ref-toderici2016full"/>
+    <w:bookmarkEnd w:id="157"/>
+    <w:bookmarkStart w:id="158" w:name="ref-toderici2016full"/>
     <w:p>
       <w:pPr>
         <w:pStyle w:val="Bibliography"/>
@@ -17843,8 +18108,8 @@
         <w:t xml:space="preserve">.</w:t>
       </w:r>
     </w:p>
-    <w:bookmarkEnd w:id="166"/>
-    <w:bookmarkStart w:id="167" w:name="ref-tuohy2006evolved"/>
+    <w:bookmarkEnd w:id="158"/>
+    <w:bookmarkStart w:id="159" w:name="ref-tuohy2006evolved"/>
     <w:p>
       <w:pPr>
         <w:pStyle w:val="Bibliography"/>
@@ -17865,8 +18130,8 @@
         <w:t xml:space="preserve">.</w:t>
       </w:r>
     </w:p>
-    <w:bookmarkEnd w:id="167"/>
-    <w:bookmarkStart w:id="168" w:name="ref-veit2016residual"/>
+    <w:bookmarkEnd w:id="159"/>
+    <w:bookmarkStart w:id="160" w:name="ref-veit2016residual"/>
     <w:p>
       <w:pPr>
         <w:pStyle w:val="Bibliography"/>
@@ -17887,8 +18152,8 @@
         <w:t xml:space="preserve">, 550–58.</w:t>
       </w:r>
     </w:p>
-    <w:bookmarkEnd w:id="168"/>
-    <w:bookmarkStart w:id="169" w:name="ref-wang2015image"/>
+    <w:bookmarkEnd w:id="160"/>
+    <w:bookmarkStart w:id="161" w:name="ref-wang2015image"/>
     <w:p>
       <w:pPr>
         <w:pStyle w:val="Bibliography"/>
@@ -17912,8 +18177,8 @@
         <w:t xml:space="preserve">13 (1): 137–45.</w:t>
       </w:r>
     </w:p>
-    <w:bookmarkEnd w:id="169"/>
-    <w:bookmarkStart w:id="170" w:name="ref-widrow1960adaptive"/>
+    <w:bookmarkEnd w:id="161"/>
+    <w:bookmarkStart w:id="162" w:name="ref-widrow1960adaptive"/>
     <w:p>
       <w:pPr>
         <w:pStyle w:val="Bibliography"/>
@@ -17922,8 +18187,8 @@
         <w:t xml:space="preserve">Widrow, Bernard, and Marcian E Hoff. 1960. “Adaptive Switching Circuits.” STANFORD UNIV CA STANFORD ELECTRONICS LABS.</w:t>
       </w:r>
     </w:p>
-    <w:bookmarkEnd w:id="170"/>
-    <w:bookmarkStart w:id="171" w:name="ref-widrow199030"/>
+    <w:bookmarkEnd w:id="162"/>
+    <w:bookmarkStart w:id="163" w:name="ref-widrow199030"/>
     <w:p>
       <w:pPr>
         <w:pStyle w:val="Bibliography"/>
@@ -17947,8 +18212,8 @@
         <w:t xml:space="preserve">78 (9). IEEE: 1415–42.</w:t>
       </w:r>
     </w:p>
-    <w:bookmarkEnd w:id="171"/>
-    <w:bookmarkStart w:id="172" w:name="ref-wu2016investigating"/>
+    <w:bookmarkEnd w:id="163"/>
+    <w:bookmarkStart w:id="164" w:name="ref-wu2016investigating"/>
     <w:p>
       <w:pPr>
         <w:pStyle w:val="Bibliography"/>
@@ -17969,8 +18234,8 @@
         <w:t xml:space="preserve">, 5140–4. IEEE.</w:t>
       </w:r>
     </w:p>
-    <w:bookmarkEnd w:id="172"/>
-    <w:bookmarkStart w:id="173" w:name="ref-xu2015ccg"/>
+    <w:bookmarkEnd w:id="164"/>
+    <w:bookmarkStart w:id="165" w:name="ref-xu2015ccg"/>
     <w:p>
       <w:pPr>
         <w:pStyle w:val="Bibliography"/>
@@ -17991,8 +18256,8 @@
         <w:t xml:space="preserve">, 250–55.</w:t>
       </w:r>
     </w:p>
-    <w:bookmarkEnd w:id="173"/>
-    <w:bookmarkStart w:id="174" w:name="ref-yadav2015introduction"/>
+    <w:bookmarkEnd w:id="165"/>
+    <w:bookmarkStart w:id="166" w:name="ref-yadav2015introduction"/>
     <w:p>
       <w:pPr>
         <w:pStyle w:val="Bibliography"/>
@@ -18013,8 +18278,8 @@
         <w:t xml:space="preserve">. Springer.</w:t>
       </w:r>
     </w:p>
-    <w:bookmarkEnd w:id="174"/>
-    <w:bookmarkStart w:id="176" w:name="ref-Yang2017"/>
+    <w:bookmarkEnd w:id="166"/>
+    <w:bookmarkStart w:id="168" w:name="ref-Yang2017"/>
     <w:p>
       <w:pPr>
         <w:pStyle w:val="Bibliography"/>
@@ -18025,7 +18290,7 @@
       <w:r>
         <w:t xml:space="preserve"> </w:t>
       </w:r>
-      <w:hyperlink r:id="rId175">
+      <w:hyperlink r:id="rId167">
         <w:r>
           <w:rPr>
             <w:rStyle w:val="Hyperlink"/>
@@ -18037,8 +18302,8 @@
         <w:t xml:space="preserve">.</w:t>
       </w:r>
     </w:p>
-    <w:bookmarkEnd w:id="176"/>
-    <w:bookmarkStart w:id="177" w:name="ref-zen2015unidirectional"/>
+    <w:bookmarkEnd w:id="168"/>
+    <w:bookmarkStart w:id="169" w:name="ref-zen2015unidirectional"/>
     <w:p>
       <w:pPr>
         <w:pStyle w:val="Bibliography"/>
@@ -18059,8 +18324,8 @@
         <w:t xml:space="preserve">, 4470–4. IEEE.</w:t>
       </w:r>
     </w:p>
-    <w:bookmarkEnd w:id="177"/>
-    <w:bookmarkStart w:id="178" w:name="ref-zhang2016colorful"/>
+    <w:bookmarkEnd w:id="169"/>
+    <w:bookmarkStart w:id="170" w:name="ref-zhang2016colorful"/>
     <w:p>
       <w:pPr>
         <w:pStyle w:val="Bibliography"/>
@@ -18081,8 +18346,8 @@
         <w:t xml:space="preserve">, 649–66. Springer.</w:t>
       </w:r>
     </w:p>
-    <w:bookmarkEnd w:id="178"/>
-    <w:bookmarkStart w:id="179" w:name="ref-zhang2017towards"/>
+    <w:bookmarkEnd w:id="170"/>
+    <w:bookmarkStart w:id="171" w:name="ref-zhang2017towards"/>
     <w:p>
       <w:pPr>
         <w:pStyle w:val="Bibliography"/>
@@ -18103,8 +18368,8 @@
         <w:t xml:space="preserve">.</w:t>
       </w:r>
     </w:p>
-    <w:bookmarkEnd w:id="179"/>
-    <w:bookmarkStart w:id="180" w:name="ref-zhang2017very"/>
+    <w:bookmarkEnd w:id="171"/>
+    <w:bookmarkStart w:id="172" w:name="ref-zhang2017very"/>
     <w:p>
       <w:pPr>
         <w:pStyle w:val="Bibliography"/>
@@ -18125,8 +18390,8 @@
         <w:t xml:space="preserve">, 4845–9. IEEE.</w:t>
       </w:r>
     </w:p>
-    <w:bookmarkEnd w:id="180"/>
-    <w:bookmarkStart w:id="181" w:name="ref-zhu2016generative"/>
+    <w:bookmarkEnd w:id="172"/>
+    <w:bookmarkStart w:id="173" w:name="ref-zhu2016generative"/>
     <w:p>
       <w:pPr>
         <w:pStyle w:val="Bibliography"/>
@@ -18147,8 +18412,8 @@
         <w:t xml:space="preserve">, 597–613. Springer.</w:t>
       </w:r>
     </w:p>
-    <w:bookmarkEnd w:id="181"/>
-    <w:bookmarkStart w:id="182" w:name="ref-zweig2017advances"/>
+    <w:bookmarkEnd w:id="173"/>
+    <w:bookmarkStart w:id="174" w:name="ref-zweig2017advances"/>
     <w:p>
       <w:pPr>
         <w:pStyle w:val="Bibliography"/>
@@ -18169,8 +18434,8 @@
         <w:t xml:space="preserve">, 4805–9. IEEE.</w:t>
       </w:r>
     </w:p>
-    <w:bookmarkEnd w:id="182"/>
-    <w:bookmarkEnd w:id="183"/>
+    <w:bookmarkEnd w:id="174"/>
+    <w:bookmarkEnd w:id="175"/>
     <w:sectPr>
       <w:pgSz w:w="12240" w:h="15840"/>
       <w:pgMar w:top="1440" w:right="1440" w:bottom="1440" w:left="1440" w:header="720" w:footer="720" w:gutter="0"/>

</xml_diff>

<commit_message>
mais partes foram traduzidas; removida a pasta trash
</commit_message>
<xml_diff>
--- a/Dissert.docx
+++ b/Dissert.docx
@@ -356,6 +356,12 @@
         <w:pStyle w:val="FirstParagraph"/>
       </w:pPr>
       <w:r>
+        <w:t xml:space="preserve">O objetivo deste trabalho é desenvolver um modelo de simulação, em tempo real, de instrumentos acústicos baseado na utilização de redes neurais artificias.</w:t>
+      </w:r>
+      <w:r>
+        <w:t xml:space="preserve"> </w:t>
+      </w:r>
+      <w:r>
         <w:t xml:space="preserve">Busca-se, desta forma, identificar técnicas baseadas no estado da arte das redes neurais artificiais que, em conjunto com abordagens tradicionais, deem suporte à modelagem de instrumentos musicais acústicos, dando origem a simulações mais realistas, principalmente do ponto de vista da percepção humana, e sobretudo mais computacionalmente eficientes.</w:t>
       </w:r>
     </w:p>
@@ -374,7 +380,13 @@
         <w:pStyle w:val="FirstParagraph"/>
       </w:pPr>
       <w:r>
-        <w:t xml:space="preserve">Limitar o trabalho à investigação de instrumentos que possam ser aproximados por um modelo de excitação impulsivo, como é o caso, possibilita excluir da observação uma subárea significativa do processamento de sinais que lida com a evolução das frequências de uma onda sonora no domínio do tempo, trazendo o volume de pesquisa a níveis razoáveis, sem uma perda substancial em termos conceituais.</w:t>
+        <w:t xml:space="preserve">O trabalho limita-se à emulação de instrumentos musicais acústicos convencionais, e não aborda a área mais subjetiva, do desenho de novos instrumentos senão tangencialmente, através de um exemplo em que um instrumento híbrido é apresentado; um tratamento razoavelmente completo do tema, pela infinidade de possibilidades que oferece (</w:t>
+      </w:r>
+      <w:r>
+        <w:t xml:space="preserve">Dalgleish, Spencer, and Foster (2014)</w:t>
+      </w:r>
+      <w:r>
+        <w:t xml:space="preserve">), está muito além do objetivo deste trabalho.</w:t>
       </w:r>
     </w:p>
     <w:p>
@@ -382,7 +394,15 @@
         <w:pStyle w:val="BodyText"/>
       </w:pPr>
       <w:r>
-        <w:t xml:space="preserve">Uma outra vantagem é de cunho técnico, já que essa escolha reduz a duração média das ondas investigadas, o que é uma escolha sensível quando alguns dos algoritmos utilizados, como a Transformada Discreta de Fourier, possuem complexidade</w:t>
+        <w:t xml:space="preserve">Adicionalmente, limitar o escopo do trabalho à investigação de instrumentos que possam ser aproximados por um modelo de excitação impulsivo, como aqui é feito, possibilita excluir da observação uma subárea significativa do processamento de sinais que lida com a evolução das frequências de uma onda sonora no domínio do tempo, trazendo o volume de pesquisa a níveis razoáveis, sem uma perda substancial em termos conceituais.</w:t>
+      </w:r>
+    </w:p>
+    <w:p>
+      <w:pPr>
+        <w:pStyle w:val="BodyText"/>
+      </w:pPr>
+      <w:r>
+        <w:t xml:space="preserve">Uma outra vantagem desse recorte é de cunho técnico, já que essa escolha reduz a duração média das ondas investigadas, o que é uma escolha sensível quando alguns dos algoritmos utilizados, como a Transformada Discreta de Fourier, possuem complexidade</w:t>
       </w:r>
       <w:r>
         <w:t xml:space="preserve"> </w:t>
@@ -412,6 +432,9 @@
         <m:r>
           <m:t>)</m:t>
         </m:r>
+        <m:r>
+          <m:t>)</m:t>
+        </m:r>
       </m:oMath>
     </w:p>
     <w:p>
@@ -434,7 +457,7 @@
         <w:t xml:space="preserve"> </w:t>
       </w:r>
       <w:r>
-        <w:t xml:space="preserve">de instrumentos acústicos, razão pela qual o foco deste trabalho é a síntese em tempo real, econômica do ponto de vista computacional. Desenvolvimentos nesse sentido podem, por exemplo, motivar implementações em plataformas mais compactas, como teclados, pianos e baterias eletrônicas, além de encontrarem aplicação em áreas em ascensão, como realidade virtual e aumentada.</w:t>
+        <w:t xml:space="preserve">de instrumentos acústicos, razão pela qual o foco deste trabalho é a síntese em tempo real. Desenvolvimentos nesse sentido podem, por exemplo, motivar implementações em plataformas mais compactas, como teclados, pianos e baterias eletrônicas, além de encontrarem aplicação em áreas em ascensão, como realidade virtual e aumentada.</w:t>
       </w:r>
     </w:p>
     <w:p>
@@ -442,7 +465,7 @@
         <w:pStyle w:val="BodyText"/>
       </w:pPr>
       <w:r>
-        <w:t xml:space="preserve">Em relação ao tratamento das redes neurais, prioridade foi dada às arquiteturas consolidadas na literatura, o que excluiu, por exemplo, uma investigação da promissora arquitetura Capsnet(</w:t>
+        <w:t xml:space="preserve">Em relação ao tratamento das redes neurais, prioridade foi dada às arquiteturas já consolidadas na literatura, o que excluiu, por exemplo, uma investigação da promissora arquitetura Capsnet(</w:t>
       </w:r>
       <w:r>
         <w:rPr>
@@ -457,7 +480,7 @@
         <w:t xml:space="preserve"> </w:t>
       </w:r>
       <w:r>
-        <w:t xml:space="preserve">A escolha é necessária devido à limitações de tempo, frente ao grande volume de pesquisas envolvendo novas arquiteturas que pode-se observar.</w:t>
+        <w:t xml:space="preserve">A escolha é necessária devido à limitações de tempo em contraste com o grande volume de pesquisas envolvendo novas arquiteturas.</w:t>
       </w:r>
     </w:p>
     <w:p>
@@ -582,6 +605,86 @@
         <w:t xml:space="preserve">Relevância socio-econômica</w:t>
       </w:r>
       <w:bookmarkEnd w:id="24"/>
+    </w:p>
+    <w:p>
+      <w:pPr>
+        <w:pStyle w:val="FirstParagraph"/>
+      </w:pPr>
+      <w:r>
+        <w:t xml:space="preserve">Os computadores introduziram a produção musical em uma nova era, permitindo, por um lado, experimentações com novos timbres e formas de interação homem máquina para a criação musical e, por outro, a emulação de instrumentos tradicionais, através de técnicas promissoras, como a modelagem acústica(</w:t>
+      </w:r>
+      <w:r>
+        <w:t xml:space="preserve">Bovermann et al. (2016)</w:t>
+      </w:r>
+      <w:r>
+        <w:t xml:space="preserve">).</w:t>
+      </w:r>
+    </w:p>
+    <w:p>
+      <w:pPr>
+        <w:pStyle w:val="BodyText"/>
+      </w:pPr>
+      <w:r>
+        <w:t xml:space="preserve">Avançar essas pesquisas significa, na medida em que, por exemplo, diminui custos de software e hardware dedicados, levando em conta ainda a crescente disponibilidade de dispositivos portáteis, como tablets e telefones celulares, oferecer a um maior número de pessoas a oportunidade de uma educação musical, e por conseguinte uma formação intelectual, mais rica.</w:t>
+      </w:r>
+    </w:p>
+    <w:p>
+      <w:pPr>
+        <w:pStyle w:val="BodyText"/>
+      </w:pPr>
+      <w:r>
+        <w:t xml:space="preserve">Algumas vantagens do acesso precoce à educação musical são delineadas no estudo de</w:t>
+      </w:r>
+      <w:r>
+        <w:t xml:space="preserve"> </w:t>
+      </w:r>
+      <w:r>
+        <w:t xml:space="preserve">Forgeard et al. (2008)</w:t>
+      </w:r>
+      <w:r>
+        <w:t xml:space="preserve">, que sugere uma maior habilidade verbal e uma maior capacidade de raciocínio não verbal em crianças que praticaram instrumentos em sua infância, na mesma linha, o trabalho de</w:t>
+      </w:r>
+      <w:r>
+        <w:t xml:space="preserve"> </w:t>
+      </w:r>
+      <w:r>
+        <w:t xml:space="preserve">Vaughn (2000)</w:t>
+      </w:r>
+      <w:r>
+        <w:t xml:space="preserve"> </w:t>
+      </w:r>
+      <w:r>
+        <w:t xml:space="preserve">aponta para uma relação entre o estudo voluntário de música e uma melhoria do desempenho matemático, a partir de uma meta análise de 20 estudos.</w:t>
+      </w:r>
+    </w:p>
+    <w:p>
+      <w:pPr>
+        <w:pStyle w:val="BodyText"/>
+      </w:pPr>
+      <w:r>
+        <w:t xml:space="preserve">Uma outra motivação importante é estimular a descentralização do capital intelectual relacionado ao campo de instrumentos virtuais, desde a década de 70 fortemente concentrado em algumas empresas japonesas, situadas em sua maioria na cidade de Hamamatsu como Yamaha e Roland (</w:t>
+      </w:r>
+      <w:r>
+        <w:t xml:space="preserve">Reiffenstein (2006)</w:t>
+      </w:r>
+      <w:r>
+        <w:t xml:space="preserve">). Que detém, exclusivamente ou parcialmente, as patentes para alguns importantes algoritmos de síntese sonora, como os</w:t>
+      </w:r>
+      <w:r>
+        <w:t xml:space="preserve"> </w:t>
+      </w:r>
+      <w:r>
+        <w:rPr>
+          <w:i/>
+        </w:rPr>
+        <w:t xml:space="preserve">waveguides</w:t>
+      </w:r>
+      <w:r>
+        <w:t xml:space="preserve"> </w:t>
+      </w:r>
+      <w:r>
+        <w:t xml:space="preserve">digitais.</w:t>
+      </w:r>
     </w:p>
     <w:p>
       <w:pPr>
@@ -1278,7 +1381,7 @@
         <w:pStyle w:val="FirstParagraph"/>
       </w:pPr>
       <w:r>
-        <w:t xml:space="preserve">A maioria dos trabalhos que investigam a aplicação de redes neurais à música, sobretudo envolvendo sua síntese, ocorrem em um nível de abstração mais alto do que a geração direta dos sons. Geralmente tomam como base a manipulação de representações musicais como partituras, por exemplo, ou representações sonoras compactas, como os espectrogramas.</w:t>
+        <w:t xml:space="preserve">A maioria dos trabalhos que investigam a aplicação de redes neurais à música, sobretudo envolvendo sua síntese, ocorrem em um nível de abstração mais alto do que a geração direta dos sons: Geralmente tomam como base a manipulação de representações musicais como partituras, por exemplo, ou representações sonoras compactas, como espectrogramas. Os motivos passam pela alta dimensionalidade dos outputs: no caso de um framerate de 441 00 samples por segundo, a qualidade encontrada em cds, por exemplo, a síntese de 10 segundos de áudio envolve a criação de mais de 4 milhões de samples.</w:t>
       </w:r>
     </w:p>
     <w:p>
@@ -1286,16 +1389,111 @@
         <w:pStyle w:val="BodyText"/>
       </w:pPr>
       <w:r>
-        <w:t xml:space="preserve">Classification</w:t>
-      </w:r>
-      <w:r>
-        <w:t xml:space="preserve"> </w:t>
-      </w:r>
-      <w:r>
-        <w:t xml:space="preserve">This task involves assigning tags, generally genre-related or emotion related, to musical pieces.</w:t>
-      </w:r>
-      <w:r>
-        <w:t xml:space="preserve"> </w:t>
+        <w:t xml:space="preserve">O trabalho desenvolvido em conjunto pelas equipes do Google Brain team e do DeepMind é um exemplo de esforço nesse sentido</w:t>
+      </w:r>
+      <w:r>
+        <w:t xml:space="preserve">(Engel et al. 2017)</w:t>
+      </w:r>
+      <w:r>
+        <w:t xml:space="preserve">. Nele, uma arquitetura desenvolvida a partir da Wavenet (aprofundada no tópico sobre discurso falado) é utilizada para a geração de ondas sonoras a partir do treinamento direto com samples de vários instrumentos musicais. Os resultados mostram que a arquitetura encoder-decoder utilizada é capaz de aprender representações no domínio da frequência para vários tipos de instrumentos diferentes e uma extensão do trabalho denominada Magenta, consistindo em um player em tempo real para os sons da rede corroboram sua aplicabilidade em tempo real.</w:t>
+      </w:r>
+    </w:p>
+    <w:p>
+      <w:pPr>
+        <w:pStyle w:val="BodyText"/>
+      </w:pPr>
+      <w:r>
+        <w:t xml:space="preserve">Equanto as camadas das arquiteturas anteriores são predominantemente convolucionais,</w:t>
+      </w:r>
+      <w:r>
+        <w:t xml:space="preserve"> </w:t>
+      </w:r>
+      <w:r>
+        <w:t xml:space="preserve">Pfalz (2018)</w:t>
+      </w:r>
+      <w:r>
+        <w:t xml:space="preserve"> </w:t>
+      </w:r>
+      <w:r>
+        <w:t xml:space="preserve">apresenta um trabalho bastante abrangente sobre o uso de redes neurais recorrentes puras para essa finalidade. Um dos primeiros trabalhos na área é, talvez, o desenvolvido por</w:t>
+      </w:r>
+      <w:r>
+        <w:t xml:space="preserve"> </w:t>
+      </w:r>
+      <w:r>
+        <w:t xml:space="preserve">(Stanley 2007)</w:t>
+      </w:r>
+      <w:r>
+        <w:t xml:space="preserve">, consistindo na investigação da capacidade de uma rede em prever sons, em analogia direta com séries temporais. Os resultados são bastante tímidos, e a uma rede capaz de prever apenas uma onda sonora, oriunda de uma nota de saxofone, é apresentada. De maneira semelhante,</w:t>
+      </w:r>
+      <w:r>
+        <w:t xml:space="preserve"> </w:t>
+      </w:r>
+      <w:r>
+        <w:t xml:space="preserve">Sarroff and Casey (2014)</w:t>
+      </w:r>
+      <w:r>
+        <w:t xml:space="preserve"> </w:t>
+      </w:r>
+      <w:r>
+        <w:t xml:space="preserve">investiga a aplicação direta de redes neurais, de arquitetura densa, na geração direta de multiplos samples de audio.</w:t>
+      </w:r>
+    </w:p>
+    <w:p>
+      <w:pPr>
+        <w:pStyle w:val="BodyText"/>
+      </w:pPr>
+      <w:r>
+        <w:t xml:space="preserve">A geração de música em níveis mais altos de abstração é, para o trabalho aqui desenvolvido, apenas marginalmente interessante, na medida em que pode oferecer insights sobre representações compactas dos sons. O trabalho de</w:t>
+      </w:r>
+      <w:r>
+        <w:t xml:space="preserve"> </w:t>
+      </w:r>
+      <w:r>
+        <w:t xml:space="preserve">(Hutchings 2017)</w:t>
+      </w:r>
+      <w:r>
+        <w:t xml:space="preserve">, por exemplo, utiliza tablaturas para a previsão de partes completas de bateria tomando como base o ritmo de uma de suas peças.</w:t>
+      </w:r>
+    </w:p>
+    <w:p>
+      <w:pPr>
+        <w:pStyle w:val="BodyText"/>
+      </w:pPr>
+      <w:r>
+        <w:t xml:space="preserve">Tomando emprestados os desenvolvimentos obtidos na área de computer vision, os trabalhos de</w:t>
+      </w:r>
+      <w:r>
+        <w:t xml:space="preserve"> </w:t>
+      </w:r>
+      <w:r>
+        <w:t xml:space="preserve">Grinstein et al. (2017)</w:t>
+      </w:r>
+      <w:r>
+        <w:t xml:space="preserve"> </w:t>
+      </w:r>
+      <w:r>
+        <w:t xml:space="preserve">e</w:t>
+      </w:r>
+      <w:r>
+        <w:t xml:space="preserve"> </w:t>
+      </w:r>
+      <w:r>
+        <w:t xml:space="preserve">Mital (2017)</w:t>
+      </w:r>
+      <w:r>
+        <w:t xml:space="preserve"> </w:t>
+      </w:r>
+      <w:r>
+        <w:t xml:space="preserve">buscam transpor os avanços alcançados no campo da transferência de estilo entre imagens para o domínio do som. O primeiro, de cunho exploratório, investiga as arquiteturas mais promissoras para a tarefa, chamando a atenção para o desempenho de arquiteturas rasas, enquanto o segundo investiga, a partir da Wavenet, representações apropriadas.</w:t>
+      </w:r>
+    </w:p>
+    <w:p>
+      <w:pPr>
+        <w:pStyle w:val="BodyText"/>
+      </w:pPr>
+      <w:r>
+        <w:t xml:space="preserve">Os esforços de classificação costumam introduzir inovações interessantes nas representações utilizadas:</w:t>
       </w:r>
       <w:r>
         <w:t xml:space="preserve">(Costa, Oliveira, and Silla 2017)</w:t>
@@ -1304,7 +1502,7 @@
         <w:t xml:space="preserve"> </w:t>
       </w:r>
       <w:r>
-        <w:t xml:space="preserve">and</w:t>
+        <w:t xml:space="preserve">e</w:t>
       </w:r>
       <w:r>
         <w:t xml:space="preserve"> </w:t>
@@ -1316,7 +1514,7 @@
         <w:t xml:space="preserve"> </w:t>
       </w:r>
       <w:r>
-        <w:t xml:space="preserve">tackles this task with a fully convolutional neural network fed, in the latter case, with music represented by a mel-spectrogram, while in</w:t>
+        <w:t xml:space="preserve">abordam a tarefa a partir de redes convolucionais; no primeiro trabalho as redes são alimentadas com música representada por um mel-spectrogram e no segundo arquiteturas convolucionais profundas são investigadas, assim como</w:t>
       </w:r>
       <w:r>
         <w:t xml:space="preserve"> </w:t>
@@ -1328,7 +1526,7 @@
         <w:t xml:space="preserve"> </w:t>
       </w:r>
       <w:r>
-        <w:t xml:space="preserve">a recurrent architecture is also explored, to exploit the temporal correlation of the inputs.</w:t>
+        <w:t xml:space="preserve">que acrescenta recorrencia às arquiteturas convolucionais, no intuito de explorar as interrelações temporais dos samples utilizados.</w:t>
       </w:r>
     </w:p>
     <w:p>
@@ -1336,13 +1534,7 @@
         <w:pStyle w:val="BodyText"/>
       </w:pPr>
       <w:r>
-        <w:t xml:space="preserve">Transcription</w:t>
-      </w:r>
-      <w:r>
-        <w:t xml:space="preserve"> </w:t>
-      </w:r>
-      <w:r>
-        <w:t xml:space="preserve">the common task in this field is to translate music parts, generally specific instruments, into a symbolic representation, like tablatures or music scores, for example. One of the first contributions to this field is seen in</w:t>
+        <w:t xml:space="preserve">Representações não canonicas também possuem importante papel nas tarefas relacionadas à transcrição musical com o uso e redes neurais onde busca-se traduzir a música em representações de nível mais alto, simbólicas, como tablaturas e partituras, por exemplo. Uma das primeiras contribuições nesse sentido pode ser vista em</w:t>
       </w:r>
       <w:r>
         <w:t xml:space="preserve"> </w:t>
@@ -1354,7 +1546,7 @@
         <w:t xml:space="preserve"> </w:t>
       </w:r>
       <w:r>
-        <w:t xml:space="preserve">via the coupling of a network and a local heuristic hill-climber applied over the results, to generate tablatures from music.</w:t>
+        <w:t xml:space="preserve">por meio de um modelo que combina redes neurais e uma heurística hill-climber.</w:t>
       </w:r>
     </w:p>
     <w:p>
@@ -1362,7 +1554,7 @@
         <w:pStyle w:val="BodyText"/>
       </w:pPr>
       <w:r>
-        <w:t xml:space="preserve">With the use of a recurrent net,</w:t>
+        <w:t xml:space="preserve">Com o uso de uma rede recorrente,</w:t>
       </w:r>
       <w:r>
         <w:t xml:space="preserve"> </w:t>
@@ -1374,7 +1566,7 @@
         <w:t xml:space="preserve"> </w:t>
       </w:r>
       <w:r>
-        <w:t xml:space="preserve">transcribes spectrograms of general musical parts into piano roll midi commands, while</w:t>
+        <w:t xml:space="preserve">transcreve, a partir de espectrogramas, diferentes partes musicais em comandos midi. Na mesma linha</w:t>
       </w:r>
       <w:r>
         <w:t xml:space="preserve"> </w:t>
@@ -1386,16 +1578,16 @@
         <w:t xml:space="preserve"> </w:t>
       </w:r>
       <w:r>
-        <w:t xml:space="preserve">offers a similar approach, restricted to polyphonic piano sound, as in the case of</w:t>
-      </w:r>
-      <w:r>
-        <w:t xml:space="preserve"> </w:t>
+        <w:t xml:space="preserve">e</w:t>
       </w:r>
       <w:r>
         <w:t xml:space="preserve">(Sigtia, Benetos, and Dixon 2016)</w:t>
       </w:r>
       <w:r>
-        <w:t xml:space="preserve">. The last work, however, uses different architectures for the acoustic, a simple network and the language, a recurrent network model. With the use of a bidirectional recurrent net fed with spectral representations,</w:t>
+        <w:t xml:space="preserve"> </w:t>
+      </w:r>
+      <w:r>
+        <w:t xml:space="preserve">introduzem trabalhos focados na transcrição de sons polifônicos produzidos por pianos. Em relação á transcrição de partes de um kit de bateria,</w:t>
       </w:r>
       <w:r>
         <w:t xml:space="preserve"> </w:t>
@@ -1404,39 +1596,10 @@
         <w:t xml:space="preserve">(Southall, Stables, and Hockman 2016)</w:t>
       </w:r>
       <w:r>
-        <w:t xml:space="preserve">, creates drum representations.</w:t>
-      </w:r>
-    </w:p>
-    <w:p>
-      <w:pPr>
-        <w:pStyle w:val="BodyText"/>
-      </w:pPr>
-      <w:r>
-        <w:t xml:space="preserve">Generation</w:t>
-      </w:r>
-      <w:r>
-        <w:t xml:space="preserve"> </w:t>
-      </w:r>
-      <w:r>
-        <w:t xml:space="preserve">Here the aim is the inverse of that in the music transcription: given a representation, audio output is generated. One of the first works in the field is seen in</w:t>
-      </w:r>
-      <w:r>
-        <w:t xml:space="preserve">(Stanley 2007)</w:t>
-      </w:r>
-      <w:r>
-        <w:t xml:space="preserve">, consisting of a compositional pattern producing network generating music on the fly based on user input.</w:t>
-      </w:r>
-      <w:r>
-        <w:t xml:space="preserve"> </w:t>
-      </w:r>
-      <w:r>
-        <w:t xml:space="preserve">(Hutchings 2017)</w:t>
-      </w:r>
-      <w:r>
-        <w:t xml:space="preserve"> </w:t>
-      </w:r>
-      <w:r>
-        <w:t xml:space="preserve">generates full drum parts based on a kick drum pattern, with a recurrent net, and investigates the quality of the results via an online survey.</w:t>
+        <w:t xml:space="preserve"> </w:t>
+      </w:r>
+      <w:r>
+        <w:t xml:space="preserve">aborda a tarefa a partir de uma arquitetura recorrente alimentada com representações espectrais.</w:t>
       </w:r>
     </w:p>
     <w:p>
@@ -1454,7 +1617,16 @@
         <w:pStyle w:val="FirstParagraph"/>
       </w:pPr>
       <w:r>
-        <w:t xml:space="preserve">Poucos trabalhos investigam a utilização de redes neurais para a síntese sonora direta. Não obstante, algumas das áreas correlatas são bastante exploradas, e podem oferecer insights interessantes.</w:t>
+        <w:t xml:space="preserve">Um dos trabalho mais notáveis, desenvolvido pela equipe de machine learning do Google, é a chamada (Wavenet)[https://deepmind.com/blog/wavenet-generative-model-raw-audio/]</w:t>
+      </w:r>
+      <w:r>
+        <w:t xml:space="preserve"> </w:t>
+      </w:r>
+      <w:r>
+        <w:t xml:space="preserve">(Van Den Oord et al. 2016)</w:t>
+      </w:r>
+      <w:r>
+        <w:t xml:space="preserve">, uma arquitetura baseada em camadas convolucionais, para a geração end-to-end de discurso. A geração dá-se sample a sample, levando em conta um grande número de inputs passados; os resultados introduzem um novo estado da arte para a tarefa.</w:t>
       </w:r>
     </w:p>
     <w:p>
@@ -1521,7 +1693,7 @@
         <w:pStyle w:val="BodyText"/>
       </w:pPr>
       <w:r>
-        <w:t xml:space="preserve">A partir de uma arquitetura hibrica, combinando um modelo fonético recorrente com um classificador acústico baseado em uma rede neural profunda,</w:t>
+        <w:t xml:space="preserve">A partir de uma arquitetura hibrida, combinando um modelo fonético recorrente com um classificador acústico baseado em uma rede neural profunda,</w:t>
       </w:r>
       <w:r>
         <w:t xml:space="preserve"> </w:t>
@@ -1756,7 +1928,7 @@
         <w:t xml:space="preserve">(Engel et al. 2017)</w:t>
       </w:r>
       <w:r>
-        <w:t xml:space="preserve">, por exemplo, busca inspiração na área de geração de imagens para elaborar uma arquitetura apropriada a síntese sonora.</w:t>
+        <w:t xml:space="preserve">, citado acima, por exemplo, busca inspiração na área de geração de imagens para elaborar uma arquitetura apropriada a síntese sonora.</w:t>
       </w:r>
       <w:r>
         <w:t xml:space="preserve"> </w:t>
@@ -16617,7 +16789,7 @@
       </w:r>
       <w:bookmarkEnd w:id="90"/>
     </w:p>
-    <w:bookmarkStart w:id="175" w:name="refs"/>
+    <w:bookmarkStart w:id="185" w:name="refs"/>
     <w:bookmarkStart w:id="91" w:name="ref-balle2016end"/>
     <w:p>
       <w:pPr>
@@ -16756,7 +16928,29 @@
       </w:r>
     </w:p>
     <w:bookmarkEnd w:id="96"/>
-    <w:bookmarkStart w:id="97" w:name="ref-bock2012polyphonic"/>
+    <w:bookmarkStart w:id="97" w:name="ref-bovermann2016musical"/>
+    <w:p>
+      <w:pPr>
+        <w:pStyle w:val="Bibliography"/>
+      </w:pPr>
+      <w:r>
+        <w:t xml:space="preserve">Bovermann, Till, Alberto de Campo, Hauke Egermann, Sarah-Indriyati Hardjowirogo, and Stefan Weinzierl. 2016.</w:t>
+      </w:r>
+      <w:r>
+        <w:t xml:space="preserve"> </w:t>
+      </w:r>
+      <w:r>
+        <w:rPr>
+          <w:i/>
+        </w:rPr>
+        <w:t xml:space="preserve">Musical Instruments in the 21st Century</w:t>
+      </w:r>
+      <w:r>
+        <w:t xml:space="preserve">. Springer.</w:t>
+      </w:r>
+    </w:p>
+    <w:bookmarkEnd w:id="97"/>
+    <w:bookmarkStart w:id="98" w:name="ref-bock2012polyphonic"/>
     <w:p>
       <w:pPr>
         <w:pStyle w:val="Bibliography"/>
@@ -16777,8 +16971,8 @@
         <w:t xml:space="preserve">, 121–24. IEEE.</w:t>
       </w:r>
     </w:p>
-    <w:bookmarkEnd w:id="97"/>
-    <w:bookmarkStart w:id="98" w:name="ref-choi2016automatic"/>
+    <w:bookmarkEnd w:id="98"/>
+    <w:bookmarkStart w:id="99" w:name="ref-choi2016automatic"/>
     <w:p>
       <w:pPr>
         <w:pStyle w:val="Bibliography"/>
@@ -16799,8 +16993,8 @@
         <w:t xml:space="preserve">.</w:t>
       </w:r>
     </w:p>
-    <w:bookmarkEnd w:id="98"/>
-    <w:bookmarkStart w:id="99" w:name="ref-choi2017convolutional"/>
+    <w:bookmarkEnd w:id="99"/>
+    <w:bookmarkStart w:id="100" w:name="ref-choi2017convolutional"/>
     <w:p>
       <w:pPr>
         <w:pStyle w:val="Bibliography"/>
@@ -16821,8 +17015,8 @@
         <w:t xml:space="preserve">, 2392–6. IEEE.</w:t>
       </w:r>
     </w:p>
-    <w:bookmarkEnd w:id="99"/>
-    <w:bookmarkStart w:id="100" w:name="ref-costa2017evaluation"/>
+    <w:bookmarkEnd w:id="100"/>
+    <w:bookmarkStart w:id="101" w:name="ref-costa2017evaluation"/>
     <w:p>
       <w:pPr>
         <w:pStyle w:val="Bibliography"/>
@@ -16846,8 +17040,18 @@
         <w:t xml:space="preserve">52. Elsevier: 28–38.</w:t>
       </w:r>
     </w:p>
-    <w:bookmarkEnd w:id="100"/>
-    <w:bookmarkStart w:id="101" w:name="ref-elman1990finding"/>
+    <w:bookmarkEnd w:id="101"/>
+    <w:bookmarkStart w:id="102" w:name="ref-dalgleish2014blurring"/>
+    <w:p>
+      <w:pPr>
+        <w:pStyle w:val="Bibliography"/>
+      </w:pPr>
+      <w:r>
+        <w:t xml:space="preserve">Dalgleish, Mathew, Steve Spencer, and Chris Foster. 2014. “BLURRING the Lines: AN Integrated Compositional Model for Digital Musical Instrument Design.” In. Proceedings of the 9th Conference on Interdisciplinary Musicology. CIM14. Berlin, Germany.</w:t>
+      </w:r>
+    </w:p>
+    <w:bookmarkEnd w:id="102"/>
+    <w:bookmarkStart w:id="103" w:name="ref-elman1990finding"/>
     <w:p>
       <w:pPr>
         <w:pStyle w:val="Bibliography"/>
@@ -16871,8 +17075,8 @@
         <w:t xml:space="preserve">14 (2). Wiley Online Library: 179–211.</w:t>
       </w:r>
     </w:p>
-    <w:bookmarkEnd w:id="101"/>
-    <w:bookmarkStart w:id="102" w:name="ref-engel2017neural"/>
+    <w:bookmarkEnd w:id="103"/>
+    <w:bookmarkStart w:id="104" w:name="ref-engel2017neural"/>
     <w:p>
       <w:pPr>
         <w:pStyle w:val="Bibliography"/>
@@ -16893,8 +17097,33 @@
         <w:t xml:space="preserve">.</w:t>
       </w:r>
     </w:p>
-    <w:bookmarkEnd w:id="102"/>
-    <w:bookmarkStart w:id="103" w:name="ref-frans2017outline"/>
+    <w:bookmarkEnd w:id="104"/>
+    <w:bookmarkStart w:id="105" w:name="ref-forgeard2008practicing"/>
+    <w:p>
+      <w:pPr>
+        <w:pStyle w:val="Bibliography"/>
+      </w:pPr>
+      <w:r>
+        <w:t xml:space="preserve">Forgeard, Marie, Ellen Winner, Andrea Norton, and Gottfried Schlaug. 2008. “Practicing a Musical Instrument in Childhood Is Associated with Enhanced Verbal Ability and Nonverbal Reasoning.”</w:t>
+      </w:r>
+      <w:r>
+        <w:t xml:space="preserve"> </w:t>
+      </w:r>
+      <w:r>
+        <w:rPr>
+          <w:i/>
+        </w:rPr>
+        <w:t xml:space="preserve">PloS One</w:t>
+      </w:r>
+      <w:r>
+        <w:t xml:space="preserve"> </w:t>
+      </w:r>
+      <w:r>
+        <w:t xml:space="preserve">3 (10). Public Library of Science: e3566.</w:t>
+      </w:r>
+    </w:p>
+    <w:bookmarkEnd w:id="105"/>
+    <w:bookmarkStart w:id="106" w:name="ref-frans2017outline"/>
     <w:p>
       <w:pPr>
         <w:pStyle w:val="Bibliography"/>
@@ -16915,8 +17144,8 @@
         <w:t xml:space="preserve">.</w:t>
       </w:r>
     </w:p>
-    <w:bookmarkEnd w:id="103"/>
-    <w:bookmarkStart w:id="104" w:name="ref-gatys2016image"/>
+    <w:bookmarkEnd w:id="106"/>
+    <w:bookmarkStart w:id="107" w:name="ref-gatys2016image"/>
     <w:p>
       <w:pPr>
         <w:pStyle w:val="Bibliography"/>
@@ -16937,8 +17166,8 @@
         <w:t xml:space="preserve">, 2414–23.</w:t>
       </w:r>
     </w:p>
-    <w:bookmarkEnd w:id="104"/>
-    <w:bookmarkStart w:id="105" w:name="ref-goldberg2016primer"/>
+    <w:bookmarkEnd w:id="107"/>
+    <w:bookmarkStart w:id="108" w:name="ref-goldberg2016primer"/>
     <w:p>
       <w:pPr>
         <w:pStyle w:val="Bibliography"/>
@@ -16962,8 +17191,8 @@
         <w:t xml:space="preserve">57: 345–420.</w:t>
       </w:r>
     </w:p>
-    <w:bookmarkEnd w:id="105"/>
-    <w:bookmarkStart w:id="107" w:name="ref-cnnmoney"/>
+    <w:bookmarkEnd w:id="108"/>
+    <w:bookmarkStart w:id="110" w:name="ref-cnnmoney"/>
     <w:p>
       <w:pPr>
         <w:pStyle w:val="Bibliography"/>
@@ -16986,7 +17215,7 @@
       <w:r>
         <w:t xml:space="preserve"> </w:t>
       </w:r>
-      <w:hyperlink r:id="rId106">
+      <w:hyperlink r:id="rId109">
         <w:r>
           <w:rPr>
             <w:rStyle w:val="Hyperlink"/>
@@ -16998,8 +17227,8 @@
         <w:t xml:space="preserve">.</w:t>
       </w:r>
     </w:p>
-    <w:bookmarkEnd w:id="107"/>
-    <w:bookmarkStart w:id="108" w:name="ref-gracia2016wave"/>
+    <w:bookmarkEnd w:id="110"/>
+    <w:bookmarkStart w:id="111" w:name="ref-gracia2016wave"/>
     <w:p>
       <w:pPr>
         <w:pStyle w:val="Bibliography"/>
@@ -17020,8 +17249,8 @@
         <w:t xml:space="preserve">.</w:t>
       </w:r>
     </w:p>
-    <w:bookmarkEnd w:id="108"/>
-    <w:bookmarkStart w:id="109" w:name="ref-graves2013speech"/>
+    <w:bookmarkEnd w:id="111"/>
+    <w:bookmarkStart w:id="112" w:name="ref-graves2013speech"/>
     <w:p>
       <w:pPr>
         <w:pStyle w:val="Bibliography"/>
@@ -17042,8 +17271,8 @@
         <w:t xml:space="preserve">, 6645–9. IEEE.</w:t>
       </w:r>
     </w:p>
-    <w:bookmarkEnd w:id="109"/>
-    <w:bookmarkStart w:id="110" w:name="ref-gregor2016towards"/>
+    <w:bookmarkEnd w:id="112"/>
+    <w:bookmarkStart w:id="113" w:name="ref-gregor2016towards"/>
     <w:p>
       <w:pPr>
         <w:pStyle w:val="Bibliography"/>
@@ -17064,8 +17293,30 @@
         <w:t xml:space="preserve">, 3549–57.</w:t>
       </w:r>
     </w:p>
-    <w:bookmarkEnd w:id="110"/>
-    <w:bookmarkStart w:id="111" w:name="ref-hagan1996neural"/>
+    <w:bookmarkEnd w:id="113"/>
+    <w:bookmarkStart w:id="114" w:name="ref-grinstein2017audio"/>
+    <w:p>
+      <w:pPr>
+        <w:pStyle w:val="Bibliography"/>
+      </w:pPr>
+      <w:r>
+        <w:t xml:space="preserve">Grinstein, Eric, Ngoc Duong, Alexey Ozerov, and Patrick Perez. 2017. “Audio Style Transfer.”</w:t>
+      </w:r>
+      <w:r>
+        <w:t xml:space="preserve"> </w:t>
+      </w:r>
+      <w:r>
+        <w:rPr>
+          <w:i/>
+        </w:rPr>
+        <w:t xml:space="preserve">arXiv Preprint arXiv:1710.11385</w:t>
+      </w:r>
+      <w:r>
+        <w:t xml:space="preserve">.</w:t>
+      </w:r>
+    </w:p>
+    <w:bookmarkEnd w:id="114"/>
+    <w:bookmarkStart w:id="115" w:name="ref-hagan1996neural"/>
     <w:p>
       <w:pPr>
         <w:pStyle w:val="Bibliography"/>
@@ -17086,8 +17337,8 @@
         <w:t xml:space="preserve">. Vol. 20. Pws Pub. Boston.</w:t>
       </w:r>
     </w:p>
-    <w:bookmarkEnd w:id="111"/>
-    <w:bookmarkStart w:id="112" w:name="ref-he2015multimodal"/>
+    <w:bookmarkEnd w:id="115"/>
+    <w:bookmarkStart w:id="116" w:name="ref-he2015multimodal"/>
     <w:p>
       <w:pPr>
         <w:pStyle w:val="Bibliography"/>
@@ -17108,8 +17359,8 @@
         <w:t xml:space="preserve">, 73–80. ACM.</w:t>
       </w:r>
     </w:p>
-    <w:bookmarkEnd w:id="112"/>
-    <w:bookmarkStart w:id="113" w:name="ref-hinton2012deep"/>
+    <w:bookmarkEnd w:id="116"/>
+    <w:bookmarkStart w:id="117" w:name="ref-hinton2012deep"/>
     <w:p>
       <w:pPr>
         <w:pStyle w:val="Bibliography"/>
@@ -17133,8 +17384,8 @@
         <w:t xml:space="preserve">29 (6). IEEE: 82–97.</w:t>
       </w:r>
     </w:p>
-    <w:bookmarkEnd w:id="113"/>
-    <w:bookmarkStart w:id="114" w:name="ref-hornik91"/>
+    <w:bookmarkEnd w:id="117"/>
+    <w:bookmarkStart w:id="118" w:name="ref-hornik91"/>
     <w:p>
       <w:pPr>
         <w:pStyle w:val="Bibliography"/>
@@ -17158,8 +17409,8 @@
         <w:t xml:space="preserve">4 (2). Elsevier: 251–57.</w:t>
       </w:r>
     </w:p>
-    <w:bookmarkEnd w:id="114"/>
-    <w:bookmarkStart w:id="115" w:name="ref-hornik89"/>
+    <w:bookmarkEnd w:id="118"/>
+    <w:bookmarkStart w:id="119" w:name="ref-hornik89"/>
     <w:p>
       <w:pPr>
         <w:pStyle w:val="Bibliography"/>
@@ -17183,8 +17434,8 @@
         <w:t xml:space="preserve">2 (5). Elsevier: 359–66.</w:t>
       </w:r>
     </w:p>
-    <w:bookmarkEnd w:id="115"/>
-    <w:bookmarkStart w:id="116" w:name="ref-hutchings2017talking"/>
+    <w:bookmarkEnd w:id="119"/>
+    <w:bookmarkStart w:id="120" w:name="ref-hutchings2017talking"/>
     <w:p>
       <w:pPr>
         <w:pStyle w:val="Bibliography"/>
@@ -17205,8 +17456,8 @@
         <w:t xml:space="preserve">.</w:t>
       </w:r>
     </w:p>
-    <w:bookmarkEnd w:id="116"/>
-    <w:bookmarkStart w:id="117" w:name="ref-hwangimage"/>
+    <w:bookmarkEnd w:id="120"/>
+    <w:bookmarkStart w:id="121" w:name="ref-hwangimage"/>
     <w:p>
       <w:pPr>
         <w:pStyle w:val="Bibliography"/>
@@ -17215,8 +17466,8 @@
         <w:t xml:space="preserve">Hwang, Jeff, and You Zhou. 2016. “Image Colorization with Deep Convolutional Neural Networks.”</w:t>
       </w:r>
     </w:p>
-    <w:bookmarkEnd w:id="117"/>
-    <w:bookmarkStart w:id="118" w:name="ref-iizuka2016let"/>
+    <w:bookmarkEnd w:id="121"/>
+    <w:bookmarkStart w:id="122" w:name="ref-iizuka2016let"/>
     <w:p>
       <w:pPr>
         <w:pStyle w:val="Bibliography"/>
@@ -17240,8 +17491,8 @@
         <w:t xml:space="preserve">35 (4). ACM: 110.</w:t>
       </w:r>
     </w:p>
-    <w:bookmarkEnd w:id="118"/>
-    <w:bookmarkStart w:id="119" w:name="ref-isola2016image"/>
+    <w:bookmarkEnd w:id="122"/>
+    <w:bookmarkStart w:id="123" w:name="ref-isola2016image"/>
     <w:p>
       <w:pPr>
         <w:pStyle w:val="Bibliography"/>
@@ -17262,8 +17513,8 @@
         <w:t xml:space="preserve">.</w:t>
       </w:r>
     </w:p>
-    <w:bookmarkEnd w:id="119"/>
-    <w:bookmarkStart w:id="120" w:name="ref-jiang1999image"/>
+    <w:bookmarkEnd w:id="123"/>
+    <w:bookmarkStart w:id="124" w:name="ref-jiang1999image"/>
     <w:p>
       <w:pPr>
         <w:pStyle w:val="Bibliography"/>
@@ -17287,8 +17538,8 @@
         <w:t xml:space="preserve">14 (9). Elsevier: 737–60.</w:t>
       </w:r>
     </w:p>
-    <w:bookmarkEnd w:id="120"/>
-    <w:bookmarkStart w:id="121" w:name="ref-johnston2017improved"/>
+    <w:bookmarkEnd w:id="124"/>
+    <w:bookmarkStart w:id="125" w:name="ref-johnston2017improved"/>
     <w:p>
       <w:pPr>
         <w:pStyle w:val="Bibliography"/>
@@ -17309,8 +17560,8 @@
         <w:t xml:space="preserve">.</w:t>
       </w:r>
     </w:p>
-    <w:bookmarkEnd w:id="121"/>
-    <w:bookmarkStart w:id="122" w:name="ref-karjalainen2004digital"/>
+    <w:bookmarkEnd w:id="125"/>
+    <w:bookmarkStart w:id="126" w:name="ref-karjalainen2004digital"/>
     <w:p>
       <w:pPr>
         <w:pStyle w:val="Bibliography"/>
@@ -17334,8 +17585,8 @@
         <w:t xml:space="preserve">2004. Hindawi Publishing Corp.: 978–89.</w:t>
       </w:r>
     </w:p>
-    <w:bookmarkEnd w:id="122"/>
-    <w:bookmarkStart w:id="123" w:name="ref-karpathy2014large"/>
+    <w:bookmarkEnd w:id="126"/>
+    <w:bookmarkStart w:id="127" w:name="ref-karpathy2014large"/>
     <w:p>
       <w:pPr>
         <w:pStyle w:val="Bibliography"/>
@@ -17356,8 +17607,8 @@
         <w:t xml:space="preserve">, 1725–32.</w:t>
       </w:r>
     </w:p>
-    <w:bookmarkEnd w:id="123"/>
-    <w:bookmarkStart w:id="124" w:name="ref-khorrami2016deep"/>
+    <w:bookmarkEnd w:id="127"/>
+    <w:bookmarkStart w:id="128" w:name="ref-khorrami2016deep"/>
     <w:p>
       <w:pPr>
         <w:pStyle w:val="Bibliography"/>
@@ -17378,8 +17629,8 @@
         <w:t xml:space="preserve">, 619–23. IEEE.</w:t>
       </w:r>
     </w:p>
-    <w:bookmarkEnd w:id="124"/>
-    <w:bookmarkStart w:id="125" w:name="ref-kulkarni2015deep"/>
+    <w:bookmarkEnd w:id="128"/>
+    <w:bookmarkStart w:id="129" w:name="ref-kulkarni2015deep"/>
     <w:p>
       <w:pPr>
         <w:pStyle w:val="Bibliography"/>
@@ -17400,8 +17651,8 @@
         <w:t xml:space="preserve">, 2539–47.</w:t>
       </w:r>
     </w:p>
-    <w:bookmarkEnd w:id="125"/>
-    <w:bookmarkStart w:id="126" w:name="ref-larsson2016learning"/>
+    <w:bookmarkEnd w:id="129"/>
+    <w:bookmarkStart w:id="130" w:name="ref-larsson2016learning"/>
     <w:p>
       <w:pPr>
         <w:pStyle w:val="Bibliography"/>
@@ -17422,8 +17673,8 @@
         <w:t xml:space="preserve">, 577–93. Springer.</w:t>
       </w:r>
     </w:p>
-    <w:bookmarkEnd w:id="126"/>
-    <w:bookmarkStart w:id="127" w:name="ref-lecun1998gradient"/>
+    <w:bookmarkEnd w:id="130"/>
+    <w:bookmarkStart w:id="131" w:name="ref-lecun1998gradient"/>
     <w:p>
       <w:pPr>
         <w:pStyle w:val="Bibliography"/>
@@ -17447,8 +17698,8 @@
         <w:t xml:space="preserve">86 (11). IEEE: 2278–2324.</w:t>
       </w:r>
     </w:p>
-    <w:bookmarkEnd w:id="127"/>
-    <w:bookmarkStart w:id="128" w:name="ref-leshno93"/>
+    <w:bookmarkEnd w:id="131"/>
+    <w:bookmarkStart w:id="132" w:name="ref-leshno93"/>
     <w:p>
       <w:pPr>
         <w:pStyle w:val="Bibliography"/>
@@ -17472,8 +17723,8 @@
         <w:t xml:space="preserve">6 (6). Elsevier: 861–67.</w:t>
       </w:r>
     </w:p>
-    <w:bookmarkEnd w:id="128"/>
-    <w:bookmarkStart w:id="129" w:name="ref-lyons2011understanding"/>
+    <w:bookmarkEnd w:id="132"/>
+    <w:bookmarkStart w:id="133" w:name="ref-lyons2011understanding"/>
     <w:p>
       <w:pPr>
         <w:pStyle w:val="Bibliography"/>
@@ -17494,8 +17745,8 @@
         <w:t xml:space="preserve">. Pearson Education India.</w:t>
       </w:r>
     </w:p>
-    <w:bookmarkEnd w:id="129"/>
-    <w:bookmarkStart w:id="130" w:name="ref-maas2013rectifier"/>
+    <w:bookmarkEnd w:id="133"/>
+    <w:bookmarkStart w:id="134" w:name="ref-maas2013rectifier"/>
     <w:p>
       <w:pPr>
         <w:pStyle w:val="Bibliography"/>
@@ -17516,8 +17767,8 @@
         <w:t xml:space="preserve">. Vol. 30. 1.</w:t>
       </w:r>
     </w:p>
-    <w:bookmarkEnd w:id="130"/>
-    <w:bookmarkStart w:id="131" w:name="ref-mcculloch1943logical"/>
+    <w:bookmarkEnd w:id="134"/>
+    <w:bookmarkStart w:id="135" w:name="ref-mcculloch1943logical"/>
     <w:p>
       <w:pPr>
         <w:pStyle w:val="Bibliography"/>
@@ -17541,8 +17792,8 @@
         <w:t xml:space="preserve">5 (4). Springer: 115–33.</w:t>
       </w:r>
     </w:p>
-    <w:bookmarkEnd w:id="131"/>
-    <w:bookmarkStart w:id="132" w:name="ref-minski1969perceptrons"/>
+    <w:bookmarkEnd w:id="135"/>
+    <w:bookmarkStart w:id="136" w:name="ref-minski1969perceptrons"/>
     <w:p>
       <w:pPr>
         <w:pStyle w:val="Bibliography"/>
@@ -17563,8 +17814,30 @@
         <w:t xml:space="preserve">.</w:t>
       </w:r>
     </w:p>
-    <w:bookmarkEnd w:id="132"/>
-    <w:bookmarkStart w:id="133" w:name="ref-mizutani2000derivation"/>
+    <w:bookmarkEnd w:id="136"/>
+    <w:bookmarkStart w:id="137" w:name="ref-mital2017time"/>
+    <w:p>
+      <w:pPr>
+        <w:pStyle w:val="Bibliography"/>
+      </w:pPr>
+      <w:r>
+        <w:t xml:space="preserve">Mital, Parag K. 2017. “Time Domain Neural Audio Style Transfer.”</w:t>
+      </w:r>
+      <w:r>
+        <w:t xml:space="preserve"> </w:t>
+      </w:r>
+      <w:r>
+        <w:rPr>
+          <w:i/>
+        </w:rPr>
+        <w:t xml:space="preserve">arXiv Preprint arXiv:1711.11160</w:t>
+      </w:r>
+      <w:r>
+        <w:t xml:space="preserve">.</w:t>
+      </w:r>
+    </w:p>
+    <w:bookmarkEnd w:id="137"/>
+    <w:bookmarkStart w:id="138" w:name="ref-mizutani2000derivation"/>
     <w:p>
       <w:pPr>
         <w:pStyle w:val="Bibliography"/>
@@ -17585,8 +17858,8 @@
         <w:t xml:space="preserve">, 2:167–72. IEEE.</w:t>
       </w:r>
     </w:p>
-    <w:bookmarkEnd w:id="133"/>
-    <w:bookmarkStart w:id="134" w:name="ref-oord2016pixel"/>
+    <w:bookmarkEnd w:id="138"/>
+    <w:bookmarkStart w:id="139" w:name="ref-oord2016pixel"/>
     <w:p>
       <w:pPr>
         <w:pStyle w:val="Bibliography"/>
@@ -17607,8 +17880,8 @@
         <w:t xml:space="preserve">.</w:t>
       </w:r>
     </w:p>
-    <w:bookmarkEnd w:id="134"/>
-    <w:bookmarkStart w:id="135" w:name="ref-pang2017convolution"/>
+    <w:bookmarkEnd w:id="139"/>
+    <w:bookmarkStart w:id="140" w:name="ref-pang2017convolution"/>
     <w:p>
       <w:pPr>
         <w:pStyle w:val="Bibliography"/>
@@ -17629,8 +17902,8 @@
         <w:t xml:space="preserve">. IEEE.</w:t>
       </w:r>
     </w:p>
-    <w:bookmarkEnd w:id="135"/>
-    <w:bookmarkStart w:id="136" w:name="ref-parker1985learning"/>
+    <w:bookmarkEnd w:id="140"/>
+    <w:bookmarkStart w:id="141" w:name="ref-parker1985learning"/>
     <w:p>
       <w:pPr>
         <w:pStyle w:val="Bibliography"/>
@@ -17639,8 +17912,18 @@
         <w:t xml:space="preserve">Parker, David B. 1985. “Learning Logic.”</w:t>
       </w:r>
     </w:p>
-    <w:bookmarkEnd w:id="136"/>
-    <w:bookmarkStart w:id="137" w:name="ref-rehman2014image"/>
+    <w:bookmarkEnd w:id="141"/>
+    <w:bookmarkStart w:id="142" w:name="ref-pfalz2018generating"/>
+    <w:p>
+      <w:pPr>
+        <w:pStyle w:val="Bibliography"/>
+      </w:pPr>
+      <w:r>
+        <w:t xml:space="preserve">Pfalz, Andrew. 2018. “Generating Audio Using Recurrent Neural Networks.”</w:t>
+      </w:r>
+    </w:p>
+    <w:bookmarkEnd w:id="142"/>
+    <w:bookmarkStart w:id="143" w:name="ref-rehman2014image"/>
     <w:p>
       <w:pPr>
         <w:pStyle w:val="Bibliography"/>
@@ -17664,8 +17947,33 @@
         <w:t xml:space="preserve">7 (4). Maxwell Science Publishing: 656–72.</w:t>
       </w:r>
     </w:p>
-    <w:bookmarkEnd w:id="137"/>
-    <w:bookmarkStart w:id="138" w:name="ref-rigaud2013parametric"/>
+    <w:bookmarkEnd w:id="143"/>
+    <w:bookmarkStart w:id="144" w:name="ref-reiffenstein2006codification"/>
+    <w:p>
+      <w:pPr>
+        <w:pStyle w:val="Bibliography"/>
+      </w:pPr>
+      <w:r>
+        <w:t xml:space="preserve">Reiffenstein, Tim. 2006. “Codification, Patents and the Geography of Knowledge Transfer in the Electronic Musical Instrument Industry.”</w:t>
+      </w:r>
+      <w:r>
+        <w:t xml:space="preserve"> </w:t>
+      </w:r>
+      <w:r>
+        <w:rPr>
+          <w:i/>
+        </w:rPr>
+        <w:t xml:space="preserve">The Canadian Geographer/Le Géographe Canadien</w:t>
+      </w:r>
+      <w:r>
+        <w:t xml:space="preserve"> </w:t>
+      </w:r>
+      <w:r>
+        <w:t xml:space="preserve">50 (3). Wiley Online Library: 298–318.</w:t>
+      </w:r>
+    </w:p>
+    <w:bookmarkEnd w:id="144"/>
+    <w:bookmarkStart w:id="145" w:name="ref-rigaud2013parametric"/>
     <w:p>
       <w:pPr>
         <w:pStyle w:val="Bibliography"/>
@@ -17689,8 +17997,8 @@
         <w:t xml:space="preserve">133 (5). ASA: 3107–18.</w:t>
       </w:r>
     </w:p>
-    <w:bookmarkEnd w:id="138"/>
-    <w:bookmarkStart w:id="139" w:name="ref-Rosenblatt57"/>
+    <w:bookmarkEnd w:id="145"/>
+    <w:bookmarkStart w:id="146" w:name="ref-Rosenblatt57"/>
     <w:p>
       <w:pPr>
         <w:pStyle w:val="Bibliography"/>
@@ -17711,8 +18019,8 @@
         <w:t xml:space="preserve">. Cornell Aeronautical Laboratory.</w:t>
       </w:r>
     </w:p>
-    <w:bookmarkEnd w:id="139"/>
-    <w:bookmarkStart w:id="140" w:name="ref-rosenblatt1958perceptron"/>
+    <w:bookmarkEnd w:id="146"/>
+    <w:bookmarkStart w:id="147" w:name="ref-rosenblatt1958perceptron"/>
     <w:p>
       <w:pPr>
         <w:pStyle w:val="Bibliography"/>
@@ -17736,8 +18044,8 @@
         <w:t xml:space="preserve">65 (6). American Psychological Association: 386.</w:t>
       </w:r>
     </w:p>
-    <w:bookmarkEnd w:id="140"/>
-    <w:bookmarkStart w:id="141" w:name="ref-rumelhart1985learning"/>
+    <w:bookmarkEnd w:id="147"/>
+    <w:bookmarkStart w:id="148" w:name="ref-rumelhart1985learning"/>
     <w:p>
       <w:pPr>
         <w:pStyle w:val="Bibliography"/>
@@ -17746,8 +18054,8 @@
         <w:t xml:space="preserve">Rumelhart, David E, Geoffrey E Hinton, and Ronald J Williams. 1985. “Learning Internal Representations by Error Propagation.” California Univ San Diego La Jolla Inst for Cognitive Science.</w:t>
       </w:r>
     </w:p>
-    <w:bookmarkEnd w:id="141"/>
-    <w:bookmarkStart w:id="142" w:name="ref-sainath2015deep"/>
+    <w:bookmarkEnd w:id="148"/>
+    <w:bookmarkStart w:id="149" w:name="ref-sainath2015deep"/>
     <w:p>
       <w:pPr>
         <w:pStyle w:val="Bibliography"/>
@@ -17771,8 +18079,8 @@
         <w:t xml:space="preserve">64. Elsevier: 39–48.</w:t>
       </w:r>
     </w:p>
-    <w:bookmarkEnd w:id="142"/>
-    <w:bookmarkStart w:id="143" w:name="ref-sak2015fast"/>
+    <w:bookmarkEnd w:id="149"/>
+    <w:bookmarkStart w:id="150" w:name="ref-sak2015fast"/>
     <w:p>
       <w:pPr>
         <w:pStyle w:val="Bibliography"/>
@@ -17793,8 +18101,8 @@
         <w:t xml:space="preserve">.</w:t>
       </w:r>
     </w:p>
-    <w:bookmarkEnd w:id="143"/>
-    <w:bookmarkStart w:id="144" w:name="ref-salsa2016partial"/>
+    <w:bookmarkEnd w:id="150"/>
+    <w:bookmarkStart w:id="151" w:name="ref-salsa2016partial"/>
     <w:p>
       <w:pPr>
         <w:pStyle w:val="Bibliography"/>
@@ -17815,8 +18123,8 @@
         <w:t xml:space="preserve">. Vol. 99. Springer.</w:t>
       </w:r>
     </w:p>
-    <w:bookmarkEnd w:id="144"/>
-    <w:bookmarkStart w:id="145" w:name="ref-sangkloy2016scribbler"/>
+    <w:bookmarkEnd w:id="151"/>
+    <w:bookmarkStart w:id="152" w:name="ref-sangkloy2016scribbler"/>
     <w:p>
       <w:pPr>
         <w:pStyle w:val="Bibliography"/>
@@ -17837,8 +18145,8 @@
         <w:t xml:space="preserve">.</w:t>
       </w:r>
     </w:p>
-    <w:bookmarkEnd w:id="145"/>
-    <w:bookmarkStart w:id="146" w:name="ref-santurkar2017generative"/>
+    <w:bookmarkEnd w:id="152"/>
+    <w:bookmarkStart w:id="153" w:name="ref-santurkar2017generative"/>
     <w:p>
       <w:pPr>
         <w:pStyle w:val="Bibliography"/>
@@ -17859,8 +18167,30 @@
         <w:t xml:space="preserve">.</w:t>
       </w:r>
     </w:p>
-    <w:bookmarkEnd w:id="146"/>
-    <w:bookmarkStart w:id="147" w:name="ref-serra2007state"/>
+    <w:bookmarkEnd w:id="153"/>
+    <w:bookmarkStart w:id="154" w:name="ref-sarroff2014musical"/>
+    <w:p>
+      <w:pPr>
+        <w:pStyle w:val="Bibliography"/>
+      </w:pPr>
+      <w:r>
+        <w:t xml:space="preserve">Sarroff, Andy M, and Michael A Casey. 2014. “Musical Audio Synthesis Using Autoencoding Neural Nets.” In</w:t>
+      </w:r>
+      <w:r>
+        <w:t xml:space="preserve"> </w:t>
+      </w:r>
+      <w:r>
+        <w:rPr>
+          <w:i/>
+        </w:rPr>
+        <w:t xml:space="preserve">ICMC</w:t>
+      </w:r>
+      <w:r>
+        <w:t xml:space="preserve">.</w:t>
+      </w:r>
+    </w:p>
+    <w:bookmarkEnd w:id="154"/>
+    <w:bookmarkStart w:id="155" w:name="ref-serra2007state"/>
     <w:p>
       <w:pPr>
         <w:pStyle w:val="Bibliography"/>
@@ -17881,8 +18211,8 @@
         <w:t xml:space="preserve">, 9–12. IEEE.</w:t>
       </w:r>
     </w:p>
-    <w:bookmarkEnd w:id="147"/>
-    <w:bookmarkStart w:id="148" w:name="ref-sigtia2016end"/>
+    <w:bookmarkEnd w:id="155"/>
+    <w:bookmarkStart w:id="156" w:name="ref-sigtia2016end"/>
     <w:p>
       <w:pPr>
         <w:pStyle w:val="Bibliography"/>
@@ -17906,8 +18236,8 @@
         <w:t xml:space="preserve">24 (5). IEEE Press: 927–39.</w:t>
       </w:r>
     </w:p>
-    <w:bookmarkEnd w:id="148"/>
-    <w:bookmarkStart w:id="149" w:name="ref-smith2006basic"/>
+    <w:bookmarkEnd w:id="156"/>
+    <w:bookmarkStart w:id="157" w:name="ref-smith2006basic"/>
     <w:p>
       <w:pPr>
         <w:pStyle w:val="Bibliography"/>
@@ -17928,8 +18258,8 @@
         <w:t xml:space="preserve">.</w:t>
       </w:r>
     </w:p>
-    <w:bookmarkEnd w:id="149"/>
-    <w:bookmarkStart w:id="150" w:name="ref-smith1992physical"/>
+    <w:bookmarkEnd w:id="157"/>
+    <w:bookmarkStart w:id="158" w:name="ref-smith1992physical"/>
     <w:p>
       <w:pPr>
         <w:pStyle w:val="Bibliography"/>
@@ -17953,8 +18283,8 @@
         <w:t xml:space="preserve">16 (4). JSTOR: 74–91.</w:t>
       </w:r>
     </w:p>
-    <w:bookmarkEnd w:id="150"/>
-    <w:bookmarkStart w:id="151" w:name="ref-socher2014recursive"/>
+    <w:bookmarkEnd w:id="158"/>
+    <w:bookmarkStart w:id="159" w:name="ref-socher2014recursive"/>
     <w:p>
       <w:pPr>
         <w:pStyle w:val="Bibliography"/>
@@ -17963,8 +18293,8 @@
         <w:t xml:space="preserve">Socher, Richard. 2014. “Recursive Deep Learning for Natural Language Processing and Computer Vision.” Citeseer.</w:t>
       </w:r>
     </w:p>
-    <w:bookmarkEnd w:id="151"/>
-    <w:bookmarkStart w:id="152" w:name="ref-southall2016automatic"/>
+    <w:bookmarkEnd w:id="159"/>
+    <w:bookmarkStart w:id="160" w:name="ref-southall2016automatic"/>
     <w:p>
       <w:pPr>
         <w:pStyle w:val="Bibliography"/>
@@ -17985,8 +18315,8 @@
         <w:t xml:space="preserve">, 591–97.</w:t>
       </w:r>
     </w:p>
-    <w:bookmarkEnd w:id="152"/>
-    <w:bookmarkStart w:id="153" w:name="ref-stanley2007compositional"/>
+    <w:bookmarkEnd w:id="160"/>
+    <w:bookmarkStart w:id="161" w:name="ref-stanley2007compositional"/>
     <w:p>
       <w:pPr>
         <w:pStyle w:val="Bibliography"/>
@@ -18010,8 +18340,8 @@
         <w:t xml:space="preserve">8 (2). Springer: 131–62.</w:t>
       </w:r>
     </w:p>
-    <w:bookmarkEnd w:id="153"/>
-    <w:bookmarkStart w:id="154" w:name="ref-staudt2016development"/>
+    <w:bookmarkEnd w:id="161"/>
+    <w:bookmarkStart w:id="162" w:name="ref-staudt2016development"/>
     <w:p>
       <w:pPr>
         <w:pStyle w:val="Bibliography"/>
@@ -18020,8 +18350,8 @@
         <w:t xml:space="preserve">Staudt, Pascal. 2016. “Development of a Digital Musical Instrument with Embedded Sound Synthesis.”</w:t>
       </w:r>
     </w:p>
-    <w:bookmarkEnd w:id="154"/>
-    <w:bookmarkStart w:id="155" w:name="ref-theis2015generative"/>
+    <w:bookmarkEnd w:id="162"/>
+    <w:bookmarkStart w:id="163" w:name="ref-theis2015generative"/>
     <w:p>
       <w:pPr>
         <w:pStyle w:val="Bibliography"/>
@@ -18042,8 +18372,8 @@
         <w:t xml:space="preserve">, 1927–35.</w:t>
       </w:r>
     </w:p>
-    <w:bookmarkEnd w:id="155"/>
-    <w:bookmarkStart w:id="156" w:name="ref-theis2017lossy"/>
+    <w:bookmarkEnd w:id="163"/>
+    <w:bookmarkStart w:id="164" w:name="ref-theis2017lossy"/>
     <w:p>
       <w:pPr>
         <w:pStyle w:val="Bibliography"/>
@@ -18064,8 +18394,8 @@
         <w:t xml:space="preserve">.</w:t>
       </w:r>
     </w:p>
-    <w:bookmarkEnd w:id="156"/>
-    <w:bookmarkStart w:id="157" w:name="ref-toderici2015variable"/>
+    <w:bookmarkEnd w:id="164"/>
+    <w:bookmarkStart w:id="165" w:name="ref-toderici2015variable"/>
     <w:p>
       <w:pPr>
         <w:pStyle w:val="Bibliography"/>
@@ -18086,8 +18416,8 @@
         <w:t xml:space="preserve">.</w:t>
       </w:r>
     </w:p>
-    <w:bookmarkEnd w:id="157"/>
-    <w:bookmarkStart w:id="158" w:name="ref-toderici2016full"/>
+    <w:bookmarkEnd w:id="165"/>
+    <w:bookmarkStart w:id="166" w:name="ref-toderici2016full"/>
     <w:p>
       <w:pPr>
         <w:pStyle w:val="Bibliography"/>
@@ -18108,8 +18438,8 @@
         <w:t xml:space="preserve">.</w:t>
       </w:r>
     </w:p>
-    <w:bookmarkEnd w:id="158"/>
-    <w:bookmarkStart w:id="159" w:name="ref-tuohy2006evolved"/>
+    <w:bookmarkEnd w:id="166"/>
+    <w:bookmarkStart w:id="167" w:name="ref-tuohy2006evolved"/>
     <w:p>
       <w:pPr>
         <w:pStyle w:val="Bibliography"/>
@@ -18130,8 +18460,55 @@
         <w:t xml:space="preserve">.</w:t>
       </w:r>
     </w:p>
-    <w:bookmarkEnd w:id="159"/>
-    <w:bookmarkStart w:id="160" w:name="ref-veit2016residual"/>
+    <w:bookmarkEnd w:id="167"/>
+    <w:bookmarkStart w:id="168" w:name="ref-van2016wavenet"/>
+    <w:p>
+      <w:pPr>
+        <w:pStyle w:val="Bibliography"/>
+      </w:pPr>
+      <w:r>
+        <w:t xml:space="preserve">Van Den Oord, Aaron, Sander Dieleman, Heiga Zen, Karen Simonyan, Oriol Vinyals, Alex Graves, Nal Kalchbrenner, Andrew Senior, and Koray Kavukcuoglu. 2016. “Wavenet: A Generative Model for Raw Audio.”</w:t>
+      </w:r>
+      <w:r>
+        <w:t xml:space="preserve"> </w:t>
+      </w:r>
+      <w:r>
+        <w:rPr>
+          <w:i/>
+        </w:rPr>
+        <w:t xml:space="preserve">arXiv Preprint arXiv:1609.03499</w:t>
+      </w:r>
+      <w:r>
+        <w:t xml:space="preserve">.</w:t>
+      </w:r>
+    </w:p>
+    <w:bookmarkEnd w:id="168"/>
+    <w:bookmarkStart w:id="169" w:name="ref-vaughn2000music"/>
+    <w:p>
+      <w:pPr>
+        <w:pStyle w:val="Bibliography"/>
+      </w:pPr>
+      <w:r>
+        <w:t xml:space="preserve">Vaughn, Kathryn. 2000. “Music and Mathematics: Modest Support for the Oft-Claimed Relationship.”</w:t>
+      </w:r>
+      <w:r>
+        <w:t xml:space="preserve"> </w:t>
+      </w:r>
+      <w:r>
+        <w:rPr>
+          <w:i/>
+        </w:rPr>
+        <w:t xml:space="preserve">Journal of Aesthetic Education</w:t>
+      </w:r>
+      <w:r>
+        <w:t xml:space="preserve"> </w:t>
+      </w:r>
+      <w:r>
+        <w:t xml:space="preserve">34 (3/4). JSTOR: 149–66.</w:t>
+      </w:r>
+    </w:p>
+    <w:bookmarkEnd w:id="169"/>
+    <w:bookmarkStart w:id="170" w:name="ref-veit2016residual"/>
     <w:p>
       <w:pPr>
         <w:pStyle w:val="Bibliography"/>
@@ -18152,8 +18529,8 @@
         <w:t xml:space="preserve">, 550–58.</w:t>
       </w:r>
     </w:p>
-    <w:bookmarkEnd w:id="160"/>
-    <w:bookmarkStart w:id="161" w:name="ref-wang2015image"/>
+    <w:bookmarkEnd w:id="170"/>
+    <w:bookmarkStart w:id="171" w:name="ref-wang2015image"/>
     <w:p>
       <w:pPr>
         <w:pStyle w:val="Bibliography"/>
@@ -18177,8 +18554,8 @@
         <w:t xml:space="preserve">13 (1): 137–45.</w:t>
       </w:r>
     </w:p>
-    <w:bookmarkEnd w:id="161"/>
-    <w:bookmarkStart w:id="162" w:name="ref-widrow1960adaptive"/>
+    <w:bookmarkEnd w:id="171"/>
+    <w:bookmarkStart w:id="172" w:name="ref-widrow1960adaptive"/>
     <w:p>
       <w:pPr>
         <w:pStyle w:val="Bibliography"/>
@@ -18187,8 +18564,8 @@
         <w:t xml:space="preserve">Widrow, Bernard, and Marcian E Hoff. 1960. “Adaptive Switching Circuits.” STANFORD UNIV CA STANFORD ELECTRONICS LABS.</w:t>
       </w:r>
     </w:p>
-    <w:bookmarkEnd w:id="162"/>
-    <w:bookmarkStart w:id="163" w:name="ref-widrow199030"/>
+    <w:bookmarkEnd w:id="172"/>
+    <w:bookmarkStart w:id="173" w:name="ref-widrow199030"/>
     <w:p>
       <w:pPr>
         <w:pStyle w:val="Bibliography"/>
@@ -18212,8 +18589,8 @@
         <w:t xml:space="preserve">78 (9). IEEE: 1415–42.</w:t>
       </w:r>
     </w:p>
-    <w:bookmarkEnd w:id="163"/>
-    <w:bookmarkStart w:id="164" w:name="ref-wu2016investigating"/>
+    <w:bookmarkEnd w:id="173"/>
+    <w:bookmarkStart w:id="174" w:name="ref-wu2016investigating"/>
     <w:p>
       <w:pPr>
         <w:pStyle w:val="Bibliography"/>
@@ -18234,8 +18611,8 @@
         <w:t xml:space="preserve">, 5140–4. IEEE.</w:t>
       </w:r>
     </w:p>
-    <w:bookmarkEnd w:id="164"/>
-    <w:bookmarkStart w:id="165" w:name="ref-xu2015ccg"/>
+    <w:bookmarkEnd w:id="174"/>
+    <w:bookmarkStart w:id="175" w:name="ref-xu2015ccg"/>
     <w:p>
       <w:pPr>
         <w:pStyle w:val="Bibliography"/>
@@ -18256,8 +18633,8 @@
         <w:t xml:space="preserve">, 250–55.</w:t>
       </w:r>
     </w:p>
-    <w:bookmarkEnd w:id="165"/>
-    <w:bookmarkStart w:id="166" w:name="ref-yadav2015introduction"/>
+    <w:bookmarkEnd w:id="175"/>
+    <w:bookmarkStart w:id="176" w:name="ref-yadav2015introduction"/>
     <w:p>
       <w:pPr>
         <w:pStyle w:val="Bibliography"/>
@@ -18278,8 +18655,8 @@
         <w:t xml:space="preserve">. Springer.</w:t>
       </w:r>
     </w:p>
-    <w:bookmarkEnd w:id="166"/>
-    <w:bookmarkStart w:id="168" w:name="ref-Yang2017"/>
+    <w:bookmarkEnd w:id="176"/>
+    <w:bookmarkStart w:id="178" w:name="ref-Yang2017"/>
     <w:p>
       <w:pPr>
         <w:pStyle w:val="Bibliography"/>
@@ -18290,7 +18667,7 @@
       <w:r>
         <w:t xml:space="preserve"> </w:t>
       </w:r>
-      <w:hyperlink r:id="rId167">
+      <w:hyperlink r:id="rId177">
         <w:r>
           <w:rPr>
             <w:rStyle w:val="Hyperlink"/>
@@ -18302,8 +18679,8 @@
         <w:t xml:space="preserve">.</w:t>
       </w:r>
     </w:p>
-    <w:bookmarkEnd w:id="168"/>
-    <w:bookmarkStart w:id="169" w:name="ref-zen2015unidirectional"/>
+    <w:bookmarkEnd w:id="178"/>
+    <w:bookmarkStart w:id="179" w:name="ref-zen2015unidirectional"/>
     <w:p>
       <w:pPr>
         <w:pStyle w:val="Bibliography"/>
@@ -18324,8 +18701,8 @@
         <w:t xml:space="preserve">, 4470–4. IEEE.</w:t>
       </w:r>
     </w:p>
-    <w:bookmarkEnd w:id="169"/>
-    <w:bookmarkStart w:id="170" w:name="ref-zhang2016colorful"/>
+    <w:bookmarkEnd w:id="179"/>
+    <w:bookmarkStart w:id="180" w:name="ref-zhang2016colorful"/>
     <w:p>
       <w:pPr>
         <w:pStyle w:val="Bibliography"/>
@@ -18346,8 +18723,8 @@
         <w:t xml:space="preserve">, 649–66. Springer.</w:t>
       </w:r>
     </w:p>
-    <w:bookmarkEnd w:id="170"/>
-    <w:bookmarkStart w:id="171" w:name="ref-zhang2017towards"/>
+    <w:bookmarkEnd w:id="180"/>
+    <w:bookmarkStart w:id="181" w:name="ref-zhang2017towards"/>
     <w:p>
       <w:pPr>
         <w:pStyle w:val="Bibliography"/>
@@ -18368,8 +18745,8 @@
         <w:t xml:space="preserve">.</w:t>
       </w:r>
     </w:p>
-    <w:bookmarkEnd w:id="171"/>
-    <w:bookmarkStart w:id="172" w:name="ref-zhang2017very"/>
+    <w:bookmarkEnd w:id="181"/>
+    <w:bookmarkStart w:id="182" w:name="ref-zhang2017very"/>
     <w:p>
       <w:pPr>
         <w:pStyle w:val="Bibliography"/>
@@ -18390,8 +18767,8 @@
         <w:t xml:space="preserve">, 4845–9. IEEE.</w:t>
       </w:r>
     </w:p>
-    <w:bookmarkEnd w:id="172"/>
-    <w:bookmarkStart w:id="173" w:name="ref-zhu2016generative"/>
+    <w:bookmarkEnd w:id="182"/>
+    <w:bookmarkStart w:id="183" w:name="ref-zhu2016generative"/>
     <w:p>
       <w:pPr>
         <w:pStyle w:val="Bibliography"/>
@@ -18412,8 +18789,8 @@
         <w:t xml:space="preserve">, 597–613. Springer.</w:t>
       </w:r>
     </w:p>
-    <w:bookmarkEnd w:id="173"/>
-    <w:bookmarkStart w:id="174" w:name="ref-zweig2017advances"/>
+    <w:bookmarkEnd w:id="183"/>
+    <w:bookmarkStart w:id="184" w:name="ref-zweig2017advances"/>
     <w:p>
       <w:pPr>
         <w:pStyle w:val="Bibliography"/>
@@ -18434,8 +18811,8 @@
         <w:t xml:space="preserve">, 4805–9. IEEE.</w:t>
       </w:r>
     </w:p>
-    <w:bookmarkEnd w:id="174"/>
-    <w:bookmarkEnd w:id="175"/>
+    <w:bookmarkEnd w:id="184"/>
+    <w:bookmarkEnd w:id="185"/>
     <w:sectPr>
       <w:pgSz w:w="12240" w:h="15840"/>
       <w:pgMar w:top="1440" w:right="1440" w:bottom="1440" w:left="1440" w:header="720" w:footer="720" w:gutter="0"/>

</xml_diff>

<commit_message>
adicionado git relativo ao código
</commit_message>
<xml_diff>
--- a/Dissert.docx
+++ b/Dissert.docx
@@ -3889,6 +3889,23 @@
         </m:r>
       </m:oMath>
       <w:r>
+        <w:t xml:space="preserve">, obtendo a equação para quando</w:t>
+      </w:r>
+      <w:r>
+        <w:t xml:space="preserve"> </w:t>
+      </w:r>
+      <m:oMath>
+        <m:r>
+          <m:t>j</m:t>
+        </m:r>
+        <m:r>
+          <m:t>=</m:t>
+        </m:r>
+        <m:r>
+          <m:t>0</m:t>
+        </m:r>
+      </m:oMath>
+      <w:r>
         <w:t xml:space="preserve">:</w:t>
       </w:r>
     </w:p>
@@ -3914,12 +3931,6 @@
             <m:t>,</m:t>
           </m:r>
           <m:r>
-            <m:t>j</m:t>
-          </m:r>
-          <m:r>
-            <m:t>+</m:t>
-          </m:r>
-          <m:r>
             <m:t>1</m:t>
           </m:r>
           <m:r>
@@ -3941,7 +3952,7 @@
             <m:t>,</m:t>
           </m:r>
           <m:r>
-            <m:t>j</m:t>
+            <m:t>0</m:t>
           </m:r>
           <m:r>
             <m:t>]</m:t>
@@ -3998,7 +4009,7 @@
             <m:t>,</m:t>
           </m:r>
           <m:r>
-            <m:t>j</m:t>
+            <m:t>0</m:t>
           </m:r>
           <m:r>
             <m:t>]</m:t>
@@ -4022,7 +4033,7 @@
             <m:t>,</m:t>
           </m:r>
           <m:r>
-            <m:t>j</m:t>
+            <m:t>0</m:t>
           </m:r>
           <m:r>
             <m:t>]</m:t>
@@ -4049,7 +4060,7 @@
             <m:t>,</m:t>
           </m:r>
           <m:r>
-            <m:t>j</m:t>
+            <m:t>0</m:t>
           </m:r>
           <m:r>
             <m:t>]</m:t>
@@ -4062,49 +4073,10 @@
     </w:p>
     <w:p>
       <w:pPr>
-        <w:pStyle w:val="Heading3"/>
-      </w:pPr>
-      <w:bookmarkStart w:id="38" w:name="digital-waveguides"/>
-      <w:r>
-        <w:t xml:space="preserve">Digital Waveguides</w:t>
-      </w:r>
-      <w:bookmarkEnd w:id="38"/>
-    </w:p>
-    <w:p>
-      <w:pPr>
         <w:pStyle w:val="FirstParagraph"/>
       </w:pPr>
       <w:r>
-        <w:t xml:space="preserve">Apresentam uma abordagem simplificada da modelagem física, na medida em que concentram em alguns pontos discretos os calculos necessários à simulação, aumentando bastante a eficiência computacional do modelo. Conceitualmente, podem ser vistos como uma caso especial do método das diferenças finitas, e a maioria de suas implementações consistem na utilização de</w:t>
-      </w:r>
-      <w:r>
-        <w:t xml:space="preserve"> </w:t>
-      </w:r>
-      <w:r>
-        <w:rPr>
-          <w:i/>
-        </w:rPr>
-        <w:t xml:space="preserve">delay lines</w:t>
-      </w:r>
-      <w:r>
-        <w:t xml:space="preserve"> </w:t>
-      </w:r>
-      <w:r>
-        <w:t xml:space="preserve">e filtros digitais para a modelagem da propagação da onda</w:t>
-      </w:r>
-      <w:r>
-        <w:t xml:space="preserve">(Smith 2006)</w:t>
-      </w:r>
-      <w:r>
-        <w:t xml:space="preserve">.</w:t>
-      </w:r>
-    </w:p>
-    <w:p>
-      <w:pPr>
-        <w:pStyle w:val="BodyText"/>
-      </w:pPr>
-      <w:r>
-        <w:t xml:space="preserve">Se considerarmos, por exemplo, um framerate típico de 44100 frames por segundo podemos evitar desperdício computacional fazendo com que a simulação conincida com o intervalos 1/44100 entre os</w:t>
+        <w:t xml:space="preserve">É conveniente colocar a formulação em termos físicos: se considerarmos, por exemplo, um framerate típico de 44100 frames por segundo podemos evitar desperdício computacional fazendo com que a simulação coincida com o intervalos 1/44100 entre os</w:t>
       </w:r>
       <w:r>
         <w:t xml:space="preserve"> </w:t>
@@ -4375,33 +4347,2346 @@
     </w:p>
     <w:p>
       <w:pPr>
+        <w:pStyle w:val="BodyText"/>
+      </w:pPr>
+      <w:r>
+        <w:t xml:space="preserve">O fragmento de implementação abaixo ajuda a entender o funcionamento do algoritmo (o código que segue é ilustrativo; uma implementação funcional pode ser encontrada no repositório dedicado ao trabalho, no arquivo</w:t>
+      </w:r>
+      <w:r>
+        <w:t xml:space="preserve"> </w:t>
+      </w:r>
+      <w:hyperlink r:id="rId38">
+        <w:r>
+          <w:rPr>
+            <w:rStyle w:val="Hyperlink"/>
+          </w:rPr>
+          <w:t xml:space="preserve">Finite_Difference.py</w:t>
+        </w:r>
+      </w:hyperlink>
+      <w:r>
+        <w:t xml:space="preserve">):</w:t>
+      </w:r>
+    </w:p>
+    <w:p>
+      <w:pPr>
+        <w:pStyle w:val="SourceCode"/>
+      </w:pPr>
+      <w:r>
+        <w:rPr>
+          <w:rStyle w:val="NormalTok"/>
+        </w:rPr>
+        <w:t xml:space="preserve">amplitude </w:t>
+      </w:r>
+      <w:r>
+        <w:rPr>
+          <w:rStyle w:val="OperatorTok"/>
+        </w:rPr>
+        <w:t xml:space="preserve">=</w:t>
+      </w:r>
+      <w:r>
+        <w:rPr>
+          <w:rStyle w:val="NormalTok"/>
+        </w:rPr>
+        <w:t xml:space="preserve"> </w:t>
+      </w:r>
+      <w:r>
+        <w:rPr>
+          <w:rStyle w:val="FloatTok"/>
+        </w:rPr>
+        <w:t xml:space="preserve">0.005</w:t>
+      </w:r>
+      <w:r>
+        <w:rPr>
+          <w:rStyle w:val="NormalTok"/>
+        </w:rPr>
+        <w:t xml:space="preserve"> </w:t>
+      </w:r>
+      <w:r>
+        <w:rPr>
+          <w:rStyle w:val="CommentTok"/>
+        </w:rPr>
+        <w:t xml:space="preserve"># meters</w:t>
+      </w:r>
+      <w:r>
+        <w:br w:type="textWrapping"/>
+      </w:r>
+      <w:r>
+        <w:rPr>
+          <w:rStyle w:val="NormalTok"/>
+        </w:rPr>
+        <w:t xml:space="preserve">pluck_position </w:t>
+      </w:r>
+      <w:r>
+        <w:rPr>
+          <w:rStyle w:val="OperatorTok"/>
+        </w:rPr>
+        <w:t xml:space="preserve">=</w:t>
+      </w:r>
+      <w:r>
+        <w:rPr>
+          <w:rStyle w:val="NormalTok"/>
+        </w:rPr>
+        <w:t xml:space="preserve"> </w:t>
+      </w:r>
+      <w:r>
+        <w:rPr>
+          <w:rStyle w:val="FloatTok"/>
+        </w:rPr>
+        <w:t xml:space="preserve">.5</w:t>
+      </w:r>
+      <w:r>
+        <w:rPr>
+          <w:rStyle w:val="NormalTok"/>
+        </w:rPr>
+        <w:t xml:space="preserve"> </w:t>
+      </w:r>
+      <w:r>
+        <w:rPr>
+          <w:rStyle w:val="CommentTok"/>
+        </w:rPr>
+        <w:t xml:space="preserve"># fraction of L</w:t>
+      </w:r>
+      <w:r>
+        <w:br w:type="textWrapping"/>
+      </w:r>
+      <w:r>
+        <w:rPr>
+          <w:rStyle w:val="NormalTok"/>
+        </w:rPr>
+        <w:t xml:space="preserve">pickup_position </w:t>
+      </w:r>
+      <w:r>
+        <w:rPr>
+          <w:rStyle w:val="OperatorTok"/>
+        </w:rPr>
+        <w:t xml:space="preserve">=</w:t>
+      </w:r>
+      <w:r>
+        <w:rPr>
+          <w:rStyle w:val="NormalTok"/>
+        </w:rPr>
+        <w:t xml:space="preserve"> </w:t>
+      </w:r>
+      <w:r>
+        <w:rPr>
+          <w:rStyle w:val="FloatTok"/>
+        </w:rPr>
+        <w:t xml:space="preserve">.5</w:t>
+      </w:r>
+      <w:r>
+        <w:rPr>
+          <w:rStyle w:val="NormalTok"/>
+        </w:rPr>
+        <w:t xml:space="preserve"> </w:t>
+      </w:r>
+      <w:r>
+        <w:rPr>
+          <w:rStyle w:val="CommentTok"/>
+        </w:rPr>
+        <w:t xml:space="preserve"># fraction of L</w:t>
+      </w:r>
+      <w:r>
+        <w:br w:type="textWrapping"/>
+      </w:r>
+      <w:r>
+        <w:rPr>
+          <w:rStyle w:val="NormalTok"/>
+        </w:rPr>
+        <w:t xml:space="preserve">fps </w:t>
+      </w:r>
+      <w:r>
+        <w:rPr>
+          <w:rStyle w:val="OperatorTok"/>
+        </w:rPr>
+        <w:t xml:space="preserve">=</w:t>
+      </w:r>
+      <w:r>
+        <w:rPr>
+          <w:rStyle w:val="NormalTok"/>
+        </w:rPr>
+        <w:t xml:space="preserve"> </w:t>
+      </w:r>
+      <w:r>
+        <w:rPr>
+          <w:rStyle w:val="DecValTok"/>
+        </w:rPr>
+        <w:t xml:space="preserve">44100</w:t>
+      </w:r>
+      <w:r>
+        <w:rPr>
+          <w:rStyle w:val="NormalTok"/>
+        </w:rPr>
+        <w:t xml:space="preserve"> </w:t>
+      </w:r>
+      <w:r>
+        <w:rPr>
+          <w:rStyle w:val="CommentTok"/>
+        </w:rPr>
+        <w:t xml:space="preserve"># samples / second</w:t>
+      </w:r>
+      <w:r>
+        <w:br w:type="textWrapping"/>
+      </w:r>
+      <w:r>
+        <w:rPr>
+          <w:rStyle w:val="NormalTok"/>
+        </w:rPr>
+        <w:t xml:space="preserve">frequency </w:t>
+      </w:r>
+      <w:r>
+        <w:rPr>
+          <w:rStyle w:val="OperatorTok"/>
+        </w:rPr>
+        <w:t xml:space="preserve">=</w:t>
+      </w:r>
+      <w:r>
+        <w:rPr>
+          <w:rStyle w:val="NormalTok"/>
+        </w:rPr>
+        <w:t xml:space="preserve"> </w:t>
+      </w:r>
+      <w:r>
+        <w:rPr>
+          <w:rStyle w:val="DecValTok"/>
+        </w:rPr>
+        <w:t xml:space="preserve">440</w:t>
+      </w:r>
+      <w:r>
+        <w:rPr>
+          <w:rStyle w:val="NormalTok"/>
+        </w:rPr>
+        <w:t xml:space="preserve"> </w:t>
+      </w:r>
+      <w:r>
+        <w:rPr>
+          <w:rStyle w:val="CommentTok"/>
+        </w:rPr>
+        <w:t xml:space="preserve">#hz</w:t>
+      </w:r>
+      <w:r>
+        <w:br w:type="textWrapping"/>
+      </w:r>
+      <w:r>
+        <w:rPr>
+          <w:rStyle w:val="NormalTok"/>
+        </w:rPr>
+        <w:t xml:space="preserve">duration </w:t>
+      </w:r>
+      <w:r>
+        <w:rPr>
+          <w:rStyle w:val="OperatorTok"/>
+        </w:rPr>
+        <w:t xml:space="preserve">=</w:t>
+      </w:r>
+      <w:r>
+        <w:rPr>
+          <w:rStyle w:val="NormalTok"/>
+        </w:rPr>
+        <w:t xml:space="preserve"> </w:t>
+      </w:r>
+      <w:r>
+        <w:rPr>
+          <w:rStyle w:val="DecValTok"/>
+        </w:rPr>
+        <w:t xml:space="preserve">1</w:t>
+      </w:r>
+      <w:r>
+        <w:rPr>
+          <w:rStyle w:val="NormalTok"/>
+        </w:rPr>
+        <w:t xml:space="preserve"> </w:t>
+      </w:r>
+      <w:r>
+        <w:rPr>
+          <w:rStyle w:val="CommentTok"/>
+        </w:rPr>
+        <w:t xml:space="preserve"># seconds</w:t>
+      </w:r>
+      <w:r>
+        <w:br w:type="textWrapping"/>
+      </w:r>
+      <w:r>
+        <w:rPr>
+          <w:rStyle w:val="NormalTok"/>
+        </w:rPr>
+        <w:t xml:space="preserve">L </w:t>
+      </w:r>
+      <w:r>
+        <w:rPr>
+          <w:rStyle w:val="OperatorTok"/>
+        </w:rPr>
+        <w:t xml:space="preserve">=</w:t>
+      </w:r>
+      <w:r>
+        <w:rPr>
+          <w:rStyle w:val="NormalTok"/>
+        </w:rPr>
+        <w:t xml:space="preserve"> </w:t>
+      </w:r>
+      <w:r>
+        <w:rPr>
+          <w:rStyle w:val="FloatTok"/>
+        </w:rPr>
+        <w:t xml:space="preserve">0.6</w:t>
+      </w:r>
+      <w:r>
+        <w:rPr>
+          <w:rStyle w:val="NormalTok"/>
+        </w:rPr>
+        <w:t xml:space="preserve"> </w:t>
+      </w:r>
+      <w:r>
+        <w:rPr>
+          <w:rStyle w:val="CommentTok"/>
+        </w:rPr>
+        <w:t xml:space="preserve"># meters</w:t>
+      </w:r>
+      <w:r>
+        <w:br w:type="textWrapping"/>
+      </w:r>
+      <w:r>
+        <w:rPr>
+          <w:rStyle w:val="NormalTok"/>
+        </w:rPr>
+        <w:t xml:space="preserve">sustain </w:t>
+      </w:r>
+      <w:r>
+        <w:rPr>
+          <w:rStyle w:val="OperatorTok"/>
+        </w:rPr>
+        <w:t xml:space="preserve">=</w:t>
+      </w:r>
+      <w:r>
+        <w:rPr>
+          <w:rStyle w:val="NormalTok"/>
+        </w:rPr>
+        <w:t xml:space="preserve"> </w:t>
+      </w:r>
+      <w:r>
+        <w:rPr>
+          <w:rStyle w:val="FloatTok"/>
+        </w:rPr>
+        <w:t xml:space="preserve">.9998</w:t>
+      </w:r>
+      <w:r>
+        <w:br w:type="textWrapping"/>
+      </w:r>
+      <w:r>
+        <w:br w:type="textWrapping"/>
+      </w:r>
+      <w:r>
+        <w:rPr>
+          <w:rStyle w:val="NormalTok"/>
+        </w:rPr>
+        <w:t xml:space="preserve">N </w:t>
+      </w:r>
+      <w:r>
+        <w:rPr>
+          <w:rStyle w:val="OperatorTok"/>
+        </w:rPr>
+        <w:t xml:space="preserve">=</w:t>
+      </w:r>
+      <w:r>
+        <w:rPr>
+          <w:rStyle w:val="NormalTok"/>
+        </w:rPr>
+        <w:t xml:space="preserve"> </w:t>
+      </w:r>
+      <w:r>
+        <w:rPr>
+          <w:rStyle w:val="BuiltInTok"/>
+        </w:rPr>
+        <w:t xml:space="preserve">int</w:t>
+      </w:r>
+      <w:r>
+        <w:rPr>
+          <w:rStyle w:val="NormalTok"/>
+        </w:rPr>
+        <w:t xml:space="preserve">(duration </w:t>
+      </w:r>
+      <w:r>
+        <w:rPr>
+          <w:rStyle w:val="OperatorTok"/>
+        </w:rPr>
+        <w:t xml:space="preserve">*</w:t>
+      </w:r>
+      <w:r>
+        <w:rPr>
+          <w:rStyle w:val="NormalTok"/>
+        </w:rPr>
+        <w:t xml:space="preserve"> fps) </w:t>
+      </w:r>
+      <w:r>
+        <w:rPr>
+          <w:rStyle w:val="CommentTok"/>
+        </w:rPr>
+        <w:t xml:space="preserve"># number of time points</w:t>
+      </w:r>
+      <w:r>
+        <w:br w:type="textWrapping"/>
+      </w:r>
+      <w:r>
+        <w:rPr>
+          <w:rStyle w:val="NormalTok"/>
+        </w:rPr>
+        <w:t xml:space="preserve">dt </w:t>
+      </w:r>
+      <w:r>
+        <w:rPr>
+          <w:rStyle w:val="OperatorTok"/>
+        </w:rPr>
+        <w:t xml:space="preserve">=</w:t>
+      </w:r>
+      <w:r>
+        <w:rPr>
+          <w:rStyle w:val="NormalTok"/>
+        </w:rPr>
+        <w:t xml:space="preserve"> </w:t>
+      </w:r>
+      <w:r>
+        <w:rPr>
+          <w:rStyle w:val="DecValTok"/>
+        </w:rPr>
+        <w:t xml:space="preserve">1</w:t>
+      </w:r>
+      <w:r>
+        <w:rPr>
+          <w:rStyle w:val="NormalTok"/>
+        </w:rPr>
+        <w:t xml:space="preserve"> </w:t>
+      </w:r>
+      <w:r>
+        <w:rPr>
+          <w:rStyle w:val="OperatorTok"/>
+        </w:rPr>
+        <w:t xml:space="preserve">/</w:t>
+      </w:r>
+      <w:r>
+        <w:rPr>
+          <w:rStyle w:val="NormalTok"/>
+        </w:rPr>
+        <w:t xml:space="preserve"> fps </w:t>
+      </w:r>
+      <w:r>
+        <w:rPr>
+          <w:rStyle w:val="CommentTok"/>
+        </w:rPr>
+        <w:t xml:space="preserve"># spacing beetwen discrete time points</w:t>
+      </w:r>
+      <w:r>
+        <w:br w:type="textWrapping"/>
+      </w:r>
+      <w:r>
+        <w:rPr>
+          <w:rStyle w:val="NormalTok"/>
+        </w:rPr>
+        <w:t xml:space="preserve">M </w:t>
+      </w:r>
+      <w:r>
+        <w:rPr>
+          <w:rStyle w:val="OperatorTok"/>
+        </w:rPr>
+        <w:t xml:space="preserve">=</w:t>
+      </w:r>
+      <w:r>
+        <w:rPr>
+          <w:rStyle w:val="NormalTok"/>
+        </w:rPr>
+        <w:t xml:space="preserve"> </w:t>
+      </w:r>
+      <w:r>
+        <w:rPr>
+          <w:rStyle w:val="BuiltInTok"/>
+        </w:rPr>
+        <w:t xml:space="preserve">int</w:t>
+      </w:r>
+      <w:r>
+        <w:rPr>
+          <w:rStyle w:val="NormalTok"/>
+        </w:rPr>
+        <w:t xml:space="preserve">(fps </w:t>
+      </w:r>
+      <w:r>
+        <w:rPr>
+          <w:rStyle w:val="OperatorTok"/>
+        </w:rPr>
+        <w:t xml:space="preserve">/</w:t>
+      </w:r>
+      <w:r>
+        <w:rPr>
+          <w:rStyle w:val="NormalTok"/>
+        </w:rPr>
+        <w:t xml:space="preserve"> (</w:t>
+      </w:r>
+      <w:r>
+        <w:rPr>
+          <w:rStyle w:val="DecValTok"/>
+        </w:rPr>
+        <w:t xml:space="preserve">2</w:t>
+      </w:r>
+      <w:r>
+        <w:rPr>
+          <w:rStyle w:val="NormalTok"/>
+        </w:rPr>
+        <w:t xml:space="preserve"> </w:t>
+      </w:r>
+      <w:r>
+        <w:rPr>
+          <w:rStyle w:val="OperatorTok"/>
+        </w:rPr>
+        <w:t xml:space="preserve">*</w:t>
+      </w:r>
+      <w:r>
+        <w:rPr>
+          <w:rStyle w:val="NormalTok"/>
+        </w:rPr>
+        <w:t xml:space="preserve"> frequency)) </w:t>
+      </w:r>
+      <w:r>
+        <w:rPr>
+          <w:rStyle w:val="CommentTok"/>
+        </w:rPr>
+        <w:t xml:space="preserve"># number of position points</w:t>
+      </w:r>
+      <w:r>
+        <w:br w:type="textWrapping"/>
+      </w:r>
+      <w:r>
+        <w:rPr>
+          <w:rStyle w:val="NormalTok"/>
+        </w:rPr>
+        <w:t xml:space="preserve">dx </w:t>
+      </w:r>
+      <w:r>
+        <w:rPr>
+          <w:rStyle w:val="OperatorTok"/>
+        </w:rPr>
+        <w:t xml:space="preserve">=</w:t>
+      </w:r>
+      <w:r>
+        <w:rPr>
+          <w:rStyle w:val="NormalTok"/>
+        </w:rPr>
+        <w:t xml:space="preserve"> L </w:t>
+      </w:r>
+      <w:r>
+        <w:rPr>
+          <w:rStyle w:val="OperatorTok"/>
+        </w:rPr>
+        <w:t xml:space="preserve">/</w:t>
+      </w:r>
+      <w:r>
+        <w:rPr>
+          <w:rStyle w:val="NormalTok"/>
+        </w:rPr>
+        <w:t xml:space="preserve"> M </w:t>
+      </w:r>
+      <w:r>
+        <w:rPr>
+          <w:rStyle w:val="CommentTok"/>
+        </w:rPr>
+        <w:t xml:space="preserve"># spacing beetwen discrete position points</w:t>
+      </w:r>
+      <w:r>
+        <w:br w:type="textWrapping"/>
+      </w:r>
+      <w:r>
+        <w:rPr>
+          <w:rStyle w:val="NormalTok"/>
+        </w:rPr>
+        <w:t xml:space="preserve">c </w:t>
+      </w:r>
+      <w:r>
+        <w:rPr>
+          <w:rStyle w:val="OperatorTok"/>
+        </w:rPr>
+        <w:t xml:space="preserve">=</w:t>
+      </w:r>
+      <w:r>
+        <w:rPr>
+          <w:rStyle w:val="NormalTok"/>
+        </w:rPr>
+        <w:t xml:space="preserve"> frequency </w:t>
+      </w:r>
+      <w:r>
+        <w:rPr>
+          <w:rStyle w:val="OperatorTok"/>
+        </w:rPr>
+        <w:t xml:space="preserve">*</w:t>
+      </w:r>
+      <w:r>
+        <w:rPr>
+          <w:rStyle w:val="NormalTok"/>
+        </w:rPr>
+        <w:t xml:space="preserve"> </w:t>
+      </w:r>
+      <w:r>
+        <w:rPr>
+          <w:rStyle w:val="DecValTok"/>
+        </w:rPr>
+        <w:t xml:space="preserve">2</w:t>
+      </w:r>
+      <w:r>
+        <w:rPr>
+          <w:rStyle w:val="NormalTok"/>
+        </w:rPr>
+        <w:t xml:space="preserve"> </w:t>
+      </w:r>
+      <w:r>
+        <w:rPr>
+          <w:rStyle w:val="OperatorTok"/>
+        </w:rPr>
+        <w:t xml:space="preserve">*</w:t>
+      </w:r>
+      <w:r>
+        <w:rPr>
+          <w:rStyle w:val="NormalTok"/>
+        </w:rPr>
+        <w:t xml:space="preserve"> L </w:t>
+      </w:r>
+      <w:r>
+        <w:rPr>
+          <w:rStyle w:val="CommentTok"/>
+        </w:rPr>
+        <w:t xml:space="preserve"># meters / second</w:t>
+      </w:r>
+      <w:r>
+        <w:br w:type="textWrapping"/>
+      </w:r>
+      <w:r>
+        <w:rPr>
+          <w:rStyle w:val="NormalTok"/>
+        </w:rPr>
+        <w:t xml:space="preserve">C </w:t>
+      </w:r>
+      <w:r>
+        <w:rPr>
+          <w:rStyle w:val="OperatorTok"/>
+        </w:rPr>
+        <w:t xml:space="preserve">=</w:t>
+      </w:r>
+      <w:r>
+        <w:rPr>
+          <w:rStyle w:val="NormalTok"/>
+        </w:rPr>
+        <w:t xml:space="preserve"> c </w:t>
+      </w:r>
+      <w:r>
+        <w:rPr>
+          <w:rStyle w:val="OperatorTok"/>
+        </w:rPr>
+        <w:t xml:space="preserve">*</w:t>
+      </w:r>
+      <w:r>
+        <w:rPr>
+          <w:rStyle w:val="NormalTok"/>
+        </w:rPr>
+        <w:t xml:space="preserve"> dt </w:t>
+      </w:r>
+      <w:r>
+        <w:rPr>
+          <w:rStyle w:val="OperatorTok"/>
+        </w:rPr>
+        <w:t xml:space="preserve">/</w:t>
+      </w:r>
+      <w:r>
+        <w:rPr>
+          <w:rStyle w:val="NormalTok"/>
+        </w:rPr>
+        <w:t xml:space="preserve"> dx </w:t>
+      </w:r>
+      <w:r>
+        <w:rPr>
+          <w:rStyle w:val="CommentTok"/>
+        </w:rPr>
+        <w:t xml:space="preserve"># Courant number</w:t>
+      </w:r>
+      <w:r>
+        <w:br w:type="textWrapping"/>
+      </w:r>
+      <w:r>
+        <w:rPr>
+          <w:rStyle w:val="NormalTok"/>
+        </w:rPr>
+        <w:t xml:space="preserve">x </w:t>
+      </w:r>
+      <w:r>
+        <w:rPr>
+          <w:rStyle w:val="OperatorTok"/>
+        </w:rPr>
+        <w:t xml:space="preserve">=</w:t>
+      </w:r>
+      <w:r>
+        <w:rPr>
+          <w:rStyle w:val="NormalTok"/>
+        </w:rPr>
+        <w:t xml:space="preserve"> np.arange(</w:t>
+      </w:r>
+      <w:r>
+        <w:rPr>
+          <w:rStyle w:val="DecValTok"/>
+        </w:rPr>
+        <w:t xml:space="preserve">0</w:t>
+      </w:r>
+      <w:r>
+        <w:rPr>
+          <w:rStyle w:val="NormalTok"/>
+        </w:rPr>
+        <w:t xml:space="preserve">, M </w:t>
+      </w:r>
+      <w:r>
+        <w:rPr>
+          <w:rStyle w:val="OperatorTok"/>
+        </w:rPr>
+        <w:t xml:space="preserve">+</w:t>
+      </w:r>
+      <w:r>
+        <w:rPr>
+          <w:rStyle w:val="NormalTok"/>
+        </w:rPr>
+        <w:t xml:space="preserve"> </w:t>
+      </w:r>
+      <w:r>
+        <w:rPr>
+          <w:rStyle w:val="DecValTok"/>
+        </w:rPr>
+        <w:t xml:space="preserve">1</w:t>
+      </w:r>
+      <w:r>
+        <w:rPr>
+          <w:rStyle w:val="NormalTok"/>
+        </w:rPr>
+        <w:t xml:space="preserve">, </w:t>
+      </w:r>
+      <w:r>
+        <w:rPr>
+          <w:rStyle w:val="DecValTok"/>
+        </w:rPr>
+        <w:t xml:space="preserve">1</w:t>
+      </w:r>
+      <w:r>
+        <w:rPr>
+          <w:rStyle w:val="NormalTok"/>
+        </w:rPr>
+        <w:t xml:space="preserve">) </w:t>
+      </w:r>
+      <w:r>
+        <w:rPr>
+          <w:rStyle w:val="OperatorTok"/>
+        </w:rPr>
+        <w:t xml:space="preserve">*</w:t>
+      </w:r>
+      <w:r>
+        <w:rPr>
+          <w:rStyle w:val="NormalTok"/>
+        </w:rPr>
+        <w:t xml:space="preserve"> dx</w:t>
+      </w:r>
+      <w:r>
+        <w:br w:type="textWrapping"/>
+      </w:r>
+      <w:r>
+        <w:rPr>
+          <w:rStyle w:val="NormalTok"/>
+        </w:rPr>
+        <w:t xml:space="preserve">t </w:t>
+      </w:r>
+      <w:r>
+        <w:rPr>
+          <w:rStyle w:val="OperatorTok"/>
+        </w:rPr>
+        <w:t xml:space="preserve">=</w:t>
+      </w:r>
+      <w:r>
+        <w:rPr>
+          <w:rStyle w:val="NormalTok"/>
+        </w:rPr>
+        <w:t xml:space="preserve"> np.arange(</w:t>
+      </w:r>
+      <w:r>
+        <w:rPr>
+          <w:rStyle w:val="DecValTok"/>
+        </w:rPr>
+        <w:t xml:space="preserve">0</w:t>
+      </w:r>
+      <w:r>
+        <w:rPr>
+          <w:rStyle w:val="NormalTok"/>
+        </w:rPr>
+        <w:t xml:space="preserve">, N </w:t>
+      </w:r>
+      <w:r>
+        <w:rPr>
+          <w:rStyle w:val="OperatorTok"/>
+        </w:rPr>
+        <w:t xml:space="preserve">+</w:t>
+      </w:r>
+      <w:r>
+        <w:rPr>
+          <w:rStyle w:val="NormalTok"/>
+        </w:rPr>
+        <w:t xml:space="preserve"> </w:t>
+      </w:r>
+      <w:r>
+        <w:rPr>
+          <w:rStyle w:val="DecValTok"/>
+        </w:rPr>
+        <w:t xml:space="preserve">1</w:t>
+      </w:r>
+      <w:r>
+        <w:rPr>
+          <w:rStyle w:val="NormalTok"/>
+        </w:rPr>
+        <w:t xml:space="preserve">, </w:t>
+      </w:r>
+      <w:r>
+        <w:rPr>
+          <w:rStyle w:val="DecValTok"/>
+        </w:rPr>
+        <w:t xml:space="preserve">1</w:t>
+      </w:r>
+      <w:r>
+        <w:rPr>
+          <w:rStyle w:val="NormalTok"/>
+        </w:rPr>
+        <w:t xml:space="preserve">) </w:t>
+      </w:r>
+      <w:r>
+        <w:rPr>
+          <w:rStyle w:val="OperatorTok"/>
+        </w:rPr>
+        <w:t xml:space="preserve">*</w:t>
+      </w:r>
+      <w:r>
+        <w:rPr>
+          <w:rStyle w:val="NormalTok"/>
+        </w:rPr>
+        <w:t xml:space="preserve"> dt</w:t>
+      </w:r>
+      <w:r>
+        <w:br w:type="textWrapping"/>
+      </w:r>
+      <w:r>
+        <w:rPr>
+          <w:rStyle w:val="NormalTok"/>
+        </w:rPr>
+        <w:t xml:space="preserve">pickup </w:t>
+      </w:r>
+      <w:r>
+        <w:rPr>
+          <w:rStyle w:val="OperatorTok"/>
+        </w:rPr>
+        <w:t xml:space="preserve">=</w:t>
+      </w:r>
+      <w:r>
+        <w:rPr>
+          <w:rStyle w:val="NormalTok"/>
+        </w:rPr>
+        <w:t xml:space="preserve"> </w:t>
+      </w:r>
+      <w:r>
+        <w:rPr>
+          <w:rStyle w:val="BuiltInTok"/>
+        </w:rPr>
+        <w:t xml:space="preserve">int</w:t>
+      </w:r>
+      <w:r>
+        <w:rPr>
+          <w:rStyle w:val="NormalTok"/>
+        </w:rPr>
+        <w:t xml:space="preserve">(</w:t>
+      </w:r>
+      <w:r>
+        <w:rPr>
+          <w:rStyle w:val="BuiltInTok"/>
+        </w:rPr>
+        <w:t xml:space="preserve">round</w:t>
+      </w:r>
+      <w:r>
+        <w:rPr>
+          <w:rStyle w:val="NormalTok"/>
+        </w:rPr>
+        <w:t xml:space="preserve">(M </w:t>
+      </w:r>
+      <w:r>
+        <w:rPr>
+          <w:rStyle w:val="OperatorTok"/>
+        </w:rPr>
+        <w:t xml:space="preserve">*</w:t>
+      </w:r>
+      <w:r>
+        <w:rPr>
+          <w:rStyle w:val="NormalTok"/>
+        </w:rPr>
+        <w:t xml:space="preserve"> pickup_position))</w:t>
+      </w:r>
+      <w:r>
+        <w:br w:type="textWrapping"/>
+      </w:r>
+      <w:r>
+        <w:rPr>
+          <w:rStyle w:val="NormalTok"/>
+        </w:rPr>
+        <w:t xml:space="preserve">asc </w:t>
+      </w:r>
+      <w:r>
+        <w:rPr>
+          <w:rStyle w:val="OperatorTok"/>
+        </w:rPr>
+        <w:t xml:space="preserve">=</w:t>
+      </w:r>
+      <w:r>
+        <w:rPr>
+          <w:rStyle w:val="NormalTok"/>
+        </w:rPr>
+        <w:t xml:space="preserve"> </w:t>
+      </w:r>
+      <w:r>
+        <w:rPr>
+          <w:rStyle w:val="BuiltInTok"/>
+        </w:rPr>
+        <w:t xml:space="preserve">int</w:t>
+      </w:r>
+      <w:r>
+        <w:rPr>
+          <w:rStyle w:val="NormalTok"/>
+        </w:rPr>
+        <w:t xml:space="preserve">(</w:t>
+      </w:r>
+      <w:r>
+        <w:rPr>
+          <w:rStyle w:val="BuiltInTok"/>
+        </w:rPr>
+        <w:t xml:space="preserve">round</w:t>
+      </w:r>
+      <w:r>
+        <w:rPr>
+          <w:rStyle w:val="NormalTok"/>
+        </w:rPr>
+        <w:t xml:space="preserve">(M </w:t>
+      </w:r>
+      <w:r>
+        <w:rPr>
+          <w:rStyle w:val="OperatorTok"/>
+        </w:rPr>
+        <w:t xml:space="preserve">*</w:t>
+      </w:r>
+      <w:r>
+        <w:rPr>
+          <w:rStyle w:val="NormalTok"/>
+        </w:rPr>
+        <w:t xml:space="preserve"> pluck_position))</w:t>
+      </w:r>
+      <w:r>
+        <w:br w:type="textWrapping"/>
+      </w:r>
+      <w:r>
+        <w:rPr>
+          <w:rStyle w:val="NormalTok"/>
+        </w:rPr>
+        <w:t xml:space="preserve">dsc </w:t>
+      </w:r>
+      <w:r>
+        <w:rPr>
+          <w:rStyle w:val="OperatorTok"/>
+        </w:rPr>
+        <w:t xml:space="preserve">=</w:t>
+      </w:r>
+      <w:r>
+        <w:rPr>
+          <w:rStyle w:val="NormalTok"/>
+        </w:rPr>
+        <w:t xml:space="preserve"> M </w:t>
+      </w:r>
+      <w:r>
+        <w:rPr>
+          <w:rStyle w:val="OperatorTok"/>
+        </w:rPr>
+        <w:t xml:space="preserve">+</w:t>
+      </w:r>
+      <w:r>
+        <w:rPr>
+          <w:rStyle w:val="NormalTok"/>
+        </w:rPr>
+        <w:t xml:space="preserve"> </w:t>
+      </w:r>
+      <w:r>
+        <w:rPr>
+          <w:rStyle w:val="DecValTok"/>
+        </w:rPr>
+        <w:t xml:space="preserve">2</w:t>
+      </w:r>
+      <w:r>
+        <w:rPr>
+          <w:rStyle w:val="NormalTok"/>
+        </w:rPr>
+        <w:t xml:space="preserve"> </w:t>
+      </w:r>
+      <w:r>
+        <w:rPr>
+          <w:rStyle w:val="OperatorTok"/>
+        </w:rPr>
+        <w:t xml:space="preserve">-</w:t>
+      </w:r>
+      <w:r>
+        <w:rPr>
+          <w:rStyle w:val="NormalTok"/>
+        </w:rPr>
+        <w:t xml:space="preserve"> asc</w:t>
+      </w:r>
+      <w:r>
+        <w:br w:type="textWrapping"/>
+      </w:r>
+      <w:r>
+        <w:rPr>
+          <w:rStyle w:val="NormalTok"/>
+        </w:rPr>
+        <w:t xml:space="preserve">X_asc </w:t>
+      </w:r>
+      <w:r>
+        <w:rPr>
+          <w:rStyle w:val="OperatorTok"/>
+        </w:rPr>
+        <w:t xml:space="preserve">=</w:t>
+      </w:r>
+      <w:r>
+        <w:rPr>
+          <w:rStyle w:val="NormalTok"/>
+        </w:rPr>
+        <w:t xml:space="preserve"> np.linspace(</w:t>
+      </w:r>
+      <w:r>
+        <w:rPr>
+          <w:rStyle w:val="DecValTok"/>
+        </w:rPr>
+        <w:t xml:space="preserve">0</w:t>
+      </w:r>
+      <w:r>
+        <w:rPr>
+          <w:rStyle w:val="NormalTok"/>
+        </w:rPr>
+        <w:t xml:space="preserve">, </w:t>
+      </w:r>
+      <w:r>
+        <w:rPr>
+          <w:rStyle w:val="DecValTok"/>
+        </w:rPr>
+        <w:t xml:space="preserve">1</w:t>
+      </w:r>
+      <w:r>
+        <w:rPr>
+          <w:rStyle w:val="NormalTok"/>
+        </w:rPr>
+        <w:t xml:space="preserve">, asc)</w:t>
+      </w:r>
+      <w:r>
+        <w:br w:type="textWrapping"/>
+      </w:r>
+      <w:r>
+        <w:rPr>
+          <w:rStyle w:val="NormalTok"/>
+        </w:rPr>
+        <w:t xml:space="preserve">X_dsc </w:t>
+      </w:r>
+      <w:r>
+        <w:rPr>
+          <w:rStyle w:val="OperatorTok"/>
+        </w:rPr>
+        <w:t xml:space="preserve">=</w:t>
+      </w:r>
+      <w:r>
+        <w:rPr>
+          <w:rStyle w:val="NormalTok"/>
+        </w:rPr>
+        <w:t xml:space="preserve"> np.linspace(</w:t>
+      </w:r>
+      <w:r>
+        <w:rPr>
+          <w:rStyle w:val="DecValTok"/>
+        </w:rPr>
+        <w:t xml:space="preserve">0</w:t>
+      </w:r>
+      <w:r>
+        <w:rPr>
+          <w:rStyle w:val="NormalTok"/>
+        </w:rPr>
+        <w:t xml:space="preserve">, </w:t>
+      </w:r>
+      <w:r>
+        <w:rPr>
+          <w:rStyle w:val="DecValTok"/>
+        </w:rPr>
+        <w:t xml:space="preserve">1</w:t>
+      </w:r>
+      <w:r>
+        <w:rPr>
+          <w:rStyle w:val="NormalTok"/>
+        </w:rPr>
+        <w:t xml:space="preserve">, dsc)[::</w:t>
+      </w:r>
+      <w:r>
+        <w:rPr>
+          <w:rStyle w:val="OperatorTok"/>
+        </w:rPr>
+        <w:t xml:space="preserve">-</w:t>
+      </w:r>
+      <w:r>
+        <w:rPr>
+          <w:rStyle w:val="DecValTok"/>
+        </w:rPr>
+        <w:t xml:space="preserve">1</w:t>
+      </w:r>
+      <w:r>
+        <w:rPr>
+          <w:rStyle w:val="NormalTok"/>
+        </w:rPr>
+        <w:t xml:space="preserve">][</w:t>
+      </w:r>
+      <w:r>
+        <w:rPr>
+          <w:rStyle w:val="DecValTok"/>
+        </w:rPr>
+        <w:t xml:space="preserve">1</w:t>
+      </w:r>
+      <w:r>
+        <w:rPr>
+          <w:rStyle w:val="NormalTok"/>
+        </w:rPr>
+        <w:t xml:space="preserve">: ]</w:t>
+      </w:r>
+      <w:r>
+        <w:br w:type="textWrapping"/>
+      </w:r>
+      <w:r>
+        <w:rPr>
+          <w:rStyle w:val="NormalTok"/>
+        </w:rPr>
+        <w:t xml:space="preserve">y </w:t>
+      </w:r>
+      <w:r>
+        <w:rPr>
+          <w:rStyle w:val="OperatorTok"/>
+        </w:rPr>
+        <w:t xml:space="preserve">=</w:t>
+      </w:r>
+      <w:r>
+        <w:rPr>
+          <w:rStyle w:val="NormalTok"/>
+        </w:rPr>
+        <w:t xml:space="preserve"> np.zeros(M </w:t>
+      </w:r>
+      <w:r>
+        <w:rPr>
+          <w:rStyle w:val="OperatorTok"/>
+        </w:rPr>
+        <w:t xml:space="preserve">+</w:t>
+      </w:r>
+      <w:r>
+        <w:rPr>
+          <w:rStyle w:val="NormalTok"/>
+        </w:rPr>
+        <w:t xml:space="preserve"> </w:t>
+      </w:r>
+      <w:r>
+        <w:rPr>
+          <w:rStyle w:val="DecValTok"/>
+        </w:rPr>
+        <w:t xml:space="preserve">1</w:t>
+      </w:r>
+      <w:r>
+        <w:rPr>
+          <w:rStyle w:val="NormalTok"/>
+        </w:rPr>
+        <w:t xml:space="preserve">)</w:t>
+      </w:r>
+      <w:r>
+        <w:br w:type="textWrapping"/>
+      </w:r>
+      <w:r>
+        <w:rPr>
+          <w:rStyle w:val="NormalTok"/>
+        </w:rPr>
+        <w:t xml:space="preserve">y_1 </w:t>
+      </w:r>
+      <w:r>
+        <w:rPr>
+          <w:rStyle w:val="OperatorTok"/>
+        </w:rPr>
+        <w:t xml:space="preserve">=</w:t>
+      </w:r>
+      <w:r>
+        <w:rPr>
+          <w:rStyle w:val="NormalTok"/>
+        </w:rPr>
+        <w:t xml:space="preserve"> np.hstack([X_asc,X_dsc]) </w:t>
+      </w:r>
+      <w:r>
+        <w:rPr>
+          <w:rStyle w:val="OperatorTok"/>
+        </w:rPr>
+        <w:t xml:space="preserve">*</w:t>
+      </w:r>
+      <w:r>
+        <w:rPr>
+          <w:rStyle w:val="NormalTok"/>
+        </w:rPr>
+        <w:t xml:space="preserve"> amplitude </w:t>
+      </w:r>
+      <w:r>
+        <w:rPr>
+          <w:rStyle w:val="OperatorTok"/>
+        </w:rPr>
+        <w:t xml:space="preserve">*</w:t>
+      </w:r>
+      <w:r>
+        <w:rPr>
+          <w:rStyle w:val="NormalTok"/>
+        </w:rPr>
+        <w:t xml:space="preserve"> np.random.normal(</w:t>
+      </w:r>
+      <w:r>
+        <w:rPr>
+          <w:rStyle w:val="DecValTok"/>
+        </w:rPr>
+        <w:t xml:space="preserve">1</w:t>
+      </w:r>
+      <w:r>
+        <w:rPr>
+          <w:rStyle w:val="NormalTok"/>
+        </w:rPr>
+        <w:t xml:space="preserve">, </w:t>
+      </w:r>
+      <w:r>
+        <w:rPr>
+          <w:rStyle w:val="FloatTok"/>
+        </w:rPr>
+        <w:t xml:space="preserve">.01</w:t>
+      </w:r>
+      <w:r>
+        <w:rPr>
+          <w:rStyle w:val="NormalTok"/>
+        </w:rPr>
+        <w:t xml:space="preserve">, M </w:t>
+      </w:r>
+      <w:r>
+        <w:rPr>
+          <w:rStyle w:val="OperatorTok"/>
+        </w:rPr>
+        <w:t xml:space="preserve">+</w:t>
+      </w:r>
+      <w:r>
+        <w:rPr>
+          <w:rStyle w:val="NormalTok"/>
+        </w:rPr>
+        <w:t xml:space="preserve"> </w:t>
+      </w:r>
+      <w:r>
+        <w:rPr>
+          <w:rStyle w:val="DecValTok"/>
+        </w:rPr>
+        <w:t xml:space="preserve">1</w:t>
+      </w:r>
+      <w:r>
+        <w:rPr>
+          <w:rStyle w:val="NormalTok"/>
+        </w:rPr>
+        <w:t xml:space="preserve">) </w:t>
+      </w:r>
+      <w:r>
+        <w:rPr>
+          <w:rStyle w:val="CommentTok"/>
+        </w:rPr>
+        <w:t xml:space="preserve"># initial displacement shape</w:t>
+      </w:r>
+      <w:r>
+        <w:br w:type="textWrapping"/>
+      </w:r>
+      <w:r>
+        <w:rPr>
+          <w:rStyle w:val="NormalTok"/>
+        </w:rPr>
+        <w:t xml:space="preserve">y_2 </w:t>
+      </w:r>
+      <w:r>
+        <w:rPr>
+          <w:rStyle w:val="OperatorTok"/>
+        </w:rPr>
+        <w:t xml:space="preserve">=</w:t>
+      </w:r>
+      <w:r>
+        <w:rPr>
+          <w:rStyle w:val="NormalTok"/>
+        </w:rPr>
+        <w:t xml:space="preserve"> np.zeros(M </w:t>
+      </w:r>
+      <w:r>
+        <w:rPr>
+          <w:rStyle w:val="OperatorTok"/>
+        </w:rPr>
+        <w:t xml:space="preserve">+</w:t>
+      </w:r>
+      <w:r>
+        <w:rPr>
+          <w:rStyle w:val="NormalTok"/>
+        </w:rPr>
+        <w:t xml:space="preserve"> </w:t>
+      </w:r>
+      <w:r>
+        <w:rPr>
+          <w:rStyle w:val="DecValTok"/>
+        </w:rPr>
+        <w:t xml:space="preserve">1</w:t>
+      </w:r>
+      <w:r>
+        <w:rPr>
+          <w:rStyle w:val="NormalTok"/>
+        </w:rPr>
+        <w:t xml:space="preserve">)</w:t>
+      </w:r>
+      <w:r>
+        <w:br w:type="textWrapping"/>
+      </w:r>
+      <w:r>
+        <w:br w:type="textWrapping"/>
+      </w:r>
+      <w:r>
+        <w:rPr>
+          <w:rStyle w:val="NormalTok"/>
+        </w:rPr>
+        <w:t xml:space="preserve">ctr</w:t>
+      </w:r>
+      <w:r>
+        <w:rPr>
+          <w:rStyle w:val="OperatorTok"/>
+        </w:rPr>
+        <w:t xml:space="preserve">=</w:t>
+      </w:r>
+      <w:r>
+        <w:rPr>
+          <w:rStyle w:val="DecValTok"/>
+        </w:rPr>
+        <w:t xml:space="preserve">0</w:t>
+      </w:r>
+      <w:r>
+        <w:br w:type="textWrapping"/>
+      </w:r>
+      <w:r>
+        <w:rPr>
+          <w:rStyle w:val="NormalTok"/>
+        </w:rPr>
+        <w:t xml:space="preserve">w </w:t>
+      </w:r>
+      <w:r>
+        <w:rPr>
+          <w:rStyle w:val="OperatorTok"/>
+        </w:rPr>
+        <w:t xml:space="preserve">=</w:t>
+      </w:r>
+      <w:r>
+        <w:rPr>
+          <w:rStyle w:val="NormalTok"/>
+        </w:rPr>
+        <w:t xml:space="preserve"> []</w:t>
+      </w:r>
+      <w:r>
+        <w:br w:type="textWrapping"/>
+      </w:r>
+      <w:r>
+        <w:rPr>
+          <w:rStyle w:val="ControlFlowTok"/>
+        </w:rPr>
+        <w:t xml:space="preserve">for</w:t>
+      </w:r>
+      <w:r>
+        <w:rPr>
+          <w:rStyle w:val="NormalTok"/>
+        </w:rPr>
+        <w:t xml:space="preserve"> i </w:t>
+      </w:r>
+      <w:r>
+        <w:rPr>
+          <w:rStyle w:val="KeywordTok"/>
+        </w:rPr>
+        <w:t xml:space="preserve">in</w:t>
+      </w:r>
+      <w:r>
+        <w:rPr>
+          <w:rStyle w:val="NormalTok"/>
+        </w:rPr>
+        <w:t xml:space="preserve"> </w:t>
+      </w:r>
+      <w:r>
+        <w:rPr>
+          <w:rStyle w:val="BuiltInTok"/>
+        </w:rPr>
+        <w:t xml:space="preserve">range</w:t>
+      </w:r>
+      <w:r>
+        <w:rPr>
+          <w:rStyle w:val="NormalTok"/>
+        </w:rPr>
+        <w:t xml:space="preserve">(</w:t>
+      </w:r>
+      <w:r>
+        <w:rPr>
+          <w:rStyle w:val="DecValTok"/>
+        </w:rPr>
+        <w:t xml:space="preserve">1</w:t>
+      </w:r>
+      <w:r>
+        <w:rPr>
+          <w:rStyle w:val="NormalTok"/>
+        </w:rPr>
+        <w:t xml:space="preserve">, M):</w:t>
+      </w:r>
+      <w:r>
+        <w:br w:type="textWrapping"/>
+      </w:r>
+      <w:r>
+        <w:rPr>
+          <w:rStyle w:val="NormalTok"/>
+        </w:rPr>
+        <w:t xml:space="preserve">  y[i] </w:t>
+      </w:r>
+      <w:r>
+        <w:rPr>
+          <w:rStyle w:val="OperatorTok"/>
+        </w:rPr>
+        <w:t xml:space="preserve">=</w:t>
+      </w:r>
+      <w:r>
+        <w:rPr>
+          <w:rStyle w:val="NormalTok"/>
+        </w:rPr>
+        <w:t xml:space="preserve"> y_1[i] </w:t>
+      </w:r>
+      <w:r>
+        <w:rPr>
+          <w:rStyle w:val="OperatorTok"/>
+        </w:rPr>
+        <w:t xml:space="preserve">+</w:t>
+      </w:r>
+      <w:r>
+        <w:rPr>
+          <w:rStyle w:val="NormalTok"/>
+        </w:rPr>
+        <w:t xml:space="preserve"> </w:t>
+      </w:r>
+      <w:r>
+        <w:rPr>
+          <w:rStyle w:val="FloatTok"/>
+        </w:rPr>
+        <w:t xml:space="preserve">0.5</w:t>
+      </w:r>
+      <w:r>
+        <w:rPr>
+          <w:rStyle w:val="NormalTok"/>
+        </w:rPr>
+        <w:t xml:space="preserve"> </w:t>
+      </w:r>
+      <w:r>
+        <w:rPr>
+          <w:rStyle w:val="OperatorTok"/>
+        </w:rPr>
+        <w:t xml:space="preserve">*</w:t>
+      </w:r>
+      <w:r>
+        <w:rPr>
+          <w:rStyle w:val="NormalTok"/>
+        </w:rPr>
+        <w:t xml:space="preserve"> C</w:t>
+      </w:r>
+      <w:r>
+        <w:rPr>
+          <w:rStyle w:val="OperatorTok"/>
+        </w:rPr>
+        <w:t xml:space="preserve">**</w:t>
+      </w:r>
+      <w:r>
+        <w:rPr>
+          <w:rStyle w:val="DecValTok"/>
+        </w:rPr>
+        <w:t xml:space="preserve">2</w:t>
+      </w:r>
+      <w:r>
+        <w:rPr>
+          <w:rStyle w:val="NormalTok"/>
+        </w:rPr>
+        <w:t xml:space="preserve"> </w:t>
+      </w:r>
+      <w:r>
+        <w:rPr>
+          <w:rStyle w:val="OperatorTok"/>
+        </w:rPr>
+        <w:t xml:space="preserve">*</w:t>
+      </w:r>
+      <w:r>
+        <w:rPr>
+          <w:rStyle w:val="NormalTok"/>
+        </w:rPr>
+        <w:t xml:space="preserve">(y_1[i</w:t>
+      </w:r>
+      <w:r>
+        <w:rPr>
+          <w:rStyle w:val="OperatorTok"/>
+        </w:rPr>
+        <w:t xml:space="preserve">+</w:t>
+      </w:r>
+      <w:r>
+        <w:rPr>
+          <w:rStyle w:val="DecValTok"/>
+        </w:rPr>
+        <w:t xml:space="preserve">1</w:t>
+      </w:r>
+      <w:r>
+        <w:rPr>
+          <w:rStyle w:val="NormalTok"/>
+        </w:rPr>
+        <w:t xml:space="preserve">] </w:t>
+      </w:r>
+      <w:r>
+        <w:rPr>
+          <w:rStyle w:val="OperatorTok"/>
+        </w:rPr>
+        <w:t xml:space="preserve">-</w:t>
+      </w:r>
+      <w:r>
+        <w:rPr>
+          <w:rStyle w:val="NormalTok"/>
+        </w:rPr>
+        <w:t xml:space="preserve"> </w:t>
+      </w:r>
+      <w:r>
+        <w:rPr>
+          <w:rStyle w:val="DecValTok"/>
+        </w:rPr>
+        <w:t xml:space="preserve">2</w:t>
+      </w:r>
+      <w:r>
+        <w:rPr>
+          <w:rStyle w:val="OperatorTok"/>
+        </w:rPr>
+        <w:t xml:space="preserve">*</w:t>
+      </w:r>
+      <w:r>
+        <w:rPr>
+          <w:rStyle w:val="NormalTok"/>
+        </w:rPr>
+        <w:t xml:space="preserve">y_1[i] </w:t>
+      </w:r>
+      <w:r>
+        <w:rPr>
+          <w:rStyle w:val="OperatorTok"/>
+        </w:rPr>
+        <w:t xml:space="preserve">+</w:t>
+      </w:r>
+      <w:r>
+        <w:rPr>
+          <w:rStyle w:val="NormalTok"/>
+        </w:rPr>
+        <w:t xml:space="preserve"> y_1[i</w:t>
+      </w:r>
+      <w:r>
+        <w:rPr>
+          <w:rStyle w:val="DecValTok"/>
+        </w:rPr>
+        <w:t xml:space="preserve">-1</w:t>
+      </w:r>
+      <w:r>
+        <w:rPr>
+          <w:rStyle w:val="NormalTok"/>
+        </w:rPr>
+        <w:t xml:space="preserve">])</w:t>
+      </w:r>
+      <w:r>
+        <w:br w:type="textWrapping"/>
+      </w:r>
+      <w:r>
+        <w:rPr>
+          <w:rStyle w:val="NormalTok"/>
+        </w:rPr>
+        <w:t xml:space="preserve">y[</w:t>
+      </w:r>
+      <w:r>
+        <w:rPr>
+          <w:rStyle w:val="DecValTok"/>
+        </w:rPr>
+        <w:t xml:space="preserve">0</w:t>
+      </w:r>
+      <w:r>
+        <w:rPr>
+          <w:rStyle w:val="NormalTok"/>
+        </w:rPr>
+        <w:t xml:space="preserve">] </w:t>
+      </w:r>
+      <w:r>
+        <w:rPr>
+          <w:rStyle w:val="OperatorTok"/>
+        </w:rPr>
+        <w:t xml:space="preserve">=</w:t>
+      </w:r>
+      <w:r>
+        <w:rPr>
+          <w:rStyle w:val="NormalTok"/>
+        </w:rPr>
+        <w:t xml:space="preserve"> </w:t>
+      </w:r>
+      <w:r>
+        <w:rPr>
+          <w:rStyle w:val="DecValTok"/>
+        </w:rPr>
+        <w:t xml:space="preserve">0</w:t>
+      </w:r>
+      <w:r>
+        <w:br w:type="textWrapping"/>
+      </w:r>
+      <w:r>
+        <w:rPr>
+          <w:rStyle w:val="NormalTok"/>
+        </w:rPr>
+        <w:t xml:space="preserve">y[M] </w:t>
+      </w:r>
+      <w:r>
+        <w:rPr>
+          <w:rStyle w:val="OperatorTok"/>
+        </w:rPr>
+        <w:t xml:space="preserve">=</w:t>
+      </w:r>
+      <w:r>
+        <w:rPr>
+          <w:rStyle w:val="NormalTok"/>
+        </w:rPr>
+        <w:t xml:space="preserve"> </w:t>
+      </w:r>
+      <w:r>
+        <w:rPr>
+          <w:rStyle w:val="DecValTok"/>
+        </w:rPr>
+        <w:t xml:space="preserve">0</w:t>
+      </w:r>
+      <w:r>
+        <w:br w:type="textWrapping"/>
+      </w:r>
+      <w:r>
+        <w:rPr>
+          <w:rStyle w:val="NormalTok"/>
+        </w:rPr>
+        <w:t xml:space="preserve">w.append(y[pickup])</w:t>
+      </w:r>
+      <w:r>
+        <w:br w:type="textWrapping"/>
+      </w:r>
+      <w:r>
+        <w:rPr>
+          <w:rStyle w:val="NormalTok"/>
+        </w:rPr>
+        <w:t xml:space="preserve">y_2[:] </w:t>
+      </w:r>
+      <w:r>
+        <w:rPr>
+          <w:rStyle w:val="OperatorTok"/>
+        </w:rPr>
+        <w:t xml:space="preserve">=</w:t>
+      </w:r>
+      <w:r>
+        <w:rPr>
+          <w:rStyle w:val="NormalTok"/>
+        </w:rPr>
+        <w:t xml:space="preserve"> y_1</w:t>
+      </w:r>
+      <w:r>
+        <w:br w:type="textWrapping"/>
+      </w:r>
+      <w:r>
+        <w:rPr>
+          <w:rStyle w:val="NormalTok"/>
+        </w:rPr>
+        <w:t xml:space="preserve">y_1[:] </w:t>
+      </w:r>
+      <w:r>
+        <w:rPr>
+          <w:rStyle w:val="OperatorTok"/>
+        </w:rPr>
+        <w:t xml:space="preserve">=</w:t>
+      </w:r>
+      <w:r>
+        <w:rPr>
+          <w:rStyle w:val="NormalTok"/>
+        </w:rPr>
+        <w:t xml:space="preserve"> y</w:t>
+      </w:r>
+      <w:r>
+        <w:br w:type="textWrapping"/>
+      </w:r>
+      <w:r>
+        <w:rPr>
+          <w:rStyle w:val="NormalTok"/>
+        </w:rPr>
+        <w:t xml:space="preserve">ctr </w:t>
+      </w:r>
+      <w:r>
+        <w:rPr>
+          <w:rStyle w:val="OperatorTok"/>
+        </w:rPr>
+        <w:t xml:space="preserve">+=</w:t>
+      </w:r>
+      <w:r>
+        <w:rPr>
+          <w:rStyle w:val="NormalTok"/>
+        </w:rPr>
+        <w:t xml:space="preserve"> </w:t>
+      </w:r>
+      <w:r>
+        <w:rPr>
+          <w:rStyle w:val="DecValTok"/>
+        </w:rPr>
+        <w:t xml:space="preserve">1</w:t>
+      </w:r>
+      <w:r>
+        <w:br w:type="textWrapping"/>
+      </w:r>
+      <w:r>
+        <w:rPr>
+          <w:rStyle w:val="ControlFlowTok"/>
+        </w:rPr>
+        <w:t xml:space="preserve">for</w:t>
+      </w:r>
+      <w:r>
+        <w:rPr>
+          <w:rStyle w:val="NormalTok"/>
+        </w:rPr>
+        <w:t xml:space="preserve"> j </w:t>
+      </w:r>
+      <w:r>
+        <w:rPr>
+          <w:rStyle w:val="KeywordTok"/>
+        </w:rPr>
+        <w:t xml:space="preserve">in</w:t>
+      </w:r>
+      <w:r>
+        <w:rPr>
+          <w:rStyle w:val="NormalTok"/>
+        </w:rPr>
+        <w:t xml:space="preserve"> </w:t>
+      </w:r>
+      <w:r>
+        <w:rPr>
+          <w:rStyle w:val="BuiltInTok"/>
+        </w:rPr>
+        <w:t xml:space="preserve">range</w:t>
+      </w:r>
+      <w:r>
+        <w:rPr>
+          <w:rStyle w:val="NormalTok"/>
+        </w:rPr>
+        <w:t xml:space="preserve">(</w:t>
+      </w:r>
+      <w:r>
+        <w:rPr>
+          <w:rStyle w:val="DecValTok"/>
+        </w:rPr>
+        <w:t xml:space="preserve">1</w:t>
+      </w:r>
+      <w:r>
+        <w:rPr>
+          <w:rStyle w:val="NormalTok"/>
+        </w:rPr>
+        <w:t xml:space="preserve">, N):</w:t>
+      </w:r>
+      <w:r>
+        <w:br w:type="textWrapping"/>
+      </w:r>
+      <w:r>
+        <w:rPr>
+          <w:rStyle w:val="NormalTok"/>
+        </w:rPr>
+        <w:t xml:space="preserve">  </w:t>
+      </w:r>
+      <w:r>
+        <w:rPr>
+          <w:rStyle w:val="BuiltInTok"/>
+        </w:rPr>
+        <w:t xml:space="preserve">print</w:t>
+      </w:r>
+      <w:r>
+        <w:rPr>
+          <w:rStyle w:val="NormalTok"/>
+        </w:rPr>
+        <w:t xml:space="preserve">(</w:t>
+      </w:r>
+      <w:r>
+        <w:rPr>
+          <w:rStyle w:val="StringTok"/>
+        </w:rPr>
+        <w:t xml:space="preserve">'step '</w:t>
+      </w:r>
+      <w:r>
+        <w:rPr>
+          <w:rStyle w:val="NormalTok"/>
+        </w:rPr>
+        <w:t xml:space="preserve">, ctr,</w:t>
+      </w:r>
+      <w:r>
+        <w:rPr>
+          <w:rStyle w:val="StringTok"/>
+        </w:rPr>
+        <w:t xml:space="preserve">' of '</w:t>
+      </w:r>
+      <w:r>
+        <w:rPr>
+          <w:rStyle w:val="NormalTok"/>
+        </w:rPr>
+        <w:t xml:space="preserve">, N)</w:t>
+      </w:r>
+      <w:r>
+        <w:br w:type="textWrapping"/>
+      </w:r>
+      <w:r>
+        <w:rPr>
+          <w:rStyle w:val="NormalTok"/>
+        </w:rPr>
+        <w:t xml:space="preserve">  </w:t>
+      </w:r>
+      <w:r>
+        <w:rPr>
+          <w:rStyle w:val="ControlFlowTok"/>
+        </w:rPr>
+        <w:t xml:space="preserve">for</w:t>
+      </w:r>
+      <w:r>
+        <w:rPr>
+          <w:rStyle w:val="NormalTok"/>
+        </w:rPr>
+        <w:t xml:space="preserve"> i </w:t>
+      </w:r>
+      <w:r>
+        <w:rPr>
+          <w:rStyle w:val="KeywordTok"/>
+        </w:rPr>
+        <w:t xml:space="preserve">in</w:t>
+      </w:r>
+      <w:r>
+        <w:rPr>
+          <w:rStyle w:val="NormalTok"/>
+        </w:rPr>
+        <w:t xml:space="preserve"> </w:t>
+      </w:r>
+      <w:r>
+        <w:rPr>
+          <w:rStyle w:val="BuiltInTok"/>
+        </w:rPr>
+        <w:t xml:space="preserve">range</w:t>
+      </w:r>
+      <w:r>
+        <w:rPr>
+          <w:rStyle w:val="NormalTok"/>
+        </w:rPr>
+        <w:t xml:space="preserve">(</w:t>
+      </w:r>
+      <w:r>
+        <w:rPr>
+          <w:rStyle w:val="DecValTok"/>
+        </w:rPr>
+        <w:t xml:space="preserve">1</w:t>
+      </w:r>
+      <w:r>
+        <w:rPr>
+          <w:rStyle w:val="NormalTok"/>
+        </w:rPr>
+        <w:t xml:space="preserve">, M):</w:t>
+      </w:r>
+      <w:r>
+        <w:br w:type="textWrapping"/>
+      </w:r>
+      <w:r>
+        <w:rPr>
+          <w:rStyle w:val="NormalTok"/>
+        </w:rPr>
+        <w:t xml:space="preserve">    y[i] </w:t>
+      </w:r>
+      <w:r>
+        <w:rPr>
+          <w:rStyle w:val="OperatorTok"/>
+        </w:rPr>
+        <w:t xml:space="preserve">=</w:t>
+      </w:r>
+      <w:r>
+        <w:rPr>
+          <w:rStyle w:val="NormalTok"/>
+        </w:rPr>
+        <w:t xml:space="preserve"> </w:t>
+      </w:r>
+      <w:r>
+        <w:rPr>
+          <w:rStyle w:val="DecValTok"/>
+        </w:rPr>
+        <w:t xml:space="preserve">2</w:t>
+      </w:r>
+      <w:r>
+        <w:rPr>
+          <w:rStyle w:val="NormalTok"/>
+        </w:rPr>
+        <w:t xml:space="preserve"> </w:t>
+      </w:r>
+      <w:r>
+        <w:rPr>
+          <w:rStyle w:val="OperatorTok"/>
+        </w:rPr>
+        <w:t xml:space="preserve">*</w:t>
+      </w:r>
+      <w:r>
+        <w:rPr>
+          <w:rStyle w:val="NormalTok"/>
+        </w:rPr>
+        <w:t xml:space="preserve"> y_1[i] </w:t>
+      </w:r>
+      <w:r>
+        <w:rPr>
+          <w:rStyle w:val="OperatorTok"/>
+        </w:rPr>
+        <w:t xml:space="preserve">-</w:t>
+      </w:r>
+      <w:r>
+        <w:rPr>
+          <w:rStyle w:val="NormalTok"/>
+        </w:rPr>
+        <w:t xml:space="preserve"> y_2[i] </w:t>
+      </w:r>
+      <w:r>
+        <w:rPr>
+          <w:rStyle w:val="OperatorTok"/>
+        </w:rPr>
+        <w:t xml:space="preserve">+</w:t>
+      </w:r>
+      <w:r>
+        <w:rPr>
+          <w:rStyle w:val="NormalTok"/>
+        </w:rPr>
+        <w:t xml:space="preserve"> C</w:t>
+      </w:r>
+      <w:r>
+        <w:rPr>
+          <w:rStyle w:val="OperatorTok"/>
+        </w:rPr>
+        <w:t xml:space="preserve">**</w:t>
+      </w:r>
+      <w:r>
+        <w:rPr>
+          <w:rStyle w:val="DecValTok"/>
+        </w:rPr>
+        <w:t xml:space="preserve">2</w:t>
+      </w:r>
+      <w:r>
+        <w:rPr>
+          <w:rStyle w:val="NormalTok"/>
+        </w:rPr>
+        <w:t xml:space="preserve"> </w:t>
+      </w:r>
+      <w:r>
+        <w:rPr>
+          <w:rStyle w:val="OperatorTok"/>
+        </w:rPr>
+        <w:t xml:space="preserve">*</w:t>
+      </w:r>
+      <w:r>
+        <w:rPr>
+          <w:rStyle w:val="NormalTok"/>
+        </w:rPr>
+        <w:t xml:space="preserve"> (y_1[i</w:t>
+      </w:r>
+      <w:r>
+        <w:rPr>
+          <w:rStyle w:val="OperatorTok"/>
+        </w:rPr>
+        <w:t xml:space="preserve">+</w:t>
+      </w:r>
+      <w:r>
+        <w:rPr>
+          <w:rStyle w:val="DecValTok"/>
+        </w:rPr>
+        <w:t xml:space="preserve">1</w:t>
+      </w:r>
+      <w:r>
+        <w:rPr>
+          <w:rStyle w:val="NormalTok"/>
+        </w:rPr>
+        <w:t xml:space="preserve">] </w:t>
+      </w:r>
+      <w:r>
+        <w:rPr>
+          <w:rStyle w:val="OperatorTok"/>
+        </w:rPr>
+        <w:t xml:space="preserve">-</w:t>
+      </w:r>
+      <w:r>
+        <w:rPr>
+          <w:rStyle w:val="NormalTok"/>
+        </w:rPr>
+        <w:t xml:space="preserve"> </w:t>
+      </w:r>
+      <w:r>
+        <w:rPr>
+          <w:rStyle w:val="DecValTok"/>
+        </w:rPr>
+        <w:t xml:space="preserve">2</w:t>
+      </w:r>
+      <w:r>
+        <w:rPr>
+          <w:rStyle w:val="OperatorTok"/>
+        </w:rPr>
+        <w:t xml:space="preserve">*</w:t>
+      </w:r>
+      <w:r>
+        <w:rPr>
+          <w:rStyle w:val="NormalTok"/>
+        </w:rPr>
+        <w:t xml:space="preserve">y_1[i] </w:t>
+      </w:r>
+      <w:r>
+        <w:rPr>
+          <w:rStyle w:val="OperatorTok"/>
+        </w:rPr>
+        <w:t xml:space="preserve">+</w:t>
+      </w:r>
+      <w:r>
+        <w:rPr>
+          <w:rStyle w:val="NormalTok"/>
+        </w:rPr>
+        <w:t xml:space="preserve"> y_1[i</w:t>
+      </w:r>
+      <w:r>
+        <w:rPr>
+          <w:rStyle w:val="DecValTok"/>
+        </w:rPr>
+        <w:t xml:space="preserve">-1</w:t>
+      </w:r>
+      <w:r>
+        <w:rPr>
+          <w:rStyle w:val="NormalTok"/>
+        </w:rPr>
+        <w:t xml:space="preserve">])</w:t>
+      </w:r>
+      <w:r>
+        <w:br w:type="textWrapping"/>
+      </w:r>
+      <w:r>
+        <w:rPr>
+          <w:rStyle w:val="NormalTok"/>
+        </w:rPr>
+        <w:t xml:space="preserve">  y[</w:t>
+      </w:r>
+      <w:r>
+        <w:rPr>
+          <w:rStyle w:val="DecValTok"/>
+        </w:rPr>
+        <w:t xml:space="preserve">0</w:t>
+      </w:r>
+      <w:r>
+        <w:rPr>
+          <w:rStyle w:val="NormalTok"/>
+        </w:rPr>
+        <w:t xml:space="preserve">] </w:t>
+      </w:r>
+      <w:r>
+        <w:rPr>
+          <w:rStyle w:val="OperatorTok"/>
+        </w:rPr>
+        <w:t xml:space="preserve">=</w:t>
+      </w:r>
+      <w:r>
+        <w:rPr>
+          <w:rStyle w:val="NormalTok"/>
+        </w:rPr>
+        <w:t xml:space="preserve"> y[</w:t>
+      </w:r>
+      <w:r>
+        <w:rPr>
+          <w:rStyle w:val="DecValTok"/>
+        </w:rPr>
+        <w:t xml:space="preserve">0</w:t>
+      </w:r>
+      <w:r>
+        <w:rPr>
+          <w:rStyle w:val="NormalTok"/>
+        </w:rPr>
+        <w:t xml:space="preserve">] </w:t>
+      </w:r>
+      <w:r>
+        <w:rPr>
+          <w:rStyle w:val="OperatorTok"/>
+        </w:rPr>
+        <w:t xml:space="preserve">*</w:t>
+      </w:r>
+      <w:r>
+        <w:rPr>
+          <w:rStyle w:val="NormalTok"/>
+        </w:rPr>
+        <w:t xml:space="preserve"> </w:t>
+      </w:r>
+      <w:r>
+        <w:rPr>
+          <w:rStyle w:val="FloatTok"/>
+        </w:rPr>
+        <w:t xml:space="preserve">0.5</w:t>
+      </w:r>
+      <w:r>
+        <w:br w:type="textWrapping"/>
+      </w:r>
+      <w:r>
+        <w:rPr>
+          <w:rStyle w:val="NormalTok"/>
+        </w:rPr>
+        <w:t xml:space="preserve">  y[M] </w:t>
+      </w:r>
+      <w:r>
+        <w:rPr>
+          <w:rStyle w:val="OperatorTok"/>
+        </w:rPr>
+        <w:t xml:space="preserve">=</w:t>
+      </w:r>
+      <w:r>
+        <w:rPr>
+          <w:rStyle w:val="NormalTok"/>
+        </w:rPr>
+        <w:t xml:space="preserve"> y[M] </w:t>
+      </w:r>
+      <w:r>
+        <w:rPr>
+          <w:rStyle w:val="OperatorTok"/>
+        </w:rPr>
+        <w:t xml:space="preserve">*</w:t>
+      </w:r>
+      <w:r>
+        <w:rPr>
+          <w:rStyle w:val="NormalTok"/>
+        </w:rPr>
+        <w:t xml:space="preserve"> </w:t>
+      </w:r>
+      <w:r>
+        <w:rPr>
+          <w:rStyle w:val="FloatTok"/>
+        </w:rPr>
+        <w:t xml:space="preserve">0.5</w:t>
+      </w:r>
+      <w:r>
+        <w:br w:type="textWrapping"/>
+      </w:r>
+      <w:r>
+        <w:rPr>
+          <w:rStyle w:val="NormalTok"/>
+        </w:rPr>
+        <w:t xml:space="preserve">  y </w:t>
+      </w:r>
+      <w:r>
+        <w:rPr>
+          <w:rStyle w:val="OperatorTok"/>
+        </w:rPr>
+        <w:t xml:space="preserve">=</w:t>
+      </w:r>
+      <w:r>
+        <w:rPr>
+          <w:rStyle w:val="NormalTok"/>
+        </w:rPr>
+        <w:t xml:space="preserve"> y </w:t>
+      </w:r>
+      <w:r>
+        <w:rPr>
+          <w:rStyle w:val="OperatorTok"/>
+        </w:rPr>
+        <w:t xml:space="preserve">*</w:t>
+      </w:r>
+      <w:r>
+        <w:rPr>
+          <w:rStyle w:val="NormalTok"/>
+        </w:rPr>
+        <w:t xml:space="preserve"> sustain</w:t>
+      </w:r>
+      <w:r>
+        <w:br w:type="textWrapping"/>
+      </w:r>
+      <w:r>
+        <w:rPr>
+          <w:rStyle w:val="NormalTok"/>
+        </w:rPr>
+        <w:t xml:space="preserve">  w.append(y[pickup])</w:t>
+      </w:r>
+      <w:r>
+        <w:br w:type="textWrapping"/>
+      </w:r>
+      <w:r>
+        <w:rPr>
+          <w:rStyle w:val="NormalTok"/>
+        </w:rPr>
+        <w:t xml:space="preserve">  y_2[:] </w:t>
+      </w:r>
+      <w:r>
+        <w:rPr>
+          <w:rStyle w:val="OperatorTok"/>
+        </w:rPr>
+        <w:t xml:space="preserve">=</w:t>
+      </w:r>
+      <w:r>
+        <w:rPr>
+          <w:rStyle w:val="NormalTok"/>
+        </w:rPr>
+        <w:t xml:space="preserve"> y_1 </w:t>
+      </w:r>
+      <w:r>
+        <w:br w:type="textWrapping"/>
+      </w:r>
+      <w:r>
+        <w:rPr>
+          <w:rStyle w:val="NormalTok"/>
+        </w:rPr>
+        <w:t xml:space="preserve">  y_1[:] </w:t>
+      </w:r>
+      <w:r>
+        <w:rPr>
+          <w:rStyle w:val="OperatorTok"/>
+        </w:rPr>
+        <w:t xml:space="preserve">=</w:t>
+      </w:r>
+      <w:r>
+        <w:rPr>
+          <w:rStyle w:val="NormalTok"/>
+        </w:rPr>
+        <w:t xml:space="preserve"> y</w:t>
+      </w:r>
+      <w:r>
+        <w:br w:type="textWrapping"/>
+      </w:r>
+      <w:r>
+        <w:rPr>
+          <w:rStyle w:val="NormalTok"/>
+        </w:rPr>
+        <w:t xml:space="preserve">  ctr </w:t>
+      </w:r>
+      <w:r>
+        <w:rPr>
+          <w:rStyle w:val="OperatorTok"/>
+        </w:rPr>
+        <w:t xml:space="preserve">+=</w:t>
+      </w:r>
+      <w:r>
+        <w:rPr>
+          <w:rStyle w:val="NormalTok"/>
+        </w:rPr>
+        <w:t xml:space="preserve"> </w:t>
+      </w:r>
+      <w:r>
+        <w:rPr>
+          <w:rStyle w:val="DecValTok"/>
+        </w:rPr>
+        <w:t xml:space="preserve">1</w:t>
+      </w:r>
+      <w:r>
+        <w:br w:type="textWrapping"/>
+      </w:r>
+      <w:r>
+        <w:rPr>
+          <w:rStyle w:val="NormalTok"/>
+        </w:rPr>
+        <w:t xml:space="preserve">w </w:t>
+      </w:r>
+      <w:r>
+        <w:rPr>
+          <w:rStyle w:val="OperatorTok"/>
+        </w:rPr>
+        <w:t xml:space="preserve">=</w:t>
+      </w:r>
+      <w:r>
+        <w:rPr>
+          <w:rStyle w:val="NormalTok"/>
+        </w:rPr>
+        <w:t xml:space="preserve"> np.array(w) </w:t>
+      </w:r>
+      <w:r>
+        <w:rPr>
+          <w:rStyle w:val="OperatorTok"/>
+        </w:rPr>
+        <w:t xml:space="preserve">*</w:t>
+      </w:r>
+      <w:r>
+        <w:rPr>
+          <w:rStyle w:val="NormalTok"/>
+        </w:rPr>
+        <w:t xml:space="preserve"> </w:t>
+      </w:r>
+      <w:r>
+        <w:rPr>
+          <w:rStyle w:val="DecValTok"/>
+        </w:rPr>
+        <w:t xml:space="preserve">4000000</w:t>
+      </w:r>
+    </w:p>
+    <w:p>
+      <w:pPr>
+        <w:pStyle w:val="Heading3"/>
+      </w:pPr>
+      <w:bookmarkStart w:id="39" w:name="digital-waveguides"/>
+      <w:r>
+        <w:t xml:space="preserve">Digital Waveguides</w:t>
+      </w:r>
+      <w:bookmarkEnd w:id="39"/>
+    </w:p>
+    <w:p>
+      <w:pPr>
+        <w:pStyle w:val="FirstParagraph"/>
+      </w:pPr>
+      <w:r>
+        <w:t xml:space="preserve">Apresentam uma abordagem simplificada da modelagem física, na medida em que concentram em alguns pontos discretos os cálculos necessários à simulação, aumentando bastante a eficiência computacional do modelo. Conceitualmente, podem ser vistos como uma caso especial do método das diferenças finitas, e a maioria de suas implementações consistem na utilização de</w:t>
+      </w:r>
+      <w:r>
+        <w:t xml:space="preserve"> </w:t>
+      </w:r>
+      <w:r>
+        <w:rPr>
+          <w:i/>
+        </w:rPr>
+        <w:t xml:space="preserve">delay lines</w:t>
+      </w:r>
+      <w:r>
+        <w:t xml:space="preserve"> </w:t>
+      </w:r>
+      <w:r>
+        <w:t xml:space="preserve">e filtros digitais para a modelagem da propagação da onda</w:t>
+      </w:r>
+      <w:r>
+        <w:t xml:space="preserve">(Smith 2006)</w:t>
+      </w:r>
+      <w:r>
+        <w:t xml:space="preserve">.</w:t>
+      </w:r>
+    </w:p>
+    <w:p>
+      <w:pPr>
         <w:pStyle w:val="Heading2"/>
       </w:pPr>
-      <w:bookmarkStart w:id="39" w:name="acústica-e-psicoacústica"/>
+      <w:bookmarkStart w:id="40" w:name="acústica-e-psicoacústica"/>
       <w:r>
         <w:t xml:space="preserve">Acústica e Psicoacústica</w:t>
       </w:r>
-      <w:bookmarkEnd w:id="39"/>
+      <w:bookmarkEnd w:id="40"/>
     </w:p>
     <w:p>
       <w:pPr>
         <w:pStyle w:val="Heading1"/>
       </w:pPr>
-      <w:bookmarkStart w:id="40" w:name="referencial-teórico"/>
+      <w:bookmarkStart w:id="41" w:name="referencial-teórico"/>
       <w:r>
         <w:t xml:space="preserve">Referencial Teórico</w:t>
       </w:r>
-      <w:bookmarkEnd w:id="40"/>
+      <w:bookmarkEnd w:id="41"/>
     </w:p>
     <w:p>
       <w:pPr>
         <w:pStyle w:val="Heading2"/>
       </w:pPr>
-      <w:bookmarkStart w:id="41" w:name="transformada-discreta-de-fourier"/>
+      <w:bookmarkStart w:id="42" w:name="transformada-discreta-de-fourier"/>
       <w:r>
         <w:t xml:space="preserve">Transformada Discreta de Fourier</w:t>
       </w:r>
-      <w:bookmarkEnd w:id="41"/>
+      <w:bookmarkEnd w:id="42"/>
     </w:p>
     <w:p>
       <w:pPr>
@@ -5762,7 +8047,7 @@
                     </pic:cNvPicPr>
                   </pic:nvPicPr>
                   <pic:blipFill>
-                    <a:blip r:embed="rId42"/>
+                    <a:blip r:embed="rId43"/>
                     <a:stretch>
                       <a:fillRect/>
                     </a:stretch>
@@ -6311,11 +8596,11 @@
       <w:pPr>
         <w:pStyle w:val="Heading2"/>
       </w:pPr>
-      <w:bookmarkStart w:id="43" w:name="a-equação-da-onda"/>
+      <w:bookmarkStart w:id="44" w:name="a-equação-da-onda"/>
       <w:r>
         <w:t xml:space="preserve">A Equação da Onda</w:t>
       </w:r>
-      <w:bookmarkEnd w:id="43"/>
+      <w:bookmarkEnd w:id="44"/>
     </w:p>
     <w:p>
       <w:pPr>
@@ -6345,7 +8630,7 @@
                     </pic:cNvPicPr>
                   </pic:nvPicPr>
                   <pic:blipFill>
-                    <a:blip r:embed="rId44"/>
+                    <a:blip r:embed="rId45"/>
                     <a:stretch>
                       <a:fillRect/>
                     </a:stretch>
@@ -8985,11 +11270,11 @@
       <w:pPr>
         <w:pStyle w:val="Heading2"/>
       </w:pPr>
-      <w:bookmarkStart w:id="45" w:name="formalização-de-uma-rede-neural---forward-pass"/>
+      <w:bookmarkStart w:id="46" w:name="formalização-de-uma-rede-neural---forward-pass"/>
       <w:r>
         <w:t xml:space="preserve">Formalização de uma Rede Neural - Forward Pass</w:t>
       </w:r>
-      <w:bookmarkEnd w:id="45"/>
+      <w:bookmarkEnd w:id="46"/>
     </w:p>
     <w:p>
       <w:pPr>
@@ -9019,7 +11304,7 @@
                     </pic:cNvPicPr>
                   </pic:nvPicPr>
                   <pic:blipFill>
-                    <a:blip r:embed="rId46"/>
+                    <a:blip r:embed="rId47"/>
                     <a:stretch>
                       <a:fillRect/>
                     </a:stretch>
@@ -10186,11 +12471,11 @@
       <w:pPr>
         <w:pStyle w:val="Heading2"/>
       </w:pPr>
-      <w:bookmarkStart w:id="47" w:name="formalização-de-uma-rede-neural---backpropagation"/>
+      <w:bookmarkStart w:id="48" w:name="formalização-de-uma-rede-neural---backpropagation"/>
       <w:r>
         <w:t xml:space="preserve">Formalização de uma Rede Neural - Backpropagation</w:t>
       </w:r>
-      <w:bookmarkEnd w:id="47"/>
+      <w:bookmarkEnd w:id="48"/>
     </w:p>
     <w:p>
       <w:pPr>
@@ -10807,7 +13092,7 @@
                     </pic:cNvPicPr>
                   </pic:nvPicPr>
                   <pic:blipFill>
-                    <a:blip r:embed="rId48"/>
+                    <a:blip r:embed="rId49"/>
                     <a:stretch>
                       <a:fillRect/>
                     </a:stretch>
@@ -12440,21 +14725,21 @@
       <w:pPr>
         <w:pStyle w:val="Heading1"/>
       </w:pPr>
-      <w:bookmarkStart w:id="49" w:name="metodologia"/>
+      <w:bookmarkStart w:id="50" w:name="metodologia"/>
       <w:r>
         <w:t xml:space="preserve">Metodologia</w:t>
       </w:r>
-      <w:bookmarkEnd w:id="49"/>
+      <w:bookmarkEnd w:id="50"/>
     </w:p>
     <w:p>
       <w:pPr>
         <w:pStyle w:val="Heading2"/>
       </w:pPr>
-      <w:bookmarkStart w:id="50" w:name="samples-utilizados"/>
+      <w:bookmarkStart w:id="51" w:name="samples-utilizados"/>
       <w:r>
         <w:t xml:space="preserve">Samples Utilizados</w:t>
       </w:r>
-      <w:bookmarkEnd w:id="50"/>
+      <w:bookmarkEnd w:id="51"/>
     </w:p>
     <w:p>
       <w:pPr>
@@ -12488,11 +14773,11 @@
       <w:pPr>
         <w:pStyle w:val="Heading2"/>
       </w:pPr>
-      <w:bookmarkStart w:id="51" w:name="redes-densas"/>
+      <w:bookmarkStart w:id="52" w:name="redes-densas"/>
       <w:r>
         <w:t xml:space="preserve">Redes Densas</w:t>
       </w:r>
-      <w:bookmarkEnd w:id="51"/>
+      <w:bookmarkEnd w:id="52"/>
     </w:p>
     <w:p>
       <w:pPr>
@@ -13020,11 +15305,11 @@
       <w:pPr>
         <w:pStyle w:val="Heading3"/>
       </w:pPr>
-      <w:bookmarkStart w:id="52" w:name="algoritmos-de-otimização"/>
+      <w:bookmarkStart w:id="53" w:name="algoritmos-de-otimização"/>
       <w:r>
         <w:t xml:space="preserve">Algoritmos de Otimização</w:t>
       </w:r>
-      <w:bookmarkEnd w:id="52"/>
+      <w:bookmarkEnd w:id="53"/>
     </w:p>
     <w:p>
       <w:pPr>
@@ -13070,11 +15355,11 @@
       <w:pPr>
         <w:pStyle w:val="Heading3"/>
       </w:pPr>
-      <w:bookmarkStart w:id="53" w:name="grid-search-para-topologia-e-parâmetros"/>
+      <w:bookmarkStart w:id="54" w:name="grid-search-para-topologia-e-parâmetros"/>
       <w:r>
         <w:t xml:space="preserve">Grid search para topologia e parâmetros</w:t>
       </w:r>
-      <w:bookmarkEnd w:id="53"/>
+      <w:bookmarkEnd w:id="54"/>
     </w:p>
     <w:p>
       <w:pPr>
@@ -13088,11 +15373,11 @@
       <w:pPr>
         <w:pStyle w:val="Heading4"/>
       </w:pPr>
-      <w:bookmarkStart w:id="54" w:name="adagrad"/>
+      <w:bookmarkStart w:id="55" w:name="adagrad"/>
       <w:r>
         <w:t xml:space="preserve">Adagrad</w:t>
       </w:r>
-      <w:bookmarkEnd w:id="54"/>
+      <w:bookmarkEnd w:id="55"/>
     </w:p>
     <w:p>
       <w:pPr>
@@ -13156,7 +15441,7 @@
                     </pic:cNvPicPr>
                   </pic:nvPicPr>
                   <pic:blipFill>
-                    <a:blip r:embed="rId55"/>
+                    <a:blip r:embed="rId56"/>
                     <a:stretch>
                       <a:fillRect/>
                     </a:stretch>
@@ -13211,7 +15496,7 @@
                     </pic:cNvPicPr>
                   </pic:nvPicPr>
                   <pic:blipFill>
-                    <a:blip r:embed="rId56"/>
+                    <a:blip r:embed="rId57"/>
                     <a:stretch>
                       <a:fillRect/>
                     </a:stretch>
@@ -13624,11 +15909,11 @@
       <w:pPr>
         <w:pStyle w:val="Heading4"/>
       </w:pPr>
-      <w:bookmarkStart w:id="57" w:name="nadam"/>
+      <w:bookmarkStart w:id="58" w:name="nadam"/>
       <w:r>
         <w:t xml:space="preserve">Nadam</w:t>
       </w:r>
-      <w:bookmarkEnd w:id="57"/>
+      <w:bookmarkEnd w:id="58"/>
     </w:p>
     <w:p>
       <w:pPr>
@@ -13658,7 +15943,7 @@
                     </pic:cNvPicPr>
                   </pic:nvPicPr>
                   <pic:blipFill>
-                    <a:blip r:embed="rId58"/>
+                    <a:blip r:embed="rId59"/>
                     <a:stretch>
                       <a:fillRect/>
                     </a:stretch>
@@ -13713,7 +15998,7 @@
                     </pic:cNvPicPr>
                   </pic:nvPicPr>
                   <pic:blipFill>
-                    <a:blip r:embed="rId59"/>
+                    <a:blip r:embed="rId60"/>
                     <a:stretch>
                       <a:fillRect/>
                     </a:stretch>
@@ -14126,11 +16411,11 @@
       <w:pPr>
         <w:pStyle w:val="Heading4"/>
       </w:pPr>
-      <w:bookmarkStart w:id="60" w:name="ativações-e-otimizadores"/>
+      <w:bookmarkStart w:id="61" w:name="ativações-e-otimizadores"/>
       <w:r>
         <w:t xml:space="preserve">Ativações e Otimizadores</w:t>
       </w:r>
-      <w:bookmarkEnd w:id="60"/>
+      <w:bookmarkEnd w:id="61"/>
     </w:p>
     <w:p>
       <w:pPr>
@@ -14160,7 +16445,7 @@
                     </pic:cNvPicPr>
                   </pic:nvPicPr>
                   <pic:blipFill>
-                    <a:blip r:embed="rId61"/>
+                    <a:blip r:embed="rId62"/>
                     <a:stretch>
                       <a:fillRect/>
                     </a:stretch>
@@ -14207,11 +16492,11 @@
       <w:pPr>
         <w:pStyle w:val="Heading3"/>
       </w:pPr>
-      <w:bookmarkStart w:id="62" w:name="análise-dos-resultados"/>
+      <w:bookmarkStart w:id="63" w:name="análise-dos-resultados"/>
       <w:r>
         <w:t xml:space="preserve">Análise dos resultados</w:t>
       </w:r>
-      <w:bookmarkEnd w:id="62"/>
+      <w:bookmarkEnd w:id="63"/>
     </w:p>
     <w:p>
       <w:pPr>
@@ -14575,7 +16860,7 @@
       <w:r>
         <w:t xml:space="preserve"> </w:t>
       </w:r>
-      <w:hyperlink r:id="rId63">
+      <w:hyperlink r:id="rId64">
         <w:r>
           <w:rPr>
             <w:rStyle w:val="Hyperlink"/>
@@ -14610,7 +16895,7 @@
                     </pic:cNvPicPr>
                   </pic:nvPicPr>
                   <pic:blipFill>
-                    <a:blip r:embed="rId64"/>
+                    <a:blip r:embed="rId65"/>
                     <a:stretch>
                       <a:fillRect/>
                     </a:stretch>
@@ -14673,11 +16958,11 @@
       <w:pPr>
         <w:pStyle w:val="Heading2"/>
       </w:pPr>
-      <w:bookmarkStart w:id="65" w:name="redes-recorrentes-1"/>
+      <w:bookmarkStart w:id="66" w:name="redes-recorrentes-1"/>
       <w:r>
         <w:t xml:space="preserve">Redes Recorrentes</w:t>
       </w:r>
-      <w:bookmarkEnd w:id="65"/>
+      <w:bookmarkEnd w:id="66"/>
     </w:p>
     <w:p>
       <w:pPr>
@@ -14707,7 +16992,7 @@
                     </pic:cNvPicPr>
                   </pic:nvPicPr>
                   <pic:blipFill>
-                    <a:blip r:embed="rId66"/>
+                    <a:blip r:embed="rId67"/>
                     <a:stretch>
                       <a:fillRect/>
                     </a:stretch>
@@ -14770,7 +17055,7 @@
                     </pic:cNvPicPr>
                   </pic:nvPicPr>
                   <pic:blipFill>
-                    <a:blip r:embed="rId67"/>
+                    <a:blip r:embed="rId68"/>
                     <a:stretch>
                       <a:fillRect/>
                     </a:stretch>
@@ -14892,7 +17177,7 @@
                     </pic:cNvPicPr>
                   </pic:nvPicPr>
                   <pic:blipFill>
-                    <a:blip r:embed="rId68"/>
+                    <a:blip r:embed="rId69"/>
                     <a:stretch>
                       <a:fillRect/>
                     </a:stretch>
@@ -14937,7 +17222,7 @@
       <w:r>
         <w:t xml:space="preserve"> </w:t>
       </w:r>
-      <w:hyperlink r:id="rId69">
+      <w:hyperlink r:id="rId70">
         <w:r>
           <w:rPr>
             <w:rStyle w:val="Hyperlink"/>
@@ -14959,7 +17244,7 @@
       <w:r>
         <w:t xml:space="preserve"> </w:t>
       </w:r>
-      <w:hyperlink r:id="rId69">
+      <w:hyperlink r:id="rId70">
         <w:r>
           <w:rPr>
             <w:rStyle w:val="Hyperlink"/>
@@ -14994,7 +17279,7 @@
                     </pic:cNvPicPr>
                   </pic:nvPicPr>
                   <pic:blipFill>
-                    <a:blip r:embed="rId70"/>
+                    <a:blip r:embed="rId71"/>
                     <a:stretch>
                       <a:fillRect/>
                     </a:stretch>
@@ -15041,21 +17326,21 @@
       <w:pPr>
         <w:pStyle w:val="Heading2"/>
       </w:pPr>
-      <w:bookmarkStart w:id="71" w:name="redes-convolucionais-e-convolucionais-recorrentes"/>
+      <w:bookmarkStart w:id="72" w:name="redes-convolucionais-e-convolucionais-recorrentes"/>
       <w:r>
         <w:t xml:space="preserve">Redes Convolucionais e Convolucionais-Recorrentes</w:t>
       </w:r>
-      <w:bookmarkEnd w:id="71"/>
+      <w:bookmarkEnd w:id="72"/>
     </w:p>
     <w:p>
       <w:pPr>
         <w:pStyle w:val="Heading2"/>
       </w:pPr>
-      <w:bookmarkStart w:id="72" w:name="domínio-da-frequência"/>
+      <w:bookmarkStart w:id="73" w:name="domínio-da-frequência"/>
       <w:r>
         <w:t xml:space="preserve">Domínio da Frequência</w:t>
       </w:r>
-      <w:bookmarkEnd w:id="72"/>
+      <w:bookmarkEnd w:id="73"/>
     </w:p>
     <w:p>
       <w:pPr>
@@ -15101,7 +17386,7 @@
                     </pic:cNvPicPr>
                   </pic:nvPicPr>
                   <pic:blipFill>
-                    <a:blip r:embed="rId73"/>
+                    <a:blip r:embed="rId74"/>
                     <a:stretch>
                       <a:fillRect/>
                     </a:stretch>
@@ -15191,7 +17476,7 @@
                     </pic:cNvPicPr>
                   </pic:nvPicPr>
                   <pic:blipFill>
-                    <a:blip r:embed="rId74"/>
+                    <a:blip r:embed="rId75"/>
                     <a:stretch>
                       <a:fillRect/>
                     </a:stretch>
@@ -15280,7 +17565,7 @@
                     </pic:cNvPicPr>
                   </pic:nvPicPr>
                   <pic:blipFill>
-                    <a:blip r:embed="rId75"/>
+                    <a:blip r:embed="rId76"/>
                     <a:stretch>
                       <a:fillRect/>
                     </a:stretch>
@@ -15327,11 +17612,11 @@
       <w:pPr>
         <w:pStyle w:val="Heading2"/>
       </w:pPr>
-      <w:bookmarkStart w:id="76" w:name="modelo-misto"/>
+      <w:bookmarkStart w:id="77" w:name="modelo-misto"/>
       <w:r>
         <w:t xml:space="preserve">Modelo Misto</w:t>
       </w:r>
-      <w:bookmarkEnd w:id="76"/>
+      <w:bookmarkEnd w:id="77"/>
     </w:p>
     <w:p>
       <w:pPr>
@@ -15379,7 +17664,7 @@
                     </pic:cNvPicPr>
                   </pic:nvPicPr>
                   <pic:blipFill>
-                    <a:blip r:embed="rId77"/>
+                    <a:blip r:embed="rId78"/>
                     <a:stretch>
                       <a:fillRect/>
                     </a:stretch>
@@ -15480,7 +17765,7 @@
                     </pic:cNvPicPr>
                   </pic:nvPicPr>
                   <pic:blipFill>
-                    <a:blip r:embed="rId78"/>
+                    <a:blip r:embed="rId79"/>
                     <a:stretch>
                       <a:fillRect/>
                     </a:stretch>
@@ -15527,11 +17812,11 @@
       <w:pPr>
         <w:pStyle w:val="Heading3"/>
       </w:pPr>
-      <w:bookmarkStart w:id="79" w:name="frequências"/>
+      <w:bookmarkStart w:id="80" w:name="frequências"/>
       <w:r>
         <w:t xml:space="preserve">Frequências</w:t>
       </w:r>
-      <w:bookmarkEnd w:id="79"/>
+      <w:bookmarkEnd w:id="80"/>
     </w:p>
     <w:p>
       <w:pPr>
@@ -15747,7 +18032,7 @@
                     </pic:cNvPicPr>
                   </pic:nvPicPr>
                   <pic:blipFill>
-                    <a:blip r:embed="rId80"/>
+                    <a:blip r:embed="rId81"/>
                     <a:stretch>
                       <a:fillRect/>
                     </a:stretch>
@@ -15814,11 +18099,11 @@
       <w:pPr>
         <w:pStyle w:val="Heading3"/>
       </w:pPr>
-      <w:bookmarkStart w:id="81" w:name="decaimentos-e-amplitudes"/>
+      <w:bookmarkStart w:id="82" w:name="decaimentos-e-amplitudes"/>
       <w:r>
         <w:t xml:space="preserve">Decaimentos e Amplitudes</w:t>
       </w:r>
-      <w:bookmarkEnd w:id="81"/>
+      <w:bookmarkEnd w:id="82"/>
     </w:p>
     <w:p>
       <w:pPr>
@@ -16110,7 +18395,7 @@
                     </pic:cNvPicPr>
                   </pic:nvPicPr>
                   <pic:blipFill>
-                    <a:blip r:embed="rId82"/>
+                    <a:blip r:embed="rId83"/>
                     <a:stretch>
                       <a:fillRect/>
                     </a:stretch>
@@ -16163,11 +18448,11 @@
       <w:pPr>
         <w:pStyle w:val="Heading3"/>
       </w:pPr>
-      <w:bookmarkStart w:id="83" w:name="formulação-final"/>
+      <w:bookmarkStart w:id="84" w:name="formulação-final"/>
       <w:r>
         <w:t xml:space="preserve">Formulação Final</w:t>
       </w:r>
-      <w:bookmarkEnd w:id="83"/>
+      <w:bookmarkEnd w:id="84"/>
     </w:p>
     <w:p>
       <w:pPr>
@@ -16509,7 +18794,7 @@
                     </pic:cNvPicPr>
                   </pic:nvPicPr>
                   <pic:blipFill>
-                    <a:blip r:embed="rId84"/>
+                    <a:blip r:embed="rId85"/>
                     <a:stretch>
                       <a:fillRect/>
                     </a:stretch>
@@ -16567,61 +18852,6 @@
                 <pic:pic>
                   <pic:nvPicPr>
                     <pic:cNvPr descr="im/piano_max_decays.png" id="0" name="Picture"/>
-                    <pic:cNvPicPr>
-                      <a:picLocks noChangeArrowheads="1" noChangeAspect="1"/>
-                    </pic:cNvPicPr>
-                  </pic:nvPicPr>
-                  <pic:blipFill>
-                    <a:blip r:embed="rId85"/>
-                    <a:stretch>
-                      <a:fillRect/>
-                    </a:stretch>
-                  </pic:blipFill>
-                  <pic:spPr bwMode="auto">
-                    <a:xfrm>
-                      <a:off x="0" y="0"/>
-                      <a:ext cx="5943600" cy="1188720"/>
-                    </a:xfrm>
-                    <a:prstGeom prst="rect">
-                      <a:avLst/>
-                    </a:prstGeom>
-                    <a:noFill/>
-                    <a:ln w="9525">
-                      <a:noFill/>
-                      <a:headEnd/>
-                      <a:tailEnd/>
-                    </a:ln>
-                  </pic:spPr>
-                </pic:pic>
-              </a:graphicData>
-            </a:graphic>
-          </wp:inline>
-        </w:drawing>
-      </w:r>
-    </w:p>
-    <w:p>
-      <w:pPr>
-        <w:pStyle w:val="ImageCaption"/>
-      </w:pPr>
-      <w:r>
-        <w:t xml:space="preserve">Decaimentos Máximos por Notas</w:t>
-      </w:r>
-    </w:p>
-    <w:p>
-      <w:pPr>
-        <w:pStyle w:val="CaptionedFigure"/>
-      </w:pPr>
-      <w:r>
-        <w:drawing>
-          <wp:inline>
-            <wp:extent cx="5943600" cy="1188720"/>
-            <wp:effectExtent b="0" l="0" r="0" t="0"/>
-            <wp:docPr descr="Amplitudes Máximas por Notas" title="" id="1" name="Picture"/>
-            <a:graphic>
-              <a:graphicData uri="http://schemas.openxmlformats.org/drawingml/2006/picture">
-                <pic:pic>
-                  <pic:nvPicPr>
-                    <pic:cNvPr descr="im/piano_max_amps.png" id="0" name="Picture"/>
                     <pic:cNvPicPr>
                       <a:picLocks noChangeArrowheads="1" noChangeAspect="1"/>
                     </pic:cNvPicPr>
@@ -16659,6 +18889,61 @@
         <w:pStyle w:val="ImageCaption"/>
       </w:pPr>
       <w:r>
+        <w:t xml:space="preserve">Decaimentos Máximos por Notas</w:t>
+      </w:r>
+    </w:p>
+    <w:p>
+      <w:pPr>
+        <w:pStyle w:val="CaptionedFigure"/>
+      </w:pPr>
+      <w:r>
+        <w:drawing>
+          <wp:inline>
+            <wp:extent cx="5943600" cy="1188720"/>
+            <wp:effectExtent b="0" l="0" r="0" t="0"/>
+            <wp:docPr descr="Amplitudes Máximas por Notas" title="" id="1" name="Picture"/>
+            <a:graphic>
+              <a:graphicData uri="http://schemas.openxmlformats.org/drawingml/2006/picture">
+                <pic:pic>
+                  <pic:nvPicPr>
+                    <pic:cNvPr descr="im/piano_max_amps.png" id="0" name="Picture"/>
+                    <pic:cNvPicPr>
+                      <a:picLocks noChangeArrowheads="1" noChangeAspect="1"/>
+                    </pic:cNvPicPr>
+                  </pic:nvPicPr>
+                  <pic:blipFill>
+                    <a:blip r:embed="rId87"/>
+                    <a:stretch>
+                      <a:fillRect/>
+                    </a:stretch>
+                  </pic:blipFill>
+                  <pic:spPr bwMode="auto">
+                    <a:xfrm>
+                      <a:off x="0" y="0"/>
+                      <a:ext cx="5943600" cy="1188720"/>
+                    </a:xfrm>
+                    <a:prstGeom prst="rect">
+                      <a:avLst/>
+                    </a:prstGeom>
+                    <a:noFill/>
+                    <a:ln w="9525">
+                      <a:noFill/>
+                      <a:headEnd/>
+                      <a:tailEnd/>
+                    </a:ln>
+                  </pic:spPr>
+                </pic:pic>
+              </a:graphicData>
+            </a:graphic>
+          </wp:inline>
+        </w:drawing>
+      </w:r>
+    </w:p>
+    <w:p>
+      <w:pPr>
+        <w:pStyle w:val="ImageCaption"/>
+      </w:pPr>
+      <w:r>
         <w:t xml:space="preserve">Amplitudes Máximas por Notas</w:t>
       </w:r>
     </w:p>
@@ -16792,7 +19077,7 @@
                     </pic:cNvPicPr>
                   </pic:nvPicPr>
                   <pic:blipFill>
-                    <a:blip r:embed="rId87"/>
+                    <a:blip r:embed="rId88"/>
                     <a:stretch>
                       <a:fillRect/>
                     </a:stretch>
@@ -16831,34 +19116,34 @@
       <w:pPr>
         <w:pStyle w:val="Heading1"/>
       </w:pPr>
-      <w:bookmarkStart w:id="88" w:name="resultados"/>
+      <w:bookmarkStart w:id="89" w:name="resultados"/>
       <w:r>
         <w:t xml:space="preserve">Resultados</w:t>
       </w:r>
-      <w:bookmarkEnd w:id="88"/>
+      <w:bookmarkEnd w:id="89"/>
     </w:p>
     <w:p>
       <w:pPr>
         <w:pStyle w:val="Heading1"/>
       </w:pPr>
-      <w:bookmarkStart w:id="89" w:name="conclusão"/>
+      <w:bookmarkStart w:id="90" w:name="conclusão"/>
       <w:r>
         <w:t xml:space="preserve">Conclusão</w:t>
       </w:r>
-      <w:bookmarkEnd w:id="89"/>
+      <w:bookmarkEnd w:id="90"/>
     </w:p>
     <w:p>
       <w:pPr>
         <w:pStyle w:val="Heading1"/>
       </w:pPr>
-      <w:bookmarkStart w:id="90" w:name="referências"/>
+      <w:bookmarkStart w:id="91" w:name="referências"/>
       <w:r>
         <w:t xml:space="preserve">Referências</w:t>
       </w:r>
-      <w:bookmarkEnd w:id="90"/>
-    </w:p>
-    <w:bookmarkStart w:id="186" w:name="refs"/>
-    <w:bookmarkStart w:id="91" w:name="ref-balle2016end"/>
+      <w:bookmarkEnd w:id="91"/>
+    </w:p>
+    <w:bookmarkStart w:id="187" w:name="refs"/>
+    <w:bookmarkStart w:id="92" w:name="ref-balle2016end"/>
     <w:p>
       <w:pPr>
         <w:pStyle w:val="Bibliography"/>
@@ -16879,8 +19164,8 @@
         <w:t xml:space="preserve">.</w:t>
       </w:r>
     </w:p>
-    <w:bookmarkEnd w:id="91"/>
-    <w:bookmarkStart w:id="92" w:name="ref-bensa2005computational"/>
+    <w:bookmarkEnd w:id="92"/>
+    <w:bookmarkStart w:id="93" w:name="ref-bensa2005computational"/>
     <w:p>
       <w:pPr>
         <w:pStyle w:val="Bibliography"/>
@@ -16904,8 +19189,8 @@
         <w:t xml:space="preserve">91 (2). S. Hirzel Verlag: 289–98.</w:t>
       </w:r>
     </w:p>
-    <w:bookmarkEnd w:id="92"/>
-    <w:bookmarkStart w:id="93" w:name="ref-bensa2003simulation"/>
+    <w:bookmarkEnd w:id="93"/>
+    <w:bookmarkStart w:id="94" w:name="ref-bensa2003simulation"/>
     <w:p>
       <w:pPr>
         <w:pStyle w:val="Bibliography"/>
@@ -16929,8 +19214,8 @@
         <w:t xml:space="preserve">114 (2). ASA: 1095–1107.</w:t>
       </w:r>
     </w:p>
-    <w:bookmarkEnd w:id="93"/>
-    <w:bookmarkStart w:id="94" w:name="ref-bishop06"/>
+    <w:bookmarkEnd w:id="94"/>
+    <w:bookmarkStart w:id="95" w:name="ref-bishop06"/>
     <w:p>
       <w:pPr>
         <w:pStyle w:val="Bibliography"/>
@@ -16951,8 +19236,8 @@
         <w:t xml:space="preserve">. springer.</w:t>
       </w:r>
     </w:p>
-    <w:bookmarkEnd w:id="94"/>
-    <w:bookmarkStart w:id="95" w:name="ref-boulanger2013high"/>
+    <w:bookmarkEnd w:id="95"/>
+    <w:bookmarkStart w:id="96" w:name="ref-boulanger2013high"/>
     <w:p>
       <w:pPr>
         <w:pStyle w:val="Bibliography"/>
@@ -16973,8 +19258,8 @@
         <w:t xml:space="preserve">, 3178–82. IEEE.</w:t>
       </w:r>
     </w:p>
-    <w:bookmarkEnd w:id="95"/>
-    <w:bookmarkStart w:id="96" w:name="ref-boulanger2014phone"/>
+    <w:bookmarkEnd w:id="96"/>
+    <w:bookmarkStart w:id="97" w:name="ref-boulanger2014phone"/>
     <w:p>
       <w:pPr>
         <w:pStyle w:val="Bibliography"/>
@@ -16995,8 +19280,8 @@
         <w:t xml:space="preserve">, 5417–21. IEEE.</w:t>
       </w:r>
     </w:p>
-    <w:bookmarkEnd w:id="96"/>
-    <w:bookmarkStart w:id="97" w:name="ref-bovermann2016musical"/>
+    <w:bookmarkEnd w:id="97"/>
+    <w:bookmarkStart w:id="98" w:name="ref-bovermann2016musical"/>
     <w:p>
       <w:pPr>
         <w:pStyle w:val="Bibliography"/>
@@ -17017,8 +19302,8 @@
         <w:t xml:space="preserve">. Springer.</w:t>
       </w:r>
     </w:p>
-    <w:bookmarkEnd w:id="97"/>
-    <w:bookmarkStart w:id="98" w:name="ref-bock2012polyphonic"/>
+    <w:bookmarkEnd w:id="98"/>
+    <w:bookmarkStart w:id="99" w:name="ref-bock2012polyphonic"/>
     <w:p>
       <w:pPr>
         <w:pStyle w:val="Bibliography"/>
@@ -17039,8 +19324,8 @@
         <w:t xml:space="preserve">, 121–24. IEEE.</w:t>
       </w:r>
     </w:p>
-    <w:bookmarkEnd w:id="98"/>
-    <w:bookmarkStart w:id="99" w:name="ref-choi2016automatic"/>
+    <w:bookmarkEnd w:id="99"/>
+    <w:bookmarkStart w:id="100" w:name="ref-choi2016automatic"/>
     <w:p>
       <w:pPr>
         <w:pStyle w:val="Bibliography"/>
@@ -17061,8 +19346,8 @@
         <w:t xml:space="preserve">.</w:t>
       </w:r>
     </w:p>
-    <w:bookmarkEnd w:id="99"/>
-    <w:bookmarkStart w:id="100" w:name="ref-choi2017convolutional"/>
+    <w:bookmarkEnd w:id="100"/>
+    <w:bookmarkStart w:id="101" w:name="ref-choi2017convolutional"/>
     <w:p>
       <w:pPr>
         <w:pStyle w:val="Bibliography"/>
@@ -17083,8 +19368,8 @@
         <w:t xml:space="preserve">, 2392–6. IEEE.</w:t>
       </w:r>
     </w:p>
-    <w:bookmarkEnd w:id="100"/>
-    <w:bookmarkStart w:id="101" w:name="ref-costa2017evaluation"/>
+    <w:bookmarkEnd w:id="101"/>
+    <w:bookmarkStart w:id="102" w:name="ref-costa2017evaluation"/>
     <w:p>
       <w:pPr>
         <w:pStyle w:val="Bibliography"/>
@@ -17108,8 +19393,8 @@
         <w:t xml:space="preserve">52. Elsevier: 28–38.</w:t>
       </w:r>
     </w:p>
-    <w:bookmarkEnd w:id="101"/>
-    <w:bookmarkStart w:id="102" w:name="ref-dalgleish2014blurring"/>
+    <w:bookmarkEnd w:id="102"/>
+    <w:bookmarkStart w:id="103" w:name="ref-dalgleish2014blurring"/>
     <w:p>
       <w:pPr>
         <w:pStyle w:val="Bibliography"/>
@@ -17118,8 +19403,8 @@
         <w:t xml:space="preserve">Dalgleish, Mathew, Steve Spencer, and Chris Foster. 2014. “BLURRING the Lines: AN Integrated Compositional Model for Digital Musical Instrument Design.” In. Proceedings of the 9th Conference on Interdisciplinary Musicology. CIM14. Berlin, Germany.</w:t>
       </w:r>
     </w:p>
-    <w:bookmarkEnd w:id="102"/>
-    <w:bookmarkStart w:id="103" w:name="ref-elman1990finding"/>
+    <w:bookmarkEnd w:id="103"/>
+    <w:bookmarkStart w:id="104" w:name="ref-elman1990finding"/>
     <w:p>
       <w:pPr>
         <w:pStyle w:val="Bibliography"/>
@@ -17143,8 +19428,8 @@
         <w:t xml:space="preserve">14 (2). Wiley Online Library: 179–211.</w:t>
       </w:r>
     </w:p>
-    <w:bookmarkEnd w:id="103"/>
-    <w:bookmarkStart w:id="104" w:name="ref-engel2017neural"/>
+    <w:bookmarkEnd w:id="104"/>
+    <w:bookmarkStart w:id="105" w:name="ref-engel2017neural"/>
     <w:p>
       <w:pPr>
         <w:pStyle w:val="Bibliography"/>
@@ -17165,8 +19450,8 @@
         <w:t xml:space="preserve">.</w:t>
       </w:r>
     </w:p>
-    <w:bookmarkEnd w:id="104"/>
-    <w:bookmarkStart w:id="105" w:name="ref-forgeard2008practicing"/>
+    <w:bookmarkEnd w:id="105"/>
+    <w:bookmarkStart w:id="106" w:name="ref-forgeard2008practicing"/>
     <w:p>
       <w:pPr>
         <w:pStyle w:val="Bibliography"/>
@@ -17190,8 +19475,8 @@
         <w:t xml:space="preserve">3 (10). Public Library of Science: e3566.</w:t>
       </w:r>
     </w:p>
-    <w:bookmarkEnd w:id="105"/>
-    <w:bookmarkStart w:id="106" w:name="ref-frans2017outline"/>
+    <w:bookmarkEnd w:id="106"/>
+    <w:bookmarkStart w:id="107" w:name="ref-frans2017outline"/>
     <w:p>
       <w:pPr>
         <w:pStyle w:val="Bibliography"/>
@@ -17212,8 +19497,8 @@
         <w:t xml:space="preserve">.</w:t>
       </w:r>
     </w:p>
-    <w:bookmarkEnd w:id="106"/>
-    <w:bookmarkStart w:id="107" w:name="ref-gatys2016image"/>
+    <w:bookmarkEnd w:id="107"/>
+    <w:bookmarkStart w:id="108" w:name="ref-gatys2016image"/>
     <w:p>
       <w:pPr>
         <w:pStyle w:val="Bibliography"/>
@@ -17234,8 +19519,8 @@
         <w:t xml:space="preserve">, 2414–23.</w:t>
       </w:r>
     </w:p>
-    <w:bookmarkEnd w:id="107"/>
-    <w:bookmarkStart w:id="108" w:name="ref-goldberg2016primer"/>
+    <w:bookmarkEnd w:id="108"/>
+    <w:bookmarkStart w:id="109" w:name="ref-goldberg2016primer"/>
     <w:p>
       <w:pPr>
         <w:pStyle w:val="Bibliography"/>
@@ -17259,8 +19544,8 @@
         <w:t xml:space="preserve">57: 345–420.</w:t>
       </w:r>
     </w:p>
-    <w:bookmarkEnd w:id="108"/>
-    <w:bookmarkStart w:id="110" w:name="ref-cnnmoney"/>
+    <w:bookmarkEnd w:id="109"/>
+    <w:bookmarkStart w:id="111" w:name="ref-cnnmoney"/>
     <w:p>
       <w:pPr>
         <w:pStyle w:val="Bibliography"/>
@@ -17283,7 +19568,7 @@
       <w:r>
         <w:t xml:space="preserve"> </w:t>
       </w:r>
-      <w:hyperlink r:id="rId109">
+      <w:hyperlink r:id="rId110">
         <w:r>
           <w:rPr>
             <w:rStyle w:val="Hyperlink"/>
@@ -17295,8 +19580,8 @@
         <w:t xml:space="preserve">.</w:t>
       </w:r>
     </w:p>
-    <w:bookmarkEnd w:id="110"/>
-    <w:bookmarkStart w:id="111" w:name="ref-gracia2016wave"/>
+    <w:bookmarkEnd w:id="111"/>
+    <w:bookmarkStart w:id="112" w:name="ref-gracia2016wave"/>
     <w:p>
       <w:pPr>
         <w:pStyle w:val="Bibliography"/>
@@ -17317,8 +19602,8 @@
         <w:t xml:space="preserve">.</w:t>
       </w:r>
     </w:p>
-    <w:bookmarkEnd w:id="111"/>
-    <w:bookmarkStart w:id="112" w:name="ref-graves2013speech"/>
+    <w:bookmarkEnd w:id="112"/>
+    <w:bookmarkStart w:id="113" w:name="ref-graves2013speech"/>
     <w:p>
       <w:pPr>
         <w:pStyle w:val="Bibliography"/>
@@ -17339,8 +19624,8 @@
         <w:t xml:space="preserve">, 6645–9. IEEE.</w:t>
       </w:r>
     </w:p>
-    <w:bookmarkEnd w:id="112"/>
-    <w:bookmarkStart w:id="113" w:name="ref-gregor2016towards"/>
+    <w:bookmarkEnd w:id="113"/>
+    <w:bookmarkStart w:id="114" w:name="ref-gregor2016towards"/>
     <w:p>
       <w:pPr>
         <w:pStyle w:val="Bibliography"/>
@@ -17361,8 +19646,8 @@
         <w:t xml:space="preserve">, 3549–57.</w:t>
       </w:r>
     </w:p>
-    <w:bookmarkEnd w:id="113"/>
-    <w:bookmarkStart w:id="114" w:name="ref-grinstein2017audio"/>
+    <w:bookmarkEnd w:id="114"/>
+    <w:bookmarkStart w:id="115" w:name="ref-grinstein2017audio"/>
     <w:p>
       <w:pPr>
         <w:pStyle w:val="Bibliography"/>
@@ -17383,8 +19668,8 @@
         <w:t xml:space="preserve">.</w:t>
       </w:r>
     </w:p>
-    <w:bookmarkEnd w:id="114"/>
-    <w:bookmarkStart w:id="115" w:name="ref-hagan1996neural"/>
+    <w:bookmarkEnd w:id="115"/>
+    <w:bookmarkStart w:id="116" w:name="ref-hagan1996neural"/>
     <w:p>
       <w:pPr>
         <w:pStyle w:val="Bibliography"/>
@@ -17405,8 +19690,8 @@
         <w:t xml:space="preserve">. Vol. 20. Pws Pub. Boston.</w:t>
       </w:r>
     </w:p>
-    <w:bookmarkEnd w:id="115"/>
-    <w:bookmarkStart w:id="116" w:name="ref-he2015multimodal"/>
+    <w:bookmarkEnd w:id="116"/>
+    <w:bookmarkStart w:id="117" w:name="ref-he2015multimodal"/>
     <w:p>
       <w:pPr>
         <w:pStyle w:val="Bibliography"/>
@@ -17427,8 +19712,8 @@
         <w:t xml:space="preserve">, 73–80. ACM.</w:t>
       </w:r>
     </w:p>
-    <w:bookmarkEnd w:id="116"/>
-    <w:bookmarkStart w:id="117" w:name="ref-hinton2012deep"/>
+    <w:bookmarkEnd w:id="117"/>
+    <w:bookmarkStart w:id="118" w:name="ref-hinton2012deep"/>
     <w:p>
       <w:pPr>
         <w:pStyle w:val="Bibliography"/>
@@ -17452,8 +19737,8 @@
         <w:t xml:space="preserve">29 (6). IEEE: 82–97.</w:t>
       </w:r>
     </w:p>
-    <w:bookmarkEnd w:id="117"/>
-    <w:bookmarkStart w:id="118" w:name="ref-hornik91"/>
+    <w:bookmarkEnd w:id="118"/>
+    <w:bookmarkStart w:id="119" w:name="ref-hornik91"/>
     <w:p>
       <w:pPr>
         <w:pStyle w:val="Bibliography"/>
@@ -17477,8 +19762,8 @@
         <w:t xml:space="preserve">4 (2). Elsevier: 251–57.</w:t>
       </w:r>
     </w:p>
-    <w:bookmarkEnd w:id="118"/>
-    <w:bookmarkStart w:id="119" w:name="ref-hornik89"/>
+    <w:bookmarkEnd w:id="119"/>
+    <w:bookmarkStart w:id="120" w:name="ref-hornik89"/>
     <w:p>
       <w:pPr>
         <w:pStyle w:val="Bibliography"/>
@@ -17502,8 +19787,8 @@
         <w:t xml:space="preserve">2 (5). Elsevier: 359–66.</w:t>
       </w:r>
     </w:p>
-    <w:bookmarkEnd w:id="119"/>
-    <w:bookmarkStart w:id="120" w:name="ref-hutchings2017talking"/>
+    <w:bookmarkEnd w:id="120"/>
+    <w:bookmarkStart w:id="121" w:name="ref-hutchings2017talking"/>
     <w:p>
       <w:pPr>
         <w:pStyle w:val="Bibliography"/>
@@ -17524,8 +19809,8 @@
         <w:t xml:space="preserve">.</w:t>
       </w:r>
     </w:p>
-    <w:bookmarkEnd w:id="120"/>
-    <w:bookmarkStart w:id="121" w:name="ref-hwangimage"/>
+    <w:bookmarkEnd w:id="121"/>
+    <w:bookmarkStart w:id="122" w:name="ref-hwangimage"/>
     <w:p>
       <w:pPr>
         <w:pStyle w:val="Bibliography"/>
@@ -17534,8 +19819,8 @@
         <w:t xml:space="preserve">Hwang, Jeff, and You Zhou. 2016. “Image Colorization with Deep Convolutional Neural Networks.”</w:t>
       </w:r>
     </w:p>
-    <w:bookmarkEnd w:id="121"/>
-    <w:bookmarkStart w:id="122" w:name="ref-iizuka2016let"/>
+    <w:bookmarkEnd w:id="122"/>
+    <w:bookmarkStart w:id="123" w:name="ref-iizuka2016let"/>
     <w:p>
       <w:pPr>
         <w:pStyle w:val="Bibliography"/>
@@ -17559,8 +19844,8 @@
         <w:t xml:space="preserve">35 (4). ACM: 110.</w:t>
       </w:r>
     </w:p>
-    <w:bookmarkEnd w:id="122"/>
-    <w:bookmarkStart w:id="123" w:name="ref-isola2016image"/>
+    <w:bookmarkEnd w:id="123"/>
+    <w:bookmarkStart w:id="124" w:name="ref-isola2016image"/>
     <w:p>
       <w:pPr>
         <w:pStyle w:val="Bibliography"/>
@@ -17581,8 +19866,8 @@
         <w:t xml:space="preserve">.</w:t>
       </w:r>
     </w:p>
-    <w:bookmarkEnd w:id="123"/>
-    <w:bookmarkStart w:id="124" w:name="ref-jiang1999image"/>
+    <w:bookmarkEnd w:id="124"/>
+    <w:bookmarkStart w:id="125" w:name="ref-jiang1999image"/>
     <w:p>
       <w:pPr>
         <w:pStyle w:val="Bibliography"/>
@@ -17606,8 +19891,8 @@
         <w:t xml:space="preserve">14 (9). Elsevier: 737–60.</w:t>
       </w:r>
     </w:p>
-    <w:bookmarkEnd w:id="124"/>
-    <w:bookmarkStart w:id="125" w:name="ref-johnston2017improved"/>
+    <w:bookmarkEnd w:id="125"/>
+    <w:bookmarkStart w:id="126" w:name="ref-johnston2017improved"/>
     <w:p>
       <w:pPr>
         <w:pStyle w:val="Bibliography"/>
@@ -17628,8 +19913,8 @@
         <w:t xml:space="preserve">.</w:t>
       </w:r>
     </w:p>
-    <w:bookmarkEnd w:id="125"/>
-    <w:bookmarkStart w:id="126" w:name="ref-karjalainen2004digital"/>
+    <w:bookmarkEnd w:id="126"/>
+    <w:bookmarkStart w:id="127" w:name="ref-karjalainen2004digital"/>
     <w:p>
       <w:pPr>
         <w:pStyle w:val="Bibliography"/>
@@ -17653,8 +19938,8 @@
         <w:t xml:space="preserve">2004. Hindawi Publishing Corp.: 978–89.</w:t>
       </w:r>
     </w:p>
-    <w:bookmarkEnd w:id="126"/>
-    <w:bookmarkStart w:id="127" w:name="ref-karpathy2014large"/>
+    <w:bookmarkEnd w:id="127"/>
+    <w:bookmarkStart w:id="128" w:name="ref-karpathy2014large"/>
     <w:p>
       <w:pPr>
         <w:pStyle w:val="Bibliography"/>
@@ -17675,8 +19960,8 @@
         <w:t xml:space="preserve">, 1725–32.</w:t>
       </w:r>
     </w:p>
-    <w:bookmarkEnd w:id="127"/>
-    <w:bookmarkStart w:id="128" w:name="ref-khorrami2016deep"/>
+    <w:bookmarkEnd w:id="128"/>
+    <w:bookmarkStart w:id="129" w:name="ref-khorrami2016deep"/>
     <w:p>
       <w:pPr>
         <w:pStyle w:val="Bibliography"/>
@@ -17697,8 +19982,8 @@
         <w:t xml:space="preserve">, 619–23. IEEE.</w:t>
       </w:r>
     </w:p>
-    <w:bookmarkEnd w:id="128"/>
-    <w:bookmarkStart w:id="129" w:name="ref-kulkarni2015deep"/>
+    <w:bookmarkEnd w:id="129"/>
+    <w:bookmarkStart w:id="130" w:name="ref-kulkarni2015deep"/>
     <w:p>
       <w:pPr>
         <w:pStyle w:val="Bibliography"/>
@@ -17719,8 +20004,8 @@
         <w:t xml:space="preserve">, 2539–47.</w:t>
       </w:r>
     </w:p>
-    <w:bookmarkEnd w:id="129"/>
-    <w:bookmarkStart w:id="130" w:name="ref-larsson2016learning"/>
+    <w:bookmarkEnd w:id="130"/>
+    <w:bookmarkStart w:id="131" w:name="ref-larsson2016learning"/>
     <w:p>
       <w:pPr>
         <w:pStyle w:val="Bibliography"/>
@@ -17741,8 +20026,8 @@
         <w:t xml:space="preserve">, 577–93. Springer.</w:t>
       </w:r>
     </w:p>
-    <w:bookmarkEnd w:id="130"/>
-    <w:bookmarkStart w:id="131" w:name="ref-lecun1998gradient"/>
+    <w:bookmarkEnd w:id="131"/>
+    <w:bookmarkStart w:id="132" w:name="ref-lecun1998gradient"/>
     <w:p>
       <w:pPr>
         <w:pStyle w:val="Bibliography"/>
@@ -17766,8 +20051,8 @@
         <w:t xml:space="preserve">86 (11). IEEE: 2278–2324.</w:t>
       </w:r>
     </w:p>
-    <w:bookmarkEnd w:id="131"/>
-    <w:bookmarkStart w:id="132" w:name="ref-leshno93"/>
+    <w:bookmarkEnd w:id="132"/>
+    <w:bookmarkStart w:id="133" w:name="ref-leshno93"/>
     <w:p>
       <w:pPr>
         <w:pStyle w:val="Bibliography"/>
@@ -17791,8 +20076,8 @@
         <w:t xml:space="preserve">6 (6). Elsevier: 861–67.</w:t>
       </w:r>
     </w:p>
-    <w:bookmarkEnd w:id="132"/>
-    <w:bookmarkStart w:id="133" w:name="ref-lyons2011understanding"/>
+    <w:bookmarkEnd w:id="133"/>
+    <w:bookmarkStart w:id="134" w:name="ref-lyons2011understanding"/>
     <w:p>
       <w:pPr>
         <w:pStyle w:val="Bibliography"/>
@@ -17813,8 +20098,8 @@
         <w:t xml:space="preserve">. Pearson Education India.</w:t>
       </w:r>
     </w:p>
-    <w:bookmarkEnd w:id="133"/>
-    <w:bookmarkStart w:id="134" w:name="ref-maas2013rectifier"/>
+    <w:bookmarkEnd w:id="134"/>
+    <w:bookmarkStart w:id="135" w:name="ref-maas2013rectifier"/>
     <w:p>
       <w:pPr>
         <w:pStyle w:val="Bibliography"/>
@@ -17835,8 +20120,8 @@
         <w:t xml:space="preserve">. Vol. 30. 1.</w:t>
       </w:r>
     </w:p>
-    <w:bookmarkEnd w:id="134"/>
-    <w:bookmarkStart w:id="135" w:name="ref-mcculloch1943logical"/>
+    <w:bookmarkEnd w:id="135"/>
+    <w:bookmarkStart w:id="136" w:name="ref-mcculloch1943logical"/>
     <w:p>
       <w:pPr>
         <w:pStyle w:val="Bibliography"/>
@@ -17860,8 +20145,8 @@
         <w:t xml:space="preserve">5 (4). Springer: 115–33.</w:t>
       </w:r>
     </w:p>
-    <w:bookmarkEnd w:id="135"/>
-    <w:bookmarkStart w:id="136" w:name="ref-minski1969perceptrons"/>
+    <w:bookmarkEnd w:id="136"/>
+    <w:bookmarkStart w:id="137" w:name="ref-minski1969perceptrons"/>
     <w:p>
       <w:pPr>
         <w:pStyle w:val="Bibliography"/>
@@ -17882,8 +20167,8 @@
         <w:t xml:space="preserve">.</w:t>
       </w:r>
     </w:p>
-    <w:bookmarkEnd w:id="136"/>
-    <w:bookmarkStart w:id="137" w:name="ref-mital2017time"/>
+    <w:bookmarkEnd w:id="137"/>
+    <w:bookmarkStart w:id="138" w:name="ref-mital2017time"/>
     <w:p>
       <w:pPr>
         <w:pStyle w:val="Bibliography"/>
@@ -17904,8 +20189,8 @@
         <w:t xml:space="preserve">.</w:t>
       </w:r>
     </w:p>
-    <w:bookmarkEnd w:id="137"/>
-    <w:bookmarkStart w:id="138" w:name="ref-mizutani2000derivation"/>
+    <w:bookmarkEnd w:id="138"/>
+    <w:bookmarkStart w:id="139" w:name="ref-mizutani2000derivation"/>
     <w:p>
       <w:pPr>
         <w:pStyle w:val="Bibliography"/>
@@ -17926,8 +20211,8 @@
         <w:t xml:space="preserve">, 2:167–72. IEEE.</w:t>
       </w:r>
     </w:p>
-    <w:bookmarkEnd w:id="138"/>
-    <w:bookmarkStart w:id="139" w:name="ref-oord2016pixel"/>
+    <w:bookmarkEnd w:id="139"/>
+    <w:bookmarkStart w:id="140" w:name="ref-oord2016pixel"/>
     <w:p>
       <w:pPr>
         <w:pStyle w:val="Bibliography"/>
@@ -17948,8 +20233,8 @@
         <w:t xml:space="preserve">.</w:t>
       </w:r>
     </w:p>
-    <w:bookmarkEnd w:id="139"/>
-    <w:bookmarkStart w:id="140" w:name="ref-van2016conditional"/>
+    <w:bookmarkEnd w:id="140"/>
+    <w:bookmarkStart w:id="141" w:name="ref-van2016conditional"/>
     <w:p>
       <w:pPr>
         <w:pStyle w:val="Bibliography"/>
@@ -17970,8 +20255,8 @@
         <w:t xml:space="preserve">, 4790–8.</w:t>
       </w:r>
     </w:p>
-    <w:bookmarkEnd w:id="140"/>
-    <w:bookmarkStart w:id="141" w:name="ref-pang2017convolution"/>
+    <w:bookmarkEnd w:id="141"/>
+    <w:bookmarkStart w:id="142" w:name="ref-pang2017convolution"/>
     <w:p>
       <w:pPr>
         <w:pStyle w:val="Bibliography"/>
@@ -17992,8 +20277,8 @@
         <w:t xml:space="preserve">. IEEE.</w:t>
       </w:r>
     </w:p>
-    <w:bookmarkEnd w:id="141"/>
-    <w:bookmarkStart w:id="142" w:name="ref-parker1985learning"/>
+    <w:bookmarkEnd w:id="142"/>
+    <w:bookmarkStart w:id="143" w:name="ref-parker1985learning"/>
     <w:p>
       <w:pPr>
         <w:pStyle w:val="Bibliography"/>
@@ -18002,8 +20287,8 @@
         <w:t xml:space="preserve">Parker, David B. 1985. “Learning Logic.”</w:t>
       </w:r>
     </w:p>
-    <w:bookmarkEnd w:id="142"/>
-    <w:bookmarkStart w:id="143" w:name="ref-pfalz2018generating"/>
+    <w:bookmarkEnd w:id="143"/>
+    <w:bookmarkStart w:id="144" w:name="ref-pfalz2018generating"/>
     <w:p>
       <w:pPr>
         <w:pStyle w:val="Bibliography"/>
@@ -18012,8 +20297,8 @@
         <w:t xml:space="preserve">Pfalz, Andrew. 2018. “Generating Audio Using Recurrent Neural Networks.”</w:t>
       </w:r>
     </w:p>
-    <w:bookmarkEnd w:id="143"/>
-    <w:bookmarkStart w:id="144" w:name="ref-rehman2014image"/>
+    <w:bookmarkEnd w:id="144"/>
+    <w:bookmarkStart w:id="145" w:name="ref-rehman2014image"/>
     <w:p>
       <w:pPr>
         <w:pStyle w:val="Bibliography"/>
@@ -18037,8 +20322,8 @@
         <w:t xml:space="preserve">7 (4). Maxwell Science Publishing: 656–72.</w:t>
       </w:r>
     </w:p>
-    <w:bookmarkEnd w:id="144"/>
-    <w:bookmarkStart w:id="145" w:name="ref-reiffenstein2006codification"/>
+    <w:bookmarkEnd w:id="145"/>
+    <w:bookmarkStart w:id="146" w:name="ref-reiffenstein2006codification"/>
     <w:p>
       <w:pPr>
         <w:pStyle w:val="Bibliography"/>
@@ -18062,8 +20347,8 @@
         <w:t xml:space="preserve">50 (3). Wiley Online Library: 298–318.</w:t>
       </w:r>
     </w:p>
-    <w:bookmarkEnd w:id="145"/>
-    <w:bookmarkStart w:id="146" w:name="ref-rigaud2013parametric"/>
+    <w:bookmarkEnd w:id="146"/>
+    <w:bookmarkStart w:id="147" w:name="ref-rigaud2013parametric"/>
     <w:p>
       <w:pPr>
         <w:pStyle w:val="Bibliography"/>
@@ -18087,8 +20372,8 @@
         <w:t xml:space="preserve">133 (5). ASA: 3107–18.</w:t>
       </w:r>
     </w:p>
-    <w:bookmarkEnd w:id="146"/>
-    <w:bookmarkStart w:id="147" w:name="ref-Rosenblatt57"/>
+    <w:bookmarkEnd w:id="147"/>
+    <w:bookmarkStart w:id="148" w:name="ref-Rosenblatt57"/>
     <w:p>
       <w:pPr>
         <w:pStyle w:val="Bibliography"/>
@@ -18109,8 +20394,8 @@
         <w:t xml:space="preserve">. Cornell Aeronautical Laboratory.</w:t>
       </w:r>
     </w:p>
-    <w:bookmarkEnd w:id="147"/>
-    <w:bookmarkStart w:id="148" w:name="ref-rosenblatt1958perceptron"/>
+    <w:bookmarkEnd w:id="148"/>
+    <w:bookmarkStart w:id="149" w:name="ref-rosenblatt1958perceptron"/>
     <w:p>
       <w:pPr>
         <w:pStyle w:val="Bibliography"/>
@@ -18134,8 +20419,8 @@
         <w:t xml:space="preserve">65 (6). American Psychological Association: 386.</w:t>
       </w:r>
     </w:p>
-    <w:bookmarkEnd w:id="148"/>
-    <w:bookmarkStart w:id="149" w:name="ref-rumelhart1985learning"/>
+    <w:bookmarkEnd w:id="149"/>
+    <w:bookmarkStart w:id="150" w:name="ref-rumelhart1985learning"/>
     <w:p>
       <w:pPr>
         <w:pStyle w:val="Bibliography"/>
@@ -18144,8 +20429,8 @@
         <w:t xml:space="preserve">Rumelhart, David E, Geoffrey E Hinton, and Ronald J Williams. 1985. “Learning Internal Representations by Error Propagation.” California Univ San Diego La Jolla Inst for Cognitive Science.</w:t>
       </w:r>
     </w:p>
-    <w:bookmarkEnd w:id="149"/>
-    <w:bookmarkStart w:id="150" w:name="ref-sainath2015deep"/>
+    <w:bookmarkEnd w:id="150"/>
+    <w:bookmarkStart w:id="151" w:name="ref-sainath2015deep"/>
     <w:p>
       <w:pPr>
         <w:pStyle w:val="Bibliography"/>
@@ -18169,8 +20454,8 @@
         <w:t xml:space="preserve">64. Elsevier: 39–48.</w:t>
       </w:r>
     </w:p>
-    <w:bookmarkEnd w:id="150"/>
-    <w:bookmarkStart w:id="151" w:name="ref-sak2015fast"/>
+    <w:bookmarkEnd w:id="151"/>
+    <w:bookmarkStart w:id="152" w:name="ref-sak2015fast"/>
     <w:p>
       <w:pPr>
         <w:pStyle w:val="Bibliography"/>
@@ -18191,8 +20476,8 @@
         <w:t xml:space="preserve">.</w:t>
       </w:r>
     </w:p>
-    <w:bookmarkEnd w:id="151"/>
-    <w:bookmarkStart w:id="152" w:name="ref-salsa2016partial"/>
+    <w:bookmarkEnd w:id="152"/>
+    <w:bookmarkStart w:id="153" w:name="ref-salsa2016partial"/>
     <w:p>
       <w:pPr>
         <w:pStyle w:val="Bibliography"/>
@@ -18213,8 +20498,8 @@
         <w:t xml:space="preserve">. Vol. 99. Springer.</w:t>
       </w:r>
     </w:p>
-    <w:bookmarkEnd w:id="152"/>
-    <w:bookmarkStart w:id="153" w:name="ref-sangkloy2016scribbler"/>
+    <w:bookmarkEnd w:id="153"/>
+    <w:bookmarkStart w:id="154" w:name="ref-sangkloy2016scribbler"/>
     <w:p>
       <w:pPr>
         <w:pStyle w:val="Bibliography"/>
@@ -18235,8 +20520,8 @@
         <w:t xml:space="preserve">.</w:t>
       </w:r>
     </w:p>
-    <w:bookmarkEnd w:id="153"/>
-    <w:bookmarkStart w:id="154" w:name="ref-santurkar2017generative"/>
+    <w:bookmarkEnd w:id="154"/>
+    <w:bookmarkStart w:id="155" w:name="ref-santurkar2017generative"/>
     <w:p>
       <w:pPr>
         <w:pStyle w:val="Bibliography"/>
@@ -18257,8 +20542,8 @@
         <w:t xml:space="preserve">.</w:t>
       </w:r>
     </w:p>
-    <w:bookmarkEnd w:id="154"/>
-    <w:bookmarkStart w:id="155" w:name="ref-sarroff2014musical"/>
+    <w:bookmarkEnd w:id="155"/>
+    <w:bookmarkStart w:id="156" w:name="ref-sarroff2014musical"/>
     <w:p>
       <w:pPr>
         <w:pStyle w:val="Bibliography"/>
@@ -18279,8 +20564,8 @@
         <w:t xml:space="preserve">.</w:t>
       </w:r>
     </w:p>
-    <w:bookmarkEnd w:id="155"/>
-    <w:bookmarkStart w:id="156" w:name="ref-serra2007state"/>
+    <w:bookmarkEnd w:id="156"/>
+    <w:bookmarkStart w:id="157" w:name="ref-serra2007state"/>
     <w:p>
       <w:pPr>
         <w:pStyle w:val="Bibliography"/>
@@ -18301,8 +20586,8 @@
         <w:t xml:space="preserve">, 9–12. IEEE.</w:t>
       </w:r>
     </w:p>
-    <w:bookmarkEnd w:id="156"/>
-    <w:bookmarkStart w:id="157" w:name="ref-sigtia2016end"/>
+    <w:bookmarkEnd w:id="157"/>
+    <w:bookmarkStart w:id="158" w:name="ref-sigtia2016end"/>
     <w:p>
       <w:pPr>
         <w:pStyle w:val="Bibliography"/>
@@ -18326,8 +20611,8 @@
         <w:t xml:space="preserve">24 (5). IEEE Press: 927–39.</w:t>
       </w:r>
     </w:p>
-    <w:bookmarkEnd w:id="157"/>
-    <w:bookmarkStart w:id="158" w:name="ref-smith2006basic"/>
+    <w:bookmarkEnd w:id="158"/>
+    <w:bookmarkStart w:id="159" w:name="ref-smith2006basic"/>
     <w:p>
       <w:pPr>
         <w:pStyle w:val="Bibliography"/>
@@ -18348,8 +20633,8 @@
         <w:t xml:space="preserve">.</w:t>
       </w:r>
     </w:p>
-    <w:bookmarkEnd w:id="158"/>
-    <w:bookmarkStart w:id="159" w:name="ref-smith1992physical"/>
+    <w:bookmarkEnd w:id="159"/>
+    <w:bookmarkStart w:id="160" w:name="ref-smith1992physical"/>
     <w:p>
       <w:pPr>
         <w:pStyle w:val="Bibliography"/>
@@ -18373,8 +20658,8 @@
         <w:t xml:space="preserve">16 (4). JSTOR: 74–91.</w:t>
       </w:r>
     </w:p>
-    <w:bookmarkEnd w:id="159"/>
-    <w:bookmarkStart w:id="160" w:name="ref-socher2014recursive"/>
+    <w:bookmarkEnd w:id="160"/>
+    <w:bookmarkStart w:id="161" w:name="ref-socher2014recursive"/>
     <w:p>
       <w:pPr>
         <w:pStyle w:val="Bibliography"/>
@@ -18383,8 +20668,8 @@
         <w:t xml:space="preserve">Socher, Richard. 2014. “Recursive Deep Learning for Natural Language Processing and Computer Vision.” Citeseer.</w:t>
       </w:r>
     </w:p>
-    <w:bookmarkEnd w:id="160"/>
-    <w:bookmarkStart w:id="161" w:name="ref-southall2016automatic"/>
+    <w:bookmarkEnd w:id="161"/>
+    <w:bookmarkStart w:id="162" w:name="ref-southall2016automatic"/>
     <w:p>
       <w:pPr>
         <w:pStyle w:val="Bibliography"/>
@@ -18405,8 +20690,8 @@
         <w:t xml:space="preserve">, 591–97.</w:t>
       </w:r>
     </w:p>
-    <w:bookmarkEnd w:id="161"/>
-    <w:bookmarkStart w:id="162" w:name="ref-stanley2007compositional"/>
+    <w:bookmarkEnd w:id="162"/>
+    <w:bookmarkStart w:id="163" w:name="ref-stanley2007compositional"/>
     <w:p>
       <w:pPr>
         <w:pStyle w:val="Bibliography"/>
@@ -18430,8 +20715,8 @@
         <w:t xml:space="preserve">8 (2). Springer: 131–62.</w:t>
       </w:r>
     </w:p>
-    <w:bookmarkEnd w:id="162"/>
-    <w:bookmarkStart w:id="163" w:name="ref-staudt2016development"/>
+    <w:bookmarkEnd w:id="163"/>
+    <w:bookmarkStart w:id="164" w:name="ref-staudt2016development"/>
     <w:p>
       <w:pPr>
         <w:pStyle w:val="Bibliography"/>
@@ -18440,8 +20725,8 @@
         <w:t xml:space="preserve">Staudt, Pascal. 2016. “Development of a Digital Musical Instrument with Embedded Sound Synthesis.”</w:t>
       </w:r>
     </w:p>
-    <w:bookmarkEnd w:id="163"/>
-    <w:bookmarkStart w:id="164" w:name="ref-theis2015generative"/>
+    <w:bookmarkEnd w:id="164"/>
+    <w:bookmarkStart w:id="165" w:name="ref-theis2015generative"/>
     <w:p>
       <w:pPr>
         <w:pStyle w:val="Bibliography"/>
@@ -18462,8 +20747,8 @@
         <w:t xml:space="preserve">, 1927–35.</w:t>
       </w:r>
     </w:p>
-    <w:bookmarkEnd w:id="164"/>
-    <w:bookmarkStart w:id="165" w:name="ref-theis2017lossy"/>
+    <w:bookmarkEnd w:id="165"/>
+    <w:bookmarkStart w:id="166" w:name="ref-theis2017lossy"/>
     <w:p>
       <w:pPr>
         <w:pStyle w:val="Bibliography"/>
@@ -18484,8 +20769,8 @@
         <w:t xml:space="preserve">.</w:t>
       </w:r>
     </w:p>
-    <w:bookmarkEnd w:id="165"/>
-    <w:bookmarkStart w:id="166" w:name="ref-toderici2015variable"/>
+    <w:bookmarkEnd w:id="166"/>
+    <w:bookmarkStart w:id="167" w:name="ref-toderici2015variable"/>
     <w:p>
       <w:pPr>
         <w:pStyle w:val="Bibliography"/>
@@ -18506,8 +20791,8 @@
         <w:t xml:space="preserve">.</w:t>
       </w:r>
     </w:p>
-    <w:bookmarkEnd w:id="166"/>
-    <w:bookmarkStart w:id="167" w:name="ref-toderici2016full"/>
+    <w:bookmarkEnd w:id="167"/>
+    <w:bookmarkStart w:id="168" w:name="ref-toderici2016full"/>
     <w:p>
       <w:pPr>
         <w:pStyle w:val="Bibliography"/>
@@ -18528,8 +20813,8 @@
         <w:t xml:space="preserve">.</w:t>
       </w:r>
     </w:p>
-    <w:bookmarkEnd w:id="167"/>
-    <w:bookmarkStart w:id="168" w:name="ref-tuohy2006evolved"/>
+    <w:bookmarkEnd w:id="168"/>
+    <w:bookmarkStart w:id="169" w:name="ref-tuohy2006evolved"/>
     <w:p>
       <w:pPr>
         <w:pStyle w:val="Bibliography"/>
@@ -18550,8 +20835,8 @@
         <w:t xml:space="preserve">.</w:t>
       </w:r>
     </w:p>
-    <w:bookmarkEnd w:id="168"/>
-    <w:bookmarkStart w:id="169" w:name="ref-van2016wavenet"/>
+    <w:bookmarkEnd w:id="169"/>
+    <w:bookmarkStart w:id="170" w:name="ref-van2016wavenet"/>
     <w:p>
       <w:pPr>
         <w:pStyle w:val="Bibliography"/>
@@ -18572,8 +20857,8 @@
         <w:t xml:space="preserve">.</w:t>
       </w:r>
     </w:p>
-    <w:bookmarkEnd w:id="169"/>
-    <w:bookmarkStart w:id="170" w:name="ref-vaughn2000music"/>
+    <w:bookmarkEnd w:id="170"/>
+    <w:bookmarkStart w:id="171" w:name="ref-vaughn2000music"/>
     <w:p>
       <w:pPr>
         <w:pStyle w:val="Bibliography"/>
@@ -18597,8 +20882,8 @@
         <w:t xml:space="preserve">34 (3/4). JSTOR: 149–66.</w:t>
       </w:r>
     </w:p>
-    <w:bookmarkEnd w:id="170"/>
-    <w:bookmarkStart w:id="171" w:name="ref-veit2016residual"/>
+    <w:bookmarkEnd w:id="171"/>
+    <w:bookmarkStart w:id="172" w:name="ref-veit2016residual"/>
     <w:p>
       <w:pPr>
         <w:pStyle w:val="Bibliography"/>
@@ -18619,8 +20904,8 @@
         <w:t xml:space="preserve">, 550–58.</w:t>
       </w:r>
     </w:p>
-    <w:bookmarkEnd w:id="171"/>
-    <w:bookmarkStart w:id="172" w:name="ref-wang2015image"/>
+    <w:bookmarkEnd w:id="172"/>
+    <w:bookmarkStart w:id="173" w:name="ref-wang2015image"/>
     <w:p>
       <w:pPr>
         <w:pStyle w:val="Bibliography"/>
@@ -18644,8 +20929,8 @@
         <w:t xml:space="preserve">13 (1): 137–45.</w:t>
       </w:r>
     </w:p>
-    <w:bookmarkEnd w:id="172"/>
-    <w:bookmarkStart w:id="173" w:name="ref-widrow1960adaptive"/>
+    <w:bookmarkEnd w:id="173"/>
+    <w:bookmarkStart w:id="174" w:name="ref-widrow1960adaptive"/>
     <w:p>
       <w:pPr>
         <w:pStyle w:val="Bibliography"/>
@@ -18654,8 +20939,8 @@
         <w:t xml:space="preserve">Widrow, Bernard, and Marcian E Hoff. 1960. “Adaptive Switching Circuits.” STANFORD UNIV CA STANFORD ELECTRONICS LABS.</w:t>
       </w:r>
     </w:p>
-    <w:bookmarkEnd w:id="173"/>
-    <w:bookmarkStart w:id="174" w:name="ref-widrow199030"/>
+    <w:bookmarkEnd w:id="174"/>
+    <w:bookmarkStart w:id="175" w:name="ref-widrow199030"/>
     <w:p>
       <w:pPr>
         <w:pStyle w:val="Bibliography"/>
@@ -18679,8 +20964,8 @@
         <w:t xml:space="preserve">78 (9). IEEE: 1415–42.</w:t>
       </w:r>
     </w:p>
-    <w:bookmarkEnd w:id="174"/>
-    <w:bookmarkStart w:id="175" w:name="ref-wu2016investigating"/>
+    <w:bookmarkEnd w:id="175"/>
+    <w:bookmarkStart w:id="176" w:name="ref-wu2016investigating"/>
     <w:p>
       <w:pPr>
         <w:pStyle w:val="Bibliography"/>
@@ -18701,8 +20986,8 @@
         <w:t xml:space="preserve">, 5140–4. IEEE.</w:t>
       </w:r>
     </w:p>
-    <w:bookmarkEnd w:id="175"/>
-    <w:bookmarkStart w:id="176" w:name="ref-xu2015ccg"/>
+    <w:bookmarkEnd w:id="176"/>
+    <w:bookmarkStart w:id="177" w:name="ref-xu2015ccg"/>
     <w:p>
       <w:pPr>
         <w:pStyle w:val="Bibliography"/>
@@ -18723,8 +21008,8 @@
         <w:t xml:space="preserve">, 250–55.</w:t>
       </w:r>
     </w:p>
-    <w:bookmarkEnd w:id="176"/>
-    <w:bookmarkStart w:id="177" w:name="ref-yadav2015introduction"/>
+    <w:bookmarkEnd w:id="177"/>
+    <w:bookmarkStart w:id="178" w:name="ref-yadav2015introduction"/>
     <w:p>
       <w:pPr>
         <w:pStyle w:val="Bibliography"/>
@@ -18745,8 +21030,8 @@
         <w:t xml:space="preserve">. Springer.</w:t>
       </w:r>
     </w:p>
-    <w:bookmarkEnd w:id="177"/>
-    <w:bookmarkStart w:id="179" w:name="ref-Yang2017"/>
+    <w:bookmarkEnd w:id="178"/>
+    <w:bookmarkStart w:id="180" w:name="ref-Yang2017"/>
     <w:p>
       <w:pPr>
         <w:pStyle w:val="Bibliography"/>
@@ -18757,7 +21042,7 @@
       <w:r>
         <w:t xml:space="preserve"> </w:t>
       </w:r>
-      <w:hyperlink r:id="rId178">
+      <w:hyperlink r:id="rId179">
         <w:r>
           <w:rPr>
             <w:rStyle w:val="Hyperlink"/>
@@ -18769,8 +21054,8 @@
         <w:t xml:space="preserve">.</w:t>
       </w:r>
     </w:p>
-    <w:bookmarkEnd w:id="179"/>
-    <w:bookmarkStart w:id="180" w:name="ref-zen2015unidirectional"/>
+    <w:bookmarkEnd w:id="180"/>
+    <w:bookmarkStart w:id="181" w:name="ref-zen2015unidirectional"/>
     <w:p>
       <w:pPr>
         <w:pStyle w:val="Bibliography"/>
@@ -18791,8 +21076,8 @@
         <w:t xml:space="preserve">, 4470–4. IEEE.</w:t>
       </w:r>
     </w:p>
-    <w:bookmarkEnd w:id="180"/>
-    <w:bookmarkStart w:id="181" w:name="ref-zhang2016colorful"/>
+    <w:bookmarkEnd w:id="181"/>
+    <w:bookmarkStart w:id="182" w:name="ref-zhang2016colorful"/>
     <w:p>
       <w:pPr>
         <w:pStyle w:val="Bibliography"/>
@@ -18813,8 +21098,8 @@
         <w:t xml:space="preserve">, 649–66. Springer.</w:t>
       </w:r>
     </w:p>
-    <w:bookmarkEnd w:id="181"/>
-    <w:bookmarkStart w:id="182" w:name="ref-zhang2017towards"/>
+    <w:bookmarkEnd w:id="182"/>
+    <w:bookmarkStart w:id="183" w:name="ref-zhang2017towards"/>
     <w:p>
       <w:pPr>
         <w:pStyle w:val="Bibliography"/>
@@ -18835,8 +21120,8 @@
         <w:t xml:space="preserve">.</w:t>
       </w:r>
     </w:p>
-    <w:bookmarkEnd w:id="182"/>
-    <w:bookmarkStart w:id="183" w:name="ref-zhang2017very"/>
+    <w:bookmarkEnd w:id="183"/>
+    <w:bookmarkStart w:id="184" w:name="ref-zhang2017very"/>
     <w:p>
       <w:pPr>
         <w:pStyle w:val="Bibliography"/>
@@ -18857,8 +21142,8 @@
         <w:t xml:space="preserve">, 4845–9. IEEE.</w:t>
       </w:r>
     </w:p>
-    <w:bookmarkEnd w:id="183"/>
-    <w:bookmarkStart w:id="184" w:name="ref-zhu2016generative"/>
+    <w:bookmarkEnd w:id="184"/>
+    <w:bookmarkStart w:id="185" w:name="ref-zhu2016generative"/>
     <w:p>
       <w:pPr>
         <w:pStyle w:val="Bibliography"/>
@@ -18879,8 +21164,8 @@
         <w:t xml:space="preserve">, 597–613. Springer.</w:t>
       </w:r>
     </w:p>
-    <w:bookmarkEnd w:id="184"/>
-    <w:bookmarkStart w:id="185" w:name="ref-zweig2017advances"/>
+    <w:bookmarkEnd w:id="185"/>
+    <w:bookmarkStart w:id="186" w:name="ref-zweig2017advances"/>
     <w:p>
       <w:pPr>
         <w:pStyle w:val="Bibliography"/>
@@ -18901,8 +21186,8 @@
         <w:t xml:space="preserve">, 4805–9. IEEE.</w:t>
       </w:r>
     </w:p>
-    <w:bookmarkEnd w:id="185"/>
     <w:bookmarkEnd w:id="186"/>
+    <w:bookmarkEnd w:id="187"/>
     <w:sectPr>
       <w:pgSz w:w="12240" w:h="15840"/>
       <w:pgMar w:top="1440" w:right="1440" w:bottom="1440" w:left="1440" w:header="720" w:footer="720" w:gutter="0"/>

</xml_diff>

<commit_message>
novo index.html:testando o player de video
</commit_message>
<xml_diff>
--- a/Dissert.docx
+++ b/Dissert.docx
@@ -4350,7 +4350,7 @@
         <w:pStyle w:val="BodyText"/>
       </w:pPr>
       <w:r>
-        <w:t xml:space="preserve">O fragmento de implementação abaixo ajuda a entender o funcionamento do algoritmo (o código que segue é ilustrativo; uma implementação funcional pode ser encontrada no repositório dedicado ao trabalho, no arquivo</w:t>
+        <w:t xml:space="preserve">O fragmento de implementação abaixo, na linguagem Python, ajuda a entender o funcionamento do algoritmo (o código que segue é ilustrativo; uma implementação funcional pode ser encontrada no repositório dedicado ao trabalho, no arquivo</w:t>
       </w:r>
       <w:r>
         <w:t xml:space="preserve"> </w:t>
@@ -6621,20 +6621,35 @@
     </w:p>
     <w:p>
       <w:pPr>
+        <w:pStyle w:val="FirstParagraph"/>
+      </w:pPr>
+      <w:r>
+        <w:t xml:space="preserve">Uma animação de uma onda de 440 hz criada pela implementação acima pode ser encontrado no repositório da dissertação, na pasta</w:t>
+      </w:r>
+      <w:r>
+        <w:t xml:space="preserve"> </w:t>
+      </w:r>
+      <w:hyperlink r:id="rId39"/>
+      <w:r>
+        <w:t xml:space="preserve">, junto com áudios de diversas ondas, com local de excitação e captação variados. É interessante observar o efeito da variação desses parametros no timbre da onda sonora gerada.</w:t>
+      </w:r>
+    </w:p>
+    <w:p>
+      <w:pPr>
         <w:pStyle w:val="Heading3"/>
       </w:pPr>
-      <w:bookmarkStart w:id="39" w:name="digital-waveguides"/>
+      <w:bookmarkStart w:id="40" w:name="digital-waveguides"/>
       <w:r>
         <w:t xml:space="preserve">Digital Waveguides</w:t>
       </w:r>
-      <w:bookmarkEnd w:id="39"/>
+      <w:bookmarkEnd w:id="40"/>
     </w:p>
     <w:p>
       <w:pPr>
         <w:pStyle w:val="FirstParagraph"/>
       </w:pPr>
       <w:r>
-        <w:t xml:space="preserve">Apresentam uma abordagem simplificada da modelagem física, na medida em que concentram em alguns pontos discretos os cálculos necessários à simulação, aumentando bastante a eficiência computacional do modelo. Conceitualmente, podem ser vistos como uma caso especial do método das diferenças finitas, e a maioria de suas implementações consistem na utilização de</w:t>
+        <w:t xml:space="preserve">Apresentam uma abordagem simplificada da modelagem física, na medida em que concentram em alguns pontos discretos os cálculos necessários à simulação, aumentando bastante a eficiência computacional do modelo. Conceitualmente, podem ser vistos como uma caso especial do método das diferenças finitas apresentado anteriormente, e a maioria de suas implementações consistem na utilização de</w:t>
       </w:r>
       <w:r>
         <w:t xml:space="preserve"> </w:t>
@@ -6655,38 +6670,38 @@
         <w:t xml:space="preserve">(Smith 2006)</w:t>
       </w:r>
       <w:r>
-        <w:t xml:space="preserve">.</w:t>
+        <w:t xml:space="preserve">. A discretização segue a linha descrita no contexto do método das diferenças finitas, e</w:t>
       </w:r>
     </w:p>
     <w:p>
       <w:pPr>
         <w:pStyle w:val="Heading2"/>
       </w:pPr>
-      <w:bookmarkStart w:id="40" w:name="acústica-e-psicoacústica"/>
+      <w:bookmarkStart w:id="41" w:name="acústica-e-psicoacústica"/>
       <w:r>
         <w:t xml:space="preserve">Acústica e Psicoacústica</w:t>
       </w:r>
-      <w:bookmarkEnd w:id="40"/>
+      <w:bookmarkEnd w:id="41"/>
     </w:p>
     <w:p>
       <w:pPr>
         <w:pStyle w:val="Heading1"/>
       </w:pPr>
-      <w:bookmarkStart w:id="41" w:name="referencial-teórico"/>
+      <w:bookmarkStart w:id="42" w:name="referencial-teórico"/>
       <w:r>
         <w:t xml:space="preserve">Referencial Teórico</w:t>
       </w:r>
-      <w:bookmarkEnd w:id="41"/>
+      <w:bookmarkEnd w:id="42"/>
     </w:p>
     <w:p>
       <w:pPr>
         <w:pStyle w:val="Heading2"/>
       </w:pPr>
-      <w:bookmarkStart w:id="42" w:name="transformada-discreta-de-fourier"/>
+      <w:bookmarkStart w:id="43" w:name="transformada-discreta-de-fourier"/>
       <w:r>
         <w:t xml:space="preserve">Transformada Discreta de Fourier</w:t>
       </w:r>
-      <w:bookmarkEnd w:id="42"/>
+      <w:bookmarkEnd w:id="43"/>
     </w:p>
     <w:p>
       <w:pPr>
@@ -8047,7 +8062,7 @@
                     </pic:cNvPicPr>
                   </pic:nvPicPr>
                   <pic:blipFill>
-                    <a:blip r:embed="rId43"/>
+                    <a:blip r:embed="rId44"/>
                     <a:stretch>
                       <a:fillRect/>
                     </a:stretch>
@@ -8116,491 +8131,2171 @@
       </w:pPr>
       <w:r>
         <w:rPr>
-          <w:rStyle w:val="VerbatimChar"/>
-        </w:rPr>
-        <w:t xml:space="preserve">import numpy as np</w:t>
+          <w:rStyle w:val="ImportTok"/>
+        </w:rPr>
+        <w:t xml:space="preserve">import</w:t>
+      </w:r>
+      <w:r>
+        <w:rPr>
+          <w:rStyle w:val="NormalTok"/>
+        </w:rPr>
+        <w:t xml:space="preserve"> numpy </w:t>
+      </w:r>
+      <w:r>
+        <w:rPr>
+          <w:rStyle w:val="ImportTok"/>
+        </w:rPr>
+        <w:t xml:space="preserve">as</w:t>
+      </w:r>
+      <w:r>
+        <w:rPr>
+          <w:rStyle w:val="NormalTok"/>
+        </w:rPr>
+        <w:t xml:space="preserve"> np</w:t>
       </w:r>
       <w:r>
         <w:br w:type="textWrapping"/>
       </w:r>
       <w:r>
         <w:rPr>
-          <w:rStyle w:val="VerbatimChar"/>
-        </w:rPr>
-        <w:t xml:space="preserve">import matplotlib.pyplot as plt</w:t>
+          <w:rStyle w:val="ImportTok"/>
+        </w:rPr>
+        <w:t xml:space="preserve">import</w:t>
+      </w:r>
+      <w:r>
+        <w:rPr>
+          <w:rStyle w:val="NormalTok"/>
+        </w:rPr>
+        <w:t xml:space="preserve"> matplotlib.pyplot </w:t>
+      </w:r>
+      <w:r>
+        <w:rPr>
+          <w:rStyle w:val="ImportTok"/>
+        </w:rPr>
+        <w:t xml:space="preserve">as</w:t>
+      </w:r>
+      <w:r>
+        <w:rPr>
+          <w:rStyle w:val="NormalTok"/>
+        </w:rPr>
+        <w:t xml:space="preserve"> plt</w:t>
       </w:r>
       <w:r>
         <w:br w:type="textWrapping"/>
       </w:r>
       <w:r>
         <w:rPr>
-          <w:rStyle w:val="VerbatimChar"/>
-        </w:rPr>
-        <w:t xml:space="preserve">from scipy.fftpack import fft</w:t>
+          <w:rStyle w:val="ImportTok"/>
+        </w:rPr>
+        <w:t xml:space="preserve">from</w:t>
+      </w:r>
+      <w:r>
+        <w:rPr>
+          <w:rStyle w:val="NormalTok"/>
+        </w:rPr>
+        <w:t xml:space="preserve"> scipy.fftpack </w:t>
+      </w:r>
+      <w:r>
+        <w:rPr>
+          <w:rStyle w:val="ImportTok"/>
+        </w:rPr>
+        <w:t xml:space="preserve">import</w:t>
+      </w:r>
+      <w:r>
+        <w:rPr>
+          <w:rStyle w:val="NormalTok"/>
+        </w:rPr>
+        <w:t xml:space="preserve"> fft</w:t>
       </w:r>
       <w:r>
         <w:br w:type="textWrapping"/>
       </w:r>
       <w:r>
+        <w:rPr>
+          <w:rStyle w:val="CommentTok"/>
+        </w:rPr>
+        <w:t xml:space="preserve"># Discrete Fourier Transform | Transformada Discreta de Fourier</w:t>
+      </w:r>
+      <w:r>
         <w:br w:type="textWrapping"/>
       </w:r>
       <w:r>
         <w:rPr>
-          <w:rStyle w:val="VerbatimChar"/>
-        </w:rPr>
-        <w:t xml:space="preserve"># Discrete Fourier Transform | Transformada Discreta de Fourier</w:t>
+          <w:rStyle w:val="KeywordTok"/>
+        </w:rPr>
+        <w:t xml:space="preserve">def</w:t>
+      </w:r>
+      <w:r>
+        <w:rPr>
+          <w:rStyle w:val="NormalTok"/>
+        </w:rPr>
+        <w:t xml:space="preserve"> DFT(x):</w:t>
       </w:r>
       <w:r>
         <w:br w:type="textWrapping"/>
       </w:r>
       <w:r>
         <w:rPr>
-          <w:rStyle w:val="VerbatimChar"/>
-        </w:rPr>
-        <w:t xml:space="preserve">def DFT(x):</w:t>
+          <w:rStyle w:val="NormalTok"/>
+        </w:rPr>
+        <w:t xml:space="preserve">  N </w:t>
+      </w:r>
+      <w:r>
+        <w:rPr>
+          <w:rStyle w:val="OperatorTok"/>
+        </w:rPr>
+        <w:t xml:space="preserve">=</w:t>
+      </w:r>
+      <w:r>
+        <w:rPr>
+          <w:rStyle w:val="NormalTok"/>
+        </w:rPr>
+        <w:t xml:space="preserve"> x.shape[</w:t>
+      </w:r>
+      <w:r>
+        <w:rPr>
+          <w:rStyle w:val="DecValTok"/>
+        </w:rPr>
+        <w:t xml:space="preserve">0</w:t>
+      </w:r>
+      <w:r>
+        <w:rPr>
+          <w:rStyle w:val="NormalTok"/>
+        </w:rPr>
+        <w:t xml:space="preserve">]</w:t>
       </w:r>
       <w:r>
         <w:br w:type="textWrapping"/>
       </w:r>
       <w:r>
         <w:rPr>
-          <w:rStyle w:val="VerbatimChar"/>
-        </w:rPr>
-        <w:t xml:space="preserve">  N = x.shape[0]</w:t>
+          <w:rStyle w:val="NormalTok"/>
+        </w:rPr>
+        <w:t xml:space="preserve">  </w:t>
+      </w:r>
+      <w:r>
+        <w:rPr>
+          <w:rStyle w:val="CommentTok"/>
+        </w:rPr>
+        <w:t xml:space="preserve"># cria um vetor de N entradas complexas, preenchido com zeros</w:t>
       </w:r>
       <w:r>
         <w:br w:type="textWrapping"/>
       </w:r>
       <w:r>
         <w:rPr>
-          <w:rStyle w:val="VerbatimChar"/>
-        </w:rPr>
-        <w:t xml:space="preserve">  # cria um vetor de N entradas complexas, preenchido com zeros</w:t>
+          <w:rStyle w:val="NormalTok"/>
+        </w:rPr>
+        <w:t xml:space="preserve">  X </w:t>
+      </w:r>
+      <w:r>
+        <w:rPr>
+          <w:rStyle w:val="OperatorTok"/>
+        </w:rPr>
+        <w:t xml:space="preserve">=</w:t>
+      </w:r>
+      <w:r>
+        <w:rPr>
+          <w:rStyle w:val="NormalTok"/>
+        </w:rPr>
+        <w:t xml:space="preserve"> np.zeros(N, dtype</w:t>
+      </w:r>
+      <w:r>
+        <w:rPr>
+          <w:rStyle w:val="OperatorTok"/>
+        </w:rPr>
+        <w:t xml:space="preserve">=</w:t>
+      </w:r>
+      <w:r>
+        <w:rPr>
+          <w:rStyle w:val="StringTok"/>
+        </w:rPr>
+        <w:t xml:space="preserve">'complex64'</w:t>
+      </w:r>
+      <w:r>
+        <w:rPr>
+          <w:rStyle w:val="NormalTok"/>
+        </w:rPr>
+        <w:t xml:space="preserve">)</w:t>
       </w:r>
       <w:r>
         <w:br w:type="textWrapping"/>
       </w:r>
       <w:r>
         <w:rPr>
-          <w:rStyle w:val="VerbatimChar"/>
-        </w:rPr>
-        <w:t xml:space="preserve">  X = np.zeros(N, dtype='complex64')</w:t>
+          <w:rStyle w:val="NormalTok"/>
+        </w:rPr>
+        <w:t xml:space="preserve">  n </w:t>
+      </w:r>
+      <w:r>
+        <w:rPr>
+          <w:rStyle w:val="OperatorTok"/>
+        </w:rPr>
+        <w:t xml:space="preserve">=</w:t>
+      </w:r>
+      <w:r>
+        <w:rPr>
+          <w:rStyle w:val="NormalTok"/>
+        </w:rPr>
+        <w:t xml:space="preserve"> np.array([p </w:t>
+      </w:r>
+      <w:r>
+        <w:rPr>
+          <w:rStyle w:val="ControlFlowTok"/>
+        </w:rPr>
+        <w:t xml:space="preserve">for</w:t>
+      </w:r>
+      <w:r>
+        <w:rPr>
+          <w:rStyle w:val="NormalTok"/>
+        </w:rPr>
+        <w:t xml:space="preserve"> p </w:t>
+      </w:r>
+      <w:r>
+        <w:rPr>
+          <w:rStyle w:val="KeywordTok"/>
+        </w:rPr>
+        <w:t xml:space="preserve">in</w:t>
+      </w:r>
+      <w:r>
+        <w:rPr>
+          <w:rStyle w:val="NormalTok"/>
+        </w:rPr>
+        <w:t xml:space="preserve"> </w:t>
+      </w:r>
+      <w:r>
+        <w:rPr>
+          <w:rStyle w:val="BuiltInTok"/>
+        </w:rPr>
+        <w:t xml:space="preserve">range</w:t>
+      </w:r>
+      <w:r>
+        <w:rPr>
+          <w:rStyle w:val="NormalTok"/>
+        </w:rPr>
+        <w:t xml:space="preserve">(N)]) </w:t>
+      </w:r>
+      <w:r>
+        <w:rPr>
+          <w:rStyle w:val="CommentTok"/>
+        </w:rPr>
+        <w:t xml:space="preserve"># n = {0,1,2,...,N-1}</w:t>
       </w:r>
       <w:r>
         <w:br w:type="textWrapping"/>
       </w:r>
       <w:r>
         <w:rPr>
-          <w:rStyle w:val="VerbatimChar"/>
-        </w:rPr>
-        <w:t xml:space="preserve">  n = np.array([p for p in range(N)]) # n = {0,1,2,...,N-1}</w:t>
+          <w:rStyle w:val="NormalTok"/>
+        </w:rPr>
+        <w:t xml:space="preserve">  </w:t>
+      </w:r>
+      <w:r>
+        <w:rPr>
+          <w:rStyle w:val="CommentTok"/>
+        </w:rPr>
+        <w:t xml:space="preserve"># Versão de "alta resolução" de n, usada para o gráfico apenas</w:t>
       </w:r>
       <w:r>
         <w:br w:type="textWrapping"/>
       </w:r>
       <w:r>
         <w:rPr>
-          <w:rStyle w:val="VerbatimChar"/>
-        </w:rPr>
-        <w:t xml:space="preserve">  # Versão de "alta resolução" de n, usada para o gráfico apenas</w:t>
+          <w:rStyle w:val="NormalTok"/>
+        </w:rPr>
+        <w:t xml:space="preserve">  Hn </w:t>
+      </w:r>
+      <w:r>
+        <w:rPr>
+          <w:rStyle w:val="OperatorTok"/>
+        </w:rPr>
+        <w:t xml:space="preserve">=</w:t>
+      </w:r>
+      <w:r>
+        <w:rPr>
+          <w:rStyle w:val="NormalTok"/>
+        </w:rPr>
+        <w:t xml:space="preserve"> np.linspace(</w:t>
+      </w:r>
+      <w:r>
+        <w:rPr>
+          <w:rStyle w:val="DecValTok"/>
+        </w:rPr>
+        <w:t xml:space="preserve">0</w:t>
+      </w:r>
+      <w:r>
+        <w:rPr>
+          <w:rStyle w:val="NormalTok"/>
+        </w:rPr>
+        <w:t xml:space="preserve">, N</w:t>
+      </w:r>
+      <w:r>
+        <w:rPr>
+          <w:rStyle w:val="DecValTok"/>
+        </w:rPr>
+        <w:t xml:space="preserve">-1</w:t>
+      </w:r>
+      <w:r>
+        <w:rPr>
+          <w:rStyle w:val="NormalTok"/>
+        </w:rPr>
+        <w:t xml:space="preserve">, </w:t>
+      </w:r>
+      <w:r>
+        <w:rPr>
+          <w:rStyle w:val="DecValTok"/>
+        </w:rPr>
+        <w:t xml:space="preserve">100</w:t>
+      </w:r>
+      <w:r>
+        <w:rPr>
+          <w:rStyle w:val="OperatorTok"/>
+        </w:rPr>
+        <w:t xml:space="preserve">*</w:t>
+      </w:r>
+      <w:r>
+        <w:rPr>
+          <w:rStyle w:val="NormalTok"/>
+        </w:rPr>
+        <w:t xml:space="preserve">N) </w:t>
+      </w:r>
+      <w:r>
+        <w:rPr>
+          <w:rStyle w:val="CommentTok"/>
+        </w:rPr>
+        <w:t xml:space="preserve"># Hn ={0,...,1,...,2,...,N-1}</w:t>
       </w:r>
       <w:r>
         <w:br w:type="textWrapping"/>
       </w:r>
       <w:r>
         <w:rPr>
-          <w:rStyle w:val="VerbatimChar"/>
-        </w:rPr>
-        <w:t xml:space="preserve">  Hn = np.linspace(0, N-1, 100*N) # Hn ={0,...,1,...,2,...,N-1}</w:t>
+          <w:rStyle w:val="NormalTok"/>
+        </w:rPr>
+        <w:t xml:space="preserve">  </w:t>
+      </w:r>
+      <w:r>
+        <w:rPr>
+          <w:rStyle w:val="ControlFlowTok"/>
+        </w:rPr>
+        <w:t xml:space="preserve">for</w:t>
+      </w:r>
+      <w:r>
+        <w:rPr>
+          <w:rStyle w:val="NormalTok"/>
+        </w:rPr>
+        <w:t xml:space="preserve"> m </w:t>
+      </w:r>
+      <w:r>
+        <w:rPr>
+          <w:rStyle w:val="KeywordTok"/>
+        </w:rPr>
+        <w:t xml:space="preserve">in</w:t>
+      </w:r>
+      <w:r>
+        <w:rPr>
+          <w:rStyle w:val="NormalTok"/>
+        </w:rPr>
+        <w:t xml:space="preserve"> </w:t>
+      </w:r>
+      <w:r>
+        <w:rPr>
+          <w:rStyle w:val="BuiltInTok"/>
+        </w:rPr>
+        <w:t xml:space="preserve">range</w:t>
+      </w:r>
+      <w:r>
+        <w:rPr>
+          <w:rStyle w:val="NormalTok"/>
+        </w:rPr>
+        <w:t xml:space="preserve">(N): </w:t>
+      </w:r>
+      <w:r>
+        <w:rPr>
+          <w:rStyle w:val="CommentTok"/>
+        </w:rPr>
+        <w:t xml:space="preserve"># m E {0,1,2,...,N-1}</w:t>
       </w:r>
       <w:r>
         <w:br w:type="textWrapping"/>
       </w:r>
       <w:r>
         <w:rPr>
-          <w:rStyle w:val="VerbatimChar"/>
-        </w:rPr>
-        <w:t xml:space="preserve">  for m in range(N): # m E {0,1,2,...,N-1}</w:t>
+          <w:rStyle w:val="NormalTok"/>
+        </w:rPr>
+        <w:t xml:space="preserve">    C_Si </w:t>
+      </w:r>
+      <w:r>
+        <w:rPr>
+          <w:rStyle w:val="OperatorTok"/>
+        </w:rPr>
+        <w:t xml:space="preserve">=</w:t>
+      </w:r>
+      <w:r>
+        <w:rPr>
+          <w:rStyle w:val="NormalTok"/>
+        </w:rPr>
+        <w:t xml:space="preserve"> np.exp(</w:t>
+      </w:r>
+      <w:r>
+        <w:rPr>
+          <w:rStyle w:val="OperatorTok"/>
+        </w:rPr>
+        <w:t xml:space="preserve">-</w:t>
+      </w:r>
+      <w:r>
+        <w:rPr>
+          <w:rStyle w:val="DecValTok"/>
+        </w:rPr>
+        <w:t xml:space="preserve">2</w:t>
+      </w:r>
+      <w:r>
+        <w:rPr>
+          <w:rStyle w:val="NormalTok"/>
+        </w:rPr>
+        <w:t xml:space="preserve"> </w:t>
+      </w:r>
+      <w:r>
+        <w:rPr>
+          <w:rStyle w:val="OperatorTok"/>
+        </w:rPr>
+        <w:t xml:space="preserve">*</w:t>
+      </w:r>
+      <w:r>
+        <w:rPr>
+          <w:rStyle w:val="NormalTok"/>
+        </w:rPr>
+        <w:t xml:space="preserve"> np.pi </w:t>
+      </w:r>
+      <w:r>
+        <w:rPr>
+          <w:rStyle w:val="OperatorTok"/>
+        </w:rPr>
+        <w:t xml:space="preserve">*</w:t>
+      </w:r>
+      <w:r>
+        <w:rPr>
+          <w:rStyle w:val="NormalTok"/>
+        </w:rPr>
+        <w:t xml:space="preserve"> m </w:t>
+      </w:r>
+      <w:r>
+        <w:rPr>
+          <w:rStyle w:val="OperatorTok"/>
+        </w:rPr>
+        <w:t xml:space="preserve">*</w:t>
+      </w:r>
+      <w:r>
+        <w:rPr>
+          <w:rStyle w:val="NormalTok"/>
+        </w:rPr>
+        <w:t xml:space="preserve"> n </w:t>
+      </w:r>
+      <w:r>
+        <w:rPr>
+          <w:rStyle w:val="OperatorTok"/>
+        </w:rPr>
+        <w:t xml:space="preserve">/</w:t>
+      </w:r>
+      <w:r>
+        <w:rPr>
+          <w:rStyle w:val="NormalTok"/>
+        </w:rPr>
+        <w:t xml:space="preserve"> N </w:t>
+      </w:r>
+      <w:r>
+        <w:rPr>
+          <w:rStyle w:val="OperatorTok"/>
+        </w:rPr>
+        <w:t xml:space="preserve">*</w:t>
+      </w:r>
+      <w:r>
+        <w:rPr>
+          <w:rStyle w:val="NormalTok"/>
+        </w:rPr>
+        <w:t xml:space="preserve"> 1j) </w:t>
+      </w:r>
+      <w:r>
+        <w:rPr>
+          <w:rStyle w:val="CommentTok"/>
+        </w:rPr>
+        <w:t xml:space="preserve"># C(m) - S(m) i</w:t>
       </w:r>
       <w:r>
         <w:br w:type="textWrapping"/>
       </w:r>
       <w:r>
         <w:rPr>
-          <w:rStyle w:val="VerbatimChar"/>
-        </w:rPr>
-        <w:t xml:space="preserve">    C_Si = np.exp(-2 * np.pi * m * n / N * 1j) # C(m) - S(m) i</w:t>
+          <w:rStyle w:val="NormalTok"/>
+        </w:rPr>
+        <w:t xml:space="preserve">    </w:t>
+      </w:r>
+      <w:r>
+        <w:rPr>
+          <w:rStyle w:val="CommentTok"/>
+        </w:rPr>
+        <w:t xml:space="preserve"># Versão de "alta resolução" de C_Si, usada para o gráfico apenas</w:t>
       </w:r>
       <w:r>
         <w:br w:type="textWrapping"/>
       </w:r>
       <w:r>
         <w:rPr>
-          <w:rStyle w:val="VerbatimChar"/>
-        </w:rPr>
-        <w:t xml:space="preserve">    # Versão de "alta resolução" de C_Si, usada para o gráfico apenas</w:t>
+          <w:rStyle w:val="NormalTok"/>
+        </w:rPr>
+        <w:t xml:space="preserve">    HC_Si </w:t>
+      </w:r>
+      <w:r>
+        <w:rPr>
+          <w:rStyle w:val="OperatorTok"/>
+        </w:rPr>
+        <w:t xml:space="preserve">=</w:t>
+      </w:r>
+      <w:r>
+        <w:rPr>
+          <w:rStyle w:val="NormalTok"/>
+        </w:rPr>
+        <w:t xml:space="preserve"> np.exp(</w:t>
+      </w:r>
+      <w:r>
+        <w:rPr>
+          <w:rStyle w:val="OperatorTok"/>
+        </w:rPr>
+        <w:t xml:space="preserve">-</w:t>
+      </w:r>
+      <w:r>
+        <w:rPr>
+          <w:rStyle w:val="DecValTok"/>
+        </w:rPr>
+        <w:t xml:space="preserve">2</w:t>
+      </w:r>
+      <w:r>
+        <w:rPr>
+          <w:rStyle w:val="NormalTok"/>
+        </w:rPr>
+        <w:t xml:space="preserve"> </w:t>
+      </w:r>
+      <w:r>
+        <w:rPr>
+          <w:rStyle w:val="OperatorTok"/>
+        </w:rPr>
+        <w:t xml:space="preserve">*</w:t>
+      </w:r>
+      <w:r>
+        <w:rPr>
+          <w:rStyle w:val="NormalTok"/>
+        </w:rPr>
+        <w:t xml:space="preserve"> np.pi </w:t>
+      </w:r>
+      <w:r>
+        <w:rPr>
+          <w:rStyle w:val="OperatorTok"/>
+        </w:rPr>
+        <w:t xml:space="preserve">*</w:t>
+      </w:r>
+      <w:r>
+        <w:rPr>
+          <w:rStyle w:val="NormalTok"/>
+        </w:rPr>
+        <w:t xml:space="preserve"> m </w:t>
+      </w:r>
+      <w:r>
+        <w:rPr>
+          <w:rStyle w:val="OperatorTok"/>
+        </w:rPr>
+        <w:t xml:space="preserve">*</w:t>
+      </w:r>
+      <w:r>
+        <w:rPr>
+          <w:rStyle w:val="NormalTok"/>
+        </w:rPr>
+        <w:t xml:space="preserve"> Hn </w:t>
+      </w:r>
+      <w:r>
+        <w:rPr>
+          <w:rStyle w:val="OperatorTok"/>
+        </w:rPr>
+        <w:t xml:space="preserve">/</w:t>
+      </w:r>
+      <w:r>
+        <w:rPr>
+          <w:rStyle w:val="NormalTok"/>
+        </w:rPr>
+        <w:t xml:space="preserve"> N </w:t>
+      </w:r>
+      <w:r>
+        <w:rPr>
+          <w:rStyle w:val="OperatorTok"/>
+        </w:rPr>
+        <w:t xml:space="preserve">*</w:t>
+      </w:r>
+      <w:r>
+        <w:rPr>
+          <w:rStyle w:val="NormalTok"/>
+        </w:rPr>
+        <w:t xml:space="preserve"> 1j)</w:t>
       </w:r>
       <w:r>
         <w:br w:type="textWrapping"/>
       </w:r>
       <w:r>
         <w:rPr>
-          <w:rStyle w:val="VerbatimChar"/>
-        </w:rPr>
-        <w:t xml:space="preserve">    HC_Si = np.exp(-2 * np.pi * m * Hn / N * 1j)</w:t>
+          <w:rStyle w:val="NormalTok"/>
+        </w:rPr>
+        <w:t xml:space="preserve">    X[m] </w:t>
+      </w:r>
+      <w:r>
+        <w:rPr>
+          <w:rStyle w:val="OperatorTok"/>
+        </w:rPr>
+        <w:t xml:space="preserve">=</w:t>
+      </w:r>
+      <w:r>
+        <w:rPr>
+          <w:rStyle w:val="NormalTok"/>
+        </w:rPr>
+        <w:t xml:space="preserve"> </w:t>
+      </w:r>
+      <w:r>
+        <w:rPr>
+          <w:rStyle w:val="BuiltInTok"/>
+        </w:rPr>
+        <w:t xml:space="preserve">sum</w:t>
+      </w:r>
+      <w:r>
+        <w:rPr>
+          <w:rStyle w:val="NormalTok"/>
+        </w:rPr>
+        <w:t xml:space="preserve">(np.multiply(x, C_Si)) </w:t>
+      </w:r>
+      <w:r>
+        <w:rPr>
+          <w:rStyle w:val="CommentTok"/>
+        </w:rPr>
+        <w:t xml:space="preserve"># multiplicação termo a termo</w:t>
       </w:r>
       <w:r>
         <w:br w:type="textWrapping"/>
       </w:r>
       <w:r>
         <w:rPr>
-          <w:rStyle w:val="VerbatimChar"/>
-        </w:rPr>
-        <w:t xml:space="preserve">    X[m] = sum(np.multiply(x, C_Si)) # multiplicação termo a termo</w:t>
+          <w:rStyle w:val="NormalTok"/>
+        </w:rPr>
+        <w:t xml:space="preserve">    </w:t>
+      </w:r>
+      <w:r>
+        <w:rPr>
+          <w:rStyle w:val="CommentTok"/>
+        </w:rPr>
+        <w:t xml:space="preserve"># plotando:</w:t>
       </w:r>
       <w:r>
         <w:br w:type="textWrapping"/>
       </w:r>
       <w:r>
         <w:rPr>
-          <w:rStyle w:val="VerbatimChar"/>
-        </w:rPr>
-        <w:t xml:space="preserve">    # plotando:</w:t>
+          <w:rStyle w:val="NormalTok"/>
+        </w:rPr>
+        <w:t xml:space="preserve">    plt.figure(</w:t>
+      </w:r>
+      <w:r>
+        <w:rPr>
+          <w:rStyle w:val="DecValTok"/>
+        </w:rPr>
+        <w:t xml:space="preserve">1</w:t>
+      </w:r>
+      <w:r>
+        <w:rPr>
+          <w:rStyle w:val="NormalTok"/>
+        </w:rPr>
+        <w:t xml:space="preserve">)</w:t>
       </w:r>
       <w:r>
         <w:br w:type="textWrapping"/>
       </w:r>
       <w:r>
         <w:rPr>
-          <w:rStyle w:val="VerbatimChar"/>
-        </w:rPr>
-        <w:t xml:space="preserve">    plt.figure(1)</w:t>
+          <w:rStyle w:val="NormalTok"/>
+        </w:rPr>
+        <w:t xml:space="preserve">    plt.suptitle(</w:t>
+      </w:r>
+      <w:r>
+        <w:rPr>
+          <w:rStyle w:val="StringTok"/>
+        </w:rPr>
+        <w:t xml:space="preserve">'M ='</w:t>
+      </w:r>
+      <w:r>
+        <w:rPr>
+          <w:rStyle w:val="NormalTok"/>
+        </w:rPr>
+        <w:t xml:space="preserve"> </w:t>
+      </w:r>
+      <w:r>
+        <w:rPr>
+          <w:rStyle w:val="OperatorTok"/>
+        </w:rPr>
+        <w:t xml:space="preserve">+</w:t>
+      </w:r>
+      <w:r>
+        <w:rPr>
+          <w:rStyle w:val="NormalTok"/>
+        </w:rPr>
+        <w:t xml:space="preserve"> </w:t>
+      </w:r>
+      <w:r>
+        <w:rPr>
+          <w:rStyle w:val="BuiltInTok"/>
+        </w:rPr>
+        <w:t xml:space="preserve">str</w:t>
+      </w:r>
+      <w:r>
+        <w:rPr>
+          <w:rStyle w:val="NormalTok"/>
+        </w:rPr>
+        <w:t xml:space="preserve">(m), fontsize</w:t>
+      </w:r>
+      <w:r>
+        <w:rPr>
+          <w:rStyle w:val="OperatorTok"/>
+        </w:rPr>
+        <w:t xml:space="preserve">=</w:t>
+      </w:r>
+      <w:r>
+        <w:rPr>
+          <w:rStyle w:val="DecValTok"/>
+        </w:rPr>
+        <w:t xml:space="preserve">16</w:t>
+      </w:r>
+      <w:r>
+        <w:rPr>
+          <w:rStyle w:val="NormalTok"/>
+        </w:rPr>
+        <w:t xml:space="preserve">)</w:t>
       </w:r>
       <w:r>
         <w:br w:type="textWrapping"/>
       </w:r>
       <w:r>
         <w:rPr>
-          <w:rStyle w:val="VerbatimChar"/>
-        </w:rPr>
-        <w:t xml:space="preserve">    plt.suptitle('M =' + str(m), fontsize=16)</w:t>
+          <w:rStyle w:val="NormalTok"/>
+        </w:rPr>
+        <w:t xml:space="preserve">    plt.subplot(</w:t>
+      </w:r>
+      <w:r>
+        <w:rPr>
+          <w:rStyle w:val="DecValTok"/>
+        </w:rPr>
+        <w:t xml:space="preserve">211</w:t>
+      </w:r>
+      <w:r>
+        <w:rPr>
+          <w:rStyle w:val="NormalTok"/>
+        </w:rPr>
+        <w:t xml:space="preserve">)</w:t>
       </w:r>
       <w:r>
         <w:br w:type="textWrapping"/>
       </w:r>
       <w:r>
         <w:rPr>
-          <w:rStyle w:val="VerbatimChar"/>
-        </w:rPr>
-        <w:t xml:space="preserve">    plt.subplot(211)</w:t>
+          <w:rStyle w:val="NormalTok"/>
+        </w:rPr>
+        <w:t xml:space="preserve">    plt.plot(n,x[n].real, </w:t>
+      </w:r>
+      <w:r>
+        <w:rPr>
+          <w:rStyle w:val="StringTok"/>
+        </w:rPr>
+        <w:t xml:space="preserve">'k:.'</w:t>
+      </w:r>
+      <w:r>
+        <w:rPr>
+          <w:rStyle w:val="NormalTok"/>
+        </w:rPr>
+        <w:t xml:space="preserve">, label</w:t>
+      </w:r>
+      <w:r>
+        <w:rPr>
+          <w:rStyle w:val="OperatorTok"/>
+        </w:rPr>
+        <w:t xml:space="preserve">=</w:t>
+      </w:r>
+      <w:r>
+        <w:rPr>
+          <w:rStyle w:val="StringTok"/>
+        </w:rPr>
+        <w:t xml:space="preserve">'x[n]'</w:t>
+      </w:r>
+      <w:r>
+        <w:rPr>
+          <w:rStyle w:val="NormalTok"/>
+        </w:rPr>
+        <w:t xml:space="preserve">)</w:t>
       </w:r>
       <w:r>
         <w:br w:type="textWrapping"/>
       </w:r>
       <w:r>
         <w:rPr>
-          <w:rStyle w:val="VerbatimChar"/>
-        </w:rPr>
-        <w:t xml:space="preserve">    plt.plot(n,x[n].real, 'k:.', label='x[n]')</w:t>
+          <w:rStyle w:val="NormalTok"/>
+        </w:rPr>
+        <w:t xml:space="preserve">    plt.plot(n,C_Si.real, </w:t>
+      </w:r>
+      <w:r>
+        <w:rPr>
+          <w:rStyle w:val="StringTok"/>
+        </w:rPr>
+        <w:t xml:space="preserve">'k--o'</w:t>
+      </w:r>
+      <w:r>
+        <w:rPr>
+          <w:rStyle w:val="NormalTok"/>
+        </w:rPr>
+        <w:t xml:space="preserve">, label</w:t>
+      </w:r>
+      <w:r>
+        <w:rPr>
+          <w:rStyle w:val="OperatorTok"/>
+        </w:rPr>
+        <w:t xml:space="preserve">=</w:t>
+      </w:r>
+      <w:r>
+        <w:rPr>
+          <w:rStyle w:val="StringTok"/>
+        </w:rPr>
+        <w:t xml:space="preserve">'C[n]'</w:t>
+      </w:r>
+      <w:r>
+        <w:rPr>
+          <w:rStyle w:val="NormalTok"/>
+        </w:rPr>
+        <w:t xml:space="preserve">)</w:t>
       </w:r>
       <w:r>
         <w:br w:type="textWrapping"/>
       </w:r>
       <w:r>
         <w:rPr>
-          <w:rStyle w:val="VerbatimChar"/>
-        </w:rPr>
-        <w:t xml:space="preserve">    plt.plot(n,C_Si.real, 'k--o', label='C[n]')</w:t>
+          <w:rStyle w:val="NormalTok"/>
+        </w:rPr>
+        <w:t xml:space="preserve">    plt.plot(Hn,HC_Si.real, </w:t>
+      </w:r>
+      <w:r>
+        <w:rPr>
+          <w:rStyle w:val="StringTok"/>
+        </w:rPr>
+        <w:t xml:space="preserve">'k-'</w:t>
+      </w:r>
+      <w:r>
+        <w:rPr>
+          <w:rStyle w:val="NormalTok"/>
+        </w:rPr>
+        <w:t xml:space="preserve">,label</w:t>
+      </w:r>
+      <w:r>
+        <w:rPr>
+          <w:rStyle w:val="OperatorTok"/>
+        </w:rPr>
+        <w:t xml:space="preserve">=</w:t>
+      </w:r>
+      <w:r>
+        <w:rPr>
+          <w:rStyle w:val="StringTok"/>
+        </w:rPr>
+        <w:t xml:space="preserve">'C[n] ideal'</w:t>
+      </w:r>
+      <w:r>
+        <w:rPr>
+          <w:rStyle w:val="NormalTok"/>
+        </w:rPr>
+        <w:t xml:space="preserve">)</w:t>
       </w:r>
       <w:r>
         <w:br w:type="textWrapping"/>
       </w:r>
       <w:r>
         <w:rPr>
-          <w:rStyle w:val="VerbatimChar"/>
-        </w:rPr>
-        <w:t xml:space="preserve">    plt.plot(Hn,HC_Si.real, 'k-',label='C[n] ideal')</w:t>
+          <w:rStyle w:val="NormalTok"/>
+        </w:rPr>
+        <w:t xml:space="preserve">    plt.ylabel(</w:t>
+      </w:r>
+      <w:r>
+        <w:rPr>
+          <w:rStyle w:val="StringTok"/>
+        </w:rPr>
+        <w:t xml:space="preserve">'Real'</w:t>
+      </w:r>
+      <w:r>
+        <w:rPr>
+          <w:rStyle w:val="NormalTok"/>
+        </w:rPr>
+        <w:t xml:space="preserve">, fontsize</w:t>
+      </w:r>
+      <w:r>
+        <w:rPr>
+          <w:rStyle w:val="OperatorTok"/>
+        </w:rPr>
+        <w:t xml:space="preserve">=</w:t>
+      </w:r>
+      <w:r>
+        <w:rPr>
+          <w:rStyle w:val="DecValTok"/>
+        </w:rPr>
+        <w:t xml:space="preserve">14</w:t>
+      </w:r>
+      <w:r>
+        <w:rPr>
+          <w:rStyle w:val="NormalTok"/>
+        </w:rPr>
+        <w:t xml:space="preserve">, color</w:t>
+      </w:r>
+      <w:r>
+        <w:rPr>
+          <w:rStyle w:val="OperatorTok"/>
+        </w:rPr>
+        <w:t xml:space="preserve">=</w:t>
+      </w:r>
+      <w:r>
+        <w:rPr>
+          <w:rStyle w:val="StringTok"/>
+        </w:rPr>
+        <w:t xml:space="preserve">'k'</w:t>
+      </w:r>
+      <w:r>
+        <w:rPr>
+          <w:rStyle w:val="NormalTok"/>
+        </w:rPr>
+        <w:t xml:space="preserve">)    </w:t>
       </w:r>
       <w:r>
         <w:br w:type="textWrapping"/>
       </w:r>
       <w:r>
         <w:rPr>
-          <w:rStyle w:val="VerbatimChar"/>
-        </w:rPr>
-        <w:t xml:space="preserve">    plt.ylabel('Real', fontsize=14, color='k')    </w:t>
+          <w:rStyle w:val="NormalTok"/>
+        </w:rPr>
+        <w:t xml:space="preserve">    plt.subplot(</w:t>
+      </w:r>
+      <w:r>
+        <w:rPr>
+          <w:rStyle w:val="DecValTok"/>
+        </w:rPr>
+        <w:t xml:space="preserve">212</w:t>
+      </w:r>
+      <w:r>
+        <w:rPr>
+          <w:rStyle w:val="NormalTok"/>
+        </w:rPr>
+        <w:t xml:space="preserve">)</w:t>
       </w:r>
       <w:r>
         <w:br w:type="textWrapping"/>
       </w:r>
       <w:r>
         <w:rPr>
-          <w:rStyle w:val="VerbatimChar"/>
-        </w:rPr>
-        <w:t xml:space="preserve">    plt.subplot(212)</w:t>
+          <w:rStyle w:val="NormalTok"/>
+        </w:rPr>
+        <w:t xml:space="preserve">    plt.plot(n,x[n].imag, </w:t>
+      </w:r>
+      <w:r>
+        <w:rPr>
+          <w:rStyle w:val="StringTok"/>
+        </w:rPr>
+        <w:t xml:space="preserve">'k:.'</w:t>
+      </w:r>
+      <w:r>
+        <w:rPr>
+          <w:rStyle w:val="NormalTok"/>
+        </w:rPr>
+        <w:t xml:space="preserve">, label</w:t>
+      </w:r>
+      <w:r>
+        <w:rPr>
+          <w:rStyle w:val="OperatorTok"/>
+        </w:rPr>
+        <w:t xml:space="preserve">=</w:t>
+      </w:r>
+      <w:r>
+        <w:rPr>
+          <w:rStyle w:val="StringTok"/>
+        </w:rPr>
+        <w:t xml:space="preserve">'x[n]'</w:t>
+      </w:r>
+      <w:r>
+        <w:rPr>
+          <w:rStyle w:val="NormalTok"/>
+        </w:rPr>
+        <w:t xml:space="preserve">)</w:t>
       </w:r>
       <w:r>
         <w:br w:type="textWrapping"/>
       </w:r>
       <w:r>
         <w:rPr>
-          <w:rStyle w:val="VerbatimChar"/>
-        </w:rPr>
-        <w:t xml:space="preserve">    plt.plot(n,x[n].imag, 'k:.', label='x[n]')</w:t>
+          <w:rStyle w:val="NormalTok"/>
+        </w:rPr>
+        <w:t xml:space="preserve">    plt.plot(n,C_Si.imag, </w:t>
+      </w:r>
+      <w:r>
+        <w:rPr>
+          <w:rStyle w:val="StringTok"/>
+        </w:rPr>
+        <w:t xml:space="preserve">'k--o'</w:t>
+      </w:r>
+      <w:r>
+        <w:rPr>
+          <w:rStyle w:val="NormalTok"/>
+        </w:rPr>
+        <w:t xml:space="preserve">, label</w:t>
+      </w:r>
+      <w:r>
+        <w:rPr>
+          <w:rStyle w:val="OperatorTok"/>
+        </w:rPr>
+        <w:t xml:space="preserve">=</w:t>
+      </w:r>
+      <w:r>
+        <w:rPr>
+          <w:rStyle w:val="StringTok"/>
+        </w:rPr>
+        <w:t xml:space="preserve">'C[n]'</w:t>
+      </w:r>
+      <w:r>
+        <w:rPr>
+          <w:rStyle w:val="NormalTok"/>
+        </w:rPr>
+        <w:t xml:space="preserve">)</w:t>
       </w:r>
       <w:r>
         <w:br w:type="textWrapping"/>
       </w:r>
       <w:r>
         <w:rPr>
-          <w:rStyle w:val="VerbatimChar"/>
-        </w:rPr>
-        <w:t xml:space="preserve">    plt.plot(n,C_Si.imag, 'k--o', label='C[n]')</w:t>
+          <w:rStyle w:val="NormalTok"/>
+        </w:rPr>
+        <w:t xml:space="preserve">    plt.plot(Hn,HC_Si.imag, </w:t>
+      </w:r>
+      <w:r>
+        <w:rPr>
+          <w:rStyle w:val="StringTok"/>
+        </w:rPr>
+        <w:t xml:space="preserve">'k-'</w:t>
+      </w:r>
+      <w:r>
+        <w:rPr>
+          <w:rStyle w:val="NormalTok"/>
+        </w:rPr>
+        <w:t xml:space="preserve">,label</w:t>
+      </w:r>
+      <w:r>
+        <w:rPr>
+          <w:rStyle w:val="OperatorTok"/>
+        </w:rPr>
+        <w:t xml:space="preserve">=</w:t>
+      </w:r>
+      <w:r>
+        <w:rPr>
+          <w:rStyle w:val="StringTok"/>
+        </w:rPr>
+        <w:t xml:space="preserve">'C[n] ideal'</w:t>
+      </w:r>
+      <w:r>
+        <w:rPr>
+          <w:rStyle w:val="NormalTok"/>
+        </w:rPr>
+        <w:t xml:space="preserve">)</w:t>
       </w:r>
       <w:r>
         <w:br w:type="textWrapping"/>
       </w:r>
       <w:r>
         <w:rPr>
-          <w:rStyle w:val="VerbatimChar"/>
-        </w:rPr>
-        <w:t xml:space="preserve">    plt.plot(Hn,HC_Si.imag, 'k-',label='C[n] ideal')</w:t>
+          <w:rStyle w:val="NormalTok"/>
+        </w:rPr>
+        <w:t xml:space="preserve">    plt.ylabel(</w:t>
+      </w:r>
+      <w:r>
+        <w:rPr>
+          <w:rStyle w:val="StringTok"/>
+        </w:rPr>
+        <w:t xml:space="preserve">'Imaginário'</w:t>
+      </w:r>
+      <w:r>
+        <w:rPr>
+          <w:rStyle w:val="NormalTok"/>
+        </w:rPr>
+        <w:t xml:space="preserve">, fontsize</w:t>
+      </w:r>
+      <w:r>
+        <w:rPr>
+          <w:rStyle w:val="OperatorTok"/>
+        </w:rPr>
+        <w:t xml:space="preserve">=</w:t>
+      </w:r>
+      <w:r>
+        <w:rPr>
+          <w:rStyle w:val="DecValTok"/>
+        </w:rPr>
+        <w:t xml:space="preserve">14</w:t>
+      </w:r>
+      <w:r>
+        <w:rPr>
+          <w:rStyle w:val="NormalTok"/>
+        </w:rPr>
+        <w:t xml:space="preserve">, color</w:t>
+      </w:r>
+      <w:r>
+        <w:rPr>
+          <w:rStyle w:val="OperatorTok"/>
+        </w:rPr>
+        <w:t xml:space="preserve">=</w:t>
+      </w:r>
+      <w:r>
+        <w:rPr>
+          <w:rStyle w:val="StringTok"/>
+        </w:rPr>
+        <w:t xml:space="preserve">'k'</w:t>
+      </w:r>
+      <w:r>
+        <w:rPr>
+          <w:rStyle w:val="NormalTok"/>
+        </w:rPr>
+        <w:t xml:space="preserve">)</w:t>
       </w:r>
       <w:r>
         <w:br w:type="textWrapping"/>
       </w:r>
       <w:r>
         <w:rPr>
-          <w:rStyle w:val="VerbatimChar"/>
-        </w:rPr>
-        <w:t xml:space="preserve">    plt.ylabel('Imaginário', fontsize=14, color='k')</w:t>
+          <w:rStyle w:val="NormalTok"/>
+        </w:rPr>
+        <w:t xml:space="preserve">    plt.legend()</w:t>
       </w:r>
       <w:r>
         <w:br w:type="textWrapping"/>
       </w:r>
       <w:r>
         <w:rPr>
-          <w:rStyle w:val="VerbatimChar"/>
-        </w:rPr>
-        <w:t xml:space="preserve">    plt.legend()</w:t>
+          <w:rStyle w:val="NormalTok"/>
+        </w:rPr>
+        <w:t xml:space="preserve">    plt.savefig(</w:t>
+      </w:r>
+      <w:r>
+        <w:rPr>
+          <w:rStyle w:val="StringTok"/>
+        </w:rPr>
+        <w:t xml:space="preserve">'0'</w:t>
+      </w:r>
+      <w:r>
+        <w:rPr>
+          <w:rStyle w:val="NormalTok"/>
+        </w:rPr>
+        <w:t xml:space="preserve"> </w:t>
+      </w:r>
+      <w:r>
+        <w:rPr>
+          <w:rStyle w:val="OperatorTok"/>
+        </w:rPr>
+        <w:t xml:space="preserve">+</w:t>
+      </w:r>
+      <w:r>
+        <w:rPr>
+          <w:rStyle w:val="NormalTok"/>
+        </w:rPr>
+        <w:t xml:space="preserve"> </w:t>
+      </w:r>
+      <w:r>
+        <w:rPr>
+          <w:rStyle w:val="BuiltInTok"/>
+        </w:rPr>
+        <w:t xml:space="preserve">str</w:t>
+      </w:r>
+      <w:r>
+        <w:rPr>
+          <w:rStyle w:val="NormalTok"/>
+        </w:rPr>
+        <w:t xml:space="preserve">(m) </w:t>
+      </w:r>
+      <w:r>
+        <w:rPr>
+          <w:rStyle w:val="OperatorTok"/>
+        </w:rPr>
+        <w:t xml:space="preserve">+</w:t>
+      </w:r>
+      <w:r>
+        <w:rPr>
+          <w:rStyle w:val="NormalTok"/>
+        </w:rPr>
+        <w:t xml:space="preserve"> </w:t>
+      </w:r>
+      <w:r>
+        <w:rPr>
+          <w:rStyle w:val="StringTok"/>
+        </w:rPr>
+        <w:t xml:space="preserve">'.png'</w:t>
+      </w:r>
+      <w:r>
+        <w:rPr>
+          <w:rStyle w:val="NormalTok"/>
+        </w:rPr>
+        <w:t xml:space="preserve">, dpi</w:t>
+      </w:r>
+      <w:r>
+        <w:rPr>
+          <w:rStyle w:val="OperatorTok"/>
+        </w:rPr>
+        <w:t xml:space="preserve">=</w:t>
+      </w:r>
+      <w:r>
+        <w:rPr>
+          <w:rStyle w:val="DecValTok"/>
+        </w:rPr>
+        <w:t xml:space="preserve">150</w:t>
+      </w:r>
+      <w:r>
+        <w:rPr>
+          <w:rStyle w:val="NormalTok"/>
+        </w:rPr>
+        <w:t xml:space="preserve">)</w:t>
       </w:r>
       <w:r>
         <w:br w:type="textWrapping"/>
       </w:r>
       <w:r>
         <w:rPr>
-          <w:rStyle w:val="VerbatimChar"/>
-        </w:rPr>
-        <w:t xml:space="preserve">    plt.savefig('0' + str(m) + '.png', dpi=150)</w:t>
+          <w:rStyle w:val="NormalTok"/>
+        </w:rPr>
+        <w:t xml:space="preserve">    plt.close(</w:t>
+      </w:r>
+      <w:r>
+        <w:rPr>
+          <w:rStyle w:val="StringTok"/>
+        </w:rPr>
+        <w:t xml:space="preserve">'all'</w:t>
+      </w:r>
+      <w:r>
+        <w:rPr>
+          <w:rStyle w:val="NormalTok"/>
+        </w:rPr>
+        <w:t xml:space="preserve">)</w:t>
       </w:r>
       <w:r>
         <w:br w:type="textWrapping"/>
       </w:r>
       <w:r>
         <w:rPr>
-          <w:rStyle w:val="VerbatimChar"/>
-        </w:rPr>
-        <w:t xml:space="preserve">    plt.close('all')</w:t>
+          <w:rStyle w:val="NormalTok"/>
+        </w:rPr>
+        <w:t xml:space="preserve">  </w:t>
+      </w:r>
+      <w:r>
+        <w:rPr>
+          <w:rStyle w:val="CommentTok"/>
+        </w:rPr>
+        <w:t xml:space="preserve">#calcula o erro em relação ao algoritmo da biblioteca Scipy</w:t>
       </w:r>
       <w:r>
         <w:br w:type="textWrapping"/>
       </w:r>
       <w:r>
         <w:rPr>
-          <w:rStyle w:val="VerbatimChar"/>
-        </w:rPr>
-        <w:t xml:space="preserve">  #calcula o erro em relação ao algoritmo da biblioteca Scipy</w:t>
+          <w:rStyle w:val="NormalTok"/>
+        </w:rPr>
+        <w:t xml:space="preserve">  error </w:t>
+      </w:r>
+      <w:r>
+        <w:rPr>
+          <w:rStyle w:val="OperatorTok"/>
+        </w:rPr>
+        <w:t xml:space="preserve">=</w:t>
+      </w:r>
+      <w:r>
+        <w:rPr>
+          <w:rStyle w:val="NormalTok"/>
+        </w:rPr>
+        <w:t xml:space="preserve"> </w:t>
+      </w:r>
+      <w:r>
+        <w:rPr>
+          <w:rStyle w:val="BuiltInTok"/>
+        </w:rPr>
+        <w:t xml:space="preserve">sum</w:t>
+      </w:r>
+      <w:r>
+        <w:rPr>
+          <w:rStyle w:val="NormalTok"/>
+        </w:rPr>
+        <w:t xml:space="preserve">((X</w:t>
+      </w:r>
+      <w:r>
+        <w:rPr>
+          <w:rStyle w:val="OperatorTok"/>
+        </w:rPr>
+        <w:t xml:space="preserve">-</w:t>
+      </w:r>
+      <w:r>
+        <w:rPr>
+          <w:rStyle w:val="NormalTok"/>
+        </w:rPr>
+        <w:t xml:space="preserve">fft(x))</w:t>
+      </w:r>
+      <w:r>
+        <w:rPr>
+          <w:rStyle w:val="OperatorTok"/>
+        </w:rPr>
+        <w:t xml:space="preserve">**</w:t>
+      </w:r>
+      <w:r>
+        <w:rPr>
+          <w:rStyle w:val="DecValTok"/>
+        </w:rPr>
+        <w:t xml:space="preserve">2</w:t>
+      </w:r>
+      <w:r>
+        <w:rPr>
+          <w:rStyle w:val="NormalTok"/>
+        </w:rPr>
+        <w:t xml:space="preserve">)</w:t>
       </w:r>
       <w:r>
         <w:br w:type="textWrapping"/>
       </w:r>
       <w:r>
         <w:rPr>
-          <w:rStyle w:val="VerbatimChar"/>
-        </w:rPr>
-        <w:t xml:space="preserve">  error = sum((X-fft(x))**2)</w:t>
+          <w:rStyle w:val="NormalTok"/>
+        </w:rPr>
+        <w:t xml:space="preserve">  </w:t>
+      </w:r>
+      <w:r>
+        <w:rPr>
+          <w:rStyle w:val="BuiltInTok"/>
+        </w:rPr>
+        <w:t xml:space="preserve">print</w:t>
+      </w:r>
+      <w:r>
+        <w:rPr>
+          <w:rStyle w:val="NormalTok"/>
+        </w:rPr>
+        <w:t xml:space="preserve">(</w:t>
+      </w:r>
+      <w:r>
+        <w:rPr>
+          <w:rStyle w:val="BuiltInTok"/>
+        </w:rPr>
+        <w:t xml:space="preserve">round</w:t>
+      </w:r>
+      <w:r>
+        <w:rPr>
+          <w:rStyle w:val="NormalTok"/>
+        </w:rPr>
+        <w:t xml:space="preserve">(error,</w:t>
+      </w:r>
+      <w:r>
+        <w:rPr>
+          <w:rStyle w:val="DecValTok"/>
+        </w:rPr>
+        <w:t xml:space="preserve">5</w:t>
+      </w:r>
+      <w:r>
+        <w:rPr>
+          <w:rStyle w:val="NormalTok"/>
+        </w:rPr>
+        <w:t xml:space="preserve">))</w:t>
       </w:r>
       <w:r>
         <w:br w:type="textWrapping"/>
       </w:r>
       <w:r>
         <w:rPr>
-          <w:rStyle w:val="VerbatimChar"/>
-        </w:rPr>
-        <w:t xml:space="preserve">  print(round(error,5))</w:t>
+          <w:rStyle w:val="NormalTok"/>
+        </w:rPr>
+        <w:t xml:space="preserve">  </w:t>
+      </w:r>
+      <w:r>
+        <w:rPr>
+          <w:rStyle w:val="CommentTok"/>
+        </w:rPr>
+        <w:t xml:space="preserve"># retorna a parte não redundante da transformada</w:t>
       </w:r>
       <w:r>
         <w:br w:type="textWrapping"/>
       </w:r>
       <w:r>
         <w:rPr>
-          <w:rStyle w:val="VerbatimChar"/>
-        </w:rPr>
-        <w:t xml:space="preserve">  # retorna a parte não redundante da transformada</w:t>
+          <w:rStyle w:val="NormalTok"/>
+        </w:rPr>
+        <w:t xml:space="preserve">  </w:t>
+      </w:r>
+      <w:r>
+        <w:rPr>
+          <w:rStyle w:val="ControlFlowTok"/>
+        </w:rPr>
+        <w:t xml:space="preserve">return</w:t>
+      </w:r>
+      <w:r>
+        <w:rPr>
+          <w:rStyle w:val="NormalTok"/>
+        </w:rPr>
+        <w:t xml:space="preserve"> X[</w:t>
+      </w:r>
+      <w:r>
+        <w:rPr>
+          <w:rStyle w:val="DecValTok"/>
+        </w:rPr>
+        <w:t xml:space="preserve">0</w:t>
+      </w:r>
+      <w:r>
+        <w:rPr>
+          <w:rStyle w:val="NormalTok"/>
+        </w:rPr>
+        <w:t xml:space="preserve"> : </w:t>
+      </w:r>
+      <w:r>
+        <w:rPr>
+          <w:rStyle w:val="BuiltInTok"/>
+        </w:rPr>
+        <w:t xml:space="preserve">int</w:t>
+      </w:r>
+      <w:r>
+        <w:rPr>
+          <w:rStyle w:val="NormalTok"/>
+        </w:rPr>
+        <w:t xml:space="preserve">(N</w:t>
+      </w:r>
+      <w:r>
+        <w:rPr>
+          <w:rStyle w:val="OperatorTok"/>
+        </w:rPr>
+        <w:t xml:space="preserve">/</w:t>
+      </w:r>
+      <w:r>
+        <w:rPr>
+          <w:rStyle w:val="DecValTok"/>
+        </w:rPr>
+        <w:t xml:space="preserve">2</w:t>
+      </w:r>
+      <w:r>
+        <w:rPr>
+          <w:rStyle w:val="OperatorTok"/>
+        </w:rPr>
+        <w:t xml:space="preserve">+</w:t>
+      </w:r>
+      <w:r>
+        <w:rPr>
+          <w:rStyle w:val="DecValTok"/>
+        </w:rPr>
+        <w:t xml:space="preserve">1</w:t>
+      </w:r>
+      <w:r>
+        <w:rPr>
+          <w:rStyle w:val="NormalTok"/>
+        </w:rPr>
+        <w:t xml:space="preserve">)] </w:t>
+      </w:r>
+      <w:r>
+        <w:rPr>
+          <w:rStyle w:val="ControlFlowTok"/>
+        </w:rPr>
+        <w:t xml:space="preserve">if</w:t>
+      </w:r>
+      <w:r>
+        <w:rPr>
+          <w:rStyle w:val="NormalTok"/>
+        </w:rPr>
+        <w:t xml:space="preserve"> (N </w:t>
+      </w:r>
+      <w:r>
+        <w:rPr>
+          <w:rStyle w:val="OperatorTok"/>
+        </w:rPr>
+        <w:t xml:space="preserve">%</w:t>
+      </w:r>
+      <w:r>
+        <w:rPr>
+          <w:rStyle w:val="NormalTok"/>
+        </w:rPr>
+        <w:t xml:space="preserve"> </w:t>
+      </w:r>
+      <w:r>
+        <w:rPr>
+          <w:rStyle w:val="DecValTok"/>
+        </w:rPr>
+        <w:t xml:space="preserve">2</w:t>
+      </w:r>
+      <w:r>
+        <w:rPr>
+          <w:rStyle w:val="NormalTok"/>
+        </w:rPr>
+        <w:t xml:space="preserve"> </w:t>
+      </w:r>
+      <w:r>
+        <w:rPr>
+          <w:rStyle w:val="OperatorTok"/>
+        </w:rPr>
+        <w:t xml:space="preserve">==</w:t>
+      </w:r>
+      <w:r>
+        <w:rPr>
+          <w:rStyle w:val="NormalTok"/>
+        </w:rPr>
+        <w:t xml:space="preserve"> </w:t>
+      </w:r>
+      <w:r>
+        <w:rPr>
+          <w:rStyle w:val="DecValTok"/>
+        </w:rPr>
+        <w:t xml:space="preserve">0</w:t>
+      </w:r>
+      <w:r>
+        <w:rPr>
+          <w:rStyle w:val="NormalTok"/>
+        </w:rPr>
+        <w:t xml:space="preserve">) </w:t>
+      </w:r>
+      <w:r>
+        <w:rPr>
+          <w:rStyle w:val="ControlFlowTok"/>
+        </w:rPr>
+        <w:t xml:space="preserve">else</w:t>
+      </w:r>
+      <w:r>
+        <w:rPr>
+          <w:rStyle w:val="NormalTok"/>
+        </w:rPr>
+        <w:t xml:space="preserve"> X[</w:t>
+      </w:r>
+      <w:r>
+        <w:rPr>
+          <w:rStyle w:val="DecValTok"/>
+        </w:rPr>
+        <w:t xml:space="preserve">0</w:t>
+      </w:r>
+      <w:r>
+        <w:rPr>
+          <w:rStyle w:val="NormalTok"/>
+        </w:rPr>
+        <w:t xml:space="preserve"> : </w:t>
+      </w:r>
+      <w:r>
+        <w:rPr>
+          <w:rStyle w:val="BuiltInTok"/>
+        </w:rPr>
+        <w:t xml:space="preserve">int</w:t>
+      </w:r>
+      <w:r>
+        <w:rPr>
+          <w:rStyle w:val="NormalTok"/>
+        </w:rPr>
+        <w:t xml:space="preserve">((N</w:t>
+      </w:r>
+      <w:r>
+        <w:rPr>
+          <w:rStyle w:val="OperatorTok"/>
+        </w:rPr>
+        <w:t xml:space="preserve">+</w:t>
+      </w:r>
+      <w:r>
+        <w:rPr>
+          <w:rStyle w:val="DecValTok"/>
+        </w:rPr>
+        <w:t xml:space="preserve">1</w:t>
+      </w:r>
+      <w:r>
+        <w:rPr>
+          <w:rStyle w:val="NormalTok"/>
+        </w:rPr>
+        <w:t xml:space="preserve">)</w:t>
+      </w:r>
+      <w:r>
+        <w:rPr>
+          <w:rStyle w:val="OperatorTok"/>
+        </w:rPr>
+        <w:t xml:space="preserve">/</w:t>
+      </w:r>
+      <w:r>
+        <w:rPr>
+          <w:rStyle w:val="DecValTok"/>
+        </w:rPr>
+        <w:t xml:space="preserve">2</w:t>
+      </w:r>
+      <w:r>
+        <w:rPr>
+          <w:rStyle w:val="NormalTok"/>
+        </w:rPr>
+        <w:t xml:space="preserve">)]</w:t>
       </w:r>
       <w:r>
         <w:br w:type="textWrapping"/>
       </w:r>
       <w:r>
-        <w:rPr>
-          <w:rStyle w:val="VerbatimChar"/>
-        </w:rPr>
-        <w:t xml:space="preserve">  return X[0 : int(N/2+1)] if (N % 2 == 0) else X[0 : int((N+1)/2)]</w:t>
-      </w:r>
-      <w:r>
         <w:br w:type="textWrapping"/>
       </w:r>
       <w:r>
+        <w:rPr>
+          <w:rStyle w:val="KeywordTok"/>
+        </w:rPr>
+        <w:t xml:space="preserve">def</w:t>
+      </w:r>
+      <w:r>
+        <w:rPr>
+          <w:rStyle w:val="NormalTok"/>
+        </w:rPr>
+        <w:t xml:space="preserve"> s(t):</w:t>
+      </w:r>
+      <w:r>
         <w:br w:type="textWrapping"/>
       </w:r>
       <w:r>
         <w:rPr>
-          <w:rStyle w:val="VerbatimChar"/>
-        </w:rPr>
-        <w:t xml:space="preserve">def s(t):</w:t>
+          <w:rStyle w:val="NormalTok"/>
+        </w:rPr>
+        <w:t xml:space="preserve">  </w:t>
+      </w:r>
+      <w:r>
+        <w:rPr>
+          <w:rStyle w:val="ControlFlowTok"/>
+        </w:rPr>
+        <w:t xml:space="preserve">return</w:t>
+      </w:r>
+      <w:r>
+        <w:rPr>
+          <w:rStyle w:val="NormalTok"/>
+        </w:rPr>
+        <w:t xml:space="preserve"> np.cos(</w:t>
+      </w:r>
+      <w:r>
+        <w:rPr>
+          <w:rStyle w:val="DecValTok"/>
+        </w:rPr>
+        <w:t xml:space="preserve">2</w:t>
+      </w:r>
+      <w:r>
+        <w:rPr>
+          <w:rStyle w:val="NormalTok"/>
+        </w:rPr>
+        <w:t xml:space="preserve"> </w:t>
+      </w:r>
+      <w:r>
+        <w:rPr>
+          <w:rStyle w:val="OperatorTok"/>
+        </w:rPr>
+        <w:t xml:space="preserve">*</w:t>
+      </w:r>
+      <w:r>
+        <w:rPr>
+          <w:rStyle w:val="NormalTok"/>
+        </w:rPr>
+        <w:t xml:space="preserve"> np.pi </w:t>
+      </w:r>
+      <w:r>
+        <w:rPr>
+          <w:rStyle w:val="OperatorTok"/>
+        </w:rPr>
+        <w:t xml:space="preserve">*</w:t>
+      </w:r>
+      <w:r>
+        <w:rPr>
+          <w:rStyle w:val="NormalTok"/>
+        </w:rPr>
+        <w:t xml:space="preserve"> t)</w:t>
       </w:r>
       <w:r>
         <w:br w:type="textWrapping"/>
       </w:r>
       <w:r>
-        <w:rPr>
-          <w:rStyle w:val="VerbatimChar"/>
-        </w:rPr>
-        <w:t xml:space="preserve">  return np.cos(2 * np.pi * t)</w:t>
-      </w:r>
-      <w:r>
         <w:br w:type="textWrapping"/>
       </w:r>
       <w:r>
+        <w:rPr>
+          <w:rStyle w:val="NormalTok"/>
+        </w:rPr>
+        <w:t xml:space="preserve">t </w:t>
+      </w:r>
+      <w:r>
+        <w:rPr>
+          <w:rStyle w:val="OperatorTok"/>
+        </w:rPr>
+        <w:t xml:space="preserve">=</w:t>
+      </w:r>
+      <w:r>
+        <w:rPr>
+          <w:rStyle w:val="NormalTok"/>
+        </w:rPr>
+        <w:t xml:space="preserve"> np.linspace(</w:t>
+      </w:r>
+      <w:r>
+        <w:rPr>
+          <w:rStyle w:val="DecValTok"/>
+        </w:rPr>
+        <w:t xml:space="preserve">0</w:t>
+      </w:r>
+      <w:r>
+        <w:rPr>
+          <w:rStyle w:val="NormalTok"/>
+        </w:rPr>
+        <w:t xml:space="preserve">, </w:t>
+      </w:r>
+      <w:r>
+        <w:rPr>
+          <w:rStyle w:val="DecValTok"/>
+        </w:rPr>
+        <w:t xml:space="preserve">1</w:t>
+      </w:r>
+      <w:r>
+        <w:rPr>
+          <w:rStyle w:val="NormalTok"/>
+        </w:rPr>
+        <w:t xml:space="preserve">, </w:t>
+      </w:r>
+      <w:r>
+        <w:rPr>
+          <w:rStyle w:val="DecValTok"/>
+        </w:rPr>
+        <w:t xml:space="preserve">8</w:t>
+      </w:r>
+      <w:r>
+        <w:rPr>
+          <w:rStyle w:val="NormalTok"/>
+        </w:rPr>
+        <w:t xml:space="preserve">) </w:t>
+      </w:r>
+      <w:r>
+        <w:rPr>
+          <w:rStyle w:val="CommentTok"/>
+        </w:rPr>
+        <w:t xml:space="preserve"># 8 pontos entre 0 e 1</w:t>
+      </w:r>
+      <w:r>
         <w:br w:type="textWrapping"/>
       </w:r>
       <w:r>
         <w:rPr>
-          <w:rStyle w:val="VerbatimChar"/>
-        </w:rPr>
-        <w:t xml:space="preserve">t = np.linspace(0, 1, 8) # 8 pontos entre 0 e 1</w:t>
+          <w:rStyle w:val="NormalTok"/>
+        </w:rPr>
+        <w:t xml:space="preserve">x </w:t>
+      </w:r>
+      <w:r>
+        <w:rPr>
+          <w:rStyle w:val="OperatorTok"/>
+        </w:rPr>
+        <w:t xml:space="preserve">=</w:t>
+      </w:r>
+      <w:r>
+        <w:rPr>
+          <w:rStyle w:val="NormalTok"/>
+        </w:rPr>
+        <w:t xml:space="preserve"> s(t) </w:t>
+      </w:r>
+      <w:r>
+        <w:rPr>
+          <w:rStyle w:val="CommentTok"/>
+        </w:rPr>
+        <w:t xml:space="preserve"># aplica a função ponto a ponto</w:t>
       </w:r>
       <w:r>
         <w:br w:type="textWrapping"/>
       </w:r>
       <w:r>
         <w:rPr>
-          <w:rStyle w:val="VerbatimChar"/>
-        </w:rPr>
-        <w:t xml:space="preserve">x = s(t) # aplica a função ponto a ponto</w:t>
+          <w:rStyle w:val="NormalTok"/>
+        </w:rPr>
+        <w:t xml:space="preserve">X </w:t>
+      </w:r>
+      <w:r>
+        <w:rPr>
+          <w:rStyle w:val="OperatorTok"/>
+        </w:rPr>
+        <w:t xml:space="preserve">=</w:t>
+      </w:r>
+      <w:r>
+        <w:rPr>
+          <w:rStyle w:val="NormalTok"/>
+        </w:rPr>
+        <w:t xml:space="preserve"> DFT(x)</w:t>
       </w:r>
       <w:r>
         <w:br w:type="textWrapping"/>
       </w:r>
       <w:r>
         <w:rPr>
-          <w:rStyle w:val="VerbatimChar"/>
-        </w:rPr>
-        <w:t xml:space="preserve">X = DFT(x)</w:t>
+          <w:rStyle w:val="CommentTok"/>
+        </w:rPr>
+        <w:t xml:space="preserve"># plotando:</w:t>
       </w:r>
       <w:r>
         <w:br w:type="textWrapping"/>
       </w:r>
       <w:r>
+        <w:rPr>
+          <w:rStyle w:val="NormalTok"/>
+        </w:rPr>
+        <w:t xml:space="preserve">plt.figure(</w:t>
+      </w:r>
+      <w:r>
+        <w:rPr>
+          <w:rStyle w:val="DecValTok"/>
+        </w:rPr>
+        <w:t xml:space="preserve">1</w:t>
+      </w:r>
+      <w:r>
+        <w:rPr>
+          <w:rStyle w:val="NormalTok"/>
+        </w:rPr>
+        <w:t xml:space="preserve">)</w:t>
+      </w:r>
+      <w:r>
         <w:br w:type="textWrapping"/>
       </w:r>
       <w:r>
         <w:rPr>
-          <w:rStyle w:val="VerbatimChar"/>
-        </w:rPr>
-        <w:t xml:space="preserve"># plotando:</w:t>
+          <w:rStyle w:val="NormalTok"/>
+        </w:rPr>
+        <w:t xml:space="preserve">plt.subplot(</w:t>
+      </w:r>
+      <w:r>
+        <w:rPr>
+          <w:rStyle w:val="DecValTok"/>
+        </w:rPr>
+        <w:t xml:space="preserve">211</w:t>
+      </w:r>
+      <w:r>
+        <w:rPr>
+          <w:rStyle w:val="NormalTok"/>
+        </w:rPr>
+        <w:t xml:space="preserve">)</w:t>
       </w:r>
       <w:r>
         <w:br w:type="textWrapping"/>
       </w:r>
       <w:r>
         <w:rPr>
-          <w:rStyle w:val="VerbatimChar"/>
-        </w:rPr>
-        <w:t xml:space="preserve">plt.figure(1)</w:t>
+          <w:rStyle w:val="NormalTok"/>
+        </w:rPr>
+        <w:t xml:space="preserve">plt.ylabel(</w:t>
+      </w:r>
+      <w:r>
+        <w:rPr>
+          <w:rStyle w:val="StringTok"/>
+        </w:rPr>
+        <w:t xml:space="preserve">'Real'</w:t>
+      </w:r>
+      <w:r>
+        <w:rPr>
+          <w:rStyle w:val="NormalTok"/>
+        </w:rPr>
+        <w:t xml:space="preserve">, fontsize</w:t>
+      </w:r>
+      <w:r>
+        <w:rPr>
+          <w:rStyle w:val="OperatorTok"/>
+        </w:rPr>
+        <w:t xml:space="preserve">=</w:t>
+      </w:r>
+      <w:r>
+        <w:rPr>
+          <w:rStyle w:val="DecValTok"/>
+        </w:rPr>
+        <w:t xml:space="preserve">14</w:t>
+      </w:r>
+      <w:r>
+        <w:rPr>
+          <w:rStyle w:val="NormalTok"/>
+        </w:rPr>
+        <w:t xml:space="preserve">, color</w:t>
+      </w:r>
+      <w:r>
+        <w:rPr>
+          <w:rStyle w:val="OperatorTok"/>
+        </w:rPr>
+        <w:t xml:space="preserve">=</w:t>
+      </w:r>
+      <w:r>
+        <w:rPr>
+          <w:rStyle w:val="StringTok"/>
+        </w:rPr>
+        <w:t xml:space="preserve">'k'</w:t>
+      </w:r>
+      <w:r>
+        <w:rPr>
+          <w:rStyle w:val="NormalTok"/>
+        </w:rPr>
+        <w:t xml:space="preserve">)</w:t>
       </w:r>
       <w:r>
         <w:br w:type="textWrapping"/>
       </w:r>
       <w:r>
         <w:rPr>
-          <w:rStyle w:val="VerbatimChar"/>
-        </w:rPr>
-        <w:t xml:space="preserve">plt.subplot(211)</w:t>
+          <w:rStyle w:val="NormalTok"/>
+        </w:rPr>
+        <w:t xml:space="preserve">plt.stem(X.real,linefmt</w:t>
+      </w:r>
+      <w:r>
+        <w:rPr>
+          <w:rStyle w:val="OperatorTok"/>
+        </w:rPr>
+        <w:t xml:space="preserve">=</w:t>
+      </w:r>
+      <w:r>
+        <w:rPr>
+          <w:rStyle w:val="StringTok"/>
+        </w:rPr>
+        <w:t xml:space="preserve">'k--'</w:t>
+      </w:r>
+      <w:r>
+        <w:rPr>
+          <w:rStyle w:val="NormalTok"/>
+        </w:rPr>
+        <w:t xml:space="preserve">,markerfmt</w:t>
+      </w:r>
+      <w:r>
+        <w:rPr>
+          <w:rStyle w:val="OperatorTok"/>
+        </w:rPr>
+        <w:t xml:space="preserve">=</w:t>
+      </w:r>
+      <w:r>
+        <w:rPr>
+          <w:rStyle w:val="StringTok"/>
+        </w:rPr>
+        <w:t xml:space="preserve">'ko'</w:t>
+      </w:r>
+      <w:r>
+        <w:rPr>
+          <w:rStyle w:val="NormalTok"/>
+        </w:rPr>
+        <w:t xml:space="preserve">, basefmt</w:t>
+      </w:r>
+      <w:r>
+        <w:rPr>
+          <w:rStyle w:val="OperatorTok"/>
+        </w:rPr>
+        <w:t xml:space="preserve">=</w:t>
+      </w:r>
+      <w:r>
+        <w:rPr>
+          <w:rStyle w:val="StringTok"/>
+        </w:rPr>
+        <w:t xml:space="preserve">'k--'</w:t>
+      </w:r>
+      <w:r>
+        <w:rPr>
+          <w:rStyle w:val="NormalTok"/>
+        </w:rPr>
+        <w:t xml:space="preserve">)</w:t>
       </w:r>
       <w:r>
         <w:br w:type="textWrapping"/>
       </w:r>
       <w:r>
         <w:rPr>
-          <w:rStyle w:val="VerbatimChar"/>
-        </w:rPr>
-        <w:t xml:space="preserve">plt.ylabel('Real', fontsize=14, color='k')</w:t>
+          <w:rStyle w:val="NormalTok"/>
+        </w:rPr>
+        <w:t xml:space="preserve">plt.subplot(</w:t>
+      </w:r>
+      <w:r>
+        <w:rPr>
+          <w:rStyle w:val="DecValTok"/>
+        </w:rPr>
+        <w:t xml:space="preserve">212</w:t>
+      </w:r>
+      <w:r>
+        <w:rPr>
+          <w:rStyle w:val="NormalTok"/>
+        </w:rPr>
+        <w:t xml:space="preserve">)</w:t>
       </w:r>
       <w:r>
         <w:br w:type="textWrapping"/>
       </w:r>
       <w:r>
         <w:rPr>
-          <w:rStyle w:val="VerbatimChar"/>
-        </w:rPr>
-        <w:t xml:space="preserve">plt.stem(X.real,linefmt='k--',markerfmt='ko', basefmt='k--')</w:t>
+          <w:rStyle w:val="NormalTok"/>
+        </w:rPr>
+        <w:t xml:space="preserve">plt.stem(X.imag,linefmt</w:t>
+      </w:r>
+      <w:r>
+        <w:rPr>
+          <w:rStyle w:val="OperatorTok"/>
+        </w:rPr>
+        <w:t xml:space="preserve">=</w:t>
+      </w:r>
+      <w:r>
+        <w:rPr>
+          <w:rStyle w:val="StringTok"/>
+        </w:rPr>
+        <w:t xml:space="preserve">'k--'</w:t>
+      </w:r>
+      <w:r>
+        <w:rPr>
+          <w:rStyle w:val="NormalTok"/>
+        </w:rPr>
+        <w:t xml:space="preserve">,markerfmt</w:t>
+      </w:r>
+      <w:r>
+        <w:rPr>
+          <w:rStyle w:val="OperatorTok"/>
+        </w:rPr>
+        <w:t xml:space="preserve">=</w:t>
+      </w:r>
+      <w:r>
+        <w:rPr>
+          <w:rStyle w:val="StringTok"/>
+        </w:rPr>
+        <w:t xml:space="preserve">'ks'</w:t>
+      </w:r>
+      <w:r>
+        <w:rPr>
+          <w:rStyle w:val="NormalTok"/>
+        </w:rPr>
+        <w:t xml:space="preserve">, basefmt</w:t>
+      </w:r>
+      <w:r>
+        <w:rPr>
+          <w:rStyle w:val="OperatorTok"/>
+        </w:rPr>
+        <w:t xml:space="preserve">=</w:t>
+      </w:r>
+      <w:r>
+        <w:rPr>
+          <w:rStyle w:val="StringTok"/>
+        </w:rPr>
+        <w:t xml:space="preserve">'k--'</w:t>
+      </w:r>
+      <w:r>
+        <w:rPr>
+          <w:rStyle w:val="NormalTok"/>
+        </w:rPr>
+        <w:t xml:space="preserve">)</w:t>
       </w:r>
       <w:r>
         <w:br w:type="textWrapping"/>
       </w:r>
       <w:r>
         <w:rPr>
-          <w:rStyle w:val="VerbatimChar"/>
-        </w:rPr>
-        <w:t xml:space="preserve">plt.subplot(212)</w:t>
+          <w:rStyle w:val="NormalTok"/>
+        </w:rPr>
+        <w:t xml:space="preserve">plt.ylabel(</w:t>
+      </w:r>
+      <w:r>
+        <w:rPr>
+          <w:rStyle w:val="StringTok"/>
+        </w:rPr>
+        <w:t xml:space="preserve">'Imaginário'</w:t>
+      </w:r>
+      <w:r>
+        <w:rPr>
+          <w:rStyle w:val="NormalTok"/>
+        </w:rPr>
+        <w:t xml:space="preserve">, fontsize</w:t>
+      </w:r>
+      <w:r>
+        <w:rPr>
+          <w:rStyle w:val="OperatorTok"/>
+        </w:rPr>
+        <w:t xml:space="preserve">=</w:t>
+      </w:r>
+      <w:r>
+        <w:rPr>
+          <w:rStyle w:val="DecValTok"/>
+        </w:rPr>
+        <w:t xml:space="preserve">14</w:t>
+      </w:r>
+      <w:r>
+        <w:rPr>
+          <w:rStyle w:val="NormalTok"/>
+        </w:rPr>
+        <w:t xml:space="preserve">, color</w:t>
+      </w:r>
+      <w:r>
+        <w:rPr>
+          <w:rStyle w:val="OperatorTok"/>
+        </w:rPr>
+        <w:t xml:space="preserve">=</w:t>
+      </w:r>
+      <w:r>
+        <w:rPr>
+          <w:rStyle w:val="StringTok"/>
+        </w:rPr>
+        <w:t xml:space="preserve">'k'</w:t>
+      </w:r>
+      <w:r>
+        <w:rPr>
+          <w:rStyle w:val="NormalTok"/>
+        </w:rPr>
+        <w:t xml:space="preserve">)</w:t>
       </w:r>
       <w:r>
         <w:br w:type="textWrapping"/>
       </w:r>
       <w:r>
         <w:rPr>
-          <w:rStyle w:val="VerbatimChar"/>
-        </w:rPr>
-        <w:t xml:space="preserve">plt.stem(X.imag,linefmt='k--',markerfmt='ks', basefmt='k--')</w:t>
+          <w:rStyle w:val="NormalTok"/>
+        </w:rPr>
+        <w:t xml:space="preserve">plt.savefig(</w:t>
+      </w:r>
+      <w:r>
+        <w:rPr>
+          <w:rStyle w:val="StringTok"/>
+        </w:rPr>
+        <w:t xml:space="preserve">'transform.png'</w:t>
+      </w:r>
+      <w:r>
+        <w:rPr>
+          <w:rStyle w:val="NormalTok"/>
+        </w:rPr>
+        <w:t xml:space="preserve">, dpi</w:t>
+      </w:r>
+      <w:r>
+        <w:rPr>
+          <w:rStyle w:val="OperatorTok"/>
+        </w:rPr>
+        <w:t xml:space="preserve">=</w:t>
+      </w:r>
+      <w:r>
+        <w:rPr>
+          <w:rStyle w:val="DecValTok"/>
+        </w:rPr>
+        <w:t xml:space="preserve">150</w:t>
+      </w:r>
+      <w:r>
+        <w:rPr>
+          <w:rStyle w:val="NormalTok"/>
+        </w:rPr>
+        <w:t xml:space="preserve">)</w:t>
       </w:r>
       <w:r>
         <w:br w:type="textWrapping"/>
       </w:r>
       <w:r>
         <w:rPr>
-          <w:rStyle w:val="VerbatimChar"/>
-        </w:rPr>
-        <w:t xml:space="preserve">plt.ylabel('Imaginário', fontsize=14, color='k')</w:t>
-      </w:r>
-      <w:r>
-        <w:br w:type="textWrapping"/>
-      </w:r>
-      <w:r>
-        <w:rPr>
-          <w:rStyle w:val="VerbatimChar"/>
-        </w:rPr>
-        <w:t xml:space="preserve">plt.savefig('transform.png', dpi=150)</w:t>
-      </w:r>
-      <w:r>
-        <w:br w:type="textWrapping"/>
-      </w:r>
-      <w:r>
-        <w:rPr>
-          <w:rStyle w:val="VerbatimChar"/>
-        </w:rPr>
-        <w:t xml:space="preserve">plt.close('all')</w:t>
+          <w:rStyle w:val="NormalTok"/>
+        </w:rPr>
+        <w:t xml:space="preserve">plt.close(</w:t>
+      </w:r>
+      <w:r>
+        <w:rPr>
+          <w:rStyle w:val="StringTok"/>
+        </w:rPr>
+        <w:t xml:space="preserve">'all'</w:t>
+      </w:r>
+      <w:r>
+        <w:rPr>
+          <w:rStyle w:val="NormalTok"/>
+        </w:rPr>
+        <w:t xml:space="preserve">)</w:t>
       </w:r>
     </w:p>
     <w:p>
       <w:pPr>
         <w:pStyle w:val="Heading2"/>
       </w:pPr>
-      <w:bookmarkStart w:id="44" w:name="a-equação-da-onda"/>
+      <w:bookmarkStart w:id="45" w:name="a-equação-da-onda"/>
       <w:r>
         <w:t xml:space="preserve">A Equação da Onda</w:t>
       </w:r>
-      <w:bookmarkEnd w:id="44"/>
+      <w:bookmarkEnd w:id="45"/>
     </w:p>
     <w:p>
       <w:pPr>
@@ -8630,7 +10325,7 @@
                     </pic:cNvPicPr>
                   </pic:nvPicPr>
                   <pic:blipFill>
-                    <a:blip r:embed="rId45"/>
+                    <a:blip r:embed="rId46"/>
                     <a:stretch>
                       <a:fillRect/>
                     </a:stretch>
@@ -8857,10 +10552,250 @@
       <w:pPr>
         <w:pStyle w:val="BodyText"/>
       </w:pPr>
-      <w:r>
-        <w:t xml:space="preserve">$$F(x,t) = T(x + dx,t)\sin(\theta + d\theta) - T(x,t)\sin(\theta) = \\
-T(x + dx,t)\cos(\theta + d\theta) \tan(\theta + d\theta) - T(x,t)\cos(\theta)\tan(\theta)$$</w:t>
-      </w:r>
+      <m:oMathPara>
+        <m:oMathParaPr>
+          <m:jc m:val="center"/>
+        </m:oMathParaPr>
+        <m:oMath>
+          <m:r>
+            <m:t>F</m:t>
+          </m:r>
+          <m:r>
+            <m:t>(</m:t>
+          </m:r>
+          <m:r>
+            <m:t>x</m:t>
+          </m:r>
+          <m:r>
+            <m:t>,</m:t>
+          </m:r>
+          <m:r>
+            <m:t>t</m:t>
+          </m:r>
+          <m:r>
+            <m:t>)</m:t>
+          </m:r>
+          <m:r>
+            <m:t>=</m:t>
+          </m:r>
+          <m:r>
+            <m:t>T</m:t>
+          </m:r>
+          <m:r>
+            <m:t>(</m:t>
+          </m:r>
+          <m:r>
+            <m:t>x</m:t>
+          </m:r>
+          <m:r>
+            <m:t>+</m:t>
+          </m:r>
+          <m:r>
+            <m:t>d</m:t>
+          </m:r>
+          <m:r>
+            <m:t>x</m:t>
+          </m:r>
+          <m:r>
+            <m:t>,</m:t>
+          </m:r>
+          <m:r>
+            <m:t>t</m:t>
+          </m:r>
+          <m:r>
+            <m:t>)</m:t>
+          </m:r>
+          <m:r>
+            <m:rPr>
+              <m:sty m:val="p"/>
+            </m:rPr>
+            <m:t>sin</m:t>
+          </m:r>
+          <m:r>
+            <m:t>(</m:t>
+          </m:r>
+          <m:r>
+            <m:t>θ</m:t>
+          </m:r>
+          <m:r>
+            <m:t>+</m:t>
+          </m:r>
+          <m:r>
+            <m:t>d</m:t>
+          </m:r>
+          <m:r>
+            <m:t>θ</m:t>
+          </m:r>
+          <m:r>
+            <m:t>)</m:t>
+          </m:r>
+          <m:r>
+            <m:t>−</m:t>
+          </m:r>
+          <m:r>
+            <m:t>T</m:t>
+          </m:r>
+          <m:r>
+            <m:t>(</m:t>
+          </m:r>
+          <m:r>
+            <m:t>x</m:t>
+          </m:r>
+          <m:r>
+            <m:t>,</m:t>
+          </m:r>
+          <m:r>
+            <m:t>t</m:t>
+          </m:r>
+          <m:r>
+            <m:t>)</m:t>
+          </m:r>
+          <m:r>
+            <m:rPr>
+              <m:sty m:val="p"/>
+            </m:rPr>
+            <m:t>sin</m:t>
+          </m:r>
+          <m:r>
+            <m:t>(</m:t>
+          </m:r>
+          <m:r>
+            <m:t>θ</m:t>
+          </m:r>
+          <m:r>
+            <m:t>)</m:t>
+          </m:r>
+          <m:r>
+            <m:t>=</m:t>
+          </m:r>
+          <m:r>
+            <m:t>T</m:t>
+          </m:r>
+          <m:r>
+            <m:t>(</m:t>
+          </m:r>
+          <m:r>
+            <m:t>x</m:t>
+          </m:r>
+          <m:r>
+            <m:t>+</m:t>
+          </m:r>
+          <m:r>
+            <m:t>d</m:t>
+          </m:r>
+          <m:r>
+            <m:t>x</m:t>
+          </m:r>
+          <m:r>
+            <m:t>,</m:t>
+          </m:r>
+          <m:r>
+            <m:t>t</m:t>
+          </m:r>
+          <m:r>
+            <m:t>)</m:t>
+          </m:r>
+          <m:r>
+            <m:rPr>
+              <m:sty m:val="p"/>
+            </m:rPr>
+            <m:t>cos</m:t>
+          </m:r>
+          <m:r>
+            <m:t>(</m:t>
+          </m:r>
+          <m:r>
+            <m:t>θ</m:t>
+          </m:r>
+          <m:r>
+            <m:t>+</m:t>
+          </m:r>
+          <m:r>
+            <m:t>d</m:t>
+          </m:r>
+          <m:r>
+            <m:t>θ</m:t>
+          </m:r>
+          <m:r>
+            <m:t>)</m:t>
+          </m:r>
+          <m:r>
+            <m:rPr>
+              <m:sty m:val="p"/>
+            </m:rPr>
+            <m:t>tan</m:t>
+          </m:r>
+          <m:r>
+            <m:t>(</m:t>
+          </m:r>
+          <m:r>
+            <m:t>θ</m:t>
+          </m:r>
+          <m:r>
+            <m:t>+</m:t>
+          </m:r>
+          <m:r>
+            <m:t>d</m:t>
+          </m:r>
+          <m:r>
+            <m:t>θ</m:t>
+          </m:r>
+          <m:r>
+            <m:t>)</m:t>
+          </m:r>
+          <m:r>
+            <m:t>−</m:t>
+          </m:r>
+          <m:r>
+            <m:t>T</m:t>
+          </m:r>
+          <m:r>
+            <m:t>(</m:t>
+          </m:r>
+          <m:r>
+            <m:t>x</m:t>
+          </m:r>
+          <m:r>
+            <m:t>,</m:t>
+          </m:r>
+          <m:r>
+            <m:t>t</m:t>
+          </m:r>
+          <m:r>
+            <m:t>)</m:t>
+          </m:r>
+          <m:r>
+            <m:rPr>
+              <m:sty m:val="p"/>
+            </m:rPr>
+            <m:t>cos</m:t>
+          </m:r>
+          <m:r>
+            <m:t>(</m:t>
+          </m:r>
+          <m:r>
+            <m:t>θ</m:t>
+          </m:r>
+          <m:r>
+            <m:t>)</m:t>
+          </m:r>
+          <m:r>
+            <m:rPr>
+              <m:sty m:val="p"/>
+            </m:rPr>
+            <m:t>tan</m:t>
+          </m:r>
+          <m:r>
+            <m:t>(</m:t>
+          </m:r>
+          <m:r>
+            <m:t>θ</m:t>
+          </m:r>
+          <m:r>
+            <m:t>)</m:t>
+          </m:r>
+        </m:oMath>
+      </m:oMathPara>
     </w:p>
     <w:p>
       <w:pPr>
@@ -11270,11 +13205,11 @@
       <w:pPr>
         <w:pStyle w:val="Heading2"/>
       </w:pPr>
-      <w:bookmarkStart w:id="46" w:name="formalização-de-uma-rede-neural---forward-pass"/>
+      <w:bookmarkStart w:id="47" w:name="formalização-de-uma-rede-neural---forward-pass"/>
       <w:r>
         <w:t xml:space="preserve">Formalização de uma Rede Neural - Forward Pass</w:t>
       </w:r>
-      <w:bookmarkEnd w:id="46"/>
+      <w:bookmarkEnd w:id="47"/>
     </w:p>
     <w:p>
       <w:pPr>
@@ -11304,7 +13239,7 @@
                     </pic:cNvPicPr>
                   </pic:nvPicPr>
                   <pic:blipFill>
-                    <a:blip r:embed="rId47"/>
+                    <a:blip r:embed="rId48"/>
                     <a:stretch>
                       <a:fillRect/>
                     </a:stretch>
@@ -12471,11 +14406,11 @@
       <w:pPr>
         <w:pStyle w:val="Heading2"/>
       </w:pPr>
-      <w:bookmarkStart w:id="48" w:name="formalização-de-uma-rede-neural---backpropagation"/>
+      <w:bookmarkStart w:id="49" w:name="formalização-de-uma-rede-neural---backpropagation"/>
       <w:r>
         <w:t xml:space="preserve">Formalização de uma Rede Neural - Backpropagation</w:t>
       </w:r>
-      <w:bookmarkEnd w:id="48"/>
+      <w:bookmarkEnd w:id="49"/>
     </w:p>
     <w:p>
       <w:pPr>
@@ -13092,7 +15027,7 @@
                     </pic:cNvPicPr>
                   </pic:nvPicPr>
                   <pic:blipFill>
-                    <a:blip r:embed="rId49"/>
+                    <a:blip r:embed="rId50"/>
                     <a:stretch>
                       <a:fillRect/>
                     </a:stretch>
@@ -14725,21 +16660,21 @@
       <w:pPr>
         <w:pStyle w:val="Heading1"/>
       </w:pPr>
-      <w:bookmarkStart w:id="50" w:name="metodologia"/>
+      <w:bookmarkStart w:id="51" w:name="metodologia"/>
       <w:r>
         <w:t xml:space="preserve">Metodologia</w:t>
       </w:r>
-      <w:bookmarkEnd w:id="50"/>
+      <w:bookmarkEnd w:id="51"/>
     </w:p>
     <w:p>
       <w:pPr>
         <w:pStyle w:val="Heading2"/>
       </w:pPr>
-      <w:bookmarkStart w:id="51" w:name="samples-utilizados"/>
+      <w:bookmarkStart w:id="52" w:name="samples-utilizados"/>
       <w:r>
         <w:t xml:space="preserve">Samples Utilizados</w:t>
       </w:r>
-      <w:bookmarkEnd w:id="51"/>
+      <w:bookmarkEnd w:id="52"/>
     </w:p>
     <w:p>
       <w:pPr>
@@ -14773,11 +16708,11 @@
       <w:pPr>
         <w:pStyle w:val="Heading2"/>
       </w:pPr>
-      <w:bookmarkStart w:id="52" w:name="redes-densas"/>
+      <w:bookmarkStart w:id="53" w:name="redes-densas"/>
       <w:r>
         <w:t xml:space="preserve">Redes Densas</w:t>
       </w:r>
-      <w:bookmarkEnd w:id="52"/>
+      <w:bookmarkEnd w:id="53"/>
     </w:p>
     <w:p>
       <w:pPr>
@@ -15305,11 +17240,11 @@
       <w:pPr>
         <w:pStyle w:val="Heading3"/>
       </w:pPr>
-      <w:bookmarkStart w:id="53" w:name="algoritmos-de-otimização"/>
+      <w:bookmarkStart w:id="54" w:name="algoritmos-de-otimização"/>
       <w:r>
         <w:t xml:space="preserve">Algoritmos de Otimização</w:t>
       </w:r>
-      <w:bookmarkEnd w:id="53"/>
+      <w:bookmarkEnd w:id="54"/>
     </w:p>
     <w:p>
       <w:pPr>
@@ -15355,11 +17290,11 @@
       <w:pPr>
         <w:pStyle w:val="Heading3"/>
       </w:pPr>
-      <w:bookmarkStart w:id="54" w:name="grid-search-para-topologia-e-parâmetros"/>
+      <w:bookmarkStart w:id="55" w:name="grid-search-para-topologia-e-parâmetros"/>
       <w:r>
         <w:t xml:space="preserve">Grid search para topologia e parâmetros</w:t>
       </w:r>
-      <w:bookmarkEnd w:id="54"/>
+      <w:bookmarkEnd w:id="55"/>
     </w:p>
     <w:p>
       <w:pPr>
@@ -15373,11 +17308,11 @@
       <w:pPr>
         <w:pStyle w:val="Heading4"/>
       </w:pPr>
-      <w:bookmarkStart w:id="55" w:name="adagrad"/>
+      <w:bookmarkStart w:id="56" w:name="adagrad"/>
       <w:r>
         <w:t xml:space="preserve">Adagrad</w:t>
       </w:r>
-      <w:bookmarkEnd w:id="55"/>
+      <w:bookmarkEnd w:id="56"/>
     </w:p>
     <w:p>
       <w:pPr>
@@ -15441,7 +17376,7 @@
                     </pic:cNvPicPr>
                   </pic:nvPicPr>
                   <pic:blipFill>
-                    <a:blip r:embed="rId56"/>
+                    <a:blip r:embed="rId57"/>
                     <a:stretch>
                       <a:fillRect/>
                     </a:stretch>
@@ -15496,7 +17431,7 @@
                     </pic:cNvPicPr>
                   </pic:nvPicPr>
                   <pic:blipFill>
-                    <a:blip r:embed="rId57"/>
+                    <a:blip r:embed="rId58"/>
                     <a:stretch>
                       <a:fillRect/>
                     </a:stretch>
@@ -15909,11 +17844,11 @@
       <w:pPr>
         <w:pStyle w:val="Heading4"/>
       </w:pPr>
-      <w:bookmarkStart w:id="58" w:name="nadam"/>
+      <w:bookmarkStart w:id="59" w:name="nadam"/>
       <w:r>
         <w:t xml:space="preserve">Nadam</w:t>
       </w:r>
-      <w:bookmarkEnd w:id="58"/>
+      <w:bookmarkEnd w:id="59"/>
     </w:p>
     <w:p>
       <w:pPr>
@@ -15943,7 +17878,7 @@
                     </pic:cNvPicPr>
                   </pic:nvPicPr>
                   <pic:blipFill>
-                    <a:blip r:embed="rId59"/>
+                    <a:blip r:embed="rId60"/>
                     <a:stretch>
                       <a:fillRect/>
                     </a:stretch>
@@ -15998,7 +17933,7 @@
                     </pic:cNvPicPr>
                   </pic:nvPicPr>
                   <pic:blipFill>
-                    <a:blip r:embed="rId60"/>
+                    <a:blip r:embed="rId61"/>
                     <a:stretch>
                       <a:fillRect/>
                     </a:stretch>
@@ -16411,11 +18346,11 @@
       <w:pPr>
         <w:pStyle w:val="Heading4"/>
       </w:pPr>
-      <w:bookmarkStart w:id="61" w:name="ativações-e-otimizadores"/>
+      <w:bookmarkStart w:id="62" w:name="ativações-e-otimizadores"/>
       <w:r>
         <w:t xml:space="preserve">Ativações e Otimizadores</w:t>
       </w:r>
-      <w:bookmarkEnd w:id="61"/>
+      <w:bookmarkEnd w:id="62"/>
     </w:p>
     <w:p>
       <w:pPr>
@@ -16445,7 +18380,7 @@
                     </pic:cNvPicPr>
                   </pic:nvPicPr>
                   <pic:blipFill>
-                    <a:blip r:embed="rId62"/>
+                    <a:blip r:embed="rId63"/>
                     <a:stretch>
                       <a:fillRect/>
                     </a:stretch>
@@ -16492,11 +18427,11 @@
       <w:pPr>
         <w:pStyle w:val="Heading3"/>
       </w:pPr>
-      <w:bookmarkStart w:id="63" w:name="análise-dos-resultados"/>
+      <w:bookmarkStart w:id="64" w:name="análise-dos-resultados"/>
       <w:r>
         <w:t xml:space="preserve">Análise dos resultados</w:t>
       </w:r>
-      <w:bookmarkEnd w:id="63"/>
+      <w:bookmarkEnd w:id="64"/>
     </w:p>
     <w:p>
       <w:pPr>
@@ -16860,7 +18795,7 @@
       <w:r>
         <w:t xml:space="preserve"> </w:t>
       </w:r>
-      <w:hyperlink r:id="rId64">
+      <w:hyperlink r:id="rId65">
         <w:r>
           <w:rPr>
             <w:rStyle w:val="Hyperlink"/>
@@ -16895,7 +18830,7 @@
                     </pic:cNvPicPr>
                   </pic:nvPicPr>
                   <pic:blipFill>
-                    <a:blip r:embed="rId65"/>
+                    <a:blip r:embed="rId66"/>
                     <a:stretch>
                       <a:fillRect/>
                     </a:stretch>
@@ -16958,11 +18893,11 @@
       <w:pPr>
         <w:pStyle w:val="Heading2"/>
       </w:pPr>
-      <w:bookmarkStart w:id="66" w:name="redes-recorrentes-1"/>
+      <w:bookmarkStart w:id="67" w:name="redes-recorrentes-1"/>
       <w:r>
         <w:t xml:space="preserve">Redes Recorrentes</w:t>
       </w:r>
-      <w:bookmarkEnd w:id="66"/>
+      <w:bookmarkEnd w:id="67"/>
     </w:p>
     <w:p>
       <w:pPr>
@@ -16992,7 +18927,7 @@
                     </pic:cNvPicPr>
                   </pic:nvPicPr>
                   <pic:blipFill>
-                    <a:blip r:embed="rId67"/>
+                    <a:blip r:embed="rId68"/>
                     <a:stretch>
                       <a:fillRect/>
                     </a:stretch>
@@ -17055,7 +18990,7 @@
                     </pic:cNvPicPr>
                   </pic:nvPicPr>
                   <pic:blipFill>
-                    <a:blip r:embed="rId68"/>
+                    <a:blip r:embed="rId69"/>
                     <a:stretch>
                       <a:fillRect/>
                     </a:stretch>
@@ -17177,7 +19112,7 @@
                     </pic:cNvPicPr>
                   </pic:nvPicPr>
                   <pic:blipFill>
-                    <a:blip r:embed="rId69"/>
+                    <a:blip r:embed="rId70"/>
                     <a:stretch>
                       <a:fillRect/>
                     </a:stretch>
@@ -17222,7 +19157,7 @@
       <w:r>
         <w:t xml:space="preserve"> </w:t>
       </w:r>
-      <w:hyperlink r:id="rId70">
+      <w:hyperlink r:id="rId39">
         <w:r>
           <w:rPr>
             <w:rStyle w:val="Hyperlink"/>
@@ -17244,7 +19179,7 @@
       <w:r>
         <w:t xml:space="preserve"> </w:t>
       </w:r>
-      <w:hyperlink r:id="rId70">
+      <w:hyperlink r:id="rId39">
         <w:r>
           <w:rPr>
             <w:rStyle w:val="Hyperlink"/>

</xml_diff>

<commit_message>
audio e video funcionando na versão em html.
</commit_message>
<xml_diff>
--- a/Dissert.docx
+++ b/Dissert.docx
@@ -4360,7 +4360,7 @@
           <w:rPr>
             <w:rStyle w:val="Hyperlink"/>
           </w:rPr>
-          <w:t xml:space="preserve">Finite_Difference.py</w:t>
+          <w:t xml:space="preserve">resources/Finite_Difference.py</w:t>
         </w:r>
       </w:hyperlink>
       <w:r>
@@ -6629,20 +6629,302 @@
       <w:r>
         <w:t xml:space="preserve"> </w:t>
       </w:r>
-      <w:hyperlink r:id="rId39"/>
-      <w:r>
-        <w:t xml:space="preserve">, junto com áudios de diversas ondas, com local de excitação e captação variados. É interessante observar o efeito da variação desses parametros no timbre da onda sonora gerada.</w:t>
+      <w:hyperlink r:id="rId39">
+        <w:r>
+          <w:rPr>
+            <w:rStyle w:val="Hyperlink"/>
+          </w:rPr>
+          <w:t xml:space="preserve">resources/Demo Finite Difference</w:t>
+        </w:r>
+      </w:hyperlink>
+      <w:r>
+        <w:t xml:space="preserve">, junto com áudios de diversas ondas, com local de excitação e captação variados. É interessante observar o efeito da variação desses parametros no timbre da onda sonora gerada. Cabe notar que a velocidade e a escala da animação estão bastante distorcidas.</w:t>
+      </w:r>
+    </w:p>
+    <w:p>
+      <w:pPr>
+        <w:pStyle w:val="CaptionedFigure"/>
+      </w:pPr>
+      <w:r>
+        <w:drawing>
+          <wp:inline>
+            <wp:extent cx="5943600" cy="1128744"/>
+            <wp:effectExtent b="0" l="0" r="0" t="0"/>
+            <wp:docPr descr="Excitação: 0.1 - Captação: 0.1" title="" id="1" name="Picture"/>
+            <a:graphic>
+              <a:graphicData uri="http://schemas.openxmlformats.org/drawingml/2006/picture">
+                <pic:pic>
+                  <pic:nvPicPr>
+                    <pic:cNvPr descr="im/FD_440_Pluck_0-1_Pick_0-1.png" id="0" name="Picture"/>
+                    <pic:cNvPicPr>
+                      <a:picLocks noChangeArrowheads="1" noChangeAspect="1"/>
+                    </pic:cNvPicPr>
+                  </pic:nvPicPr>
+                  <pic:blipFill>
+                    <a:blip r:embed="rId40"/>
+                    <a:stretch>
+                      <a:fillRect/>
+                    </a:stretch>
+                  </pic:blipFill>
+                  <pic:spPr bwMode="auto">
+                    <a:xfrm>
+                      <a:off x="0" y="0"/>
+                      <a:ext cx="5943600" cy="1128744"/>
+                    </a:xfrm>
+                    <a:prstGeom prst="rect">
+                      <a:avLst/>
+                    </a:prstGeom>
+                    <a:noFill/>
+                    <a:ln w="9525">
+                      <a:noFill/>
+                      <a:headEnd/>
+                      <a:tailEnd/>
+                    </a:ln>
+                  </pic:spPr>
+                </pic:pic>
+              </a:graphicData>
+            </a:graphic>
+          </wp:inline>
+        </w:drawing>
+      </w:r>
+    </w:p>
+    <w:p>
+      <w:pPr>
+        <w:pStyle w:val="ImageCaption"/>
+      </w:pPr>
+      <w:r>
+        <w:t xml:space="preserve">Excitação: 0.1 - Captação: 0.1</w:t>
+      </w:r>
+    </w:p>
+    <w:p>
+      <w:pPr>
+        <w:pStyle w:val="CaptionedFigure"/>
+      </w:pPr>
+      <w:r>
+        <w:drawing>
+          <wp:inline>
+            <wp:extent cx="5943600" cy="1128744"/>
+            <wp:effectExtent b="0" l="0" r="0" t="0"/>
+            <wp:docPr descr="Excitação: 0.1 - Captação: 0.5" title="" id="1" name="Picture"/>
+            <a:graphic>
+              <a:graphicData uri="http://schemas.openxmlformats.org/drawingml/2006/picture">
+                <pic:pic>
+                  <pic:nvPicPr>
+                    <pic:cNvPr descr="im/FD_440_Pluck_0-1_Pick_0-5.png" id="0" name="Picture"/>
+                    <pic:cNvPicPr>
+                      <a:picLocks noChangeArrowheads="1" noChangeAspect="1"/>
+                    </pic:cNvPicPr>
+                  </pic:nvPicPr>
+                  <pic:blipFill>
+                    <a:blip r:embed="rId41"/>
+                    <a:stretch>
+                      <a:fillRect/>
+                    </a:stretch>
+                  </pic:blipFill>
+                  <pic:spPr bwMode="auto">
+                    <a:xfrm>
+                      <a:off x="0" y="0"/>
+                      <a:ext cx="5943600" cy="1128744"/>
+                    </a:xfrm>
+                    <a:prstGeom prst="rect">
+                      <a:avLst/>
+                    </a:prstGeom>
+                    <a:noFill/>
+                    <a:ln w="9525">
+                      <a:noFill/>
+                      <a:headEnd/>
+                      <a:tailEnd/>
+                    </a:ln>
+                  </pic:spPr>
+                </pic:pic>
+              </a:graphicData>
+            </a:graphic>
+          </wp:inline>
+        </w:drawing>
+      </w:r>
+    </w:p>
+    <w:p>
+      <w:pPr>
+        <w:pStyle w:val="ImageCaption"/>
+      </w:pPr>
+      <w:r>
+        <w:t xml:space="preserve">Excitação: 0.1 - Captação: 0.5</w:t>
+      </w:r>
+    </w:p>
+    <w:p>
+      <w:pPr>
+        <w:pStyle w:val="CaptionedFigure"/>
+      </w:pPr>
+      <w:r>
+        <w:drawing>
+          <wp:inline>
+            <wp:extent cx="5943600" cy="1128744"/>
+            <wp:effectExtent b="0" l="0" r="0" t="0"/>
+            <wp:docPr descr="Excitação: 0.3 - Captação: 0.7" title="" id="1" name="Picture"/>
+            <a:graphic>
+              <a:graphicData uri="http://schemas.openxmlformats.org/drawingml/2006/picture">
+                <pic:pic>
+                  <pic:nvPicPr>
+                    <pic:cNvPr descr="im/FD_440_Pluck_0-3_Pick_0-7.png" id="0" name="Picture"/>
+                    <pic:cNvPicPr>
+                      <a:picLocks noChangeArrowheads="1" noChangeAspect="1"/>
+                    </pic:cNvPicPr>
+                  </pic:nvPicPr>
+                  <pic:blipFill>
+                    <a:blip r:embed="rId42"/>
+                    <a:stretch>
+                      <a:fillRect/>
+                    </a:stretch>
+                  </pic:blipFill>
+                  <pic:spPr bwMode="auto">
+                    <a:xfrm>
+                      <a:off x="0" y="0"/>
+                      <a:ext cx="5943600" cy="1128744"/>
+                    </a:xfrm>
+                    <a:prstGeom prst="rect">
+                      <a:avLst/>
+                    </a:prstGeom>
+                    <a:noFill/>
+                    <a:ln w="9525">
+                      <a:noFill/>
+                      <a:headEnd/>
+                      <a:tailEnd/>
+                    </a:ln>
+                  </pic:spPr>
+                </pic:pic>
+              </a:graphicData>
+            </a:graphic>
+          </wp:inline>
+        </w:drawing>
+      </w:r>
+    </w:p>
+    <w:p>
+      <w:pPr>
+        <w:pStyle w:val="ImageCaption"/>
+      </w:pPr>
+      <w:r>
+        <w:t xml:space="preserve">Excitação: 0.3 - Captação: 0.7</w:t>
+      </w:r>
+    </w:p>
+    <w:p>
+      <w:pPr>
+        <w:pStyle w:val="CaptionedFigure"/>
+      </w:pPr>
+      <w:r>
+        <w:drawing>
+          <wp:inline>
+            <wp:extent cx="5943600" cy="1128744"/>
+            <wp:effectExtent b="0" l="0" r="0" t="0"/>
+            <wp:docPr descr="Excitação: 0.5 - Captação: 0.1" title="" id="1" name="Picture"/>
+            <a:graphic>
+              <a:graphicData uri="http://schemas.openxmlformats.org/drawingml/2006/picture">
+                <pic:pic>
+                  <pic:nvPicPr>
+                    <pic:cNvPr descr="im/FD_440_Pluck_0-5_Pick_0-1.png" id="0" name="Picture"/>
+                    <pic:cNvPicPr>
+                      <a:picLocks noChangeArrowheads="1" noChangeAspect="1"/>
+                    </pic:cNvPicPr>
+                  </pic:nvPicPr>
+                  <pic:blipFill>
+                    <a:blip r:embed="rId43"/>
+                    <a:stretch>
+                      <a:fillRect/>
+                    </a:stretch>
+                  </pic:blipFill>
+                  <pic:spPr bwMode="auto">
+                    <a:xfrm>
+                      <a:off x="0" y="0"/>
+                      <a:ext cx="5943600" cy="1128744"/>
+                    </a:xfrm>
+                    <a:prstGeom prst="rect">
+                      <a:avLst/>
+                    </a:prstGeom>
+                    <a:noFill/>
+                    <a:ln w="9525">
+                      <a:noFill/>
+                      <a:headEnd/>
+                      <a:tailEnd/>
+                    </a:ln>
+                  </pic:spPr>
+                </pic:pic>
+              </a:graphicData>
+            </a:graphic>
+          </wp:inline>
+        </w:drawing>
+      </w:r>
+    </w:p>
+    <w:p>
+      <w:pPr>
+        <w:pStyle w:val="ImageCaption"/>
+      </w:pPr>
+      <w:r>
+        <w:t xml:space="preserve">Excitação: 0.5 - Captação: 0.1</w:t>
+      </w:r>
+    </w:p>
+    <w:p>
+      <w:pPr>
+        <w:pStyle w:val="CaptionedFigure"/>
+      </w:pPr>
+      <w:r>
+        <w:drawing>
+          <wp:inline>
+            <wp:extent cx="5943600" cy="1128744"/>
+            <wp:effectExtent b="0" l="0" r="0" t="0"/>
+            <wp:docPr descr="Excitação: 0.5 - Captação: 0.5" title="" id="1" name="Picture"/>
+            <a:graphic>
+              <a:graphicData uri="http://schemas.openxmlformats.org/drawingml/2006/picture">
+                <pic:pic>
+                  <pic:nvPicPr>
+                    <pic:cNvPr descr="im/FD_440_Pluck_0-5_Pick_0-5.png" id="0" name="Picture"/>
+                    <pic:cNvPicPr>
+                      <a:picLocks noChangeArrowheads="1" noChangeAspect="1"/>
+                    </pic:cNvPicPr>
+                  </pic:nvPicPr>
+                  <pic:blipFill>
+                    <a:blip r:embed="rId44"/>
+                    <a:stretch>
+                      <a:fillRect/>
+                    </a:stretch>
+                  </pic:blipFill>
+                  <pic:spPr bwMode="auto">
+                    <a:xfrm>
+                      <a:off x="0" y="0"/>
+                      <a:ext cx="5943600" cy="1128744"/>
+                    </a:xfrm>
+                    <a:prstGeom prst="rect">
+                      <a:avLst/>
+                    </a:prstGeom>
+                    <a:noFill/>
+                    <a:ln w="9525">
+                      <a:noFill/>
+                      <a:headEnd/>
+                      <a:tailEnd/>
+                    </a:ln>
+                  </pic:spPr>
+                </pic:pic>
+              </a:graphicData>
+            </a:graphic>
+          </wp:inline>
+        </w:drawing>
+      </w:r>
+    </w:p>
+    <w:p>
+      <w:pPr>
+        <w:pStyle w:val="ImageCaption"/>
+      </w:pPr>
+      <w:r>
+        <w:t xml:space="preserve">Excitação: 0.5 - Captação: 0.5</w:t>
       </w:r>
     </w:p>
     <w:p>
       <w:pPr>
         <w:pStyle w:val="Heading3"/>
       </w:pPr>
-      <w:bookmarkStart w:id="40" w:name="digital-waveguides"/>
+      <w:bookmarkStart w:id="45" w:name="digital-waveguides"/>
       <w:r>
         <w:t xml:space="preserve">Digital Waveguides</w:t>
       </w:r>
-      <w:bookmarkEnd w:id="40"/>
+      <w:bookmarkEnd w:id="45"/>
     </w:p>
     <w:p>
       <w:pPr>
@@ -6670,38 +6952,1943 @@
         <w:t xml:space="preserve">(Smith 2006)</w:t>
       </w:r>
       <w:r>
-        <w:t xml:space="preserve">. A discretização segue a linha descrita no contexto do método das diferenças finitas, e</w:t>
-      </w:r>
-    </w:p>
+        <w:t xml:space="preserve">. O modelo também parte da equação da onda, discretizada da forma apresentada no contexto do método das diferenças finitas. O framework puramente analítico, no entanto, é abandonado, em favor de uma interpretação visual baseada na teoria de sinais digitais. A imagem abaixo apresenta a intuição dor trás do método, também para o caso de uma corda fixa em suas extremidades.</w:t>
+      </w:r>
+    </w:p>
+    <w:p>
+      <w:pPr>
+        <w:pStyle w:val="CaptionedFigure"/>
+      </w:pPr>
+      <w:r>
+        <w:drawing>
+          <wp:inline>
+            <wp:extent cx="5943600" cy="2829153"/>
+            <wp:effectExtent b="0" l="0" r="0" t="0"/>
+            <wp:docPr descr="Digital Waveguides" title="" id="1" name="Picture"/>
+            <a:graphic>
+              <a:graphicData uri="http://schemas.openxmlformats.org/drawingml/2006/picture">
+                <pic:pic>
+                  <pic:nvPicPr>
+                    <pic:cNvPr descr="im/DigitalWaveguides.png" id="0" name="Picture"/>
+                    <pic:cNvPicPr>
+                      <a:picLocks noChangeArrowheads="1" noChangeAspect="1"/>
+                    </pic:cNvPicPr>
+                  </pic:nvPicPr>
+                  <pic:blipFill>
+                    <a:blip r:embed="rId46"/>
+                    <a:stretch>
+                      <a:fillRect/>
+                    </a:stretch>
+                  </pic:blipFill>
+                  <pic:spPr bwMode="auto">
+                    <a:xfrm>
+                      <a:off x="0" y="0"/>
+                      <a:ext cx="5943600" cy="2829153"/>
+                    </a:xfrm>
+                    <a:prstGeom prst="rect">
+                      <a:avLst/>
+                    </a:prstGeom>
+                    <a:noFill/>
+                    <a:ln w="9525">
+                      <a:noFill/>
+                      <a:headEnd/>
+                      <a:tailEnd/>
+                    </a:ln>
+                  </pic:spPr>
+                </pic:pic>
+              </a:graphicData>
+            </a:graphic>
+          </wp:inline>
+        </w:drawing>
+      </w:r>
+    </w:p>
+    <w:p>
+      <w:pPr>
+        <w:pStyle w:val="ImageCaption"/>
+      </w:pPr>
+      <w:r>
+        <w:t xml:space="preserve">Digital Waveguides</w:t>
+      </w:r>
+    </w:p>
+    <w:p>
+      <w:pPr>
+        <w:pStyle w:val="BodyText"/>
+      </w:pPr>
+      <w:r>
+        <w:t xml:space="preserve">As duas linhas quadriculadas são as chamadas linhas de atraso (delay lines), por onde a onda circula, em uma direção. Ao passar de uma linha pra outra, a onda é espelhada e invertida e todos os cálculos são concatenados (lumped) nesses pontos ou, dependendo da simulação, em apenas um desses pontos, como é o caso da implementação apresentada a seguir. No modelo mais básico, somente um termo de perda é calculado, enquanto implementações mais sofisticadas fazem uso de filtros para emular a rigidez das cordas, entre muitas outras adições possíveis. O modelo pode ser extendido também para emulações bidimensionais e tridimensionais, e presta-se à implementações bastante eficientes, geralmente envolvendo uma estrutura de dados de nominada circular buffer, para a implementação das delay lines.</w:t>
+      </w:r>
+    </w:p>
+    <w:p>
+      <w:pPr>
+        <w:pStyle w:val="BodyText"/>
+      </w:pPr>
+      <w:r>
+        <w:t xml:space="preserve">A seguir, é apresentada uma implementação em Python. Observa-se que a implementação é mais simples do que a do método das diferenças finitas, e mais eficiente, como a tabela a seguir demonstra. Como antes, a versão funcional do código pode ser acessada em</w:t>
+      </w:r>
+      <w:r>
+        <w:t xml:space="preserve"> </w:t>
+      </w:r>
+      <w:hyperlink r:id="rId47">
+        <w:r>
+          <w:rPr>
+            <w:rStyle w:val="Hyperlink"/>
+          </w:rPr>
+          <w:t xml:space="preserve">resources/Digital_waveguide.py</w:t>
+        </w:r>
+      </w:hyperlink>
+      <w:r>
+        <w:t xml:space="preserve">, e uma animação ilustrando a mesma onda anterior, além dos áudios, podem ser acessados em</w:t>
+      </w:r>
+      <w:r>
+        <w:t xml:space="preserve"> </w:t>
+      </w:r>
+      <w:hyperlink r:id="rId48">
+        <w:r>
+          <w:rPr>
+            <w:rStyle w:val="Hyperlink"/>
+          </w:rPr>
+          <w:t xml:space="preserve">resources</w:t>
+        </w:r>
+        <w:r>
+          <w:rPr>
+            <w:rStyle w:val="Hyperlink"/>
+          </w:rPr>
+          <w:t xml:space="preserve">Digital Waveguide</w:t>
+        </w:r>
+      </w:hyperlink>
+    </w:p>
+    <w:p>
+      <w:pPr>
+        <w:pStyle w:val="SourceCode"/>
+      </w:pPr>
+      <w:r>
+        <w:rPr>
+          <w:rStyle w:val="NormalTok"/>
+        </w:rPr>
+        <w:t xml:space="preserve">path </w:t>
+      </w:r>
+      <w:r>
+        <w:rPr>
+          <w:rStyle w:val="OperatorTok"/>
+        </w:rPr>
+        <w:t xml:space="preserve">=</w:t>
+      </w:r>
+      <w:r>
+        <w:rPr>
+          <w:rStyle w:val="NormalTok"/>
+        </w:rPr>
+        <w:t xml:space="preserve"> </w:t>
+      </w:r>
+      <w:r>
+        <w:rPr>
+          <w:rStyle w:val="StringTok"/>
+        </w:rPr>
+        <w:t xml:space="preserve">'Demo Digital Waveguide/'</w:t>
+      </w:r>
+      <w:r>
+        <w:br w:type="textWrapping"/>
+      </w:r>
+      <w:r>
+        <w:rPr>
+          <w:rStyle w:val="NormalTok"/>
+        </w:rPr>
+        <w:t xml:space="preserve">n </w:t>
+      </w:r>
+      <w:r>
+        <w:rPr>
+          <w:rStyle w:val="OperatorTok"/>
+        </w:rPr>
+        <w:t xml:space="preserve">=</w:t>
+      </w:r>
+      <w:r>
+        <w:rPr>
+          <w:rStyle w:val="NormalTok"/>
+        </w:rPr>
+        <w:t xml:space="preserve"> </w:t>
+      </w:r>
+      <w:r>
+        <w:rPr>
+          <w:rStyle w:val="DecValTok"/>
+        </w:rPr>
+        <w:t xml:space="preserve">44100</w:t>
+      </w:r>
+      <w:r>
+        <w:br w:type="textWrapping"/>
+      </w:r>
+      <w:r>
+        <w:rPr>
+          <w:rStyle w:val="NormalTok"/>
+        </w:rPr>
+        <w:t xml:space="preserve">fps </w:t>
+      </w:r>
+      <w:r>
+        <w:rPr>
+          <w:rStyle w:val="OperatorTok"/>
+        </w:rPr>
+        <w:t xml:space="preserve">=</w:t>
+      </w:r>
+      <w:r>
+        <w:rPr>
+          <w:rStyle w:val="NormalTok"/>
+        </w:rPr>
+        <w:t xml:space="preserve"> </w:t>
+      </w:r>
+      <w:r>
+        <w:rPr>
+          <w:rStyle w:val="DecValTok"/>
+        </w:rPr>
+        <w:t xml:space="preserve">44100</w:t>
+      </w:r>
+      <w:r>
+        <w:br w:type="textWrapping"/>
+      </w:r>
+      <w:r>
+        <w:rPr>
+          <w:rStyle w:val="NormalTok"/>
+        </w:rPr>
+        <w:t xml:space="preserve">frequency </w:t>
+      </w:r>
+      <w:r>
+        <w:rPr>
+          <w:rStyle w:val="OperatorTok"/>
+        </w:rPr>
+        <w:t xml:space="preserve">=</w:t>
+      </w:r>
+      <w:r>
+        <w:rPr>
+          <w:rStyle w:val="NormalTok"/>
+        </w:rPr>
+        <w:t xml:space="preserve"> </w:t>
+      </w:r>
+      <w:r>
+        <w:rPr>
+          <w:rStyle w:val="DecValTok"/>
+        </w:rPr>
+        <w:t xml:space="preserve">440</w:t>
+      </w:r>
+      <w:r>
+        <w:br w:type="textWrapping"/>
+      </w:r>
+      <w:r>
+        <w:rPr>
+          <w:rStyle w:val="NormalTok"/>
+        </w:rPr>
+        <w:t xml:space="preserve">amplitude </w:t>
+      </w:r>
+      <w:r>
+        <w:rPr>
+          <w:rStyle w:val="OperatorTok"/>
+        </w:rPr>
+        <w:t xml:space="preserve">=</w:t>
+      </w:r>
+      <w:r>
+        <w:rPr>
+          <w:rStyle w:val="NormalTok"/>
+        </w:rPr>
+        <w:t xml:space="preserve"> </w:t>
+      </w:r>
+      <w:r>
+        <w:rPr>
+          <w:rStyle w:val="DecValTok"/>
+        </w:rPr>
+        <w:t xml:space="preserve">20000</w:t>
+      </w:r>
+      <w:r>
+        <w:br w:type="textWrapping"/>
+      </w:r>
+      <w:r>
+        <w:rPr>
+          <w:rStyle w:val="NormalTok"/>
+        </w:rPr>
+        <w:t xml:space="preserve">pluck_position </w:t>
+      </w:r>
+      <w:r>
+        <w:rPr>
+          <w:rStyle w:val="OperatorTok"/>
+        </w:rPr>
+        <w:t xml:space="preserve">=</w:t>
+      </w:r>
+      <w:r>
+        <w:rPr>
+          <w:rStyle w:val="NormalTok"/>
+        </w:rPr>
+        <w:t xml:space="preserve"> </w:t>
+      </w:r>
+      <w:r>
+        <w:rPr>
+          <w:rStyle w:val="FloatTok"/>
+        </w:rPr>
+        <w:t xml:space="preserve">.1</w:t>
+      </w:r>
+      <w:r>
+        <w:br w:type="textWrapping"/>
+      </w:r>
+      <w:r>
+        <w:rPr>
+          <w:rStyle w:val="NormalTok"/>
+        </w:rPr>
+        <w:t xml:space="preserve">pickup_position </w:t>
+      </w:r>
+      <w:r>
+        <w:rPr>
+          <w:rStyle w:val="OperatorTok"/>
+        </w:rPr>
+        <w:t xml:space="preserve">=</w:t>
+      </w:r>
+      <w:r>
+        <w:rPr>
+          <w:rStyle w:val="NormalTok"/>
+        </w:rPr>
+        <w:t xml:space="preserve"> </w:t>
+      </w:r>
+      <w:r>
+        <w:rPr>
+          <w:rStyle w:val="FloatTok"/>
+        </w:rPr>
+        <w:t xml:space="preserve">.1</w:t>
+      </w:r>
+      <w:r>
+        <w:br w:type="textWrapping"/>
+      </w:r>
+      <w:r>
+        <w:rPr>
+          <w:rStyle w:val="NormalTok"/>
+        </w:rPr>
+        <w:t xml:space="preserve">sustain </w:t>
+      </w:r>
+      <w:r>
+        <w:rPr>
+          <w:rStyle w:val="OperatorTok"/>
+        </w:rPr>
+        <w:t xml:space="preserve">=</w:t>
+      </w:r>
+      <w:r>
+        <w:rPr>
+          <w:rStyle w:val="NormalTok"/>
+        </w:rPr>
+        <w:t xml:space="preserve"> </w:t>
+      </w:r>
+      <w:r>
+        <w:rPr>
+          <w:rStyle w:val="FloatTok"/>
+        </w:rPr>
+        <w:t xml:space="preserve">.99</w:t>
+      </w:r>
+      <w:r>
+        <w:br w:type="textWrapping"/>
+      </w:r>
+      <w:r>
+        <w:rPr>
+          <w:rStyle w:val="NormalTok"/>
+        </w:rPr>
+        <w:t xml:space="preserve">smoothing </w:t>
+      </w:r>
+      <w:r>
+        <w:rPr>
+          <w:rStyle w:val="OperatorTok"/>
+        </w:rPr>
+        <w:t xml:space="preserve">=</w:t>
+      </w:r>
+      <w:r>
+        <w:rPr>
+          <w:rStyle w:val="NormalTok"/>
+        </w:rPr>
+        <w:t xml:space="preserve"> </w:t>
+      </w:r>
+      <w:r>
+        <w:rPr>
+          <w:rStyle w:val="DecValTok"/>
+        </w:rPr>
+        <w:t xml:space="preserve">3</w:t>
+      </w:r>
+      <w:r>
+        <w:br w:type="textWrapping"/>
+      </w:r>
+      <w:r>
+        <w:rPr>
+          <w:rStyle w:val="NormalTok"/>
+        </w:rPr>
+        <w:t xml:space="preserve">plot </w:t>
+      </w:r>
+      <w:r>
+        <w:rPr>
+          <w:rStyle w:val="OperatorTok"/>
+        </w:rPr>
+        <w:t xml:space="preserve">=</w:t>
+      </w:r>
+      <w:r>
+        <w:rPr>
+          <w:rStyle w:val="NormalTok"/>
+        </w:rPr>
+        <w:t xml:space="preserve"> </w:t>
+      </w:r>
+      <w:r>
+        <w:rPr>
+          <w:rStyle w:val="VariableTok"/>
+        </w:rPr>
+        <w:t xml:space="preserve">True</w:t>
+      </w:r>
+      <w:r>
+        <w:br w:type="textWrapping"/>
+      </w:r>
+      <w:r>
+        <w:br w:type="textWrapping"/>
+      </w:r>
+      <w:r>
+        <w:rPr>
+          <w:rStyle w:val="NormalTok"/>
+        </w:rPr>
+        <w:t xml:space="preserve">L </w:t>
+      </w:r>
+      <w:r>
+        <w:rPr>
+          <w:rStyle w:val="OperatorTok"/>
+        </w:rPr>
+        <w:t xml:space="preserve">=</w:t>
+      </w:r>
+      <w:r>
+        <w:rPr>
+          <w:rStyle w:val="NormalTok"/>
+        </w:rPr>
+        <w:t xml:space="preserve"> </w:t>
+      </w:r>
+      <w:r>
+        <w:rPr>
+          <w:rStyle w:val="BuiltInTok"/>
+        </w:rPr>
+        <w:t xml:space="preserve">int</w:t>
+      </w:r>
+      <w:r>
+        <w:rPr>
+          <w:rStyle w:val="NormalTok"/>
+        </w:rPr>
+        <w:t xml:space="preserve">(</w:t>
+      </w:r>
+      <w:r>
+        <w:rPr>
+          <w:rStyle w:val="BuiltInTok"/>
+        </w:rPr>
+        <w:t xml:space="preserve">round</w:t>
+      </w:r>
+      <w:r>
+        <w:rPr>
+          <w:rStyle w:val="NormalTok"/>
+        </w:rPr>
+        <w:t xml:space="preserve">(fps </w:t>
+      </w:r>
+      <w:r>
+        <w:rPr>
+          <w:rStyle w:val="OperatorTok"/>
+        </w:rPr>
+        <w:t xml:space="preserve">/</w:t>
+      </w:r>
+      <w:r>
+        <w:rPr>
+          <w:rStyle w:val="NormalTok"/>
+        </w:rPr>
+        <w:t xml:space="preserve"> (</w:t>
+      </w:r>
+      <w:r>
+        <w:rPr>
+          <w:rStyle w:val="DecValTok"/>
+        </w:rPr>
+        <w:t xml:space="preserve">2</w:t>
+      </w:r>
+      <w:r>
+        <w:rPr>
+          <w:rStyle w:val="NormalTok"/>
+        </w:rPr>
+        <w:t xml:space="preserve"> </w:t>
+      </w:r>
+      <w:r>
+        <w:rPr>
+          <w:rStyle w:val="OperatorTok"/>
+        </w:rPr>
+        <w:t xml:space="preserve">*</w:t>
+      </w:r>
+      <w:r>
+        <w:rPr>
+          <w:rStyle w:val="NormalTok"/>
+        </w:rPr>
+        <w:t xml:space="preserve"> frequency)))</w:t>
+      </w:r>
+      <w:r>
+        <w:br w:type="textWrapping"/>
+      </w:r>
+      <w:r>
+        <w:rPr>
+          <w:rStyle w:val="NormalTok"/>
+        </w:rPr>
+        <w:t xml:space="preserve">pickup </w:t>
+      </w:r>
+      <w:r>
+        <w:rPr>
+          <w:rStyle w:val="OperatorTok"/>
+        </w:rPr>
+        <w:t xml:space="preserve">=</w:t>
+      </w:r>
+      <w:r>
+        <w:rPr>
+          <w:rStyle w:val="NormalTok"/>
+        </w:rPr>
+        <w:t xml:space="preserve"> </w:t>
+      </w:r>
+      <w:r>
+        <w:rPr>
+          <w:rStyle w:val="BuiltInTok"/>
+        </w:rPr>
+        <w:t xml:space="preserve">int</w:t>
+      </w:r>
+      <w:r>
+        <w:rPr>
+          <w:rStyle w:val="NormalTok"/>
+        </w:rPr>
+        <w:t xml:space="preserve">(</w:t>
+      </w:r>
+      <w:r>
+        <w:rPr>
+          <w:rStyle w:val="BuiltInTok"/>
+        </w:rPr>
+        <w:t xml:space="preserve">round</w:t>
+      </w:r>
+      <w:r>
+        <w:rPr>
+          <w:rStyle w:val="NormalTok"/>
+        </w:rPr>
+        <w:t xml:space="preserve">(L </w:t>
+      </w:r>
+      <w:r>
+        <w:rPr>
+          <w:rStyle w:val="OperatorTok"/>
+        </w:rPr>
+        <w:t xml:space="preserve">*</w:t>
+      </w:r>
+      <w:r>
+        <w:rPr>
+          <w:rStyle w:val="NormalTok"/>
+        </w:rPr>
+        <w:t xml:space="preserve"> pickup_position))</w:t>
+      </w:r>
+      <w:r>
+        <w:br w:type="textWrapping"/>
+      </w:r>
+      <w:r>
+        <w:rPr>
+          <w:rStyle w:val="NormalTok"/>
+        </w:rPr>
+        <w:t xml:space="preserve">asc </w:t>
+      </w:r>
+      <w:r>
+        <w:rPr>
+          <w:rStyle w:val="OperatorTok"/>
+        </w:rPr>
+        <w:t xml:space="preserve">=</w:t>
+      </w:r>
+      <w:r>
+        <w:rPr>
+          <w:rStyle w:val="NormalTok"/>
+        </w:rPr>
+        <w:t xml:space="preserve"> </w:t>
+      </w:r>
+      <w:r>
+        <w:rPr>
+          <w:rStyle w:val="BuiltInTok"/>
+        </w:rPr>
+        <w:t xml:space="preserve">int</w:t>
+      </w:r>
+      <w:r>
+        <w:rPr>
+          <w:rStyle w:val="NormalTok"/>
+        </w:rPr>
+        <w:t xml:space="preserve">(</w:t>
+      </w:r>
+      <w:r>
+        <w:rPr>
+          <w:rStyle w:val="BuiltInTok"/>
+        </w:rPr>
+        <w:t xml:space="preserve">round</w:t>
+      </w:r>
+      <w:r>
+        <w:rPr>
+          <w:rStyle w:val="NormalTok"/>
+        </w:rPr>
+        <w:t xml:space="preserve">(L </w:t>
+      </w:r>
+      <w:r>
+        <w:rPr>
+          <w:rStyle w:val="OperatorTok"/>
+        </w:rPr>
+        <w:t xml:space="preserve">*</w:t>
+      </w:r>
+      <w:r>
+        <w:rPr>
+          <w:rStyle w:val="NormalTok"/>
+        </w:rPr>
+        <w:t xml:space="preserve"> pluck_position))</w:t>
+      </w:r>
+      <w:r>
+        <w:br w:type="textWrapping"/>
+      </w:r>
+      <w:r>
+        <w:rPr>
+          <w:rStyle w:val="NormalTok"/>
+        </w:rPr>
+        <w:t xml:space="preserve">dsc </w:t>
+      </w:r>
+      <w:r>
+        <w:rPr>
+          <w:rStyle w:val="OperatorTok"/>
+        </w:rPr>
+        <w:t xml:space="preserve">=</w:t>
+      </w:r>
+      <w:r>
+        <w:rPr>
+          <w:rStyle w:val="NormalTok"/>
+        </w:rPr>
+        <w:t xml:space="preserve"> L </w:t>
+      </w:r>
+      <w:r>
+        <w:rPr>
+          <w:rStyle w:val="OperatorTok"/>
+        </w:rPr>
+        <w:t xml:space="preserve">-</w:t>
+      </w:r>
+      <w:r>
+        <w:rPr>
+          <w:rStyle w:val="NormalTok"/>
+        </w:rPr>
+        <w:t xml:space="preserve"> asc</w:t>
+      </w:r>
+      <w:r>
+        <w:br w:type="textWrapping"/>
+      </w:r>
+      <w:r>
+        <w:rPr>
+          <w:rStyle w:val="NormalTok"/>
+        </w:rPr>
+        <w:t xml:space="preserve">X_asc </w:t>
+      </w:r>
+      <w:r>
+        <w:rPr>
+          <w:rStyle w:val="OperatorTok"/>
+        </w:rPr>
+        <w:t xml:space="preserve">=</w:t>
+      </w:r>
+      <w:r>
+        <w:rPr>
+          <w:rStyle w:val="NormalTok"/>
+        </w:rPr>
+        <w:t xml:space="preserve"> np.linspace(</w:t>
+      </w:r>
+      <w:r>
+        <w:rPr>
+          <w:rStyle w:val="DecValTok"/>
+        </w:rPr>
+        <w:t xml:space="preserve">0</w:t>
+      </w:r>
+      <w:r>
+        <w:rPr>
+          <w:rStyle w:val="NormalTok"/>
+        </w:rPr>
+        <w:t xml:space="preserve">, </w:t>
+      </w:r>
+      <w:r>
+        <w:rPr>
+          <w:rStyle w:val="DecValTok"/>
+        </w:rPr>
+        <w:t xml:space="preserve">1</w:t>
+      </w:r>
+      <w:r>
+        <w:rPr>
+          <w:rStyle w:val="NormalTok"/>
+        </w:rPr>
+        <w:t xml:space="preserve">, asc)</w:t>
+      </w:r>
+      <w:r>
+        <w:br w:type="textWrapping"/>
+      </w:r>
+      <w:r>
+        <w:rPr>
+          <w:rStyle w:val="NormalTok"/>
+        </w:rPr>
+        <w:t xml:space="preserve">X_dsc </w:t>
+      </w:r>
+      <w:r>
+        <w:rPr>
+          <w:rStyle w:val="OperatorTok"/>
+        </w:rPr>
+        <w:t xml:space="preserve">=</w:t>
+      </w:r>
+      <w:r>
+        <w:rPr>
+          <w:rStyle w:val="NormalTok"/>
+        </w:rPr>
+        <w:t xml:space="preserve"> np.linspace(</w:t>
+      </w:r>
+      <w:r>
+        <w:rPr>
+          <w:rStyle w:val="DecValTok"/>
+        </w:rPr>
+        <w:t xml:space="preserve">0</w:t>
+      </w:r>
+      <w:r>
+        <w:rPr>
+          <w:rStyle w:val="NormalTok"/>
+        </w:rPr>
+        <w:t xml:space="preserve">, </w:t>
+      </w:r>
+      <w:r>
+        <w:rPr>
+          <w:rStyle w:val="DecValTok"/>
+        </w:rPr>
+        <w:t xml:space="preserve">1</w:t>
+      </w:r>
+      <w:r>
+        <w:rPr>
+          <w:rStyle w:val="NormalTok"/>
+        </w:rPr>
+        <w:t xml:space="preserve">, dsc </w:t>
+      </w:r>
+      <w:r>
+        <w:rPr>
+          <w:rStyle w:val="OperatorTok"/>
+        </w:rPr>
+        <w:t xml:space="preserve">+</w:t>
+      </w:r>
+      <w:r>
+        <w:rPr>
+          <w:rStyle w:val="NormalTok"/>
+        </w:rPr>
+        <w:t xml:space="preserve"> </w:t>
+      </w:r>
+      <w:r>
+        <w:rPr>
+          <w:rStyle w:val="DecValTok"/>
+        </w:rPr>
+        <w:t xml:space="preserve">1</w:t>
+      </w:r>
+      <w:r>
+        <w:rPr>
+          <w:rStyle w:val="NormalTok"/>
+        </w:rPr>
+        <w:t xml:space="preserve">)[::</w:t>
+      </w:r>
+      <w:r>
+        <w:rPr>
+          <w:rStyle w:val="OperatorTok"/>
+        </w:rPr>
+        <w:t xml:space="preserve">-</w:t>
+      </w:r>
+      <w:r>
+        <w:rPr>
+          <w:rStyle w:val="DecValTok"/>
+        </w:rPr>
+        <w:t xml:space="preserve">1</w:t>
+      </w:r>
+      <w:r>
+        <w:rPr>
+          <w:rStyle w:val="NormalTok"/>
+        </w:rPr>
+        <w:t xml:space="preserve">][</w:t>
+      </w:r>
+      <w:r>
+        <w:rPr>
+          <w:rStyle w:val="DecValTok"/>
+        </w:rPr>
+        <w:t xml:space="preserve">1</w:t>
+      </w:r>
+      <w:r>
+        <w:rPr>
+          <w:rStyle w:val="NormalTok"/>
+        </w:rPr>
+        <w:t xml:space="preserve">: ]</w:t>
+      </w:r>
+      <w:r>
+        <w:br w:type="textWrapping"/>
+      </w:r>
+      <w:r>
+        <w:rPr>
+          <w:rStyle w:val="NormalTok"/>
+        </w:rPr>
+        <w:t xml:space="preserve">delay_r </w:t>
+      </w:r>
+      <w:r>
+        <w:rPr>
+          <w:rStyle w:val="OperatorTok"/>
+        </w:rPr>
+        <w:t xml:space="preserve">=</w:t>
+      </w:r>
+      <w:r>
+        <w:rPr>
+          <w:rStyle w:val="NormalTok"/>
+        </w:rPr>
+        <w:t xml:space="preserve"> np.hstack([X_asc,X_dsc])</w:t>
+      </w:r>
+      <w:r>
+        <w:br w:type="textWrapping"/>
+      </w:r>
+      <w:r>
+        <w:rPr>
+          <w:rStyle w:val="NormalTok"/>
+        </w:rPr>
+        <w:t xml:space="preserve">delay_l </w:t>
+      </w:r>
+      <w:r>
+        <w:rPr>
+          <w:rStyle w:val="OperatorTok"/>
+        </w:rPr>
+        <w:t xml:space="preserve">=</w:t>
+      </w:r>
+      <w:r>
+        <w:rPr>
+          <w:rStyle w:val="NormalTok"/>
+        </w:rPr>
+        <w:t xml:space="preserve"> np.zeros(L)</w:t>
+      </w:r>
+      <w:r>
+        <w:br w:type="textWrapping"/>
+      </w:r>
+      <w:r>
+        <w:br w:type="textWrapping"/>
+      </w:r>
+      <w:r>
+        <w:rPr>
+          <w:rStyle w:val="NormalTok"/>
+        </w:rPr>
+        <w:t xml:space="preserve">w </w:t>
+      </w:r>
+      <w:r>
+        <w:rPr>
+          <w:rStyle w:val="OperatorTok"/>
+        </w:rPr>
+        <w:t xml:space="preserve">=</w:t>
+      </w:r>
+      <w:r>
+        <w:rPr>
+          <w:rStyle w:val="NormalTok"/>
+        </w:rPr>
+        <w:t xml:space="preserve"> np.zeros(n)</w:t>
+      </w:r>
+      <w:r>
+        <w:br w:type="textWrapping"/>
+      </w:r>
+      <w:r>
+        <w:rPr>
+          <w:rStyle w:val="NormalTok"/>
+        </w:rPr>
+        <w:t xml:space="preserve">zeros </w:t>
+      </w:r>
+      <w:r>
+        <w:rPr>
+          <w:rStyle w:val="OperatorTok"/>
+        </w:rPr>
+        <w:t xml:space="preserve">=</w:t>
+      </w:r>
+      <w:r>
+        <w:rPr>
+          <w:rStyle w:val="NormalTok"/>
+        </w:rPr>
+        <w:t xml:space="preserve"> np.zeros(L)</w:t>
+      </w:r>
+      <w:r>
+        <w:br w:type="textWrapping"/>
+      </w:r>
+      <w:r>
+        <w:rPr>
+          <w:rStyle w:val="ControlFlowTok"/>
+        </w:rPr>
+        <w:t xml:space="preserve">for</w:t>
+      </w:r>
+      <w:r>
+        <w:rPr>
+          <w:rStyle w:val="NormalTok"/>
+        </w:rPr>
+        <w:t xml:space="preserve"> i </w:t>
+      </w:r>
+      <w:r>
+        <w:rPr>
+          <w:rStyle w:val="KeywordTok"/>
+        </w:rPr>
+        <w:t xml:space="preserve">in</w:t>
+      </w:r>
+      <w:r>
+        <w:rPr>
+          <w:rStyle w:val="NormalTok"/>
+        </w:rPr>
+        <w:t xml:space="preserve"> </w:t>
+      </w:r>
+      <w:r>
+        <w:rPr>
+          <w:rStyle w:val="BuiltInTok"/>
+        </w:rPr>
+        <w:t xml:space="preserve">range</w:t>
+      </w:r>
+      <w:r>
+        <w:rPr>
+          <w:rStyle w:val="NormalTok"/>
+        </w:rPr>
+        <w:t xml:space="preserve">(n):</w:t>
+      </w:r>
+      <w:r>
+        <w:br w:type="textWrapping"/>
+      </w:r>
+      <w:r>
+        <w:rPr>
+          <w:rStyle w:val="NormalTok"/>
+        </w:rPr>
+        <w:t xml:space="preserve">  </w:t>
+      </w:r>
+      <w:r>
+        <w:rPr>
+          <w:rStyle w:val="BuiltInTok"/>
+        </w:rPr>
+        <w:t xml:space="preserve">print</w:t>
+      </w:r>
+      <w:r>
+        <w:rPr>
+          <w:rStyle w:val="NormalTok"/>
+        </w:rPr>
+        <w:t xml:space="preserve">(</w:t>
+      </w:r>
+      <w:r>
+        <w:rPr>
+          <w:rStyle w:val="StringTok"/>
+        </w:rPr>
+        <w:t xml:space="preserve">'step '</w:t>
+      </w:r>
+      <w:r>
+        <w:rPr>
+          <w:rStyle w:val="NormalTok"/>
+        </w:rPr>
+        <w:t xml:space="preserve">, i </w:t>
+      </w:r>
+      <w:r>
+        <w:rPr>
+          <w:rStyle w:val="OperatorTok"/>
+        </w:rPr>
+        <w:t xml:space="preserve">+</w:t>
+      </w:r>
+      <w:r>
+        <w:rPr>
+          <w:rStyle w:val="NormalTok"/>
+        </w:rPr>
+        <w:t xml:space="preserve"> </w:t>
+      </w:r>
+      <w:r>
+        <w:rPr>
+          <w:rStyle w:val="DecValTok"/>
+        </w:rPr>
+        <w:t xml:space="preserve">1</w:t>
+      </w:r>
+      <w:r>
+        <w:rPr>
+          <w:rStyle w:val="NormalTok"/>
+        </w:rPr>
+        <w:t xml:space="preserve">,</w:t>
+      </w:r>
+      <w:r>
+        <w:rPr>
+          <w:rStyle w:val="StringTok"/>
+        </w:rPr>
+        <w:t xml:space="preserve">' of '</w:t>
+      </w:r>
+      <w:r>
+        <w:rPr>
+          <w:rStyle w:val="NormalTok"/>
+        </w:rPr>
+        <w:t xml:space="preserve">, n)</w:t>
+      </w:r>
+      <w:r>
+        <w:br w:type="textWrapping"/>
+      </w:r>
+      <w:r>
+        <w:rPr>
+          <w:rStyle w:val="NormalTok"/>
+        </w:rPr>
+        <w:t xml:space="preserve">  w[i] </w:t>
+      </w:r>
+      <w:r>
+        <w:rPr>
+          <w:rStyle w:val="OperatorTok"/>
+        </w:rPr>
+        <w:t xml:space="preserve">=</w:t>
+      </w:r>
+      <w:r>
+        <w:rPr>
+          <w:rStyle w:val="NormalTok"/>
+        </w:rPr>
+        <w:t xml:space="preserve"> delay_r[pickup] </w:t>
+      </w:r>
+      <w:r>
+        <w:rPr>
+          <w:rStyle w:val="OperatorTok"/>
+        </w:rPr>
+        <w:t xml:space="preserve">+</w:t>
+      </w:r>
+      <w:r>
+        <w:rPr>
+          <w:rStyle w:val="NormalTok"/>
+        </w:rPr>
+        <w:t xml:space="preserve"> delay_l[pickup]</w:t>
+      </w:r>
+      <w:r>
+        <w:br w:type="textWrapping"/>
+      </w:r>
+      <w:r>
+        <w:rPr>
+          <w:rStyle w:val="NormalTok"/>
+        </w:rPr>
+        <w:t xml:space="preserve">  to_l </w:t>
+      </w:r>
+      <w:r>
+        <w:rPr>
+          <w:rStyle w:val="OperatorTok"/>
+        </w:rPr>
+        <w:t xml:space="preserve">=</w:t>
+      </w:r>
+      <w:r>
+        <w:rPr>
+          <w:rStyle w:val="NormalTok"/>
+        </w:rPr>
+        <w:t xml:space="preserve"> </w:t>
+      </w:r>
+      <w:r>
+        <w:rPr>
+          <w:rStyle w:val="DecValTok"/>
+        </w:rPr>
+        <w:t xml:space="preserve">-1</w:t>
+      </w:r>
+      <w:r>
+        <w:rPr>
+          <w:rStyle w:val="NormalTok"/>
+        </w:rPr>
+        <w:t xml:space="preserve"> </w:t>
+      </w:r>
+      <w:r>
+        <w:rPr>
+          <w:rStyle w:val="OperatorTok"/>
+        </w:rPr>
+        <w:t xml:space="preserve">*</w:t>
+      </w:r>
+      <w:r>
+        <w:rPr>
+          <w:rStyle w:val="NormalTok"/>
+        </w:rPr>
+        <w:t xml:space="preserve"> np.average(delay_r[</w:t>
+      </w:r>
+      <w:r>
+        <w:rPr>
+          <w:rStyle w:val="OperatorTok"/>
+        </w:rPr>
+        <w:t xml:space="preserve">-</w:t>
+      </w:r>
+      <w:r>
+        <w:rPr>
+          <w:rStyle w:val="NormalTok"/>
+        </w:rPr>
+        <w:t xml:space="preserve">smoothing:]) </w:t>
+      </w:r>
+      <w:r>
+        <w:rPr>
+          <w:rStyle w:val="OperatorTok"/>
+        </w:rPr>
+        <w:t xml:space="preserve">*</w:t>
+      </w:r>
+      <w:r>
+        <w:rPr>
+          <w:rStyle w:val="NormalTok"/>
+        </w:rPr>
+        <w:t xml:space="preserve"> sustain </w:t>
+      </w:r>
+      <w:r>
+        <w:rPr>
+          <w:rStyle w:val="CommentTok"/>
+        </w:rPr>
+        <w:t xml:space="preserve"># to add in delay_l[L-1] AFTER rolling</w:t>
+      </w:r>
+      <w:r>
+        <w:br w:type="textWrapping"/>
+      </w:r>
+      <w:r>
+        <w:rPr>
+          <w:rStyle w:val="NormalTok"/>
+        </w:rPr>
+        <w:t xml:space="preserve">  delay_r </w:t>
+      </w:r>
+      <w:r>
+        <w:rPr>
+          <w:rStyle w:val="OperatorTok"/>
+        </w:rPr>
+        <w:t xml:space="preserve">=</w:t>
+      </w:r>
+      <w:r>
+        <w:rPr>
+          <w:rStyle w:val="NormalTok"/>
+        </w:rPr>
+        <w:t xml:space="preserve"> np.roll(delay_r, </w:t>
+      </w:r>
+      <w:r>
+        <w:rPr>
+          <w:rStyle w:val="DecValTok"/>
+        </w:rPr>
+        <w:t xml:space="preserve">1</w:t>
+      </w:r>
+      <w:r>
+        <w:rPr>
+          <w:rStyle w:val="NormalTok"/>
+        </w:rPr>
+        <w:t xml:space="preserve">)</w:t>
+      </w:r>
+      <w:r>
+        <w:br w:type="textWrapping"/>
+      </w:r>
+      <w:r>
+        <w:rPr>
+          <w:rStyle w:val="NormalTok"/>
+        </w:rPr>
+        <w:t xml:space="preserve">  delay_r[</w:t>
+      </w:r>
+      <w:r>
+        <w:rPr>
+          <w:rStyle w:val="DecValTok"/>
+        </w:rPr>
+        <w:t xml:space="preserve">0</w:t>
+      </w:r>
+      <w:r>
+        <w:rPr>
+          <w:rStyle w:val="NormalTok"/>
+        </w:rPr>
+        <w:t xml:space="preserve">] </w:t>
+      </w:r>
+      <w:r>
+        <w:rPr>
+          <w:rStyle w:val="OperatorTok"/>
+        </w:rPr>
+        <w:t xml:space="preserve">=</w:t>
+      </w:r>
+      <w:r>
+        <w:rPr>
+          <w:rStyle w:val="NormalTok"/>
+        </w:rPr>
+        <w:t xml:space="preserve"> </w:t>
+      </w:r>
+      <w:r>
+        <w:rPr>
+          <w:rStyle w:val="DecValTok"/>
+        </w:rPr>
+        <w:t xml:space="preserve">-1</w:t>
+      </w:r>
+      <w:r>
+        <w:rPr>
+          <w:rStyle w:val="NormalTok"/>
+        </w:rPr>
+        <w:t xml:space="preserve"> </w:t>
+      </w:r>
+      <w:r>
+        <w:rPr>
+          <w:rStyle w:val="OperatorTok"/>
+        </w:rPr>
+        <w:t xml:space="preserve">*</w:t>
+      </w:r>
+      <w:r>
+        <w:rPr>
+          <w:rStyle w:val="NormalTok"/>
+        </w:rPr>
+        <w:t xml:space="preserve"> delay_l[</w:t>
+      </w:r>
+      <w:r>
+        <w:rPr>
+          <w:rStyle w:val="DecValTok"/>
+        </w:rPr>
+        <w:t xml:space="preserve">0</w:t>
+      </w:r>
+      <w:r>
+        <w:rPr>
+          <w:rStyle w:val="NormalTok"/>
+        </w:rPr>
+        <w:t xml:space="preserve">]</w:t>
+      </w:r>
+      <w:r>
+        <w:br w:type="textWrapping"/>
+      </w:r>
+      <w:r>
+        <w:rPr>
+          <w:rStyle w:val="NormalTok"/>
+        </w:rPr>
+        <w:t xml:space="preserve">  delay_l </w:t>
+      </w:r>
+      <w:r>
+        <w:rPr>
+          <w:rStyle w:val="OperatorTok"/>
+        </w:rPr>
+        <w:t xml:space="preserve">=</w:t>
+      </w:r>
+      <w:r>
+        <w:rPr>
+          <w:rStyle w:val="NormalTok"/>
+        </w:rPr>
+        <w:t xml:space="preserve"> np.roll(delay_l, </w:t>
+      </w:r>
+      <w:r>
+        <w:rPr>
+          <w:rStyle w:val="DecValTok"/>
+        </w:rPr>
+        <w:t xml:space="preserve">-1</w:t>
+      </w:r>
+      <w:r>
+        <w:rPr>
+          <w:rStyle w:val="NormalTok"/>
+        </w:rPr>
+        <w:t xml:space="preserve">)</w:t>
+      </w:r>
+      <w:r>
+        <w:br w:type="textWrapping"/>
+      </w:r>
+      <w:r>
+        <w:rPr>
+          <w:rStyle w:val="NormalTok"/>
+        </w:rPr>
+        <w:t xml:space="preserve">  delay_l[L</w:t>
+      </w:r>
+      <w:r>
+        <w:rPr>
+          <w:rStyle w:val="DecValTok"/>
+        </w:rPr>
+        <w:t xml:space="preserve">-1</w:t>
+      </w:r>
+      <w:r>
+        <w:rPr>
+          <w:rStyle w:val="NormalTok"/>
+        </w:rPr>
+        <w:t xml:space="preserve">] </w:t>
+      </w:r>
+      <w:r>
+        <w:rPr>
+          <w:rStyle w:val="OperatorTok"/>
+        </w:rPr>
+        <w:t xml:space="preserve">=</w:t>
+      </w:r>
+      <w:r>
+        <w:rPr>
+          <w:rStyle w:val="NormalTok"/>
+        </w:rPr>
+        <w:t xml:space="preserve"> to_l</w:t>
+      </w:r>
+    </w:p>
+    <w:p>
+      <w:pPr>
+        <w:pStyle w:val="CaptionedFigure"/>
+      </w:pPr>
+      <w:r>
+        <w:drawing>
+          <wp:inline>
+            <wp:extent cx="5943600" cy="1128744"/>
+            <wp:effectExtent b="0" l="0" r="0" t="0"/>
+            <wp:docPr descr="Excitação: 0.1 - Captação: 0.1" title="" id="1" name="Picture"/>
+            <a:graphic>
+              <a:graphicData uri="http://schemas.openxmlformats.org/drawingml/2006/picture">
+                <pic:pic>
+                  <pic:nvPicPr>
+                    <pic:cNvPr descr="im/DW_440_Pluck_0-1_Pick_0-1.png" id="0" name="Picture"/>
+                    <pic:cNvPicPr>
+                      <a:picLocks noChangeArrowheads="1" noChangeAspect="1"/>
+                    </pic:cNvPicPr>
+                  </pic:nvPicPr>
+                  <pic:blipFill>
+                    <a:blip r:embed="rId49"/>
+                    <a:stretch>
+                      <a:fillRect/>
+                    </a:stretch>
+                  </pic:blipFill>
+                  <pic:spPr bwMode="auto">
+                    <a:xfrm>
+                      <a:off x="0" y="0"/>
+                      <a:ext cx="5943600" cy="1128744"/>
+                    </a:xfrm>
+                    <a:prstGeom prst="rect">
+                      <a:avLst/>
+                    </a:prstGeom>
+                    <a:noFill/>
+                    <a:ln w="9525">
+                      <a:noFill/>
+                      <a:headEnd/>
+                      <a:tailEnd/>
+                    </a:ln>
+                  </pic:spPr>
+                </pic:pic>
+              </a:graphicData>
+            </a:graphic>
+          </wp:inline>
+        </w:drawing>
+      </w:r>
+    </w:p>
+    <w:p>
+      <w:pPr>
+        <w:pStyle w:val="ImageCaption"/>
+      </w:pPr>
+      <w:r>
+        <w:t xml:space="preserve">Excitação: 0.1 - Captação: 0.1</w:t>
+      </w:r>
+    </w:p>
+    <w:p>
+      <w:pPr>
+        <w:pStyle w:val="CaptionedFigure"/>
+      </w:pPr>
+      <w:r>
+        <w:drawing>
+          <wp:inline>
+            <wp:extent cx="5943600" cy="1128744"/>
+            <wp:effectExtent b="0" l="0" r="0" t="0"/>
+            <wp:docPr descr="Excitação: 0.1 - Captação: 0.5" title="" id="1" name="Picture"/>
+            <a:graphic>
+              <a:graphicData uri="http://schemas.openxmlformats.org/drawingml/2006/picture">
+                <pic:pic>
+                  <pic:nvPicPr>
+                    <pic:cNvPr descr="im/DW_440_Pluck_0-1_Pick_0-5.png" id="0" name="Picture"/>
+                    <pic:cNvPicPr>
+                      <a:picLocks noChangeArrowheads="1" noChangeAspect="1"/>
+                    </pic:cNvPicPr>
+                  </pic:nvPicPr>
+                  <pic:blipFill>
+                    <a:blip r:embed="rId50"/>
+                    <a:stretch>
+                      <a:fillRect/>
+                    </a:stretch>
+                  </pic:blipFill>
+                  <pic:spPr bwMode="auto">
+                    <a:xfrm>
+                      <a:off x="0" y="0"/>
+                      <a:ext cx="5943600" cy="1128744"/>
+                    </a:xfrm>
+                    <a:prstGeom prst="rect">
+                      <a:avLst/>
+                    </a:prstGeom>
+                    <a:noFill/>
+                    <a:ln w="9525">
+                      <a:noFill/>
+                      <a:headEnd/>
+                      <a:tailEnd/>
+                    </a:ln>
+                  </pic:spPr>
+                </pic:pic>
+              </a:graphicData>
+            </a:graphic>
+          </wp:inline>
+        </w:drawing>
+      </w:r>
+    </w:p>
+    <w:p>
+      <w:pPr>
+        <w:pStyle w:val="ImageCaption"/>
+      </w:pPr>
+      <w:r>
+        <w:t xml:space="preserve">Excitação: 0.1 - Captação: 0.5</w:t>
+      </w:r>
+    </w:p>
+    <w:p>
+      <w:pPr>
+        <w:pStyle w:val="CaptionedFigure"/>
+      </w:pPr>
+      <w:r>
+        <w:drawing>
+          <wp:inline>
+            <wp:extent cx="5943600" cy="1128744"/>
+            <wp:effectExtent b="0" l="0" r="0" t="0"/>
+            <wp:docPr descr="Excitação: 0.3 - Captação: 0.7" title="" id="1" name="Picture"/>
+            <a:graphic>
+              <a:graphicData uri="http://schemas.openxmlformats.org/drawingml/2006/picture">
+                <pic:pic>
+                  <pic:nvPicPr>
+                    <pic:cNvPr descr="im/DW_440_Pluck_0-3_Pick_0-7.png" id="0" name="Picture"/>
+                    <pic:cNvPicPr>
+                      <a:picLocks noChangeArrowheads="1" noChangeAspect="1"/>
+                    </pic:cNvPicPr>
+                  </pic:nvPicPr>
+                  <pic:blipFill>
+                    <a:blip r:embed="rId51"/>
+                    <a:stretch>
+                      <a:fillRect/>
+                    </a:stretch>
+                  </pic:blipFill>
+                  <pic:spPr bwMode="auto">
+                    <a:xfrm>
+                      <a:off x="0" y="0"/>
+                      <a:ext cx="5943600" cy="1128744"/>
+                    </a:xfrm>
+                    <a:prstGeom prst="rect">
+                      <a:avLst/>
+                    </a:prstGeom>
+                    <a:noFill/>
+                    <a:ln w="9525">
+                      <a:noFill/>
+                      <a:headEnd/>
+                      <a:tailEnd/>
+                    </a:ln>
+                  </pic:spPr>
+                </pic:pic>
+              </a:graphicData>
+            </a:graphic>
+          </wp:inline>
+        </w:drawing>
+      </w:r>
+    </w:p>
+    <w:p>
+      <w:pPr>
+        <w:pStyle w:val="ImageCaption"/>
+      </w:pPr>
+      <w:r>
+        <w:t xml:space="preserve">Excitação: 0.3 - Captação: 0.7</w:t>
+      </w:r>
+    </w:p>
+    <w:p>
+      <w:pPr>
+        <w:pStyle w:val="CaptionedFigure"/>
+      </w:pPr>
+      <w:r>
+        <w:drawing>
+          <wp:inline>
+            <wp:extent cx="5943600" cy="1128744"/>
+            <wp:effectExtent b="0" l="0" r="0" t="0"/>
+            <wp:docPr descr="Excitação: 0.5 - Captação: 0.1" title="" id="1" name="Picture"/>
+            <a:graphic>
+              <a:graphicData uri="http://schemas.openxmlformats.org/drawingml/2006/picture">
+                <pic:pic>
+                  <pic:nvPicPr>
+                    <pic:cNvPr descr="im/DW_440_Pluck_0-5_Pick_0-1.png" id="0" name="Picture"/>
+                    <pic:cNvPicPr>
+                      <a:picLocks noChangeArrowheads="1" noChangeAspect="1"/>
+                    </pic:cNvPicPr>
+                  </pic:nvPicPr>
+                  <pic:blipFill>
+                    <a:blip r:embed="rId52"/>
+                    <a:stretch>
+                      <a:fillRect/>
+                    </a:stretch>
+                  </pic:blipFill>
+                  <pic:spPr bwMode="auto">
+                    <a:xfrm>
+                      <a:off x="0" y="0"/>
+                      <a:ext cx="5943600" cy="1128744"/>
+                    </a:xfrm>
+                    <a:prstGeom prst="rect">
+                      <a:avLst/>
+                    </a:prstGeom>
+                    <a:noFill/>
+                    <a:ln w="9525">
+                      <a:noFill/>
+                      <a:headEnd/>
+                      <a:tailEnd/>
+                    </a:ln>
+                  </pic:spPr>
+                </pic:pic>
+              </a:graphicData>
+            </a:graphic>
+          </wp:inline>
+        </w:drawing>
+      </w:r>
+    </w:p>
+    <w:p>
+      <w:pPr>
+        <w:pStyle w:val="ImageCaption"/>
+      </w:pPr>
+      <w:r>
+        <w:t xml:space="preserve">Excitação: 0.5 - Captação: 0.1</w:t>
+      </w:r>
+    </w:p>
+    <w:p>
+      <w:pPr>
+        <w:pStyle w:val="CaptionedFigure"/>
+      </w:pPr>
+      <w:r>
+        <w:drawing>
+          <wp:inline>
+            <wp:extent cx="5943600" cy="1128744"/>
+            <wp:effectExtent b="0" l="0" r="0" t="0"/>
+            <wp:docPr descr="Excitação: 0.5 - Captação: 0.5" title="" id="1" name="Picture"/>
+            <a:graphic>
+              <a:graphicData uri="http://schemas.openxmlformats.org/drawingml/2006/picture">
+                <pic:pic>
+                  <pic:nvPicPr>
+                    <pic:cNvPr descr="im/DW_440_Pluck_0-5_Pick_0-5.png" id="0" name="Picture"/>
+                    <pic:cNvPicPr>
+                      <a:picLocks noChangeArrowheads="1" noChangeAspect="1"/>
+                    </pic:cNvPicPr>
+                  </pic:nvPicPr>
+                  <pic:blipFill>
+                    <a:blip r:embed="rId53"/>
+                    <a:stretch>
+                      <a:fillRect/>
+                    </a:stretch>
+                  </pic:blipFill>
+                  <pic:spPr bwMode="auto">
+                    <a:xfrm>
+                      <a:off x="0" y="0"/>
+                      <a:ext cx="5943600" cy="1128744"/>
+                    </a:xfrm>
+                    <a:prstGeom prst="rect">
+                      <a:avLst/>
+                    </a:prstGeom>
+                    <a:noFill/>
+                    <a:ln w="9525">
+                      <a:noFill/>
+                      <a:headEnd/>
+                      <a:tailEnd/>
+                    </a:ln>
+                  </pic:spPr>
+                </pic:pic>
+              </a:graphicData>
+            </a:graphic>
+          </wp:inline>
+        </w:drawing>
+      </w:r>
+    </w:p>
+    <w:p>
+      <w:pPr>
+        <w:pStyle w:val="ImageCaption"/>
+      </w:pPr>
+      <w:r>
+        <w:t xml:space="preserve">Excitação: 0.5 - Captação: 0.5</w:t>
+      </w:r>
+    </w:p>
+    <w:p>
+      <w:pPr>
+        <w:pStyle w:val="Heading3"/>
+      </w:pPr>
+      <w:bookmarkStart w:id="54" w:name="digital-waveguides-x-diferenças-finitas"/>
+      <w:r>
+        <w:t xml:space="preserve">Digital Waveguides X Diferenças Finitas</w:t>
+      </w:r>
+      <w:bookmarkEnd w:id="54"/>
+    </w:p>
+    <w:p>
+      <w:pPr>
+        <w:pStyle w:val="FirstParagraph"/>
+      </w:pPr>
+      <w:r>
+        <w:t xml:space="preserve">Alguns exemplos de ondas equivalentes foram fornecidos, a fim de basear um julgamento subjetivo. A figura abaixo compara o primeiro frame e último das simulações da corda para os dois métodos.</w:t>
+      </w:r>
+    </w:p>
+    <w:p>
+      <w:pPr>
+        <w:pStyle w:val="CaptionedFigure"/>
+      </w:pPr>
+      <w:r>
+        <w:drawing>
+          <wp:inline>
+            <wp:extent cx="5943600" cy="2036618"/>
+            <wp:effectExtent b="0" l="0" r="0" t="0"/>
+            <wp:docPr descr="Animação da Corda - Diferenças Finital x Digital Waveguide" title="" id="1" name="Picture"/>
+            <a:graphic>
+              <a:graphicData uri="http://schemas.openxmlformats.org/drawingml/2006/picture">
+                <pic:pic>
+                  <pic:nvPicPr>
+                    <pic:cNvPr descr="im/DigitalWaveguidesXFiniteDifferences.png" id="0" name="Picture"/>
+                    <pic:cNvPicPr>
+                      <a:picLocks noChangeArrowheads="1" noChangeAspect="1"/>
+                    </pic:cNvPicPr>
+                  </pic:nvPicPr>
+                  <pic:blipFill>
+                    <a:blip r:embed="rId55"/>
+                    <a:stretch>
+                      <a:fillRect/>
+                    </a:stretch>
+                  </pic:blipFill>
+                  <pic:spPr bwMode="auto">
+                    <a:xfrm>
+                      <a:off x="0" y="0"/>
+                      <a:ext cx="5943600" cy="2036618"/>
+                    </a:xfrm>
+                    <a:prstGeom prst="rect">
+                      <a:avLst/>
+                    </a:prstGeom>
+                    <a:noFill/>
+                    <a:ln w="9525">
+                      <a:noFill/>
+                      <a:headEnd/>
+                      <a:tailEnd/>
+                    </a:ln>
+                  </pic:spPr>
+                </pic:pic>
+              </a:graphicData>
+            </a:graphic>
+          </wp:inline>
+        </w:drawing>
+      </w:r>
+    </w:p>
+    <w:p>
+      <w:pPr>
+        <w:pStyle w:val="ImageCaption"/>
+      </w:pPr>
+      <w:r>
+        <w:t xml:space="preserve">Animação da Corda - Diferenças Finital x Digital Waveguide</w:t>
+      </w:r>
+    </w:p>
+    <w:p>
+      <w:pPr>
+        <w:pStyle w:val="BodyText"/>
+      </w:pPr>
+      <w:r>
+        <w:t xml:space="preserve">A simulação baseada no método das diferenças finitas tem um caráter mais natural, enquanto é, também, mais propensa a desvios da condição de estabilidade, enquanto a simulação a partir de digital waveguides é mais robusta, porém menos rica. Em relação à eficiências, abaixo são elencados os tempos que foram necessários para a geração dos sons apresentados nos capítulos anteriores. Todos os samples tem framerate igual a 44100 FPS e duração de 1 segundo. Os tempos são apresentados em segundos</w:t>
+      </w:r>
+    </w:p>
+    <w:p>
+      <w:pPr>
+        <w:pStyle w:val="TableCaption"/>
+      </w:pPr>
+      <w:r>
+        <w:t xml:space="preserve">Latência em segundos para uma onda com 44100</w:t>
+      </w:r>
+      <w:r>
+        <w:t xml:space="preserve"> </w:t>
+      </w:r>
+      <w:r>
+        <w:rPr>
+          <w:i/>
+        </w:rPr>
+        <w:t xml:space="preserve">samples</w:t>
+      </w:r>
+    </w:p>
+    <w:tbl>
+      <w:tblPr>
+        <w:tblStyle w:val="Table"/>
+        <w:tblW w:type="pct" w:w="0.0"/>
+        <w:tblLook w:firstRow="1"/>
+        <w:tblCaption w:val="Latência em segundos para uma onda com 44100 samples"/>
+      </w:tblPr>
+      <w:tblGrid/>
+      <w:tr>
+        <w:trPr>
+          <w:cnfStyle w:firstRow="1"/>
+        </w:trPr>
+        <w:tc>
+          <w:tcPr>
+            <w:tcBorders>
+              <w:bottom w:val="single"/>
+            </w:tcBorders>
+            <w:vAlign w:val="bottom"/>
+          </w:tcPr>
+          <w:p>
+            <w:pPr>
+              <w:pStyle w:val="Compact"/>
+              <w:jc w:val="center"/>
+            </w:pPr>
+            <w:r>
+              <w:t xml:space="preserve">Excitação</w:t>
+            </w:r>
+          </w:p>
+        </w:tc>
+        <w:tc>
+          <w:tcPr>
+            <w:tcBorders>
+              <w:bottom w:val="single"/>
+            </w:tcBorders>
+            <w:vAlign w:val="bottom"/>
+          </w:tcPr>
+          <w:p>
+            <w:pPr>
+              <w:pStyle w:val="Compact"/>
+              <w:jc w:val="center"/>
+            </w:pPr>
+            <w:r>
+              <w:t xml:space="preserve">Captação</w:t>
+            </w:r>
+          </w:p>
+        </w:tc>
+        <w:tc>
+          <w:tcPr>
+            <w:tcBorders>
+              <w:bottom w:val="single"/>
+            </w:tcBorders>
+            <w:vAlign w:val="bottom"/>
+          </w:tcPr>
+          <w:p>
+            <w:pPr>
+              <w:pStyle w:val="Compact"/>
+              <w:jc w:val="center"/>
+            </w:pPr>
+            <w:r>
+              <w:t xml:space="preserve">Digital Waveguides</w:t>
+            </w:r>
+          </w:p>
+        </w:tc>
+        <w:tc>
+          <w:tcPr>
+            <w:tcBorders>
+              <w:bottom w:val="single"/>
+            </w:tcBorders>
+            <w:vAlign w:val="bottom"/>
+          </w:tcPr>
+          <w:p>
+            <w:pPr>
+              <w:pStyle w:val="Compact"/>
+              <w:jc w:val="center"/>
+            </w:pPr>
+            <w:r>
+              <w:t xml:space="preserve">Diferenças Finitas</w:t>
+            </w:r>
+          </w:p>
+        </w:tc>
+      </w:tr>
+      <w:tr>
+        <w:tc>
+          <w:p>
+            <w:pPr>
+              <w:pStyle w:val="Compact"/>
+              <w:jc w:val="center"/>
+            </w:pPr>
+            <w:r>
+              <w:t xml:space="preserve">0.1</w:t>
+            </w:r>
+          </w:p>
+        </w:tc>
+        <w:tc>
+          <w:p>
+            <w:pPr>
+              <w:pStyle w:val="Compact"/>
+              <w:jc w:val="center"/>
+            </w:pPr>
+            <w:r>
+              <w:t xml:space="preserve">0.1</w:t>
+            </w:r>
+          </w:p>
+        </w:tc>
+        <w:tc>
+          <w:p>
+            <w:pPr>
+              <w:pStyle w:val="Compact"/>
+              <w:jc w:val="center"/>
+            </w:pPr>
+            <w:r>
+              <w:t xml:space="preserve">13.811148881912231</w:t>
+            </w:r>
+          </w:p>
+        </w:tc>
+        <w:tc>
+          <w:p>
+            <w:pPr>
+              <w:pStyle w:val="Compact"/>
+              <w:jc w:val="center"/>
+            </w:pPr>
+            <w:r>
+              <w:t xml:space="preserve">16.9521381855011</w:t>
+            </w:r>
+          </w:p>
+        </w:tc>
+      </w:tr>
+      <w:tr>
+        <w:tc>
+          <w:p>
+            <w:pPr>
+              <w:pStyle w:val="Compact"/>
+              <w:jc w:val="center"/>
+            </w:pPr>
+            <w:r>
+              <w:t xml:space="preserve">0.1</w:t>
+            </w:r>
+          </w:p>
+        </w:tc>
+        <w:tc>
+          <w:p>
+            <w:pPr>
+              <w:pStyle w:val="Compact"/>
+              <w:jc w:val="center"/>
+            </w:pPr>
+            <w:r>
+              <w:t xml:space="preserve">0.5</w:t>
+            </w:r>
+          </w:p>
+        </w:tc>
+        <w:tc>
+          <w:p>
+            <w:pPr>
+              <w:pStyle w:val="Compact"/>
+              <w:jc w:val="center"/>
+            </w:pPr>
+            <w:r>
+              <w:t xml:space="preserve">13.020658254623413</w:t>
+            </w:r>
+          </w:p>
+        </w:tc>
+        <w:tc>
+          <w:p>
+            <w:pPr>
+              <w:pStyle w:val="Compact"/>
+              <w:jc w:val="center"/>
+            </w:pPr>
+            <w:r>
+              <w:t xml:space="preserve">19.620429277420044</w:t>
+            </w:r>
+          </w:p>
+        </w:tc>
+      </w:tr>
+      <w:tr>
+        <w:tc>
+          <w:p>
+            <w:pPr>
+              <w:pStyle w:val="Compact"/>
+              <w:jc w:val="center"/>
+            </w:pPr>
+            <w:r>
+              <w:t xml:space="preserve">0.3</w:t>
+            </w:r>
+          </w:p>
+        </w:tc>
+        <w:tc>
+          <w:p>
+            <w:pPr>
+              <w:pStyle w:val="Compact"/>
+              <w:jc w:val="center"/>
+            </w:pPr>
+            <w:r>
+              <w:t xml:space="preserve">0.7</w:t>
+            </w:r>
+          </w:p>
+        </w:tc>
+        <w:tc>
+          <w:p>
+            <w:pPr>
+              <w:pStyle w:val="Compact"/>
+              <w:jc w:val="center"/>
+            </w:pPr>
+            <w:r>
+              <w:t xml:space="preserve">11.332738161087036</w:t>
+            </w:r>
+          </w:p>
+        </w:tc>
+        <w:tc>
+          <w:p>
+            <w:pPr>
+              <w:pStyle w:val="Compact"/>
+              <w:jc w:val="center"/>
+            </w:pPr>
+            <w:r>
+              <w:t xml:space="preserve">24.256462335586548</w:t>
+            </w:r>
+          </w:p>
+        </w:tc>
+      </w:tr>
+      <w:tr>
+        <w:tc>
+          <w:p>
+            <w:pPr>
+              <w:pStyle w:val="Compact"/>
+              <w:jc w:val="center"/>
+            </w:pPr>
+            <w:r>
+              <w:t xml:space="preserve">0.5</w:t>
+            </w:r>
+          </w:p>
+        </w:tc>
+        <w:tc>
+          <w:p>
+            <w:pPr>
+              <w:pStyle w:val="Compact"/>
+              <w:jc w:val="center"/>
+            </w:pPr>
+            <w:r>
+              <w:t xml:space="preserve">0.1</w:t>
+            </w:r>
+          </w:p>
+        </w:tc>
+        <w:tc>
+          <w:p>
+            <w:pPr>
+              <w:pStyle w:val="Compact"/>
+              <w:jc w:val="center"/>
+            </w:pPr>
+            <w:r>
+              <w:t xml:space="preserve">12.350087404251099</w:t>
+            </w:r>
+          </w:p>
+        </w:tc>
+        <w:tc>
+          <w:p>
+            <w:pPr>
+              <w:pStyle w:val="Compact"/>
+              <w:jc w:val="center"/>
+            </w:pPr>
+            <w:r>
+              <w:t xml:space="preserve">17.89053726196289</w:t>
+            </w:r>
+          </w:p>
+        </w:tc>
+      </w:tr>
+      <w:tr>
+        <w:tc>
+          <w:p>
+            <w:pPr>
+              <w:pStyle w:val="Compact"/>
+              <w:jc w:val="center"/>
+            </w:pPr>
+            <w:r>
+              <w:t xml:space="preserve">0.5</w:t>
+            </w:r>
+          </w:p>
+        </w:tc>
+        <w:tc>
+          <w:p>
+            <w:pPr>
+              <w:pStyle w:val="Compact"/>
+              <w:jc w:val="center"/>
+            </w:pPr>
+            <w:r>
+              <w:t xml:space="preserve">0.5</w:t>
+            </w:r>
+          </w:p>
+        </w:tc>
+        <w:tc>
+          <w:p>
+            <w:pPr>
+              <w:pStyle w:val="Compact"/>
+              <w:jc w:val="center"/>
+            </w:pPr>
+            <w:r>
+              <w:t xml:space="preserve">12.122233390808105</w:t>
+            </w:r>
+          </w:p>
+        </w:tc>
+        <w:tc>
+          <w:p>
+            <w:pPr>
+              <w:pStyle w:val="Compact"/>
+              <w:jc w:val="center"/>
+            </w:pPr>
+            <w:r>
+              <w:t xml:space="preserve">18.002467393875122</w:t>
+            </w:r>
+          </w:p>
+        </w:tc>
+      </w:tr>
+    </w:tbl>
     <w:p>
       <w:pPr>
         <w:pStyle w:val="Heading2"/>
       </w:pPr>
-      <w:bookmarkStart w:id="41" w:name="acústica-e-psicoacústica"/>
+      <w:bookmarkStart w:id="56" w:name="acústica-e-psicoacústica"/>
       <w:r>
         <w:t xml:space="preserve">Acústica e Psicoacústica</w:t>
       </w:r>
-      <w:bookmarkEnd w:id="41"/>
+      <w:bookmarkEnd w:id="56"/>
     </w:p>
     <w:p>
       <w:pPr>
         <w:pStyle w:val="Heading1"/>
       </w:pPr>
-      <w:bookmarkStart w:id="42" w:name="referencial-teórico"/>
+      <w:bookmarkStart w:id="57" w:name="referencial-teórico"/>
       <w:r>
         <w:t xml:space="preserve">Referencial Teórico</w:t>
       </w:r>
-      <w:bookmarkEnd w:id="42"/>
+      <w:bookmarkEnd w:id="57"/>
     </w:p>
     <w:p>
       <w:pPr>
         <w:pStyle w:val="Heading2"/>
       </w:pPr>
-      <w:bookmarkStart w:id="43" w:name="transformada-discreta-de-fourier"/>
+      <w:bookmarkStart w:id="58" w:name="transformada-discreta-de-fourier"/>
       <w:r>
         <w:t xml:space="preserve">Transformada Discreta de Fourier</w:t>
       </w:r>
-      <w:bookmarkEnd w:id="43"/>
+      <w:bookmarkEnd w:id="58"/>
     </w:p>
     <w:p>
       <w:pPr>
@@ -8062,7 +10249,7 @@
                     </pic:cNvPicPr>
                   </pic:nvPicPr>
                   <pic:blipFill>
-                    <a:blip r:embed="rId44"/>
+                    <a:blip r:embed="rId59"/>
                     <a:stretch>
                       <a:fillRect/>
                     </a:stretch>
@@ -10291,11 +12478,11 @@
       <w:pPr>
         <w:pStyle w:val="Heading2"/>
       </w:pPr>
-      <w:bookmarkStart w:id="45" w:name="a-equação-da-onda"/>
+      <w:bookmarkStart w:id="60" w:name="a-equação-da-onda"/>
       <w:r>
         <w:t xml:space="preserve">A Equação da Onda</w:t>
       </w:r>
-      <w:bookmarkEnd w:id="45"/>
+      <w:bookmarkEnd w:id="60"/>
     </w:p>
     <w:p>
       <w:pPr>
@@ -10325,7 +12512,7 @@
                     </pic:cNvPicPr>
                   </pic:nvPicPr>
                   <pic:blipFill>
-                    <a:blip r:embed="rId46"/>
+                    <a:blip r:embed="rId61"/>
                     <a:stretch>
                       <a:fillRect/>
                     </a:stretch>
@@ -13205,11 +15392,11 @@
       <w:pPr>
         <w:pStyle w:val="Heading2"/>
       </w:pPr>
-      <w:bookmarkStart w:id="47" w:name="formalização-de-uma-rede-neural---forward-pass"/>
+      <w:bookmarkStart w:id="62" w:name="formalização-de-uma-rede-neural---forward-pass"/>
       <w:r>
         <w:t xml:space="preserve">Formalização de uma Rede Neural - Forward Pass</w:t>
       </w:r>
-      <w:bookmarkEnd w:id="47"/>
+      <w:bookmarkEnd w:id="62"/>
     </w:p>
     <w:p>
       <w:pPr>
@@ -13239,7 +15426,7 @@
                     </pic:cNvPicPr>
                   </pic:nvPicPr>
                   <pic:blipFill>
-                    <a:blip r:embed="rId48"/>
+                    <a:blip r:embed="rId63"/>
                     <a:stretch>
                       <a:fillRect/>
                     </a:stretch>
@@ -14406,11 +16593,11 @@
       <w:pPr>
         <w:pStyle w:val="Heading2"/>
       </w:pPr>
-      <w:bookmarkStart w:id="49" w:name="formalização-de-uma-rede-neural---backpropagation"/>
+      <w:bookmarkStart w:id="64" w:name="formalização-de-uma-rede-neural---backpropagation"/>
       <w:r>
         <w:t xml:space="preserve">Formalização de uma Rede Neural - Backpropagation</w:t>
       </w:r>
-      <w:bookmarkEnd w:id="49"/>
+      <w:bookmarkEnd w:id="64"/>
     </w:p>
     <w:p>
       <w:pPr>
@@ -15027,7 +17214,7 @@
                     </pic:cNvPicPr>
                   </pic:nvPicPr>
                   <pic:blipFill>
-                    <a:blip r:embed="rId50"/>
+                    <a:blip r:embed="rId65"/>
                     <a:stretch>
                       <a:fillRect/>
                     </a:stretch>
@@ -16660,21 +18847,21 @@
       <w:pPr>
         <w:pStyle w:val="Heading1"/>
       </w:pPr>
-      <w:bookmarkStart w:id="51" w:name="metodologia"/>
+      <w:bookmarkStart w:id="66" w:name="metodologia"/>
       <w:r>
         <w:t xml:space="preserve">Metodologia</w:t>
       </w:r>
-      <w:bookmarkEnd w:id="51"/>
+      <w:bookmarkEnd w:id="66"/>
     </w:p>
     <w:p>
       <w:pPr>
         <w:pStyle w:val="Heading2"/>
       </w:pPr>
-      <w:bookmarkStart w:id="52" w:name="samples-utilizados"/>
+      <w:bookmarkStart w:id="67" w:name="samples-utilizados"/>
       <w:r>
         <w:t xml:space="preserve">Samples Utilizados</w:t>
       </w:r>
-      <w:bookmarkEnd w:id="52"/>
+      <w:bookmarkEnd w:id="67"/>
     </w:p>
     <w:p>
       <w:pPr>
@@ -16708,11 +18895,11 @@
       <w:pPr>
         <w:pStyle w:val="Heading2"/>
       </w:pPr>
-      <w:bookmarkStart w:id="53" w:name="redes-densas"/>
+      <w:bookmarkStart w:id="68" w:name="redes-densas"/>
       <w:r>
         <w:t xml:space="preserve">Redes Densas</w:t>
       </w:r>
-      <w:bookmarkEnd w:id="53"/>
+      <w:bookmarkEnd w:id="68"/>
     </w:p>
     <w:p>
       <w:pPr>
@@ -17240,11 +19427,11 @@
       <w:pPr>
         <w:pStyle w:val="Heading3"/>
       </w:pPr>
-      <w:bookmarkStart w:id="54" w:name="algoritmos-de-otimização"/>
+      <w:bookmarkStart w:id="69" w:name="algoritmos-de-otimização"/>
       <w:r>
         <w:t xml:space="preserve">Algoritmos de Otimização</w:t>
       </w:r>
-      <w:bookmarkEnd w:id="54"/>
+      <w:bookmarkEnd w:id="69"/>
     </w:p>
     <w:p>
       <w:pPr>
@@ -17290,11 +19477,11 @@
       <w:pPr>
         <w:pStyle w:val="Heading3"/>
       </w:pPr>
-      <w:bookmarkStart w:id="55" w:name="grid-search-para-topologia-e-parâmetros"/>
+      <w:bookmarkStart w:id="70" w:name="grid-search-para-topologia-e-parâmetros"/>
       <w:r>
         <w:t xml:space="preserve">Grid search para topologia e parâmetros</w:t>
       </w:r>
-      <w:bookmarkEnd w:id="55"/>
+      <w:bookmarkEnd w:id="70"/>
     </w:p>
     <w:p>
       <w:pPr>
@@ -17308,11 +19495,11 @@
       <w:pPr>
         <w:pStyle w:val="Heading4"/>
       </w:pPr>
-      <w:bookmarkStart w:id="56" w:name="adagrad"/>
+      <w:bookmarkStart w:id="71" w:name="adagrad"/>
       <w:r>
         <w:t xml:space="preserve">Adagrad</w:t>
       </w:r>
-      <w:bookmarkEnd w:id="56"/>
+      <w:bookmarkEnd w:id="71"/>
     </w:p>
     <w:p>
       <w:pPr>
@@ -17376,7 +19563,7 @@
                     </pic:cNvPicPr>
                   </pic:nvPicPr>
                   <pic:blipFill>
-                    <a:blip r:embed="rId57"/>
+                    <a:blip r:embed="rId72"/>
                     <a:stretch>
                       <a:fillRect/>
                     </a:stretch>
@@ -17431,7 +19618,7 @@
                     </pic:cNvPicPr>
                   </pic:nvPicPr>
                   <pic:blipFill>
-                    <a:blip r:embed="rId58"/>
+                    <a:blip r:embed="rId73"/>
                     <a:stretch>
                       <a:fillRect/>
                     </a:stretch>
@@ -17844,11 +20031,11 @@
       <w:pPr>
         <w:pStyle w:val="Heading4"/>
       </w:pPr>
-      <w:bookmarkStart w:id="59" w:name="nadam"/>
+      <w:bookmarkStart w:id="74" w:name="nadam"/>
       <w:r>
         <w:t xml:space="preserve">Nadam</w:t>
       </w:r>
-      <w:bookmarkEnd w:id="59"/>
+      <w:bookmarkEnd w:id="74"/>
     </w:p>
     <w:p>
       <w:pPr>
@@ -17878,7 +20065,7 @@
                     </pic:cNvPicPr>
                   </pic:nvPicPr>
                   <pic:blipFill>
-                    <a:blip r:embed="rId60"/>
+                    <a:blip r:embed="rId75"/>
                     <a:stretch>
                       <a:fillRect/>
                     </a:stretch>
@@ -17933,7 +20120,7 @@
                     </pic:cNvPicPr>
                   </pic:nvPicPr>
                   <pic:blipFill>
-                    <a:blip r:embed="rId61"/>
+                    <a:blip r:embed="rId76"/>
                     <a:stretch>
                       <a:fillRect/>
                     </a:stretch>
@@ -18346,11 +20533,11 @@
       <w:pPr>
         <w:pStyle w:val="Heading4"/>
       </w:pPr>
-      <w:bookmarkStart w:id="62" w:name="ativações-e-otimizadores"/>
+      <w:bookmarkStart w:id="77" w:name="ativações-e-otimizadores"/>
       <w:r>
         <w:t xml:space="preserve">Ativações e Otimizadores</w:t>
       </w:r>
-      <w:bookmarkEnd w:id="62"/>
+      <w:bookmarkEnd w:id="77"/>
     </w:p>
     <w:p>
       <w:pPr>
@@ -18380,7 +20567,7 @@
                     </pic:cNvPicPr>
                   </pic:nvPicPr>
                   <pic:blipFill>
-                    <a:blip r:embed="rId63"/>
+                    <a:blip r:embed="rId78"/>
                     <a:stretch>
                       <a:fillRect/>
                     </a:stretch>
@@ -18427,11 +20614,11 @@
       <w:pPr>
         <w:pStyle w:val="Heading3"/>
       </w:pPr>
-      <w:bookmarkStart w:id="64" w:name="análise-dos-resultados"/>
+      <w:bookmarkStart w:id="79" w:name="análise-dos-resultados"/>
       <w:r>
         <w:t xml:space="preserve">Análise dos resultados</w:t>
       </w:r>
-      <w:bookmarkEnd w:id="64"/>
+      <w:bookmarkEnd w:id="79"/>
     </w:p>
     <w:p>
       <w:pPr>
@@ -18795,7 +20982,7 @@
       <w:r>
         <w:t xml:space="preserve"> </w:t>
       </w:r>
-      <w:hyperlink r:id="rId65">
+      <w:hyperlink r:id="rId80">
         <w:r>
           <w:rPr>
             <w:rStyle w:val="Hyperlink"/>
@@ -18830,7 +21017,7 @@
                     </pic:cNvPicPr>
                   </pic:nvPicPr>
                   <pic:blipFill>
-                    <a:blip r:embed="rId66"/>
+                    <a:blip r:embed="rId81"/>
                     <a:stretch>
                       <a:fillRect/>
                     </a:stretch>
@@ -18893,11 +21080,11 @@
       <w:pPr>
         <w:pStyle w:val="Heading2"/>
       </w:pPr>
-      <w:bookmarkStart w:id="67" w:name="redes-recorrentes-1"/>
+      <w:bookmarkStart w:id="82" w:name="redes-recorrentes-1"/>
       <w:r>
         <w:t xml:space="preserve">Redes Recorrentes</w:t>
       </w:r>
-      <w:bookmarkEnd w:id="67"/>
+      <w:bookmarkEnd w:id="82"/>
     </w:p>
     <w:p>
       <w:pPr>
@@ -18927,7 +21114,7 @@
                     </pic:cNvPicPr>
                   </pic:nvPicPr>
                   <pic:blipFill>
-                    <a:blip r:embed="rId68"/>
+                    <a:blip r:embed="rId83"/>
                     <a:stretch>
                       <a:fillRect/>
                     </a:stretch>
@@ -18990,7 +21177,7 @@
                     </pic:cNvPicPr>
                   </pic:nvPicPr>
                   <pic:blipFill>
-                    <a:blip r:embed="rId69"/>
+                    <a:blip r:embed="rId84"/>
                     <a:stretch>
                       <a:fillRect/>
                     </a:stretch>
@@ -19112,7 +21299,7 @@
                     </pic:cNvPicPr>
                   </pic:nvPicPr>
                   <pic:blipFill>
-                    <a:blip r:embed="rId70"/>
+                    <a:blip r:embed="rId85"/>
                     <a:stretch>
                       <a:fillRect/>
                     </a:stretch>
@@ -19157,7 +21344,7 @@
       <w:r>
         <w:t xml:space="preserve"> </w:t>
       </w:r>
-      <w:hyperlink r:id="rId39">
+      <w:hyperlink r:id="rId86">
         <w:r>
           <w:rPr>
             <w:rStyle w:val="Hyperlink"/>
@@ -19179,7 +21366,7 @@
       <w:r>
         <w:t xml:space="preserve"> </w:t>
       </w:r>
-      <w:hyperlink r:id="rId39">
+      <w:hyperlink r:id="rId86">
         <w:r>
           <w:rPr>
             <w:rStyle w:val="Hyperlink"/>
@@ -19214,7 +21401,7 @@
                     </pic:cNvPicPr>
                   </pic:nvPicPr>
                   <pic:blipFill>
-                    <a:blip r:embed="rId71"/>
+                    <a:blip r:embed="rId87"/>
                     <a:stretch>
                       <a:fillRect/>
                     </a:stretch>
@@ -19261,21 +21448,21 @@
       <w:pPr>
         <w:pStyle w:val="Heading2"/>
       </w:pPr>
-      <w:bookmarkStart w:id="72" w:name="redes-convolucionais-e-convolucionais-recorrentes"/>
+      <w:bookmarkStart w:id="88" w:name="redes-convolucionais-e-convolucionais-recorrentes"/>
       <w:r>
         <w:t xml:space="preserve">Redes Convolucionais e Convolucionais-Recorrentes</w:t>
       </w:r>
-      <w:bookmarkEnd w:id="72"/>
+      <w:bookmarkEnd w:id="88"/>
     </w:p>
     <w:p>
       <w:pPr>
         <w:pStyle w:val="Heading2"/>
       </w:pPr>
-      <w:bookmarkStart w:id="73" w:name="domínio-da-frequência"/>
+      <w:bookmarkStart w:id="89" w:name="domínio-da-frequência"/>
       <w:r>
         <w:t xml:space="preserve">Domínio da Frequência</w:t>
       </w:r>
-      <w:bookmarkEnd w:id="73"/>
+      <w:bookmarkEnd w:id="89"/>
     </w:p>
     <w:p>
       <w:pPr>
@@ -19321,7 +21508,7 @@
                     </pic:cNvPicPr>
                   </pic:nvPicPr>
                   <pic:blipFill>
-                    <a:blip r:embed="rId74"/>
+                    <a:blip r:embed="rId90"/>
                     <a:stretch>
                       <a:fillRect/>
                     </a:stretch>
@@ -19411,7 +21598,7 @@
                     </pic:cNvPicPr>
                   </pic:nvPicPr>
                   <pic:blipFill>
-                    <a:blip r:embed="rId75"/>
+                    <a:blip r:embed="rId91"/>
                     <a:stretch>
                       <a:fillRect/>
                     </a:stretch>
@@ -19500,7 +21687,7 @@
                     </pic:cNvPicPr>
                   </pic:nvPicPr>
                   <pic:blipFill>
-                    <a:blip r:embed="rId76"/>
+                    <a:blip r:embed="rId92"/>
                     <a:stretch>
                       <a:fillRect/>
                     </a:stretch>
@@ -19547,11 +21734,11 @@
       <w:pPr>
         <w:pStyle w:val="Heading2"/>
       </w:pPr>
-      <w:bookmarkStart w:id="77" w:name="modelo-misto"/>
+      <w:bookmarkStart w:id="93" w:name="modelo-misto"/>
       <w:r>
         <w:t xml:space="preserve">Modelo Misto</w:t>
       </w:r>
-      <w:bookmarkEnd w:id="77"/>
+      <w:bookmarkEnd w:id="93"/>
     </w:p>
     <w:p>
       <w:pPr>
@@ -19599,7 +21786,7 @@
                     </pic:cNvPicPr>
                   </pic:nvPicPr>
                   <pic:blipFill>
-                    <a:blip r:embed="rId78"/>
+                    <a:blip r:embed="rId94"/>
                     <a:stretch>
                       <a:fillRect/>
                     </a:stretch>
@@ -19700,7 +21887,7 @@
                     </pic:cNvPicPr>
                   </pic:nvPicPr>
                   <pic:blipFill>
-                    <a:blip r:embed="rId79"/>
+                    <a:blip r:embed="rId95"/>
                     <a:stretch>
                       <a:fillRect/>
                     </a:stretch>
@@ -19747,11 +21934,11 @@
       <w:pPr>
         <w:pStyle w:val="Heading3"/>
       </w:pPr>
-      <w:bookmarkStart w:id="80" w:name="frequências"/>
+      <w:bookmarkStart w:id="96" w:name="frequências"/>
       <w:r>
         <w:t xml:space="preserve">Frequências</w:t>
       </w:r>
-      <w:bookmarkEnd w:id="80"/>
+      <w:bookmarkEnd w:id="96"/>
     </w:p>
     <w:p>
       <w:pPr>
@@ -19967,7 +22154,7 @@
                     </pic:cNvPicPr>
                   </pic:nvPicPr>
                   <pic:blipFill>
-                    <a:blip r:embed="rId81"/>
+                    <a:blip r:embed="rId97"/>
                     <a:stretch>
                       <a:fillRect/>
                     </a:stretch>
@@ -20034,11 +22221,11 @@
       <w:pPr>
         <w:pStyle w:val="Heading3"/>
       </w:pPr>
-      <w:bookmarkStart w:id="82" w:name="decaimentos-e-amplitudes"/>
+      <w:bookmarkStart w:id="98" w:name="decaimentos-e-amplitudes"/>
       <w:r>
         <w:t xml:space="preserve">Decaimentos e Amplitudes</w:t>
       </w:r>
-      <w:bookmarkEnd w:id="82"/>
+      <w:bookmarkEnd w:id="98"/>
     </w:p>
     <w:p>
       <w:pPr>
@@ -20330,7 +22517,7 @@
                     </pic:cNvPicPr>
                   </pic:nvPicPr>
                   <pic:blipFill>
-                    <a:blip r:embed="rId83"/>
+                    <a:blip r:embed="rId99"/>
                     <a:stretch>
                       <a:fillRect/>
                     </a:stretch>
@@ -20383,11 +22570,11 @@
       <w:pPr>
         <w:pStyle w:val="Heading3"/>
       </w:pPr>
-      <w:bookmarkStart w:id="84" w:name="formulação-final"/>
+      <w:bookmarkStart w:id="100" w:name="formulação-final"/>
       <w:r>
         <w:t xml:space="preserve">Formulação Final</w:t>
       </w:r>
-      <w:bookmarkEnd w:id="84"/>
+      <w:bookmarkEnd w:id="100"/>
     </w:p>
     <w:p>
       <w:pPr>
@@ -20729,7 +22916,7 @@
                     </pic:cNvPicPr>
                   </pic:nvPicPr>
                   <pic:blipFill>
-                    <a:blip r:embed="rId85"/>
+                    <a:blip r:embed="rId101"/>
                     <a:stretch>
                       <a:fillRect/>
                     </a:stretch>
@@ -20792,7 +22979,7 @@
                     </pic:cNvPicPr>
                   </pic:nvPicPr>
                   <pic:blipFill>
-                    <a:blip r:embed="rId86"/>
+                    <a:blip r:embed="rId102"/>
                     <a:stretch>
                       <a:fillRect/>
                     </a:stretch>
@@ -20847,7 +23034,7 @@
                     </pic:cNvPicPr>
                   </pic:nvPicPr>
                   <pic:blipFill>
-                    <a:blip r:embed="rId87"/>
+                    <a:blip r:embed="rId103"/>
                     <a:stretch>
                       <a:fillRect/>
                     </a:stretch>
@@ -21012,7 +23199,7 @@
                     </pic:cNvPicPr>
                   </pic:nvPicPr>
                   <pic:blipFill>
-                    <a:blip r:embed="rId88"/>
+                    <a:blip r:embed="rId104"/>
                     <a:stretch>
                       <a:fillRect/>
                     </a:stretch>
@@ -21051,34 +23238,34 @@
       <w:pPr>
         <w:pStyle w:val="Heading1"/>
       </w:pPr>
-      <w:bookmarkStart w:id="89" w:name="resultados"/>
+      <w:bookmarkStart w:id="105" w:name="resultados"/>
       <w:r>
         <w:t xml:space="preserve">Resultados</w:t>
       </w:r>
-      <w:bookmarkEnd w:id="89"/>
+      <w:bookmarkEnd w:id="105"/>
     </w:p>
     <w:p>
       <w:pPr>
         <w:pStyle w:val="Heading1"/>
       </w:pPr>
-      <w:bookmarkStart w:id="90" w:name="conclusão"/>
+      <w:bookmarkStart w:id="106" w:name="conclusão"/>
       <w:r>
         <w:t xml:space="preserve">Conclusão</w:t>
       </w:r>
-      <w:bookmarkEnd w:id="90"/>
+      <w:bookmarkEnd w:id="106"/>
     </w:p>
     <w:p>
       <w:pPr>
         <w:pStyle w:val="Heading1"/>
       </w:pPr>
-      <w:bookmarkStart w:id="91" w:name="referências"/>
+      <w:bookmarkStart w:id="107" w:name="referências"/>
       <w:r>
         <w:t xml:space="preserve">Referências</w:t>
       </w:r>
-      <w:bookmarkEnd w:id="91"/>
-    </w:p>
-    <w:bookmarkStart w:id="187" w:name="refs"/>
-    <w:bookmarkStart w:id="92" w:name="ref-balle2016end"/>
+      <w:bookmarkEnd w:id="107"/>
+    </w:p>
+    <w:bookmarkStart w:id="203" w:name="refs"/>
+    <w:bookmarkStart w:id="108" w:name="ref-balle2016end"/>
     <w:p>
       <w:pPr>
         <w:pStyle w:val="Bibliography"/>
@@ -21099,8 +23286,8 @@
         <w:t xml:space="preserve">.</w:t>
       </w:r>
     </w:p>
-    <w:bookmarkEnd w:id="92"/>
-    <w:bookmarkStart w:id="93" w:name="ref-bensa2005computational"/>
+    <w:bookmarkEnd w:id="108"/>
+    <w:bookmarkStart w:id="109" w:name="ref-bensa2005computational"/>
     <w:p>
       <w:pPr>
         <w:pStyle w:val="Bibliography"/>
@@ -21124,8 +23311,8 @@
         <w:t xml:space="preserve">91 (2). S. Hirzel Verlag: 289–98.</w:t>
       </w:r>
     </w:p>
-    <w:bookmarkEnd w:id="93"/>
-    <w:bookmarkStart w:id="94" w:name="ref-bensa2003simulation"/>
+    <w:bookmarkEnd w:id="109"/>
+    <w:bookmarkStart w:id="110" w:name="ref-bensa2003simulation"/>
     <w:p>
       <w:pPr>
         <w:pStyle w:val="Bibliography"/>
@@ -21149,8 +23336,8 @@
         <w:t xml:space="preserve">114 (2). ASA: 1095–1107.</w:t>
       </w:r>
     </w:p>
-    <w:bookmarkEnd w:id="94"/>
-    <w:bookmarkStart w:id="95" w:name="ref-bishop06"/>
+    <w:bookmarkEnd w:id="110"/>
+    <w:bookmarkStart w:id="111" w:name="ref-bishop06"/>
     <w:p>
       <w:pPr>
         <w:pStyle w:val="Bibliography"/>
@@ -21171,8 +23358,8 @@
         <w:t xml:space="preserve">. springer.</w:t>
       </w:r>
     </w:p>
-    <w:bookmarkEnd w:id="95"/>
-    <w:bookmarkStart w:id="96" w:name="ref-boulanger2013high"/>
+    <w:bookmarkEnd w:id="111"/>
+    <w:bookmarkStart w:id="112" w:name="ref-boulanger2013high"/>
     <w:p>
       <w:pPr>
         <w:pStyle w:val="Bibliography"/>
@@ -21193,8 +23380,8 @@
         <w:t xml:space="preserve">, 3178–82. IEEE.</w:t>
       </w:r>
     </w:p>
-    <w:bookmarkEnd w:id="96"/>
-    <w:bookmarkStart w:id="97" w:name="ref-boulanger2014phone"/>
+    <w:bookmarkEnd w:id="112"/>
+    <w:bookmarkStart w:id="113" w:name="ref-boulanger2014phone"/>
     <w:p>
       <w:pPr>
         <w:pStyle w:val="Bibliography"/>
@@ -21215,8 +23402,8 @@
         <w:t xml:space="preserve">, 5417–21. IEEE.</w:t>
       </w:r>
     </w:p>
-    <w:bookmarkEnd w:id="97"/>
-    <w:bookmarkStart w:id="98" w:name="ref-bovermann2016musical"/>
+    <w:bookmarkEnd w:id="113"/>
+    <w:bookmarkStart w:id="114" w:name="ref-bovermann2016musical"/>
     <w:p>
       <w:pPr>
         <w:pStyle w:val="Bibliography"/>
@@ -21237,8 +23424,8 @@
         <w:t xml:space="preserve">. Springer.</w:t>
       </w:r>
     </w:p>
-    <w:bookmarkEnd w:id="98"/>
-    <w:bookmarkStart w:id="99" w:name="ref-bock2012polyphonic"/>
+    <w:bookmarkEnd w:id="114"/>
+    <w:bookmarkStart w:id="115" w:name="ref-bock2012polyphonic"/>
     <w:p>
       <w:pPr>
         <w:pStyle w:val="Bibliography"/>
@@ -21259,8 +23446,8 @@
         <w:t xml:space="preserve">, 121–24. IEEE.</w:t>
       </w:r>
     </w:p>
-    <w:bookmarkEnd w:id="99"/>
-    <w:bookmarkStart w:id="100" w:name="ref-choi2016automatic"/>
+    <w:bookmarkEnd w:id="115"/>
+    <w:bookmarkStart w:id="116" w:name="ref-choi2016automatic"/>
     <w:p>
       <w:pPr>
         <w:pStyle w:val="Bibliography"/>
@@ -21281,8 +23468,8 @@
         <w:t xml:space="preserve">.</w:t>
       </w:r>
     </w:p>
-    <w:bookmarkEnd w:id="100"/>
-    <w:bookmarkStart w:id="101" w:name="ref-choi2017convolutional"/>
+    <w:bookmarkEnd w:id="116"/>
+    <w:bookmarkStart w:id="117" w:name="ref-choi2017convolutional"/>
     <w:p>
       <w:pPr>
         <w:pStyle w:val="Bibliography"/>
@@ -21303,8 +23490,8 @@
         <w:t xml:space="preserve">, 2392–6. IEEE.</w:t>
       </w:r>
     </w:p>
-    <w:bookmarkEnd w:id="101"/>
-    <w:bookmarkStart w:id="102" w:name="ref-costa2017evaluation"/>
+    <w:bookmarkEnd w:id="117"/>
+    <w:bookmarkStart w:id="118" w:name="ref-costa2017evaluation"/>
     <w:p>
       <w:pPr>
         <w:pStyle w:val="Bibliography"/>
@@ -21328,8 +23515,8 @@
         <w:t xml:space="preserve">52. Elsevier: 28–38.</w:t>
       </w:r>
     </w:p>
-    <w:bookmarkEnd w:id="102"/>
-    <w:bookmarkStart w:id="103" w:name="ref-dalgleish2014blurring"/>
+    <w:bookmarkEnd w:id="118"/>
+    <w:bookmarkStart w:id="119" w:name="ref-dalgleish2014blurring"/>
     <w:p>
       <w:pPr>
         <w:pStyle w:val="Bibliography"/>
@@ -21338,8 +23525,8 @@
         <w:t xml:space="preserve">Dalgleish, Mathew, Steve Spencer, and Chris Foster. 2014. “BLURRING the Lines: AN Integrated Compositional Model for Digital Musical Instrument Design.” In. Proceedings of the 9th Conference on Interdisciplinary Musicology. CIM14. Berlin, Germany.</w:t>
       </w:r>
     </w:p>
-    <w:bookmarkEnd w:id="103"/>
-    <w:bookmarkStart w:id="104" w:name="ref-elman1990finding"/>
+    <w:bookmarkEnd w:id="119"/>
+    <w:bookmarkStart w:id="120" w:name="ref-elman1990finding"/>
     <w:p>
       <w:pPr>
         <w:pStyle w:val="Bibliography"/>
@@ -21363,8 +23550,8 @@
         <w:t xml:space="preserve">14 (2). Wiley Online Library: 179–211.</w:t>
       </w:r>
     </w:p>
-    <w:bookmarkEnd w:id="104"/>
-    <w:bookmarkStart w:id="105" w:name="ref-engel2017neural"/>
+    <w:bookmarkEnd w:id="120"/>
+    <w:bookmarkStart w:id="121" w:name="ref-engel2017neural"/>
     <w:p>
       <w:pPr>
         <w:pStyle w:val="Bibliography"/>
@@ -21385,8 +23572,8 @@
         <w:t xml:space="preserve">.</w:t>
       </w:r>
     </w:p>
-    <w:bookmarkEnd w:id="105"/>
-    <w:bookmarkStart w:id="106" w:name="ref-forgeard2008practicing"/>
+    <w:bookmarkEnd w:id="121"/>
+    <w:bookmarkStart w:id="122" w:name="ref-forgeard2008practicing"/>
     <w:p>
       <w:pPr>
         <w:pStyle w:val="Bibliography"/>
@@ -21410,8 +23597,8 @@
         <w:t xml:space="preserve">3 (10). Public Library of Science: e3566.</w:t>
       </w:r>
     </w:p>
-    <w:bookmarkEnd w:id="106"/>
-    <w:bookmarkStart w:id="107" w:name="ref-frans2017outline"/>
+    <w:bookmarkEnd w:id="122"/>
+    <w:bookmarkStart w:id="123" w:name="ref-frans2017outline"/>
     <w:p>
       <w:pPr>
         <w:pStyle w:val="Bibliography"/>
@@ -21432,8 +23619,8 @@
         <w:t xml:space="preserve">.</w:t>
       </w:r>
     </w:p>
-    <w:bookmarkEnd w:id="107"/>
-    <w:bookmarkStart w:id="108" w:name="ref-gatys2016image"/>
+    <w:bookmarkEnd w:id="123"/>
+    <w:bookmarkStart w:id="124" w:name="ref-gatys2016image"/>
     <w:p>
       <w:pPr>
         <w:pStyle w:val="Bibliography"/>
@@ -21454,8 +23641,8 @@
         <w:t xml:space="preserve">, 2414–23.</w:t>
       </w:r>
     </w:p>
-    <w:bookmarkEnd w:id="108"/>
-    <w:bookmarkStart w:id="109" w:name="ref-goldberg2016primer"/>
+    <w:bookmarkEnd w:id="124"/>
+    <w:bookmarkStart w:id="125" w:name="ref-goldberg2016primer"/>
     <w:p>
       <w:pPr>
         <w:pStyle w:val="Bibliography"/>
@@ -21479,8 +23666,8 @@
         <w:t xml:space="preserve">57: 345–420.</w:t>
       </w:r>
     </w:p>
-    <w:bookmarkEnd w:id="109"/>
-    <w:bookmarkStart w:id="111" w:name="ref-cnnmoney"/>
+    <w:bookmarkEnd w:id="125"/>
+    <w:bookmarkStart w:id="127" w:name="ref-cnnmoney"/>
     <w:p>
       <w:pPr>
         <w:pStyle w:val="Bibliography"/>
@@ -21503,7 +23690,7 @@
       <w:r>
         <w:t xml:space="preserve"> </w:t>
       </w:r>
-      <w:hyperlink r:id="rId110">
+      <w:hyperlink r:id="rId126">
         <w:r>
           <w:rPr>
             <w:rStyle w:val="Hyperlink"/>
@@ -21515,8 +23702,8 @@
         <w:t xml:space="preserve">.</w:t>
       </w:r>
     </w:p>
-    <w:bookmarkEnd w:id="111"/>
-    <w:bookmarkStart w:id="112" w:name="ref-gracia2016wave"/>
+    <w:bookmarkEnd w:id="127"/>
+    <w:bookmarkStart w:id="128" w:name="ref-gracia2016wave"/>
     <w:p>
       <w:pPr>
         <w:pStyle w:val="Bibliography"/>
@@ -21537,8 +23724,8 @@
         <w:t xml:space="preserve">.</w:t>
       </w:r>
     </w:p>
-    <w:bookmarkEnd w:id="112"/>
-    <w:bookmarkStart w:id="113" w:name="ref-graves2013speech"/>
+    <w:bookmarkEnd w:id="128"/>
+    <w:bookmarkStart w:id="129" w:name="ref-graves2013speech"/>
     <w:p>
       <w:pPr>
         <w:pStyle w:val="Bibliography"/>
@@ -21559,8 +23746,8 @@
         <w:t xml:space="preserve">, 6645–9. IEEE.</w:t>
       </w:r>
     </w:p>
-    <w:bookmarkEnd w:id="113"/>
-    <w:bookmarkStart w:id="114" w:name="ref-gregor2016towards"/>
+    <w:bookmarkEnd w:id="129"/>
+    <w:bookmarkStart w:id="130" w:name="ref-gregor2016towards"/>
     <w:p>
       <w:pPr>
         <w:pStyle w:val="Bibliography"/>
@@ -21581,8 +23768,8 @@
         <w:t xml:space="preserve">, 3549–57.</w:t>
       </w:r>
     </w:p>
-    <w:bookmarkEnd w:id="114"/>
-    <w:bookmarkStart w:id="115" w:name="ref-grinstein2017audio"/>
+    <w:bookmarkEnd w:id="130"/>
+    <w:bookmarkStart w:id="131" w:name="ref-grinstein2017audio"/>
     <w:p>
       <w:pPr>
         <w:pStyle w:val="Bibliography"/>
@@ -21603,8 +23790,8 @@
         <w:t xml:space="preserve">.</w:t>
       </w:r>
     </w:p>
-    <w:bookmarkEnd w:id="115"/>
-    <w:bookmarkStart w:id="116" w:name="ref-hagan1996neural"/>
+    <w:bookmarkEnd w:id="131"/>
+    <w:bookmarkStart w:id="132" w:name="ref-hagan1996neural"/>
     <w:p>
       <w:pPr>
         <w:pStyle w:val="Bibliography"/>
@@ -21625,8 +23812,8 @@
         <w:t xml:space="preserve">. Vol. 20. Pws Pub. Boston.</w:t>
       </w:r>
     </w:p>
-    <w:bookmarkEnd w:id="116"/>
-    <w:bookmarkStart w:id="117" w:name="ref-he2015multimodal"/>
+    <w:bookmarkEnd w:id="132"/>
+    <w:bookmarkStart w:id="133" w:name="ref-he2015multimodal"/>
     <w:p>
       <w:pPr>
         <w:pStyle w:val="Bibliography"/>
@@ -21647,8 +23834,8 @@
         <w:t xml:space="preserve">, 73–80. ACM.</w:t>
       </w:r>
     </w:p>
-    <w:bookmarkEnd w:id="117"/>
-    <w:bookmarkStart w:id="118" w:name="ref-hinton2012deep"/>
+    <w:bookmarkEnd w:id="133"/>
+    <w:bookmarkStart w:id="134" w:name="ref-hinton2012deep"/>
     <w:p>
       <w:pPr>
         <w:pStyle w:val="Bibliography"/>
@@ -21672,8 +23859,8 @@
         <w:t xml:space="preserve">29 (6). IEEE: 82–97.</w:t>
       </w:r>
     </w:p>
-    <w:bookmarkEnd w:id="118"/>
-    <w:bookmarkStart w:id="119" w:name="ref-hornik91"/>
+    <w:bookmarkEnd w:id="134"/>
+    <w:bookmarkStart w:id="135" w:name="ref-hornik91"/>
     <w:p>
       <w:pPr>
         <w:pStyle w:val="Bibliography"/>
@@ -21697,8 +23884,8 @@
         <w:t xml:space="preserve">4 (2). Elsevier: 251–57.</w:t>
       </w:r>
     </w:p>
-    <w:bookmarkEnd w:id="119"/>
-    <w:bookmarkStart w:id="120" w:name="ref-hornik89"/>
+    <w:bookmarkEnd w:id="135"/>
+    <w:bookmarkStart w:id="136" w:name="ref-hornik89"/>
     <w:p>
       <w:pPr>
         <w:pStyle w:val="Bibliography"/>
@@ -21722,8 +23909,8 @@
         <w:t xml:space="preserve">2 (5). Elsevier: 359–66.</w:t>
       </w:r>
     </w:p>
-    <w:bookmarkEnd w:id="120"/>
-    <w:bookmarkStart w:id="121" w:name="ref-hutchings2017talking"/>
+    <w:bookmarkEnd w:id="136"/>
+    <w:bookmarkStart w:id="137" w:name="ref-hutchings2017talking"/>
     <w:p>
       <w:pPr>
         <w:pStyle w:val="Bibliography"/>
@@ -21744,8 +23931,8 @@
         <w:t xml:space="preserve">.</w:t>
       </w:r>
     </w:p>
-    <w:bookmarkEnd w:id="121"/>
-    <w:bookmarkStart w:id="122" w:name="ref-hwangimage"/>
+    <w:bookmarkEnd w:id="137"/>
+    <w:bookmarkStart w:id="138" w:name="ref-hwangimage"/>
     <w:p>
       <w:pPr>
         <w:pStyle w:val="Bibliography"/>
@@ -21754,8 +23941,8 @@
         <w:t xml:space="preserve">Hwang, Jeff, and You Zhou. 2016. “Image Colorization with Deep Convolutional Neural Networks.”</w:t>
       </w:r>
     </w:p>
-    <w:bookmarkEnd w:id="122"/>
-    <w:bookmarkStart w:id="123" w:name="ref-iizuka2016let"/>
+    <w:bookmarkEnd w:id="138"/>
+    <w:bookmarkStart w:id="139" w:name="ref-iizuka2016let"/>
     <w:p>
       <w:pPr>
         <w:pStyle w:val="Bibliography"/>
@@ -21779,8 +23966,8 @@
         <w:t xml:space="preserve">35 (4). ACM: 110.</w:t>
       </w:r>
     </w:p>
-    <w:bookmarkEnd w:id="123"/>
-    <w:bookmarkStart w:id="124" w:name="ref-isola2016image"/>
+    <w:bookmarkEnd w:id="139"/>
+    <w:bookmarkStart w:id="140" w:name="ref-isola2016image"/>
     <w:p>
       <w:pPr>
         <w:pStyle w:val="Bibliography"/>
@@ -21801,8 +23988,8 @@
         <w:t xml:space="preserve">.</w:t>
       </w:r>
     </w:p>
-    <w:bookmarkEnd w:id="124"/>
-    <w:bookmarkStart w:id="125" w:name="ref-jiang1999image"/>
+    <w:bookmarkEnd w:id="140"/>
+    <w:bookmarkStart w:id="141" w:name="ref-jiang1999image"/>
     <w:p>
       <w:pPr>
         <w:pStyle w:val="Bibliography"/>
@@ -21826,8 +24013,8 @@
         <w:t xml:space="preserve">14 (9). Elsevier: 737–60.</w:t>
       </w:r>
     </w:p>
-    <w:bookmarkEnd w:id="125"/>
-    <w:bookmarkStart w:id="126" w:name="ref-johnston2017improved"/>
+    <w:bookmarkEnd w:id="141"/>
+    <w:bookmarkStart w:id="142" w:name="ref-johnston2017improved"/>
     <w:p>
       <w:pPr>
         <w:pStyle w:val="Bibliography"/>
@@ -21848,8 +24035,8 @@
         <w:t xml:space="preserve">.</w:t>
       </w:r>
     </w:p>
-    <w:bookmarkEnd w:id="126"/>
-    <w:bookmarkStart w:id="127" w:name="ref-karjalainen2004digital"/>
+    <w:bookmarkEnd w:id="142"/>
+    <w:bookmarkStart w:id="143" w:name="ref-karjalainen2004digital"/>
     <w:p>
       <w:pPr>
         <w:pStyle w:val="Bibliography"/>
@@ -21873,8 +24060,8 @@
         <w:t xml:space="preserve">2004. Hindawi Publishing Corp.: 978–89.</w:t>
       </w:r>
     </w:p>
-    <w:bookmarkEnd w:id="127"/>
-    <w:bookmarkStart w:id="128" w:name="ref-karpathy2014large"/>
+    <w:bookmarkEnd w:id="143"/>
+    <w:bookmarkStart w:id="144" w:name="ref-karpathy2014large"/>
     <w:p>
       <w:pPr>
         <w:pStyle w:val="Bibliography"/>
@@ -21895,8 +24082,8 @@
         <w:t xml:space="preserve">, 1725–32.</w:t>
       </w:r>
     </w:p>
-    <w:bookmarkEnd w:id="128"/>
-    <w:bookmarkStart w:id="129" w:name="ref-khorrami2016deep"/>
+    <w:bookmarkEnd w:id="144"/>
+    <w:bookmarkStart w:id="145" w:name="ref-khorrami2016deep"/>
     <w:p>
       <w:pPr>
         <w:pStyle w:val="Bibliography"/>
@@ -21917,8 +24104,8 @@
         <w:t xml:space="preserve">, 619–23. IEEE.</w:t>
       </w:r>
     </w:p>
-    <w:bookmarkEnd w:id="129"/>
-    <w:bookmarkStart w:id="130" w:name="ref-kulkarni2015deep"/>
+    <w:bookmarkEnd w:id="145"/>
+    <w:bookmarkStart w:id="146" w:name="ref-kulkarni2015deep"/>
     <w:p>
       <w:pPr>
         <w:pStyle w:val="Bibliography"/>
@@ -21939,8 +24126,8 @@
         <w:t xml:space="preserve">, 2539–47.</w:t>
       </w:r>
     </w:p>
-    <w:bookmarkEnd w:id="130"/>
-    <w:bookmarkStart w:id="131" w:name="ref-larsson2016learning"/>
+    <w:bookmarkEnd w:id="146"/>
+    <w:bookmarkStart w:id="147" w:name="ref-larsson2016learning"/>
     <w:p>
       <w:pPr>
         <w:pStyle w:val="Bibliography"/>
@@ -21961,8 +24148,8 @@
         <w:t xml:space="preserve">, 577–93. Springer.</w:t>
       </w:r>
     </w:p>
-    <w:bookmarkEnd w:id="131"/>
-    <w:bookmarkStart w:id="132" w:name="ref-lecun1998gradient"/>
+    <w:bookmarkEnd w:id="147"/>
+    <w:bookmarkStart w:id="148" w:name="ref-lecun1998gradient"/>
     <w:p>
       <w:pPr>
         <w:pStyle w:val="Bibliography"/>
@@ -21986,8 +24173,8 @@
         <w:t xml:space="preserve">86 (11). IEEE: 2278–2324.</w:t>
       </w:r>
     </w:p>
-    <w:bookmarkEnd w:id="132"/>
-    <w:bookmarkStart w:id="133" w:name="ref-leshno93"/>
+    <w:bookmarkEnd w:id="148"/>
+    <w:bookmarkStart w:id="149" w:name="ref-leshno93"/>
     <w:p>
       <w:pPr>
         <w:pStyle w:val="Bibliography"/>
@@ -22011,8 +24198,8 @@
         <w:t xml:space="preserve">6 (6). Elsevier: 861–67.</w:t>
       </w:r>
     </w:p>
-    <w:bookmarkEnd w:id="133"/>
-    <w:bookmarkStart w:id="134" w:name="ref-lyons2011understanding"/>
+    <w:bookmarkEnd w:id="149"/>
+    <w:bookmarkStart w:id="150" w:name="ref-lyons2011understanding"/>
     <w:p>
       <w:pPr>
         <w:pStyle w:val="Bibliography"/>
@@ -22033,8 +24220,8 @@
         <w:t xml:space="preserve">. Pearson Education India.</w:t>
       </w:r>
     </w:p>
-    <w:bookmarkEnd w:id="134"/>
-    <w:bookmarkStart w:id="135" w:name="ref-maas2013rectifier"/>
+    <w:bookmarkEnd w:id="150"/>
+    <w:bookmarkStart w:id="151" w:name="ref-maas2013rectifier"/>
     <w:p>
       <w:pPr>
         <w:pStyle w:val="Bibliography"/>
@@ -22055,8 +24242,8 @@
         <w:t xml:space="preserve">. Vol. 30. 1.</w:t>
       </w:r>
     </w:p>
-    <w:bookmarkEnd w:id="135"/>
-    <w:bookmarkStart w:id="136" w:name="ref-mcculloch1943logical"/>
+    <w:bookmarkEnd w:id="151"/>
+    <w:bookmarkStart w:id="152" w:name="ref-mcculloch1943logical"/>
     <w:p>
       <w:pPr>
         <w:pStyle w:val="Bibliography"/>
@@ -22080,8 +24267,8 @@
         <w:t xml:space="preserve">5 (4). Springer: 115–33.</w:t>
       </w:r>
     </w:p>
-    <w:bookmarkEnd w:id="136"/>
-    <w:bookmarkStart w:id="137" w:name="ref-minski1969perceptrons"/>
+    <w:bookmarkEnd w:id="152"/>
+    <w:bookmarkStart w:id="153" w:name="ref-minski1969perceptrons"/>
     <w:p>
       <w:pPr>
         <w:pStyle w:val="Bibliography"/>
@@ -22102,8 +24289,8 @@
         <w:t xml:space="preserve">.</w:t>
       </w:r>
     </w:p>
-    <w:bookmarkEnd w:id="137"/>
-    <w:bookmarkStart w:id="138" w:name="ref-mital2017time"/>
+    <w:bookmarkEnd w:id="153"/>
+    <w:bookmarkStart w:id="154" w:name="ref-mital2017time"/>
     <w:p>
       <w:pPr>
         <w:pStyle w:val="Bibliography"/>
@@ -22124,8 +24311,8 @@
         <w:t xml:space="preserve">.</w:t>
       </w:r>
     </w:p>
-    <w:bookmarkEnd w:id="138"/>
-    <w:bookmarkStart w:id="139" w:name="ref-mizutani2000derivation"/>
+    <w:bookmarkEnd w:id="154"/>
+    <w:bookmarkStart w:id="155" w:name="ref-mizutani2000derivation"/>
     <w:p>
       <w:pPr>
         <w:pStyle w:val="Bibliography"/>
@@ -22146,8 +24333,8 @@
         <w:t xml:space="preserve">, 2:167–72. IEEE.</w:t>
       </w:r>
     </w:p>
-    <w:bookmarkEnd w:id="139"/>
-    <w:bookmarkStart w:id="140" w:name="ref-oord2016pixel"/>
+    <w:bookmarkEnd w:id="155"/>
+    <w:bookmarkStart w:id="156" w:name="ref-oord2016pixel"/>
     <w:p>
       <w:pPr>
         <w:pStyle w:val="Bibliography"/>
@@ -22168,8 +24355,8 @@
         <w:t xml:space="preserve">.</w:t>
       </w:r>
     </w:p>
-    <w:bookmarkEnd w:id="140"/>
-    <w:bookmarkStart w:id="141" w:name="ref-van2016conditional"/>
+    <w:bookmarkEnd w:id="156"/>
+    <w:bookmarkStart w:id="157" w:name="ref-van2016conditional"/>
     <w:p>
       <w:pPr>
         <w:pStyle w:val="Bibliography"/>
@@ -22190,8 +24377,8 @@
         <w:t xml:space="preserve">, 4790–8.</w:t>
       </w:r>
     </w:p>
-    <w:bookmarkEnd w:id="141"/>
-    <w:bookmarkStart w:id="142" w:name="ref-pang2017convolution"/>
+    <w:bookmarkEnd w:id="157"/>
+    <w:bookmarkStart w:id="158" w:name="ref-pang2017convolution"/>
     <w:p>
       <w:pPr>
         <w:pStyle w:val="Bibliography"/>
@@ -22212,8 +24399,8 @@
         <w:t xml:space="preserve">. IEEE.</w:t>
       </w:r>
     </w:p>
-    <w:bookmarkEnd w:id="142"/>
-    <w:bookmarkStart w:id="143" w:name="ref-parker1985learning"/>
+    <w:bookmarkEnd w:id="158"/>
+    <w:bookmarkStart w:id="159" w:name="ref-parker1985learning"/>
     <w:p>
       <w:pPr>
         <w:pStyle w:val="Bibliography"/>
@@ -22222,8 +24409,8 @@
         <w:t xml:space="preserve">Parker, David B. 1985. “Learning Logic.”</w:t>
       </w:r>
     </w:p>
-    <w:bookmarkEnd w:id="143"/>
-    <w:bookmarkStart w:id="144" w:name="ref-pfalz2018generating"/>
+    <w:bookmarkEnd w:id="159"/>
+    <w:bookmarkStart w:id="160" w:name="ref-pfalz2018generating"/>
     <w:p>
       <w:pPr>
         <w:pStyle w:val="Bibliography"/>
@@ -22232,8 +24419,8 @@
         <w:t xml:space="preserve">Pfalz, Andrew. 2018. “Generating Audio Using Recurrent Neural Networks.”</w:t>
       </w:r>
     </w:p>
-    <w:bookmarkEnd w:id="144"/>
-    <w:bookmarkStart w:id="145" w:name="ref-rehman2014image"/>
+    <w:bookmarkEnd w:id="160"/>
+    <w:bookmarkStart w:id="161" w:name="ref-rehman2014image"/>
     <w:p>
       <w:pPr>
         <w:pStyle w:val="Bibliography"/>
@@ -22257,8 +24444,8 @@
         <w:t xml:space="preserve">7 (4). Maxwell Science Publishing: 656–72.</w:t>
       </w:r>
     </w:p>
-    <w:bookmarkEnd w:id="145"/>
-    <w:bookmarkStart w:id="146" w:name="ref-reiffenstein2006codification"/>
+    <w:bookmarkEnd w:id="161"/>
+    <w:bookmarkStart w:id="162" w:name="ref-reiffenstein2006codification"/>
     <w:p>
       <w:pPr>
         <w:pStyle w:val="Bibliography"/>
@@ -22282,8 +24469,8 @@
         <w:t xml:space="preserve">50 (3). Wiley Online Library: 298–318.</w:t>
       </w:r>
     </w:p>
-    <w:bookmarkEnd w:id="146"/>
-    <w:bookmarkStart w:id="147" w:name="ref-rigaud2013parametric"/>
+    <w:bookmarkEnd w:id="162"/>
+    <w:bookmarkStart w:id="163" w:name="ref-rigaud2013parametric"/>
     <w:p>
       <w:pPr>
         <w:pStyle w:val="Bibliography"/>
@@ -22307,8 +24494,8 @@
         <w:t xml:space="preserve">133 (5). ASA: 3107–18.</w:t>
       </w:r>
     </w:p>
-    <w:bookmarkEnd w:id="147"/>
-    <w:bookmarkStart w:id="148" w:name="ref-Rosenblatt57"/>
+    <w:bookmarkEnd w:id="163"/>
+    <w:bookmarkStart w:id="164" w:name="ref-Rosenblatt57"/>
     <w:p>
       <w:pPr>
         <w:pStyle w:val="Bibliography"/>
@@ -22329,8 +24516,8 @@
         <w:t xml:space="preserve">. Cornell Aeronautical Laboratory.</w:t>
       </w:r>
     </w:p>
-    <w:bookmarkEnd w:id="148"/>
-    <w:bookmarkStart w:id="149" w:name="ref-rosenblatt1958perceptron"/>
+    <w:bookmarkEnd w:id="164"/>
+    <w:bookmarkStart w:id="165" w:name="ref-rosenblatt1958perceptron"/>
     <w:p>
       <w:pPr>
         <w:pStyle w:val="Bibliography"/>
@@ -22354,8 +24541,8 @@
         <w:t xml:space="preserve">65 (6). American Psychological Association: 386.</w:t>
       </w:r>
     </w:p>
-    <w:bookmarkEnd w:id="149"/>
-    <w:bookmarkStart w:id="150" w:name="ref-rumelhart1985learning"/>
+    <w:bookmarkEnd w:id="165"/>
+    <w:bookmarkStart w:id="166" w:name="ref-rumelhart1985learning"/>
     <w:p>
       <w:pPr>
         <w:pStyle w:val="Bibliography"/>
@@ -22364,8 +24551,8 @@
         <w:t xml:space="preserve">Rumelhart, David E, Geoffrey E Hinton, and Ronald J Williams. 1985. “Learning Internal Representations by Error Propagation.” California Univ San Diego La Jolla Inst for Cognitive Science.</w:t>
       </w:r>
     </w:p>
-    <w:bookmarkEnd w:id="150"/>
-    <w:bookmarkStart w:id="151" w:name="ref-sainath2015deep"/>
+    <w:bookmarkEnd w:id="166"/>
+    <w:bookmarkStart w:id="167" w:name="ref-sainath2015deep"/>
     <w:p>
       <w:pPr>
         <w:pStyle w:val="Bibliography"/>
@@ -22389,8 +24576,8 @@
         <w:t xml:space="preserve">64. Elsevier: 39–48.</w:t>
       </w:r>
     </w:p>
-    <w:bookmarkEnd w:id="151"/>
-    <w:bookmarkStart w:id="152" w:name="ref-sak2015fast"/>
+    <w:bookmarkEnd w:id="167"/>
+    <w:bookmarkStart w:id="168" w:name="ref-sak2015fast"/>
     <w:p>
       <w:pPr>
         <w:pStyle w:val="Bibliography"/>
@@ -22411,8 +24598,8 @@
         <w:t xml:space="preserve">.</w:t>
       </w:r>
     </w:p>
-    <w:bookmarkEnd w:id="152"/>
-    <w:bookmarkStart w:id="153" w:name="ref-salsa2016partial"/>
+    <w:bookmarkEnd w:id="168"/>
+    <w:bookmarkStart w:id="169" w:name="ref-salsa2016partial"/>
     <w:p>
       <w:pPr>
         <w:pStyle w:val="Bibliography"/>
@@ -22433,8 +24620,8 @@
         <w:t xml:space="preserve">. Vol. 99. Springer.</w:t>
       </w:r>
     </w:p>
-    <w:bookmarkEnd w:id="153"/>
-    <w:bookmarkStart w:id="154" w:name="ref-sangkloy2016scribbler"/>
+    <w:bookmarkEnd w:id="169"/>
+    <w:bookmarkStart w:id="170" w:name="ref-sangkloy2016scribbler"/>
     <w:p>
       <w:pPr>
         <w:pStyle w:val="Bibliography"/>
@@ -22455,8 +24642,8 @@
         <w:t xml:space="preserve">.</w:t>
       </w:r>
     </w:p>
-    <w:bookmarkEnd w:id="154"/>
-    <w:bookmarkStart w:id="155" w:name="ref-santurkar2017generative"/>
+    <w:bookmarkEnd w:id="170"/>
+    <w:bookmarkStart w:id="171" w:name="ref-santurkar2017generative"/>
     <w:p>
       <w:pPr>
         <w:pStyle w:val="Bibliography"/>
@@ -22477,8 +24664,8 @@
         <w:t xml:space="preserve">.</w:t>
       </w:r>
     </w:p>
-    <w:bookmarkEnd w:id="155"/>
-    <w:bookmarkStart w:id="156" w:name="ref-sarroff2014musical"/>
+    <w:bookmarkEnd w:id="171"/>
+    <w:bookmarkStart w:id="172" w:name="ref-sarroff2014musical"/>
     <w:p>
       <w:pPr>
         <w:pStyle w:val="Bibliography"/>
@@ -22499,8 +24686,8 @@
         <w:t xml:space="preserve">.</w:t>
       </w:r>
     </w:p>
-    <w:bookmarkEnd w:id="156"/>
-    <w:bookmarkStart w:id="157" w:name="ref-serra2007state"/>
+    <w:bookmarkEnd w:id="172"/>
+    <w:bookmarkStart w:id="173" w:name="ref-serra2007state"/>
     <w:p>
       <w:pPr>
         <w:pStyle w:val="Bibliography"/>
@@ -22521,8 +24708,8 @@
         <w:t xml:space="preserve">, 9–12. IEEE.</w:t>
       </w:r>
     </w:p>
-    <w:bookmarkEnd w:id="157"/>
-    <w:bookmarkStart w:id="158" w:name="ref-sigtia2016end"/>
+    <w:bookmarkEnd w:id="173"/>
+    <w:bookmarkStart w:id="174" w:name="ref-sigtia2016end"/>
     <w:p>
       <w:pPr>
         <w:pStyle w:val="Bibliography"/>
@@ -22546,8 +24733,8 @@
         <w:t xml:space="preserve">24 (5). IEEE Press: 927–39.</w:t>
       </w:r>
     </w:p>
-    <w:bookmarkEnd w:id="158"/>
-    <w:bookmarkStart w:id="159" w:name="ref-smith2006basic"/>
+    <w:bookmarkEnd w:id="174"/>
+    <w:bookmarkStart w:id="175" w:name="ref-smith2006basic"/>
     <w:p>
       <w:pPr>
         <w:pStyle w:val="Bibliography"/>
@@ -22568,8 +24755,8 @@
         <w:t xml:space="preserve">.</w:t>
       </w:r>
     </w:p>
-    <w:bookmarkEnd w:id="159"/>
-    <w:bookmarkStart w:id="160" w:name="ref-smith1992physical"/>
+    <w:bookmarkEnd w:id="175"/>
+    <w:bookmarkStart w:id="176" w:name="ref-smith1992physical"/>
     <w:p>
       <w:pPr>
         <w:pStyle w:val="Bibliography"/>
@@ -22593,8 +24780,8 @@
         <w:t xml:space="preserve">16 (4). JSTOR: 74–91.</w:t>
       </w:r>
     </w:p>
-    <w:bookmarkEnd w:id="160"/>
-    <w:bookmarkStart w:id="161" w:name="ref-socher2014recursive"/>
+    <w:bookmarkEnd w:id="176"/>
+    <w:bookmarkStart w:id="177" w:name="ref-socher2014recursive"/>
     <w:p>
       <w:pPr>
         <w:pStyle w:val="Bibliography"/>
@@ -22603,8 +24790,8 @@
         <w:t xml:space="preserve">Socher, Richard. 2014. “Recursive Deep Learning for Natural Language Processing and Computer Vision.” Citeseer.</w:t>
       </w:r>
     </w:p>
-    <w:bookmarkEnd w:id="161"/>
-    <w:bookmarkStart w:id="162" w:name="ref-southall2016automatic"/>
+    <w:bookmarkEnd w:id="177"/>
+    <w:bookmarkStart w:id="178" w:name="ref-southall2016automatic"/>
     <w:p>
       <w:pPr>
         <w:pStyle w:val="Bibliography"/>
@@ -22625,8 +24812,8 @@
         <w:t xml:space="preserve">, 591–97.</w:t>
       </w:r>
     </w:p>
-    <w:bookmarkEnd w:id="162"/>
-    <w:bookmarkStart w:id="163" w:name="ref-stanley2007compositional"/>
+    <w:bookmarkEnd w:id="178"/>
+    <w:bookmarkStart w:id="179" w:name="ref-stanley2007compositional"/>
     <w:p>
       <w:pPr>
         <w:pStyle w:val="Bibliography"/>
@@ -22650,8 +24837,8 @@
         <w:t xml:space="preserve">8 (2). Springer: 131–62.</w:t>
       </w:r>
     </w:p>
-    <w:bookmarkEnd w:id="163"/>
-    <w:bookmarkStart w:id="164" w:name="ref-staudt2016development"/>
+    <w:bookmarkEnd w:id="179"/>
+    <w:bookmarkStart w:id="180" w:name="ref-staudt2016development"/>
     <w:p>
       <w:pPr>
         <w:pStyle w:val="Bibliography"/>
@@ -22660,8 +24847,8 @@
         <w:t xml:space="preserve">Staudt, Pascal. 2016. “Development of a Digital Musical Instrument with Embedded Sound Synthesis.”</w:t>
       </w:r>
     </w:p>
-    <w:bookmarkEnd w:id="164"/>
-    <w:bookmarkStart w:id="165" w:name="ref-theis2015generative"/>
+    <w:bookmarkEnd w:id="180"/>
+    <w:bookmarkStart w:id="181" w:name="ref-theis2015generative"/>
     <w:p>
       <w:pPr>
         <w:pStyle w:val="Bibliography"/>
@@ -22682,8 +24869,8 @@
         <w:t xml:space="preserve">, 1927–35.</w:t>
       </w:r>
     </w:p>
-    <w:bookmarkEnd w:id="165"/>
-    <w:bookmarkStart w:id="166" w:name="ref-theis2017lossy"/>
+    <w:bookmarkEnd w:id="181"/>
+    <w:bookmarkStart w:id="182" w:name="ref-theis2017lossy"/>
     <w:p>
       <w:pPr>
         <w:pStyle w:val="Bibliography"/>
@@ -22704,8 +24891,8 @@
         <w:t xml:space="preserve">.</w:t>
       </w:r>
     </w:p>
-    <w:bookmarkEnd w:id="166"/>
-    <w:bookmarkStart w:id="167" w:name="ref-toderici2015variable"/>
+    <w:bookmarkEnd w:id="182"/>
+    <w:bookmarkStart w:id="183" w:name="ref-toderici2015variable"/>
     <w:p>
       <w:pPr>
         <w:pStyle w:val="Bibliography"/>
@@ -22726,8 +24913,8 @@
         <w:t xml:space="preserve">.</w:t>
       </w:r>
     </w:p>
-    <w:bookmarkEnd w:id="167"/>
-    <w:bookmarkStart w:id="168" w:name="ref-toderici2016full"/>
+    <w:bookmarkEnd w:id="183"/>
+    <w:bookmarkStart w:id="184" w:name="ref-toderici2016full"/>
     <w:p>
       <w:pPr>
         <w:pStyle w:val="Bibliography"/>
@@ -22748,8 +24935,8 @@
         <w:t xml:space="preserve">.</w:t>
       </w:r>
     </w:p>
-    <w:bookmarkEnd w:id="168"/>
-    <w:bookmarkStart w:id="169" w:name="ref-tuohy2006evolved"/>
+    <w:bookmarkEnd w:id="184"/>
+    <w:bookmarkStart w:id="185" w:name="ref-tuohy2006evolved"/>
     <w:p>
       <w:pPr>
         <w:pStyle w:val="Bibliography"/>
@@ -22770,8 +24957,8 @@
         <w:t xml:space="preserve">.</w:t>
       </w:r>
     </w:p>
-    <w:bookmarkEnd w:id="169"/>
-    <w:bookmarkStart w:id="170" w:name="ref-van2016wavenet"/>
+    <w:bookmarkEnd w:id="185"/>
+    <w:bookmarkStart w:id="186" w:name="ref-van2016wavenet"/>
     <w:p>
       <w:pPr>
         <w:pStyle w:val="Bibliography"/>
@@ -22792,8 +24979,8 @@
         <w:t xml:space="preserve">.</w:t>
       </w:r>
     </w:p>
-    <w:bookmarkEnd w:id="170"/>
-    <w:bookmarkStart w:id="171" w:name="ref-vaughn2000music"/>
+    <w:bookmarkEnd w:id="186"/>
+    <w:bookmarkStart w:id="187" w:name="ref-vaughn2000music"/>
     <w:p>
       <w:pPr>
         <w:pStyle w:val="Bibliography"/>
@@ -22817,8 +25004,8 @@
         <w:t xml:space="preserve">34 (3/4). JSTOR: 149–66.</w:t>
       </w:r>
     </w:p>
-    <w:bookmarkEnd w:id="171"/>
-    <w:bookmarkStart w:id="172" w:name="ref-veit2016residual"/>
+    <w:bookmarkEnd w:id="187"/>
+    <w:bookmarkStart w:id="188" w:name="ref-veit2016residual"/>
     <w:p>
       <w:pPr>
         <w:pStyle w:val="Bibliography"/>
@@ -22839,8 +25026,8 @@
         <w:t xml:space="preserve">, 550–58.</w:t>
       </w:r>
     </w:p>
-    <w:bookmarkEnd w:id="172"/>
-    <w:bookmarkStart w:id="173" w:name="ref-wang2015image"/>
+    <w:bookmarkEnd w:id="188"/>
+    <w:bookmarkStart w:id="189" w:name="ref-wang2015image"/>
     <w:p>
       <w:pPr>
         <w:pStyle w:val="Bibliography"/>
@@ -22864,8 +25051,8 @@
         <w:t xml:space="preserve">13 (1): 137–45.</w:t>
       </w:r>
     </w:p>
-    <w:bookmarkEnd w:id="173"/>
-    <w:bookmarkStart w:id="174" w:name="ref-widrow1960adaptive"/>
+    <w:bookmarkEnd w:id="189"/>
+    <w:bookmarkStart w:id="190" w:name="ref-widrow1960adaptive"/>
     <w:p>
       <w:pPr>
         <w:pStyle w:val="Bibliography"/>
@@ -22874,8 +25061,8 @@
         <w:t xml:space="preserve">Widrow, Bernard, and Marcian E Hoff. 1960. “Adaptive Switching Circuits.” STANFORD UNIV CA STANFORD ELECTRONICS LABS.</w:t>
       </w:r>
     </w:p>
-    <w:bookmarkEnd w:id="174"/>
-    <w:bookmarkStart w:id="175" w:name="ref-widrow199030"/>
+    <w:bookmarkEnd w:id="190"/>
+    <w:bookmarkStart w:id="191" w:name="ref-widrow199030"/>
     <w:p>
       <w:pPr>
         <w:pStyle w:val="Bibliography"/>
@@ -22899,8 +25086,8 @@
         <w:t xml:space="preserve">78 (9). IEEE: 1415–42.</w:t>
       </w:r>
     </w:p>
-    <w:bookmarkEnd w:id="175"/>
-    <w:bookmarkStart w:id="176" w:name="ref-wu2016investigating"/>
+    <w:bookmarkEnd w:id="191"/>
+    <w:bookmarkStart w:id="192" w:name="ref-wu2016investigating"/>
     <w:p>
       <w:pPr>
         <w:pStyle w:val="Bibliography"/>
@@ -22921,8 +25108,8 @@
         <w:t xml:space="preserve">, 5140–4. IEEE.</w:t>
       </w:r>
     </w:p>
-    <w:bookmarkEnd w:id="176"/>
-    <w:bookmarkStart w:id="177" w:name="ref-xu2015ccg"/>
+    <w:bookmarkEnd w:id="192"/>
+    <w:bookmarkStart w:id="193" w:name="ref-xu2015ccg"/>
     <w:p>
       <w:pPr>
         <w:pStyle w:val="Bibliography"/>
@@ -22943,8 +25130,8 @@
         <w:t xml:space="preserve">, 250–55.</w:t>
       </w:r>
     </w:p>
-    <w:bookmarkEnd w:id="177"/>
-    <w:bookmarkStart w:id="178" w:name="ref-yadav2015introduction"/>
+    <w:bookmarkEnd w:id="193"/>
+    <w:bookmarkStart w:id="194" w:name="ref-yadav2015introduction"/>
     <w:p>
       <w:pPr>
         <w:pStyle w:val="Bibliography"/>
@@ -22965,8 +25152,8 @@
         <w:t xml:space="preserve">. Springer.</w:t>
       </w:r>
     </w:p>
-    <w:bookmarkEnd w:id="178"/>
-    <w:bookmarkStart w:id="180" w:name="ref-Yang2017"/>
+    <w:bookmarkEnd w:id="194"/>
+    <w:bookmarkStart w:id="196" w:name="ref-Yang2017"/>
     <w:p>
       <w:pPr>
         <w:pStyle w:val="Bibliography"/>
@@ -22977,7 +25164,7 @@
       <w:r>
         <w:t xml:space="preserve"> </w:t>
       </w:r>
-      <w:hyperlink r:id="rId179">
+      <w:hyperlink r:id="rId195">
         <w:r>
           <w:rPr>
             <w:rStyle w:val="Hyperlink"/>
@@ -22989,8 +25176,8 @@
         <w:t xml:space="preserve">.</w:t>
       </w:r>
     </w:p>
-    <w:bookmarkEnd w:id="180"/>
-    <w:bookmarkStart w:id="181" w:name="ref-zen2015unidirectional"/>
+    <w:bookmarkEnd w:id="196"/>
+    <w:bookmarkStart w:id="197" w:name="ref-zen2015unidirectional"/>
     <w:p>
       <w:pPr>
         <w:pStyle w:val="Bibliography"/>
@@ -23011,8 +25198,8 @@
         <w:t xml:space="preserve">, 4470–4. IEEE.</w:t>
       </w:r>
     </w:p>
-    <w:bookmarkEnd w:id="181"/>
-    <w:bookmarkStart w:id="182" w:name="ref-zhang2016colorful"/>
+    <w:bookmarkEnd w:id="197"/>
+    <w:bookmarkStart w:id="198" w:name="ref-zhang2016colorful"/>
     <w:p>
       <w:pPr>
         <w:pStyle w:val="Bibliography"/>
@@ -23033,8 +25220,8 @@
         <w:t xml:space="preserve">, 649–66. Springer.</w:t>
       </w:r>
     </w:p>
-    <w:bookmarkEnd w:id="182"/>
-    <w:bookmarkStart w:id="183" w:name="ref-zhang2017towards"/>
+    <w:bookmarkEnd w:id="198"/>
+    <w:bookmarkStart w:id="199" w:name="ref-zhang2017towards"/>
     <w:p>
       <w:pPr>
         <w:pStyle w:val="Bibliography"/>
@@ -23055,8 +25242,8 @@
         <w:t xml:space="preserve">.</w:t>
       </w:r>
     </w:p>
-    <w:bookmarkEnd w:id="183"/>
-    <w:bookmarkStart w:id="184" w:name="ref-zhang2017very"/>
+    <w:bookmarkEnd w:id="199"/>
+    <w:bookmarkStart w:id="200" w:name="ref-zhang2017very"/>
     <w:p>
       <w:pPr>
         <w:pStyle w:val="Bibliography"/>
@@ -23077,8 +25264,8 @@
         <w:t xml:space="preserve">, 4845–9. IEEE.</w:t>
       </w:r>
     </w:p>
-    <w:bookmarkEnd w:id="184"/>
-    <w:bookmarkStart w:id="185" w:name="ref-zhu2016generative"/>
+    <w:bookmarkEnd w:id="200"/>
+    <w:bookmarkStart w:id="201" w:name="ref-zhu2016generative"/>
     <w:p>
       <w:pPr>
         <w:pStyle w:val="Bibliography"/>
@@ -23099,8 +25286,8 @@
         <w:t xml:space="preserve">, 597–613. Springer.</w:t>
       </w:r>
     </w:p>
-    <w:bookmarkEnd w:id="185"/>
-    <w:bookmarkStart w:id="186" w:name="ref-zweig2017advances"/>
+    <w:bookmarkEnd w:id="201"/>
+    <w:bookmarkStart w:id="202" w:name="ref-zweig2017advances"/>
     <w:p>
       <w:pPr>
         <w:pStyle w:val="Bibliography"/>
@@ -23121,8 +25308,8 @@
         <w:t xml:space="preserve">, 4805–9. IEEE.</w:t>
       </w:r>
     </w:p>
-    <w:bookmarkEnd w:id="186"/>
-    <w:bookmarkEnd w:id="187"/>
+    <w:bookmarkEnd w:id="202"/>
+    <w:bookmarkEnd w:id="203"/>
     <w:sectPr>
       <w:pgSz w:w="12240" w:h="15840"/>
       <w:pgMar w:top="1440" w:right="1440" w:bottom="1440" w:left="1440" w:header="720" w:footer="720" w:gutter="0"/>

</xml_diff>

<commit_message>
versão com conteúdo completo.
</commit_message>
<xml_diff>
--- a/Dissert.docx
+++ b/Dissert.docx
@@ -23236,6 +23236,14 @@
     </w:p>
     <w:p>
       <w:pPr>
+        <w:pStyle w:val="BodyText"/>
+      </w:pPr>
+      <w:r>
+        <w:t xml:space="preserve">Podemos, assim, definir uma nova metodologia voltada à modelagem sonora de instrumentos harmonicos, batizada de Neuro-spectral Synthesis, resumida de maneira esquemática na figura a seguir.</w:t>
+      </w:r>
+    </w:p>
+    <w:p>
+      <w:pPr>
         <w:pStyle w:val="Heading1"/>
       </w:pPr>
       <w:bookmarkStart w:id="105" w:name="resultados"/>
@@ -23246,6 +23254,1622 @@
     </w:p>
     <w:p>
       <w:pPr>
+        <w:pStyle w:val="FirstParagraph"/>
+      </w:pPr>
+      <w:r>
+        <w:t xml:space="preserve">O modelo final apresenta resultados mais realistas do que as implementações baseadas no modelo de Digital Waveguides e no método das diferenças finitas, e é ao menos uma ordem de grandeza mais eficiente, nas implementações aqui apresentadas. Para efeito de comparação, levando em conta a geração de 5 ondas de 1 segundo, a 44100 FPS, o método proposto foi, em média, 17 vezes mais rápido que o método bateado em Digital Waveguides e 26 vezes mais rápido do que o método das diferenças finitas.</w:t>
+      </w:r>
+      <w:r>
+        <w:t xml:space="preserve"> </w:t>
+      </w:r>
+      <w:r>
+        <w:t xml:space="preserve">A tabela abaixo apresenta os resultados.</w:t>
+      </w:r>
+    </w:p>
+    <w:p>
+      <w:pPr>
+        <w:pStyle w:val="TableCaption"/>
+      </w:pPr>
+      <w:r>
+        <w:t xml:space="preserve">Comparação Tempo de Geração(s)</w:t>
+      </w:r>
+    </w:p>
+    <w:tbl>
+      <w:tblPr>
+        <w:tblStyle w:val="Table"/>
+        <w:tblW w:type="pct" w:w="0.0"/>
+        <w:tblLook w:firstRow="1"/>
+        <w:tblCaption w:val="Comparação Tempo de Geração(s)"/>
+      </w:tblPr>
+      <w:tblGrid/>
+      <w:tr>
+        <w:trPr>
+          <w:cnfStyle w:firstRow="1"/>
+        </w:trPr>
+        <w:tc>
+          <w:tcPr>
+            <w:tcBorders>
+              <w:bottom w:val="single"/>
+            </w:tcBorders>
+            <w:vAlign w:val="bottom"/>
+          </w:tcPr>
+          <w:p>
+            <w:pPr>
+              <w:pStyle w:val="Compact"/>
+            </w:pPr>
+          </w:p>
+        </w:tc>
+        <w:tc>
+          <w:tcPr>
+            <w:tcBorders>
+              <w:bottom w:val="single"/>
+            </w:tcBorders>
+            <w:vAlign w:val="bottom"/>
+          </w:tcPr>
+          <w:p>
+            <w:pPr>
+              <w:pStyle w:val="Compact"/>
+              <w:jc w:val="center"/>
+            </w:pPr>
+            <w:r>
+              <w:t xml:space="preserve">Finite Differences</w:t>
+            </w:r>
+          </w:p>
+        </w:tc>
+        <w:tc>
+          <w:tcPr>
+            <w:tcBorders>
+              <w:bottom w:val="single"/>
+            </w:tcBorders>
+            <w:vAlign w:val="bottom"/>
+          </w:tcPr>
+          <w:p>
+            <w:pPr>
+              <w:pStyle w:val="Compact"/>
+              <w:jc w:val="center"/>
+            </w:pPr>
+            <w:r>
+              <w:t xml:space="preserve">Digital Waveguides</w:t>
+            </w:r>
+          </w:p>
+        </w:tc>
+        <w:tc>
+          <w:tcPr>
+            <w:tcBorders>
+              <w:bottom w:val="single"/>
+            </w:tcBorders>
+            <w:vAlign w:val="bottom"/>
+          </w:tcPr>
+          <w:p>
+            <w:pPr>
+              <w:pStyle w:val="Compact"/>
+              <w:jc w:val="center"/>
+            </w:pPr>
+            <w:r>
+              <w:t xml:space="preserve">Neuro-Spectral Synthesis</w:t>
+            </w:r>
+          </w:p>
+        </w:tc>
+      </w:tr>
+      <w:tr>
+        <w:tc>
+          <w:p>
+            <w:pPr>
+              <w:pStyle w:val="Compact"/>
+              <w:jc w:val="left"/>
+            </w:pPr>
+            <w:r>
+              <w:t xml:space="preserve">1</w:t>
+            </w:r>
+          </w:p>
+        </w:tc>
+        <w:tc>
+          <w:p>
+            <w:pPr>
+              <w:pStyle w:val="Compact"/>
+              <w:jc w:val="center"/>
+            </w:pPr>
+            <w:r>
+              <w:t xml:space="preserve">16.95213819</w:t>
+            </w:r>
+          </w:p>
+        </w:tc>
+        <w:tc>
+          <w:p>
+            <w:pPr>
+              <w:pStyle w:val="Compact"/>
+              <w:jc w:val="center"/>
+            </w:pPr>
+            <w:r>
+              <w:t xml:space="preserve">13.81114888</w:t>
+            </w:r>
+          </w:p>
+        </w:tc>
+        <w:tc>
+          <w:p>
+            <w:pPr>
+              <w:pStyle w:val="Compact"/>
+              <w:jc w:val="center"/>
+            </w:pPr>
+            <w:r>
+              <w:t xml:space="preserve">0.5896253586</w:t>
+            </w:r>
+          </w:p>
+        </w:tc>
+      </w:tr>
+      <w:tr>
+        <w:tc>
+          <w:p>
+            <w:pPr>
+              <w:pStyle w:val="Compact"/>
+              <w:jc w:val="left"/>
+            </w:pPr>
+            <w:r>
+              <w:t xml:space="preserve">2</w:t>
+            </w:r>
+          </w:p>
+        </w:tc>
+        <w:tc>
+          <w:p>
+            <w:pPr>
+              <w:pStyle w:val="Compact"/>
+              <w:jc w:val="center"/>
+            </w:pPr>
+            <w:r>
+              <w:t xml:space="preserve">19.62042928</w:t>
+            </w:r>
+          </w:p>
+        </w:tc>
+        <w:tc>
+          <w:p>
+            <w:pPr>
+              <w:pStyle w:val="Compact"/>
+              <w:jc w:val="center"/>
+            </w:pPr>
+            <w:r>
+              <w:t xml:space="preserve">13.02065825</w:t>
+            </w:r>
+          </w:p>
+        </w:tc>
+        <w:tc>
+          <w:p>
+            <w:pPr>
+              <w:pStyle w:val="Compact"/>
+              <w:jc w:val="center"/>
+            </w:pPr>
+            <w:r>
+              <w:t xml:space="preserve">0.8354649544</w:t>
+            </w:r>
+          </w:p>
+        </w:tc>
+      </w:tr>
+      <w:tr>
+        <w:tc>
+          <w:p>
+            <w:pPr>
+              <w:pStyle w:val="Compact"/>
+              <w:jc w:val="left"/>
+            </w:pPr>
+            <w:r>
+              <w:t xml:space="preserve">3</w:t>
+            </w:r>
+          </w:p>
+        </w:tc>
+        <w:tc>
+          <w:p>
+            <w:pPr>
+              <w:pStyle w:val="Compact"/>
+              <w:jc w:val="center"/>
+            </w:pPr>
+            <w:r>
+              <w:t xml:space="preserve">24.25646234</w:t>
+            </w:r>
+          </w:p>
+        </w:tc>
+        <w:tc>
+          <w:p>
+            <w:pPr>
+              <w:pStyle w:val="Compact"/>
+              <w:jc w:val="center"/>
+            </w:pPr>
+            <w:r>
+              <w:t xml:space="preserve">11.33273816</w:t>
+            </w:r>
+          </w:p>
+        </w:tc>
+        <w:tc>
+          <w:p>
+            <w:pPr>
+              <w:pStyle w:val="Compact"/>
+              <w:jc w:val="center"/>
+            </w:pPr>
+            <w:r>
+              <w:t xml:space="preserve">0.7555158138</w:t>
+            </w:r>
+          </w:p>
+        </w:tc>
+      </w:tr>
+      <w:tr>
+        <w:tc>
+          <w:p>
+            <w:pPr>
+              <w:pStyle w:val="Compact"/>
+              <w:jc w:val="left"/>
+            </w:pPr>
+            <w:r>
+              <w:t xml:space="preserve">4</w:t>
+            </w:r>
+          </w:p>
+        </w:tc>
+        <w:tc>
+          <w:p>
+            <w:pPr>
+              <w:pStyle w:val="Compact"/>
+              <w:jc w:val="center"/>
+            </w:pPr>
+            <w:r>
+              <w:t xml:space="preserve">17.89053726</w:t>
+            </w:r>
+          </w:p>
+        </w:tc>
+        <w:tc>
+          <w:p>
+            <w:pPr>
+              <w:pStyle w:val="Compact"/>
+              <w:jc w:val="center"/>
+            </w:pPr>
+            <w:r>
+              <w:t xml:space="preserve">12.3500874</w:t>
+            </w:r>
+          </w:p>
+        </w:tc>
+        <w:tc>
+          <w:p>
+            <w:pPr>
+              <w:pStyle w:val="Compact"/>
+              <w:jc w:val="center"/>
+            </w:pPr>
+            <w:r>
+              <w:t xml:space="preserve">0.7475204468</w:t>
+            </w:r>
+          </w:p>
+        </w:tc>
+      </w:tr>
+      <w:tr>
+        <w:tc>
+          <w:p>
+            <w:pPr>
+              <w:pStyle w:val="Compact"/>
+              <w:jc w:val="left"/>
+            </w:pPr>
+            <w:r>
+              <w:t xml:space="preserve">5</w:t>
+            </w:r>
+          </w:p>
+        </w:tc>
+        <w:tc>
+          <w:p>
+            <w:pPr>
+              <w:pStyle w:val="Compact"/>
+              <w:jc w:val="center"/>
+            </w:pPr>
+            <w:r>
+              <w:t xml:space="preserve">18.00246739</w:t>
+            </w:r>
+          </w:p>
+        </w:tc>
+        <w:tc>
+          <w:p>
+            <w:pPr>
+              <w:pStyle w:val="Compact"/>
+              <w:jc w:val="center"/>
+            </w:pPr>
+            <w:r>
+              <w:t xml:space="preserve">12.12223339</w:t>
+            </w:r>
+          </w:p>
+        </w:tc>
+        <w:tc>
+          <w:p>
+            <w:pPr>
+              <w:pStyle w:val="Compact"/>
+              <w:jc w:val="center"/>
+            </w:pPr>
+            <w:r>
+              <w:t xml:space="preserve">0.7735056877</w:t>
+            </w:r>
+          </w:p>
+        </w:tc>
+      </w:tr>
+      <w:tr>
+        <w:tc>
+          <w:p>
+            <w:pPr>
+              <w:pStyle w:val="Compact"/>
+              <w:jc w:val="left"/>
+            </w:pPr>
+            <w:r>
+              <w:rPr>
+                <w:b/>
+              </w:rPr>
+              <w:t xml:space="preserve">Média</w:t>
+            </w:r>
+          </w:p>
+        </w:tc>
+        <w:tc>
+          <w:p>
+            <w:pPr>
+              <w:pStyle w:val="Compact"/>
+              <w:jc w:val="center"/>
+            </w:pPr>
+            <w:r>
+              <w:rPr>
+                <w:b/>
+              </w:rPr>
+              <w:t xml:space="preserve">19.34440689</w:t>
+            </w:r>
+          </w:p>
+        </w:tc>
+        <w:tc>
+          <w:p>
+            <w:pPr>
+              <w:pStyle w:val="Compact"/>
+              <w:jc w:val="center"/>
+            </w:pPr>
+            <w:r>
+              <w:rPr>
+                <w:b/>
+              </w:rPr>
+              <w:t xml:space="preserve">12.52737322</w:t>
+            </w:r>
+          </w:p>
+        </w:tc>
+        <w:tc>
+          <w:p>
+            <w:pPr>
+              <w:pStyle w:val="Compact"/>
+              <w:jc w:val="center"/>
+            </w:pPr>
+            <w:r>
+              <w:rPr>
+                <w:b/>
+              </w:rPr>
+              <w:t xml:space="preserve">0.7403264523</w:t>
+            </w:r>
+          </w:p>
+        </w:tc>
+      </w:tr>
+      <w:tr>
+        <w:tc>
+          <w:p>
+            <w:pPr>
+              <w:pStyle w:val="Compact"/>
+              <w:jc w:val="left"/>
+            </w:pPr>
+            <w:r>
+              <w:rPr>
+                <w:b/>
+              </w:rPr>
+              <w:t xml:space="preserve">Desvio Padrão</w:t>
+            </w:r>
+          </w:p>
+        </w:tc>
+        <w:tc>
+          <w:p>
+            <w:pPr>
+              <w:pStyle w:val="Compact"/>
+              <w:jc w:val="center"/>
+            </w:pPr>
+            <w:r>
+              <w:rPr>
+                <w:b/>
+              </w:rPr>
+              <w:t xml:space="preserve">2.908692366</w:t>
+            </w:r>
+          </w:p>
+        </w:tc>
+        <w:tc>
+          <w:p>
+            <w:pPr>
+              <w:pStyle w:val="Compact"/>
+              <w:jc w:val="center"/>
+            </w:pPr>
+            <w:r>
+              <w:rPr>
+                <w:b/>
+              </w:rPr>
+              <w:t xml:space="preserve">0.937300851</w:t>
+            </w:r>
+          </w:p>
+        </w:tc>
+        <w:tc>
+          <w:p>
+            <w:pPr>
+              <w:pStyle w:val="Compact"/>
+              <w:jc w:val="center"/>
+            </w:pPr>
+            <w:r>
+              <w:rPr>
+                <w:b/>
+              </w:rPr>
+              <w:t xml:space="preserve">0.09102950916</w:t>
+            </w:r>
+          </w:p>
+        </w:tc>
+      </w:tr>
+    </w:tbl>
+    <w:p>
+      <w:pPr>
+        <w:pStyle w:val="BodyText"/>
+      </w:pPr>
+      <w:r>
+        <w:t xml:space="preserve">Treinadas as redes, uma implementação final do modelo é bastante simples, e é apresentada abaixo.</w:t>
+      </w:r>
+    </w:p>
+    <w:p>
+      <w:pPr>
+        <w:pStyle w:val="SourceCode"/>
+      </w:pPr>
+      <w:r>
+        <w:rPr>
+          <w:rStyle w:val="NormalTok"/>
+        </w:rPr>
+        <w:t xml:space="preserve">key </w:t>
+      </w:r>
+      <w:r>
+        <w:rPr>
+          <w:rStyle w:val="OperatorTok"/>
+        </w:rPr>
+        <w:t xml:space="preserve">=</w:t>
+      </w:r>
+      <w:r>
+        <w:rPr>
+          <w:rStyle w:val="NormalTok"/>
+        </w:rPr>
+        <w:t xml:space="preserve"> </w:t>
+      </w:r>
+      <w:r>
+        <w:rPr>
+          <w:rStyle w:val="DecValTok"/>
+        </w:rPr>
+        <w:t xml:space="preserve">66</w:t>
+      </w:r>
+      <w:r>
+        <w:br w:type="textWrapping"/>
+      </w:r>
+      <w:r>
+        <w:rPr>
+          <w:rStyle w:val="NormalTok"/>
+        </w:rPr>
+        <w:t xml:space="preserve">partials </w:t>
+      </w:r>
+      <w:r>
+        <w:rPr>
+          <w:rStyle w:val="OperatorTok"/>
+        </w:rPr>
+        <w:t xml:space="preserve">=</w:t>
+      </w:r>
+      <w:r>
+        <w:rPr>
+          <w:rStyle w:val="NormalTok"/>
+        </w:rPr>
+        <w:t xml:space="preserve"> </w:t>
+      </w:r>
+      <w:r>
+        <w:rPr>
+          <w:rStyle w:val="DecValTok"/>
+        </w:rPr>
+        <w:t xml:space="preserve">100</w:t>
+      </w:r>
+      <w:r>
+        <w:br w:type="textWrapping"/>
+      </w:r>
+      <w:r>
+        <w:rPr>
+          <w:rStyle w:val="NormalTok"/>
+        </w:rPr>
+        <w:t xml:space="preserve">n </w:t>
+      </w:r>
+      <w:r>
+        <w:rPr>
+          <w:rStyle w:val="OperatorTok"/>
+        </w:rPr>
+        <w:t xml:space="preserve">=</w:t>
+      </w:r>
+      <w:r>
+        <w:rPr>
+          <w:rStyle w:val="NormalTok"/>
+        </w:rPr>
+        <w:t xml:space="preserve"> </w:t>
+      </w:r>
+      <w:r>
+        <w:rPr>
+          <w:rStyle w:val="DecValTok"/>
+        </w:rPr>
+        <w:t xml:space="preserve">44100</w:t>
+      </w:r>
+      <w:r>
+        <w:br w:type="textWrapping"/>
+      </w:r>
+      <w:r>
+        <w:rPr>
+          <w:rStyle w:val="NormalTok"/>
+        </w:rPr>
+        <w:t xml:space="preserve">fps </w:t>
+      </w:r>
+      <w:r>
+        <w:rPr>
+          <w:rStyle w:val="OperatorTok"/>
+        </w:rPr>
+        <w:t xml:space="preserve">=</w:t>
+      </w:r>
+      <w:r>
+        <w:rPr>
+          <w:rStyle w:val="NormalTok"/>
+        </w:rPr>
+        <w:t xml:space="preserve"> </w:t>
+      </w:r>
+      <w:r>
+        <w:rPr>
+          <w:rStyle w:val="DecValTok"/>
+        </w:rPr>
+        <w:t xml:space="preserve">44100</w:t>
+      </w:r>
+      <w:r>
+        <w:br w:type="textWrapping"/>
+      </w:r>
+      <w:r>
+        <w:br w:type="textWrapping"/>
+      </w:r>
+      <w:r>
+        <w:rPr>
+          <w:rStyle w:val="NormalTok"/>
+        </w:rPr>
+        <w:t xml:space="preserve">P </w:t>
+      </w:r>
+      <w:r>
+        <w:rPr>
+          <w:rStyle w:val="OperatorTok"/>
+        </w:rPr>
+        <w:t xml:space="preserve">=</w:t>
+      </w:r>
+      <w:r>
+        <w:rPr>
+          <w:rStyle w:val="NormalTok"/>
+        </w:rPr>
+        <w:t xml:space="preserve"> np.arange(</w:t>
+      </w:r>
+      <w:r>
+        <w:rPr>
+          <w:rStyle w:val="DecValTok"/>
+        </w:rPr>
+        <w:t xml:space="preserve">1</w:t>
+      </w:r>
+      <w:r>
+        <w:rPr>
+          <w:rStyle w:val="NormalTok"/>
+        </w:rPr>
+        <w:t xml:space="preserve">, partials </w:t>
+      </w:r>
+      <w:r>
+        <w:rPr>
+          <w:rStyle w:val="OperatorTok"/>
+        </w:rPr>
+        <w:t xml:space="preserve">+</w:t>
+      </w:r>
+      <w:r>
+        <w:rPr>
+          <w:rStyle w:val="NormalTok"/>
+        </w:rPr>
+        <w:t xml:space="preserve"> </w:t>
+      </w:r>
+      <w:r>
+        <w:rPr>
+          <w:rStyle w:val="DecValTok"/>
+        </w:rPr>
+        <w:t xml:space="preserve">1</w:t>
+      </w:r>
+      <w:r>
+        <w:rPr>
+          <w:rStyle w:val="NormalTok"/>
+        </w:rPr>
+        <w:t xml:space="preserve">, </w:t>
+      </w:r>
+      <w:r>
+        <w:rPr>
+          <w:rStyle w:val="DecValTok"/>
+        </w:rPr>
+        <w:t xml:space="preserve">1</w:t>
+      </w:r>
+      <w:r>
+        <w:rPr>
+          <w:rStyle w:val="NormalTok"/>
+        </w:rPr>
+        <w:t xml:space="preserve">)</w:t>
+      </w:r>
+      <w:r>
+        <w:br w:type="textWrapping"/>
+      </w:r>
+      <w:r>
+        <w:br w:type="textWrapping"/>
+      </w:r>
+      <w:r>
+        <w:rPr>
+          <w:rStyle w:val="NormalTok"/>
+        </w:rPr>
+        <w:t xml:space="preserve">[ma, Ma] </w:t>
+      </w:r>
+      <w:r>
+        <w:rPr>
+          <w:rStyle w:val="OperatorTok"/>
+        </w:rPr>
+        <w:t xml:space="preserve">=</w:t>
+      </w:r>
+      <w:r>
+        <w:rPr>
+          <w:rStyle w:val="NormalTok"/>
+        </w:rPr>
+        <w:t xml:space="preserve"> np.genfromtxt(</w:t>
+      </w:r>
+      <w:r>
+        <w:rPr>
+          <w:rStyle w:val="StringTok"/>
+        </w:rPr>
+        <w:t xml:space="preserve">'a_m_M.csv'</w:t>
+      </w:r>
+      <w:r>
+        <w:rPr>
+          <w:rStyle w:val="NormalTok"/>
+        </w:rPr>
+        <w:t xml:space="preserve">, delimiter</w:t>
+      </w:r>
+      <w:r>
+        <w:rPr>
+          <w:rStyle w:val="OperatorTok"/>
+        </w:rPr>
+        <w:t xml:space="preserve">=</w:t>
+      </w:r>
+      <w:r>
+        <w:rPr>
+          <w:rStyle w:val="StringTok"/>
+        </w:rPr>
+        <w:t xml:space="preserve">','</w:t>
+      </w:r>
+      <w:r>
+        <w:rPr>
+          <w:rStyle w:val="NormalTok"/>
+        </w:rPr>
+        <w:t xml:space="preserve">)</w:t>
+      </w:r>
+      <w:r>
+        <w:br w:type="textWrapping"/>
+      </w:r>
+      <w:r>
+        <w:rPr>
+          <w:rStyle w:val="NormalTok"/>
+        </w:rPr>
+        <w:t xml:space="preserve">[md, Md] </w:t>
+      </w:r>
+      <w:r>
+        <w:rPr>
+          <w:rStyle w:val="OperatorTok"/>
+        </w:rPr>
+        <w:t xml:space="preserve">=</w:t>
+      </w:r>
+      <w:r>
+        <w:rPr>
+          <w:rStyle w:val="NormalTok"/>
+        </w:rPr>
+        <w:t xml:space="preserve"> np.genfromtxt(</w:t>
+      </w:r>
+      <w:r>
+        <w:rPr>
+          <w:rStyle w:val="StringTok"/>
+        </w:rPr>
+        <w:t xml:space="preserve">'d_m_M.csv'</w:t>
+      </w:r>
+      <w:r>
+        <w:rPr>
+          <w:rStyle w:val="NormalTok"/>
+        </w:rPr>
+        <w:t xml:space="preserve">, delimiter</w:t>
+      </w:r>
+      <w:r>
+        <w:rPr>
+          <w:rStyle w:val="OperatorTok"/>
+        </w:rPr>
+        <w:t xml:space="preserve">=</w:t>
+      </w:r>
+      <w:r>
+        <w:rPr>
+          <w:rStyle w:val="StringTok"/>
+        </w:rPr>
+        <w:t xml:space="preserve">','</w:t>
+      </w:r>
+      <w:r>
+        <w:rPr>
+          <w:rStyle w:val="NormalTok"/>
+        </w:rPr>
+        <w:t xml:space="preserve">)</w:t>
+      </w:r>
+      <w:r>
+        <w:br w:type="textWrapping"/>
+      </w:r>
+      <w:r>
+        <w:rPr>
+          <w:rStyle w:val="NormalTok"/>
+        </w:rPr>
+        <w:t xml:space="preserve">[mf, Mf] </w:t>
+      </w:r>
+      <w:r>
+        <w:rPr>
+          <w:rStyle w:val="OperatorTok"/>
+        </w:rPr>
+        <w:t xml:space="preserve">=</w:t>
+      </w:r>
+      <w:r>
+        <w:rPr>
+          <w:rStyle w:val="NormalTok"/>
+        </w:rPr>
+        <w:t xml:space="preserve"> np.genfromtxt(</w:t>
+      </w:r>
+      <w:r>
+        <w:rPr>
+          <w:rStyle w:val="StringTok"/>
+        </w:rPr>
+        <w:t xml:space="preserve">'f_m_M.csv'</w:t>
+      </w:r>
+      <w:r>
+        <w:rPr>
+          <w:rStyle w:val="NormalTok"/>
+        </w:rPr>
+        <w:t xml:space="preserve">, delimiter</w:t>
+      </w:r>
+      <w:r>
+        <w:rPr>
+          <w:rStyle w:val="OperatorTok"/>
+        </w:rPr>
+        <w:t xml:space="preserve">=</w:t>
+      </w:r>
+      <w:r>
+        <w:rPr>
+          <w:rStyle w:val="StringTok"/>
+        </w:rPr>
+        <w:t xml:space="preserve">','</w:t>
+      </w:r>
+      <w:r>
+        <w:rPr>
+          <w:rStyle w:val="NormalTok"/>
+        </w:rPr>
+        <w:t xml:space="preserve">)</w:t>
+      </w:r>
+      <w:r>
+        <w:br w:type="textWrapping"/>
+      </w:r>
+      <w:r>
+        <w:br w:type="textWrapping"/>
+      </w:r>
+      <w:r>
+        <w:rPr>
+          <w:rStyle w:val="NormalTok"/>
+        </w:rPr>
+        <w:t xml:space="preserve">a_net </w:t>
+      </w:r>
+      <w:r>
+        <w:rPr>
+          <w:rStyle w:val="OperatorTok"/>
+        </w:rPr>
+        <w:t xml:space="preserve">=</w:t>
+      </w:r>
+      <w:r>
+        <w:rPr>
+          <w:rStyle w:val="NormalTok"/>
+        </w:rPr>
+        <w:t xml:space="preserve"> K.models.load_model(</w:t>
+      </w:r>
+      <w:r>
+        <w:rPr>
+          <w:rStyle w:val="StringTok"/>
+        </w:rPr>
+        <w:t xml:space="preserve">'a_model.H5'</w:t>
+      </w:r>
+      <w:r>
+        <w:rPr>
+          <w:rStyle w:val="NormalTok"/>
+        </w:rPr>
+        <w:t xml:space="preserve">, {</w:t>
+      </w:r>
+      <w:r>
+        <w:rPr>
+          <w:rStyle w:val="StringTok"/>
+        </w:rPr>
+        <w:t xml:space="preserve">'scaled_tanh'</w:t>
+      </w:r>
+      <w:r>
+        <w:rPr>
+          <w:rStyle w:val="NormalTok"/>
+        </w:rPr>
+        <w:t xml:space="preserve">: scaled_tanh})</w:t>
+      </w:r>
+      <w:r>
+        <w:br w:type="textWrapping"/>
+      </w:r>
+      <w:r>
+        <w:rPr>
+          <w:rStyle w:val="NormalTok"/>
+        </w:rPr>
+        <w:t xml:space="preserve">d_net </w:t>
+      </w:r>
+      <w:r>
+        <w:rPr>
+          <w:rStyle w:val="OperatorTok"/>
+        </w:rPr>
+        <w:t xml:space="preserve">=</w:t>
+      </w:r>
+      <w:r>
+        <w:rPr>
+          <w:rStyle w:val="NormalTok"/>
+        </w:rPr>
+        <w:t xml:space="preserve"> K.models.load_model(</w:t>
+      </w:r>
+      <w:r>
+        <w:rPr>
+          <w:rStyle w:val="StringTok"/>
+        </w:rPr>
+        <w:t xml:space="preserve">'d_model.H5'</w:t>
+      </w:r>
+      <w:r>
+        <w:rPr>
+          <w:rStyle w:val="NormalTok"/>
+        </w:rPr>
+        <w:t xml:space="preserve">, {</w:t>
+      </w:r>
+      <w:r>
+        <w:rPr>
+          <w:rStyle w:val="StringTok"/>
+        </w:rPr>
+        <w:t xml:space="preserve">'scaled_tanh'</w:t>
+      </w:r>
+      <w:r>
+        <w:rPr>
+          <w:rStyle w:val="NormalTok"/>
+        </w:rPr>
+        <w:t xml:space="preserve">: scaled_tanh})</w:t>
+      </w:r>
+      <w:r>
+        <w:br w:type="textWrapping"/>
+      </w:r>
+      <w:r>
+        <w:rPr>
+          <w:rStyle w:val="NormalTok"/>
+        </w:rPr>
+        <w:t xml:space="preserve">f_net </w:t>
+      </w:r>
+      <w:r>
+        <w:rPr>
+          <w:rStyle w:val="OperatorTok"/>
+        </w:rPr>
+        <w:t xml:space="preserve">=</w:t>
+      </w:r>
+      <w:r>
+        <w:rPr>
+          <w:rStyle w:val="NormalTok"/>
+        </w:rPr>
+        <w:t xml:space="preserve"> K.models.load_model(</w:t>
+      </w:r>
+      <w:r>
+        <w:rPr>
+          <w:rStyle w:val="StringTok"/>
+        </w:rPr>
+        <w:t xml:space="preserve">'f_model.H5'</w:t>
+      </w:r>
+      <w:r>
+        <w:rPr>
+          <w:rStyle w:val="NormalTok"/>
+        </w:rPr>
+        <w:t xml:space="preserve">, {</w:t>
+      </w:r>
+      <w:r>
+        <w:rPr>
+          <w:rStyle w:val="StringTok"/>
+        </w:rPr>
+        <w:t xml:space="preserve">'scaled_tanh'</w:t>
+      </w:r>
+      <w:r>
+        <w:rPr>
+          <w:rStyle w:val="NormalTok"/>
+        </w:rPr>
+        <w:t xml:space="preserve">: scaled_tanh})</w:t>
+      </w:r>
+      <w:r>
+        <w:br w:type="textWrapping"/>
+      </w:r>
+      <w:r>
+        <w:br w:type="textWrapping"/>
+      </w:r>
+      <w:r>
+        <w:rPr>
+          <w:rStyle w:val="NormalTok"/>
+        </w:rPr>
+        <w:t xml:space="preserve">f0 </w:t>
+      </w:r>
+      <w:r>
+        <w:rPr>
+          <w:rStyle w:val="OperatorTok"/>
+        </w:rPr>
+        <w:t xml:space="preserve">=</w:t>
+      </w:r>
+      <w:r>
+        <w:rPr>
+          <w:rStyle w:val="NormalTok"/>
+        </w:rPr>
+        <w:t xml:space="preserve"> np.power(</w:t>
+      </w:r>
+      <w:r>
+        <w:rPr>
+          <w:rStyle w:val="DecValTok"/>
+        </w:rPr>
+        <w:t xml:space="preserve">2</w:t>
+      </w:r>
+      <w:r>
+        <w:rPr>
+          <w:rStyle w:val="NormalTok"/>
+        </w:rPr>
+        <w:t xml:space="preserve">, (key </w:t>
+      </w:r>
+      <w:r>
+        <w:rPr>
+          <w:rStyle w:val="OperatorTok"/>
+        </w:rPr>
+        <w:t xml:space="preserve">-</w:t>
+      </w:r>
+      <w:r>
+        <w:rPr>
+          <w:rStyle w:val="NormalTok"/>
+        </w:rPr>
+        <w:t xml:space="preserve"> </w:t>
+      </w:r>
+      <w:r>
+        <w:rPr>
+          <w:rStyle w:val="DecValTok"/>
+        </w:rPr>
+        <w:t xml:space="preserve">49</w:t>
+      </w:r>
+      <w:r>
+        <w:rPr>
+          <w:rStyle w:val="NormalTok"/>
+        </w:rPr>
+        <w:t xml:space="preserve">) </w:t>
+      </w:r>
+      <w:r>
+        <w:rPr>
+          <w:rStyle w:val="OperatorTok"/>
+        </w:rPr>
+        <w:t xml:space="preserve">/</w:t>
+      </w:r>
+      <w:r>
+        <w:rPr>
+          <w:rStyle w:val="NormalTok"/>
+        </w:rPr>
+        <w:t xml:space="preserve"> </w:t>
+      </w:r>
+      <w:r>
+        <w:rPr>
+          <w:rStyle w:val="DecValTok"/>
+        </w:rPr>
+        <w:t xml:space="preserve">12</w:t>
+      </w:r>
+      <w:r>
+        <w:rPr>
+          <w:rStyle w:val="NormalTok"/>
+        </w:rPr>
+        <w:t xml:space="preserve">) </w:t>
+      </w:r>
+      <w:r>
+        <w:rPr>
+          <w:rStyle w:val="OperatorTok"/>
+        </w:rPr>
+        <w:t xml:space="preserve">*</w:t>
+      </w:r>
+      <w:r>
+        <w:rPr>
+          <w:rStyle w:val="NormalTok"/>
+        </w:rPr>
+        <w:t xml:space="preserve"> </w:t>
+      </w:r>
+      <w:r>
+        <w:rPr>
+          <w:rStyle w:val="DecValTok"/>
+        </w:rPr>
+        <w:t xml:space="preserve">440</w:t>
+      </w:r>
+      <w:r>
+        <w:br w:type="textWrapping"/>
+      </w:r>
+      <w:r>
+        <w:rPr>
+          <w:rStyle w:val="NormalTok"/>
+        </w:rPr>
+        <w:t xml:space="preserve">norm_key </w:t>
+      </w:r>
+      <w:r>
+        <w:rPr>
+          <w:rStyle w:val="OperatorTok"/>
+        </w:rPr>
+        <w:t xml:space="preserve">=</w:t>
+      </w:r>
+      <w:r>
+        <w:rPr>
+          <w:rStyle w:val="NormalTok"/>
+        </w:rPr>
+        <w:t xml:space="preserve"> (key </w:t>
+      </w:r>
+      <w:r>
+        <w:rPr>
+          <w:rStyle w:val="OperatorTok"/>
+        </w:rPr>
+        <w:t xml:space="preserve">-</w:t>
+      </w:r>
+      <w:r>
+        <w:rPr>
+          <w:rStyle w:val="NormalTok"/>
+        </w:rPr>
+        <w:t xml:space="preserve"> </w:t>
+      </w:r>
+      <w:r>
+        <w:rPr>
+          <w:rStyle w:val="DecValTok"/>
+        </w:rPr>
+        <w:t xml:space="preserve">1</w:t>
+      </w:r>
+      <w:r>
+        <w:rPr>
+          <w:rStyle w:val="NormalTok"/>
+        </w:rPr>
+        <w:t xml:space="preserve">) </w:t>
+      </w:r>
+      <w:r>
+        <w:rPr>
+          <w:rStyle w:val="OperatorTok"/>
+        </w:rPr>
+        <w:t xml:space="preserve">/</w:t>
+      </w:r>
+      <w:r>
+        <w:rPr>
+          <w:rStyle w:val="NormalTok"/>
+        </w:rPr>
+        <w:t xml:space="preserve"> </w:t>
+      </w:r>
+      <w:r>
+        <w:rPr>
+          <w:rStyle w:val="DecValTok"/>
+        </w:rPr>
+        <w:t xml:space="preserve">87</w:t>
+      </w:r>
+      <w:r>
+        <w:br w:type="textWrapping"/>
+      </w:r>
+      <w:r>
+        <w:rPr>
+          <w:rStyle w:val="NormalTok"/>
+        </w:rPr>
+        <w:t xml:space="preserve">ipt </w:t>
+      </w:r>
+      <w:r>
+        <w:rPr>
+          <w:rStyle w:val="OperatorTok"/>
+        </w:rPr>
+        <w:t xml:space="preserve">=</w:t>
+      </w:r>
+      <w:r>
+        <w:rPr>
+          <w:rStyle w:val="NormalTok"/>
+        </w:rPr>
+        <w:t xml:space="preserve"> np.array([[norm_key, p] </w:t>
+      </w:r>
+      <w:r>
+        <w:rPr>
+          <w:rStyle w:val="ControlFlowTok"/>
+        </w:rPr>
+        <w:t xml:space="preserve">for</w:t>
+      </w:r>
+      <w:r>
+        <w:rPr>
+          <w:rStyle w:val="NormalTok"/>
+        </w:rPr>
+        <w:t xml:space="preserve"> p </w:t>
+      </w:r>
+      <w:r>
+        <w:rPr>
+          <w:rStyle w:val="KeywordTok"/>
+        </w:rPr>
+        <w:t xml:space="preserve">in</w:t>
+      </w:r>
+      <w:r>
+        <w:rPr>
+          <w:rStyle w:val="NormalTok"/>
+        </w:rPr>
+        <w:t xml:space="preserve"> np.linspace(</w:t>
+      </w:r>
+      <w:r>
+        <w:rPr>
+          <w:rStyle w:val="DecValTok"/>
+        </w:rPr>
+        <w:t xml:space="preserve">0</w:t>
+      </w:r>
+      <w:r>
+        <w:rPr>
+          <w:rStyle w:val="NormalTok"/>
+        </w:rPr>
+        <w:t xml:space="preserve">, </w:t>
+      </w:r>
+      <w:r>
+        <w:rPr>
+          <w:rStyle w:val="DecValTok"/>
+        </w:rPr>
+        <w:t xml:space="preserve">1</w:t>
+      </w:r>
+      <w:r>
+        <w:rPr>
+          <w:rStyle w:val="NormalTok"/>
+        </w:rPr>
+        <w:t xml:space="preserve">, partials)])</w:t>
+      </w:r>
+      <w:r>
+        <w:br w:type="textWrapping"/>
+      </w:r>
+      <w:r>
+        <w:br w:type="textWrapping"/>
+      </w:r>
+      <w:r>
+        <w:rPr>
+          <w:rStyle w:val="NormalTok"/>
+        </w:rPr>
+        <w:t xml:space="preserve">A </w:t>
+      </w:r>
+      <w:r>
+        <w:rPr>
+          <w:rStyle w:val="OperatorTok"/>
+        </w:rPr>
+        <w:t xml:space="preserve">=</w:t>
+      </w:r>
+      <w:r>
+        <w:rPr>
+          <w:rStyle w:val="NormalTok"/>
+        </w:rPr>
+        <w:t xml:space="preserve"> np.ndarray.flatten(a_net.predict(ipt)) </w:t>
+      </w:r>
+      <w:r>
+        <w:rPr>
+          <w:rStyle w:val="OperatorTok"/>
+        </w:rPr>
+        <w:t xml:space="preserve">*</w:t>
+      </w:r>
+      <w:r>
+        <w:rPr>
+          <w:rStyle w:val="NormalTok"/>
+        </w:rPr>
+        <w:t xml:space="preserve"> ((Ma </w:t>
+      </w:r>
+      <w:r>
+        <w:rPr>
+          <w:rStyle w:val="OperatorTok"/>
+        </w:rPr>
+        <w:t xml:space="preserve">-</w:t>
+      </w:r>
+      <w:r>
+        <w:rPr>
+          <w:rStyle w:val="NormalTok"/>
+        </w:rPr>
+        <w:t xml:space="preserve"> ma) </w:t>
+      </w:r>
+      <w:r>
+        <w:rPr>
+          <w:rStyle w:val="OperatorTok"/>
+        </w:rPr>
+        <w:t xml:space="preserve">+</w:t>
+      </w:r>
+      <w:r>
+        <w:rPr>
+          <w:rStyle w:val="NormalTok"/>
+        </w:rPr>
+        <w:t xml:space="preserve"> ma) </w:t>
+      </w:r>
+      <w:r>
+        <w:rPr>
+          <w:rStyle w:val="OperatorTok"/>
+        </w:rPr>
+        <w:t xml:space="preserve">*</w:t>
+      </w:r>
+      <w:r>
+        <w:rPr>
+          <w:rStyle w:val="NormalTok"/>
+        </w:rPr>
+        <w:t xml:space="preserve"> </w:t>
+      </w:r>
+      <w:r>
+        <w:rPr>
+          <w:rStyle w:val="DecValTok"/>
+        </w:rPr>
+        <w:t xml:space="preserve">5000</w:t>
+      </w:r>
+      <w:r>
+        <w:br w:type="textWrapping"/>
+      </w:r>
+      <w:r>
+        <w:rPr>
+          <w:rStyle w:val="NormalTok"/>
+        </w:rPr>
+        <w:t xml:space="preserve">D </w:t>
+      </w:r>
+      <w:r>
+        <w:rPr>
+          <w:rStyle w:val="OperatorTok"/>
+        </w:rPr>
+        <w:t xml:space="preserve">=</w:t>
+      </w:r>
+      <w:r>
+        <w:rPr>
+          <w:rStyle w:val="NormalTok"/>
+        </w:rPr>
+        <w:t xml:space="preserve"> np.ndarray.flatten(d_net.predict(ipt)) </w:t>
+      </w:r>
+      <w:r>
+        <w:rPr>
+          <w:rStyle w:val="OperatorTok"/>
+        </w:rPr>
+        <w:t xml:space="preserve">*</w:t>
+      </w:r>
+      <w:r>
+        <w:rPr>
+          <w:rStyle w:val="NormalTok"/>
+        </w:rPr>
+        <w:t xml:space="preserve"> ((Md </w:t>
+      </w:r>
+      <w:r>
+        <w:rPr>
+          <w:rStyle w:val="OperatorTok"/>
+        </w:rPr>
+        <w:t xml:space="preserve">-</w:t>
+      </w:r>
+      <w:r>
+        <w:rPr>
+          <w:rStyle w:val="NormalTok"/>
+        </w:rPr>
+        <w:t xml:space="preserve"> md) </w:t>
+      </w:r>
+      <w:r>
+        <w:rPr>
+          <w:rStyle w:val="OperatorTok"/>
+        </w:rPr>
+        <w:t xml:space="preserve">+</w:t>
+      </w:r>
+      <w:r>
+        <w:rPr>
+          <w:rStyle w:val="NormalTok"/>
+        </w:rPr>
+        <w:t xml:space="preserve"> md) </w:t>
+      </w:r>
+      <w:r>
+        <w:rPr>
+          <w:rStyle w:val="OperatorTok"/>
+        </w:rPr>
+        <w:t xml:space="preserve">*</w:t>
+      </w:r>
+      <w:r>
+        <w:rPr>
+          <w:rStyle w:val="NormalTok"/>
+        </w:rPr>
+        <w:t xml:space="preserve"> </w:t>
+      </w:r>
+      <w:r>
+        <w:rPr>
+          <w:rStyle w:val="FloatTok"/>
+        </w:rPr>
+        <w:t xml:space="preserve">0.000113026536390889</w:t>
+      </w:r>
+      <w:r>
+        <w:rPr>
+          <w:rStyle w:val="NormalTok"/>
+        </w:rPr>
+        <w:t xml:space="preserve"> </w:t>
+      </w:r>
+      <w:r>
+        <w:rPr>
+          <w:rStyle w:val="CommentTok"/>
+        </w:rPr>
+        <w:t xml:space="preserve">#average decay</w:t>
+      </w:r>
+      <w:r>
+        <w:br w:type="textWrapping"/>
+      </w:r>
+      <w:r>
+        <w:rPr>
+          <w:rStyle w:val="NormalTok"/>
+        </w:rPr>
+        <w:t xml:space="preserve">F </w:t>
+      </w:r>
+      <w:r>
+        <w:rPr>
+          <w:rStyle w:val="OperatorTok"/>
+        </w:rPr>
+        <w:t xml:space="preserve">=</w:t>
+      </w:r>
+      <w:r>
+        <w:rPr>
+          <w:rStyle w:val="NormalTok"/>
+        </w:rPr>
+        <w:t xml:space="preserve"> (np.ndarray.flatten(f_net.predict(ipt)) </w:t>
+      </w:r>
+      <w:r>
+        <w:rPr>
+          <w:rStyle w:val="OperatorTok"/>
+        </w:rPr>
+        <w:t xml:space="preserve">*</w:t>
+      </w:r>
+      <w:r>
+        <w:rPr>
+          <w:rStyle w:val="NormalTok"/>
+        </w:rPr>
+        <w:t xml:space="preserve"> (Mf </w:t>
+      </w:r>
+      <w:r>
+        <w:rPr>
+          <w:rStyle w:val="OperatorTok"/>
+        </w:rPr>
+        <w:t xml:space="preserve">-</w:t>
+      </w:r>
+      <w:r>
+        <w:rPr>
+          <w:rStyle w:val="NormalTok"/>
+        </w:rPr>
+        <w:t xml:space="preserve"> mf) </w:t>
+      </w:r>
+      <w:r>
+        <w:rPr>
+          <w:rStyle w:val="OperatorTok"/>
+        </w:rPr>
+        <w:t xml:space="preserve">+</w:t>
+      </w:r>
+      <w:r>
+        <w:rPr>
+          <w:rStyle w:val="NormalTok"/>
+        </w:rPr>
+        <w:t xml:space="preserve"> mf) </w:t>
+      </w:r>
+      <w:r>
+        <w:rPr>
+          <w:rStyle w:val="OperatorTok"/>
+        </w:rPr>
+        <w:t xml:space="preserve">*</w:t>
+      </w:r>
+      <w:r>
+        <w:rPr>
+          <w:rStyle w:val="NormalTok"/>
+        </w:rPr>
+        <w:t xml:space="preserve"> P </w:t>
+      </w:r>
+      <w:r>
+        <w:rPr>
+          <w:rStyle w:val="OperatorTok"/>
+        </w:rPr>
+        <w:t xml:space="preserve">*</w:t>
+      </w:r>
+      <w:r>
+        <w:rPr>
+          <w:rStyle w:val="NormalTok"/>
+        </w:rPr>
+        <w:t xml:space="preserve"> f0</w:t>
+      </w:r>
+      <w:r>
+        <w:br w:type="textWrapping"/>
+      </w:r>
+      <w:r>
+        <w:br w:type="textWrapping"/>
+      </w:r>
+      <w:r>
+        <w:rPr>
+          <w:rStyle w:val="NormalTok"/>
+        </w:rPr>
+        <w:t xml:space="preserve">w </w:t>
+      </w:r>
+      <w:r>
+        <w:rPr>
+          <w:rStyle w:val="OperatorTok"/>
+        </w:rPr>
+        <w:t xml:space="preserve">=</w:t>
+      </w:r>
+      <w:r>
+        <w:rPr>
+          <w:rStyle w:val="NormalTok"/>
+        </w:rPr>
+        <w:t xml:space="preserve"> np.zeros(n)</w:t>
+      </w:r>
+      <w:r>
+        <w:br w:type="textWrapping"/>
+      </w:r>
+      <w:r>
+        <w:rPr>
+          <w:rStyle w:val="ControlFlowTok"/>
+        </w:rPr>
+        <w:t xml:space="preserve">for</w:t>
+      </w:r>
+      <w:r>
+        <w:rPr>
+          <w:rStyle w:val="NormalTok"/>
+        </w:rPr>
+        <w:t xml:space="preserve"> i </w:t>
+      </w:r>
+      <w:r>
+        <w:rPr>
+          <w:rStyle w:val="KeywordTok"/>
+        </w:rPr>
+        <w:t xml:space="preserve">in</w:t>
+      </w:r>
+      <w:r>
+        <w:rPr>
+          <w:rStyle w:val="NormalTok"/>
+        </w:rPr>
+        <w:t xml:space="preserve"> </w:t>
+      </w:r>
+      <w:r>
+        <w:rPr>
+          <w:rStyle w:val="BuiltInTok"/>
+        </w:rPr>
+        <w:t xml:space="preserve">range</w:t>
+      </w:r>
+      <w:r>
+        <w:rPr>
+          <w:rStyle w:val="NormalTok"/>
+        </w:rPr>
+        <w:t xml:space="preserve">(partials):</w:t>
+      </w:r>
+      <w:r>
+        <w:br w:type="textWrapping"/>
+      </w:r>
+      <w:r>
+        <w:rPr>
+          <w:rStyle w:val="NormalTok"/>
+        </w:rPr>
+        <w:t xml:space="preserve">  </w:t>
+      </w:r>
+      <w:r>
+        <w:rPr>
+          <w:rStyle w:val="BuiltInTok"/>
+        </w:rPr>
+        <w:t xml:space="preserve">print</w:t>
+      </w:r>
+      <w:r>
+        <w:rPr>
+          <w:rStyle w:val="NormalTok"/>
+        </w:rPr>
+        <w:t xml:space="preserve">(</w:t>
+      </w:r>
+      <w:r>
+        <w:rPr>
+          <w:rStyle w:val="StringTok"/>
+        </w:rPr>
+        <w:t xml:space="preserve">'partial:'</w:t>
+      </w:r>
+      <w:r>
+        <w:rPr>
+          <w:rStyle w:val="NormalTok"/>
+        </w:rPr>
+        <w:t xml:space="preserve">, i)</w:t>
+      </w:r>
+      <w:r>
+        <w:br w:type="textWrapping"/>
+      </w:r>
+      <w:r>
+        <w:rPr>
+          <w:rStyle w:val="NormalTok"/>
+        </w:rPr>
+        <w:t xml:space="preserve">  ph </w:t>
+      </w:r>
+      <w:r>
+        <w:rPr>
+          <w:rStyle w:val="OperatorTok"/>
+        </w:rPr>
+        <w:t xml:space="preserve">=</w:t>
+      </w:r>
+      <w:r>
+        <w:rPr>
+          <w:rStyle w:val="NormalTok"/>
+        </w:rPr>
+        <w:t xml:space="preserve"> np.random.uniform(</w:t>
+      </w:r>
+      <w:r>
+        <w:rPr>
+          <w:rStyle w:val="DecValTok"/>
+        </w:rPr>
+        <w:t xml:space="preserve">0</w:t>
+      </w:r>
+      <w:r>
+        <w:rPr>
+          <w:rStyle w:val="NormalTok"/>
+        </w:rPr>
+        <w:t xml:space="preserve">, </w:t>
+      </w:r>
+      <w:r>
+        <w:rPr>
+          <w:rStyle w:val="DecValTok"/>
+        </w:rPr>
+        <w:t xml:space="preserve">2</w:t>
+      </w:r>
+      <w:r>
+        <w:rPr>
+          <w:rStyle w:val="NormalTok"/>
+        </w:rPr>
+        <w:t xml:space="preserve"> </w:t>
+      </w:r>
+      <w:r>
+        <w:rPr>
+          <w:rStyle w:val="OperatorTok"/>
+        </w:rPr>
+        <w:t xml:space="preserve">*</w:t>
+      </w:r>
+      <w:r>
+        <w:rPr>
+          <w:rStyle w:val="NormalTok"/>
+        </w:rPr>
+        <w:t xml:space="preserve"> np.pi)</w:t>
+      </w:r>
+      <w:r>
+        <w:br w:type="textWrapping"/>
+      </w:r>
+      <w:r>
+        <w:rPr>
+          <w:rStyle w:val="NormalTok"/>
+        </w:rPr>
+        <w:t xml:space="preserve">  w </w:t>
+      </w:r>
+      <w:r>
+        <w:rPr>
+          <w:rStyle w:val="OperatorTok"/>
+        </w:rPr>
+        <w:t xml:space="preserve">+=</w:t>
+      </w:r>
+      <w:r>
+        <w:rPr>
+          <w:rStyle w:val="NormalTok"/>
+        </w:rPr>
+        <w:t xml:space="preserve"> create_signal(n, fps, F[i], ph, A[i], D[i])</w:t>
+      </w:r>
+    </w:p>
+    <w:p>
+      <w:pPr>
+        <w:pStyle w:val="FirstParagraph"/>
+      </w:pPr>
+      <w:r>
+        <w:t xml:space="preserve">Uma implementação como essa, funcional, mais os arquivos de definição da arquitetura das redes e seus respectivos pesos estão disponíveis no repositório preparado para este trabalho, em xxx, e ocupam aproximadamente 250kb.</w:t>
+      </w:r>
+    </w:p>
+    <w:p>
+      <w:pPr>
+        <w:pStyle w:val="BodyText"/>
+      </w:pPr>
+      <w:r>
+        <w:t xml:space="preserve">A principal limitação é que todos os parametros a serem manipulados no modelo final devem, antes, ter sido incorporados ao processo de treinamento. Os dois paradigmas de modelagem física utilizados para comparação, tanto o método das diferenças finitas quanto os digital waveguides, permitem alguma manipulação em tempo real, a posteriori, de seus parametros: nos exemplos apresentados, o ponto de excitação pode ser mudado de onda para onda e, a qualquer tempo, o ponto de captação pode ser alterado, até mesmo durante a simulação, refletindo no timbre do som gerado.</w:t>
+      </w:r>
+    </w:p>
+    <w:p>
+      <w:pPr>
+        <w:pStyle w:val="BodyText"/>
+      </w:pPr>
+      <w:r>
+        <w:t xml:space="preserve">Além disso, esses modelos prestam-se à incorporação razoavelmente trivial de uma fonte, contínua ou periódica, de excitação, e podem ser utilizados para a simulação de instrumentos de som continuo, como violinos acionados pelo arco (ao contrario do acionamento pizzicato aqui apresentado) e metais, por exemplo; esse não é o caso do modelo aqui proposto, e constitui uma possibilidade de desenvolvimento futuro interessante.</w:t>
+      </w:r>
+    </w:p>
+    <w:p>
+      <w:pPr>
+        <w:pStyle w:val="BodyText"/>
+      </w:pPr>
+      <w:r>
+        <w:t xml:space="preserve">Uma outra barreira é que o modelo aprende características sonoras a partir de exemplos e não presta-se de forma prática à exploração sonora direta; esta deve ser efetuada a partir de outra ferramenta, e então incorporada ao modelo, à época de seu treinamento.</w:t>
+      </w:r>
+    </w:p>
+    <w:p>
+      <w:pPr>
         <w:pStyle w:val="Heading1"/>
       </w:pPr>
       <w:bookmarkStart w:id="106" w:name="conclusão"/>
@@ -23253,6 +24877,38 @@
         <w:t xml:space="preserve">Conclusão</w:t>
       </w:r>
       <w:bookmarkEnd w:id="106"/>
+    </w:p>
+    <w:p>
+      <w:pPr>
+        <w:pStyle w:val="FirstParagraph"/>
+      </w:pPr>
+      <w:r>
+        <w:t xml:space="preserve">O presente trabalho, ao construir uma nova técnica de modelagem sonora, demonstra o potencial do uso de redes neurais à síntese de áudio, provando sobretudo a possibilidade desse uso em tempo real.</w:t>
+      </w:r>
+    </w:p>
+    <w:p>
+      <w:pPr>
+        <w:pStyle w:val="BodyText"/>
+      </w:pPr>
+      <w:r>
+        <w:t xml:space="preserve">Fica evidente ainda o potencial sinergético entre os desenvolvimentos na pesquisa acústica e a utilização de redes neurais para basear modelos destinados à emulação de instrumentos, ou famílias de instrumentos, específicas.</w:t>
+      </w:r>
+    </w:p>
+    <w:p>
+      <w:pPr>
+        <w:pStyle w:val="BodyText"/>
+      </w:pPr>
+      <w:r>
+        <w:t xml:space="preserve">As possibilidas desenvolvimentos futuros nesta área de intersecção são inúmeras, haja vista a escassez de investigações semelhantes: Seria interessante, por exemplo, utilizar as saídas de um modelo elaborado a partir do método das diferenças finitas, que pode ser formulado de forma a simular características como rigidez, ressonância e vários termos de perda de um dado sistema acústico, ao custo de uma alta demanda de recursos computacionais, para treinar um modelo baseado em digital waveguides que tenha uma rede neural no ponto onde as perdas e demais cálculos são efetuados.</w:t>
+      </w:r>
+    </w:p>
+    <w:p>
+      <w:pPr>
+        <w:pStyle w:val="BodyText"/>
+      </w:pPr>
+      <w:r>
+        <w:t xml:space="preserve">Devido ao alto grau de recursividade do algoritmo digital waveguides, o treinamento à partir do resultado final esperado para o modelo é bastante complexo de ser implementado; os outputs de uma simulação baseada em diferenças finitas, no entanto, são plenamente compatíveis para este treinamento, e a inserção de uma rede neural pode levar a um modelo que retenha ao menos parte da acurácia da simulação pelo método de diferenças finitas, com eficiência computacional próxima, ou até superior, à apresentada pelo algoritmo de digital waveguides.</w:t>
+      </w:r>
     </w:p>
     <w:p>
       <w:pPr>

</xml_diff>

<commit_message>
adicionado rascunho da apresentação para qualificação; adicionado programa para plotar parciais de um piano; melhorias incrementais.
</commit_message>
<xml_diff>
--- a/Dissert.docx
+++ b/Dissert.docx
@@ -21178,9 +21178,21 @@
       <w:r>
         <w:t xml:space="preserve">Os testes psicoacústicos revelam, porém, que as pequenas descontinuidades entre duas previsões subsequentes (não visíveis na figura acima) traduzem-se em um som de batidas, o que compromete a qualidade do som gerado pela rede.</w:t>
       </w:r>
-      <w:r>
-        <w:t xml:space="preserve"> </w:t>
-      </w:r>
+    </w:p>
+    <w:p>
+      <w:pPr>
+        <w:pStyle w:val="Heading2"/>
+      </w:pPr>
+      <w:bookmarkStart w:id="85" w:name="redes-convolucionais-e-convolucionais-recorrentes"/>
+      <w:r>
+        <w:t xml:space="preserve">Redes Convolucionais e Convolucionais-Recorrentes</w:t>
+      </w:r>
+      <w:bookmarkEnd w:id="85"/>
+    </w:p>
+    <w:p>
+      <w:pPr>
+        <w:pStyle w:val="FirstParagraph"/>
+      </w:pPr>
       <w:r>
         <w:t xml:space="preserve">Uma estratégia adotada para contornar o problema, inspirada no funcionamento das redes convolucionais, foi adotar um overlap entre previsões subsequentes da rede; essa região seria ao fim convolucionada com uma função smoothstep decrescente, da forma</w:t>
       </w:r>
@@ -21258,7 +21270,7 @@
                     </pic:cNvPicPr>
                   </pic:nvPicPr>
                   <pic:blipFill>
-                    <a:blip r:embed="rId85"/>
+                    <a:blip r:embed="rId86"/>
                     <a:stretch>
                       <a:fillRect/>
                     </a:stretch>
@@ -21303,7 +21315,7 @@
       <w:r>
         <w:t xml:space="preserve"> </w:t>
       </w:r>
-      <w:hyperlink r:id="rId86">
+      <w:hyperlink r:id="rId87">
         <w:r>
           <w:rPr>
             <w:rStyle w:val="Hyperlink"/>
@@ -21312,7 +21324,7 @@
         </w:r>
       </w:hyperlink>
       <w:r>
-        <w:t xml:space="preserve">, as entradas recebem o mesmo vetor do input inicial em cada passo, ou um vetor nulo, por limitações técnicas. Após o primeiro passo, no entanto, a rede aprende a ignorar essas entradas adicionais). Todas as frações geradas, com exceção da última, possuem um overlap com o início da fração seguinte, e a influência de cada uma das previsões no resultado final dá-se a partir dos pesos retirados da função smoothstep: O primeiro ponto da região de overlap é determinado, portanto, inteiramente pela previsão mais antiga enquanto o último o é totalmente pela previsão mais recente. A influência majoritária nos pontos internos passa gradativamente, de maneira suave, da previsão mais antiga para a mais nova.</w:t>
+        <w:t xml:space="preserve">, as entradas recebem o mesmo vetor do input inicial em cada passo, ou um vetor nulo, por limitações técnicas. Após o primeiro passo, no entanto, a rede aprende a ignorar essas entradas adicionais).</w:t>
       </w:r>
     </w:p>
     <w:p>
@@ -21320,12 +21332,73 @@
         <w:pStyle w:val="BodyText"/>
       </w:pPr>
       <w:r>
-        <w:t xml:space="preserve">Contudo, nos resultados alisados persiste ainda um problema relacionado, principalmente, ao transiente no meio onda propaga-se a perturabação, uma etapa bastante mal comportada que ocorre logo após o impulso inicial ser aplicada à corda, membrana ou prato e durante a qual o regime (quasi) periódico não foi ainda alcançado. Isso resulta, do ponto de vista da onda, em uma etapa curta, no início do gráfico, que apresenta vibrações aberrantes em frequências diferentese maiores do que frequência fundamental do sistema. Essas frequências são capturadas pela rede recorrente, e erroneamente aplicadas no início de cada um dos seus passos (e não só ao primeiro). A figura abaixo, um detalhe aumentado da onda correspondente ao sample 111 que captura a fronteira entre duas previsões subsequentes, ilustra esse efeito na coluna da direita, enquanto as descontinuidades não tratadas podem ser vistas na coluna da esquerda. As consequências sonoras podem ser ouvido no repositório do</w:t>
-      </w:r>
-      <w:r>
-        <w:t xml:space="preserve"> </w:t>
-      </w:r>
-      <w:hyperlink r:id="rId86">
+        <w:t xml:space="preserve">Todas as frações de onda geradas, com exceção da última, possuem um</w:t>
+      </w:r>
+      <w:r>
+        <w:t xml:space="preserve"> </w:t>
+      </w:r>
+      <w:r>
+        <w:rPr>
+          <w:i/>
+        </w:rPr>
+        <w:t xml:space="preserve">overlap</w:t>
+      </w:r>
+      <w:r>
+        <w:t xml:space="preserve"> </w:t>
+      </w:r>
+      <w:r>
+        <w:t xml:space="preserve">com o início da fração seguinte, e a influência de cada uma das previsões no resultado final dá-se a partir dos pesos retirados da função smoothstep: O primeiro ponto da região de</w:t>
+      </w:r>
+      <w:r>
+        <w:t xml:space="preserve"> </w:t>
+      </w:r>
+      <w:r>
+        <w:rPr>
+          <w:i/>
+        </w:rPr>
+        <w:t xml:space="preserve">overlap</w:t>
+      </w:r>
+      <w:r>
+        <w:t xml:space="preserve"> </w:t>
+      </w:r>
+      <w:r>
+        <w:t xml:space="preserve">é determinado, portanto, inteiramente pela previsão mais antiga enquanto o último o é totalmente pela previsão mais recente. A influência majoritária nos pontos internos passa gradativamente, de maneira suave, da previsão mais antiga para a mais nova.</w:t>
+      </w:r>
+    </w:p>
+    <w:p>
+      <w:pPr>
+        <w:pStyle w:val="BodyText"/>
+      </w:pPr>
+      <w:r>
+        <w:t xml:space="preserve">Contudo, nos resultados alisados persiste ainda um problema relacionado, principalmente, ao transiente no meio onde propaga-se a perturbação, uma etapa bastante mal comportada que ocorre logo após o impulso inicial ser aplicada à corda, membrana ou prato e durante a qual o regime (quasi) periódico não foi ainda alcançado. Isso resulta, do ponto de vista da onda, em uma etapa curta, que pode ser vista no início do gráfico, e que apresenta vibrações aberrantes em frequências diferentes e maiores do que frequência fundamental do sistema.</w:t>
+      </w:r>
+    </w:p>
+    <w:p>
+      <w:pPr>
+        <w:pStyle w:val="BodyText"/>
+      </w:pPr>
+      <w:r>
+        <w:t xml:space="preserve">Essas frequências são capturadas pela rede recorrente, e erroneamente aplicadas no início de cada um dos seus passos (e não só ao primeiro). A figura abaixo, um detalhe aumentado da onda correspondente ao</w:t>
+      </w:r>
+      <w:r>
+        <w:t xml:space="preserve"> </w:t>
+      </w:r>
+      <w:r>
+        <w:rPr>
+          <w:i/>
+        </w:rPr>
+        <w:t xml:space="preserve">sample</w:t>
+      </w:r>
+      <w:r>
+        <w:t xml:space="preserve"> </w:t>
+      </w:r>
+      <w:r>
+        <w:t xml:space="preserve">111 onde é capturada a fronteira entre duas previsões subsequentes, ilustra esse efeito na coluna da direita, enquanto as descontinuidades não tratadas podem ser vistas na coluna da esquerda. As consequências sonoras podem ser ouvido no repositório do</w:t>
+      </w:r>
+      <w:r>
+        <w:t xml:space="preserve"> </w:t>
+      </w:r>
+      <w:hyperlink r:id="rId87">
         <w:r>
           <w:rPr>
             <w:rStyle w:val="Hyperlink"/>
@@ -21360,7 +21433,7 @@
                     </pic:cNvPicPr>
                   </pic:nvPicPr>
                   <pic:blipFill>
-                    <a:blip r:embed="rId87"/>
+                    <a:blip r:embed="rId88"/>
                     <a:stretch>
                       <a:fillRect/>
                     </a:stretch>
@@ -21400,28 +21473,44 @@
         <w:pStyle w:val="BodyText"/>
       </w:pPr>
       <w:r>
-        <w:t xml:space="preserve">O problema é tratável, e um dos encaminhamentos possíveis é distribuir o esforço de previsão entre mais de uma rede, por exemplo, ocupando cada uma de prever uma faixa de frequências. Observou-se, no caso dos samples utilizados até agora, que aproximadamente 4 faixas seriam necessárias, refletindo-se em 4 redes por família de peças, em um total de 16 redes. As exatas fronteiras entre as faixas dependem tanto da arquitetura quanto das características do instrumento a ser emulado e requerem uma investigação empírica bastante extensa que deixou de ser desenvolvida neste trabalho, por limitações de tempo.</w:t>
+        <w:t xml:space="preserve">O problema é tratável, e um dos encaminhamentos possíveis, tomando como inspiração o algoritmo dos banded digital waveguides TODO: é distribuir o esforço de previsão entre mais de uma rede, por exemplo, ocupando cada uma de prever uma faixa de frequências. Observou-se, no caso dos samples utilizados até agora, que aproximadamente 4 faixas seriam necessárias, refletindo-se em 4 redes por família de peças, em um total de 16 redes. As exatas fronteiras entre as faixas dependem tanto da arquitetura quanto das características do instrumento a ser emulado e requerem uma investigação empírica bastante extensa que deixou de ser desenvolvida neste trabalho, por limitações de tempo.</w:t>
+      </w:r>
+    </w:p>
+    <w:p>
+      <w:pPr>
+        <w:pStyle w:val="BodyText"/>
+      </w:pPr>
+      <w:r>
+        <w:t xml:space="preserve">Uma outra abordagem seria reservar à uma rede densa a previsão dos transientes, deixando sob responsabilidade de uma rede recorrente o período estacionário, mais bem comportado.</w:t>
       </w:r>
     </w:p>
     <w:p>
       <w:pPr>
         <w:pStyle w:val="Heading2"/>
       </w:pPr>
-      <w:bookmarkStart w:id="88" w:name="redes-convolucionais-e-convolucionais-recorrentes"/>
-      <w:r>
-        <w:t xml:space="preserve">Redes Convolucionais e Convolucionais-Recorrentes</w:t>
-      </w:r>
-      <w:bookmarkEnd w:id="88"/>
+      <w:bookmarkStart w:id="89" w:name="autoencoders"/>
+      <w:r>
+        <w:t xml:space="preserve">Autoencoders</w:t>
+      </w:r>
+      <w:bookmarkEnd w:id="89"/>
+    </w:p>
+    <w:p>
+      <w:pPr>
+        <w:pStyle w:val="FirstParagraph"/>
+      </w:pPr>
+      <w:r>
+        <w:t xml:space="preserve">TODO:</w:t>
+      </w:r>
     </w:p>
     <w:p>
       <w:pPr>
         <w:pStyle w:val="Heading2"/>
       </w:pPr>
-      <w:bookmarkStart w:id="89" w:name="domínio-da-frequência"/>
+      <w:bookmarkStart w:id="90" w:name="domínio-da-frequência"/>
       <w:r>
         <w:t xml:space="preserve">Domínio da Frequência</w:t>
       </w:r>
-      <w:bookmarkEnd w:id="89"/>
+      <w:bookmarkEnd w:id="90"/>
     </w:p>
     <w:p>
       <w:pPr>
@@ -21475,7 +21564,7 @@
                     </pic:cNvPicPr>
                   </pic:nvPicPr>
                   <pic:blipFill>
-                    <a:blip r:embed="rId90"/>
+                    <a:blip r:embed="rId91"/>
                     <a:stretch>
                       <a:fillRect/>
                     </a:stretch>
@@ -21565,7 +21654,7 @@
                     </pic:cNvPicPr>
                   </pic:nvPicPr>
                   <pic:blipFill>
-                    <a:blip r:embed="rId91"/>
+                    <a:blip r:embed="rId92"/>
                     <a:stretch>
                       <a:fillRect/>
                     </a:stretch>
@@ -21654,7 +21743,7 @@
                     </pic:cNvPicPr>
                   </pic:nvPicPr>
                   <pic:blipFill>
-                    <a:blip r:embed="rId92"/>
+                    <a:blip r:embed="rId93"/>
                     <a:stretch>
                       <a:fillRect/>
                     </a:stretch>
@@ -21701,11 +21790,11 @@
       <w:pPr>
         <w:pStyle w:val="Heading2"/>
       </w:pPr>
-      <w:bookmarkStart w:id="93" w:name="modelo-misto"/>
+      <w:bookmarkStart w:id="94" w:name="modelo-misto"/>
       <w:r>
         <w:t xml:space="preserve">Modelo Misto</w:t>
       </w:r>
-      <w:bookmarkEnd w:id="93"/>
+      <w:bookmarkEnd w:id="94"/>
     </w:p>
     <w:p>
       <w:pPr>
@@ -21753,7 +21842,7 @@
                     </pic:cNvPicPr>
                   </pic:nvPicPr>
                   <pic:blipFill>
-                    <a:blip r:embed="rId94"/>
+                    <a:blip r:embed="rId95"/>
                     <a:stretch>
                       <a:fillRect/>
                     </a:stretch>
@@ -21854,7 +21943,7 @@
                     </pic:cNvPicPr>
                   </pic:nvPicPr>
                   <pic:blipFill>
-                    <a:blip r:embed="rId95"/>
+                    <a:blip r:embed="rId96"/>
                     <a:stretch>
                       <a:fillRect/>
                     </a:stretch>
@@ -21916,11 +22005,11 @@
       <w:pPr>
         <w:pStyle w:val="Heading3"/>
       </w:pPr>
-      <w:bookmarkStart w:id="96" w:name="frequências"/>
+      <w:bookmarkStart w:id="97" w:name="frequências"/>
       <w:r>
         <w:t xml:space="preserve">Frequências</w:t>
       </w:r>
-      <w:bookmarkEnd w:id="96"/>
+      <w:bookmarkEnd w:id="97"/>
     </w:p>
     <w:p>
       <w:pPr>
@@ -22110,7 +22199,7 @@
                     </pic:cNvPicPr>
                   </pic:nvPicPr>
                   <pic:blipFill>
-                    <a:blip r:embed="rId97"/>
+                    <a:blip r:embed="rId98"/>
                     <a:stretch>
                       <a:fillRect/>
                     </a:stretch>
@@ -22177,11 +22266,11 @@
       <w:pPr>
         <w:pStyle w:val="Heading3"/>
       </w:pPr>
-      <w:bookmarkStart w:id="98" w:name="decaimentos-e-amplitudes"/>
+      <w:bookmarkStart w:id="99" w:name="decaimentos-e-amplitudes"/>
       <w:r>
         <w:t xml:space="preserve">Decaimentos e Amplitudes</w:t>
       </w:r>
-      <w:bookmarkEnd w:id="98"/>
+      <w:bookmarkEnd w:id="99"/>
     </w:p>
     <w:p>
       <w:pPr>
@@ -22614,7 +22703,7 @@
                     </pic:cNvPicPr>
                   </pic:nvPicPr>
                   <pic:blipFill>
-                    <a:blip r:embed="rId99"/>
+                    <a:blip r:embed="rId100"/>
                     <a:stretch>
                       <a:fillRect/>
                     </a:stretch>
@@ -22667,11 +22756,11 @@
       <w:pPr>
         <w:pStyle w:val="Heading3"/>
       </w:pPr>
-      <w:bookmarkStart w:id="100" w:name="formulação-final"/>
+      <w:bookmarkStart w:id="101" w:name="formulação-final"/>
       <w:r>
         <w:t xml:space="preserve">Formulação Final</w:t>
       </w:r>
-      <w:bookmarkEnd w:id="100"/>
+      <w:bookmarkEnd w:id="101"/>
     </w:p>
     <w:p>
       <w:pPr>
@@ -23013,7 +23102,7 @@
                     </pic:cNvPicPr>
                   </pic:nvPicPr>
                   <pic:blipFill>
-                    <a:blip r:embed="rId101"/>
+                    <a:blip r:embed="rId102"/>
                     <a:stretch>
                       <a:fillRect/>
                     </a:stretch>
@@ -23071,61 +23160,6 @@
                 <pic:pic>
                   <pic:nvPicPr>
                     <pic:cNvPr descr="im/piano_max_decays.png" id="0" name="Picture"/>
-                    <pic:cNvPicPr>
-                      <a:picLocks noChangeArrowheads="1" noChangeAspect="1"/>
-                    </pic:cNvPicPr>
-                  </pic:nvPicPr>
-                  <pic:blipFill>
-                    <a:blip r:embed="rId102"/>
-                    <a:stretch>
-                      <a:fillRect/>
-                    </a:stretch>
-                  </pic:blipFill>
-                  <pic:spPr bwMode="auto">
-                    <a:xfrm>
-                      <a:off x="0" y="0"/>
-                      <a:ext cx="5943600" cy="1188720"/>
-                    </a:xfrm>
-                    <a:prstGeom prst="rect">
-                      <a:avLst/>
-                    </a:prstGeom>
-                    <a:noFill/>
-                    <a:ln w="9525">
-                      <a:noFill/>
-                      <a:headEnd/>
-                      <a:tailEnd/>
-                    </a:ln>
-                  </pic:spPr>
-                </pic:pic>
-              </a:graphicData>
-            </a:graphic>
-          </wp:inline>
-        </w:drawing>
-      </w:r>
-    </w:p>
-    <w:p>
-      <w:pPr>
-        <w:pStyle w:val="ImageCaption"/>
-      </w:pPr>
-      <w:r>
-        <w:t xml:space="preserve">Decaimentos Máximos por Notas</w:t>
-      </w:r>
-    </w:p>
-    <w:p>
-      <w:pPr>
-        <w:pStyle w:val="CaptionedFigure"/>
-      </w:pPr>
-      <w:r>
-        <w:drawing>
-          <wp:inline>
-            <wp:extent cx="5943600" cy="1188720"/>
-            <wp:effectExtent b="0" l="0" r="0" t="0"/>
-            <wp:docPr descr="Amplitudes Máximas por Notas" title="" id="1" name="Picture"/>
-            <a:graphic>
-              <a:graphicData uri="http://schemas.openxmlformats.org/drawingml/2006/picture">
-                <pic:pic>
-                  <pic:nvPicPr>
-                    <pic:cNvPr descr="im/piano_max_amps.png" id="0" name="Picture"/>
                     <pic:cNvPicPr>
                       <a:picLocks noChangeArrowheads="1" noChangeAspect="1"/>
                     </pic:cNvPicPr>
@@ -23163,6 +23197,61 @@
         <w:pStyle w:val="ImageCaption"/>
       </w:pPr>
       <w:r>
+        <w:t xml:space="preserve">Decaimentos Máximos por Notas</w:t>
+      </w:r>
+    </w:p>
+    <w:p>
+      <w:pPr>
+        <w:pStyle w:val="CaptionedFigure"/>
+      </w:pPr>
+      <w:r>
+        <w:drawing>
+          <wp:inline>
+            <wp:extent cx="5943600" cy="1188720"/>
+            <wp:effectExtent b="0" l="0" r="0" t="0"/>
+            <wp:docPr descr="Amplitudes Máximas por Notas" title="" id="1" name="Picture"/>
+            <a:graphic>
+              <a:graphicData uri="http://schemas.openxmlformats.org/drawingml/2006/picture">
+                <pic:pic>
+                  <pic:nvPicPr>
+                    <pic:cNvPr descr="im/piano_max_amps.png" id="0" name="Picture"/>
+                    <pic:cNvPicPr>
+                      <a:picLocks noChangeArrowheads="1" noChangeAspect="1"/>
+                    </pic:cNvPicPr>
+                  </pic:nvPicPr>
+                  <pic:blipFill>
+                    <a:blip r:embed="rId104"/>
+                    <a:stretch>
+                      <a:fillRect/>
+                    </a:stretch>
+                  </pic:blipFill>
+                  <pic:spPr bwMode="auto">
+                    <a:xfrm>
+                      <a:off x="0" y="0"/>
+                      <a:ext cx="5943600" cy="1188720"/>
+                    </a:xfrm>
+                    <a:prstGeom prst="rect">
+                      <a:avLst/>
+                    </a:prstGeom>
+                    <a:noFill/>
+                    <a:ln w="9525">
+                      <a:noFill/>
+                      <a:headEnd/>
+                      <a:tailEnd/>
+                    </a:ln>
+                  </pic:spPr>
+                </pic:pic>
+              </a:graphicData>
+            </a:graphic>
+          </wp:inline>
+        </w:drawing>
+      </w:r>
+    </w:p>
+    <w:p>
+      <w:pPr>
+        <w:pStyle w:val="ImageCaption"/>
+      </w:pPr>
+      <w:r>
         <w:t xml:space="preserve">Amplitudes Máximas por Notas</w:t>
       </w:r>
     </w:p>
@@ -23323,7 +23412,7 @@
                     </pic:cNvPicPr>
                   </pic:nvPicPr>
                   <pic:blipFill>
-                    <a:blip r:embed="rId104"/>
+                    <a:blip r:embed="rId105"/>
                     <a:stretch>
                       <a:fillRect/>
                     </a:stretch>
@@ -23368,7 +23457,7 @@
       <w:r>
         <w:t xml:space="preserve"> </w:t>
       </w:r>
-      <w:hyperlink r:id="rId105">
+      <w:hyperlink r:id="rId106">
         <w:r>
           <w:rPr>
             <w:rStyle w:val="Hyperlink"/>
@@ -23415,11 +23504,11 @@
       <w:pPr>
         <w:pStyle w:val="Heading1"/>
       </w:pPr>
-      <w:bookmarkStart w:id="106" w:name="resultados"/>
+      <w:bookmarkStart w:id="107" w:name="resultados"/>
       <w:r>
         <w:t xml:space="preserve">Resultados</w:t>
       </w:r>
-      <w:bookmarkEnd w:id="106"/>
+      <w:bookmarkEnd w:id="107"/>
     </w:p>
     <w:p>
       <w:pPr>
@@ -25015,7 +25104,7 @@
       <w:r>
         <w:t xml:space="preserve"> </w:t>
       </w:r>
-      <w:hyperlink r:id="rId107">
+      <w:hyperlink r:id="rId108">
         <w:r>
           <w:rPr>
             <w:rStyle w:val="Hyperlink"/>
@@ -25076,7 +25165,7 @@
       <w:r>
         <w:t xml:space="preserve"> </w:t>
       </w:r>
-      <w:hyperlink r:id="rId108">
+      <w:hyperlink r:id="rId109">
         <w:r>
           <w:rPr>
             <w:rStyle w:val="Hyperlink"/>
@@ -25087,13 +25176,50 @@
     </w:p>
     <w:p>
       <w:pPr>
+        <w:pStyle w:val="BodyText"/>
+      </w:pPr>
+      <w:r>
+        <w:t xml:space="preserve">Do ponto de vista conceitual, o trabalho apresenta alguns</w:t>
+      </w:r>
+      <w:r>
+        <w:t xml:space="preserve"> </w:t>
+      </w:r>
+      <w:r>
+        <w:rPr>
+          <w:i/>
+        </w:rPr>
+        <w:t xml:space="preserve">insights</w:t>
+      </w:r>
+      <w:r>
+        <w:t xml:space="preserve"> </w:t>
+      </w:r>
+      <w:r>
+        <w:t xml:space="preserve">sobre a transformada discreta de Fourier que, até onde alcança o conhecimento do autor, não foram anteriormente explorados na literatura: A Interpretação geométrica da simetria da transformada discreta de Fourier aplicada à sinais no domínio real, embora não se preste à uma aplicação direta, ajuda no entendimento deste algoritmo e pode vir a ser explorada em desenvolvimentos futuros.</w:t>
+      </w:r>
+    </w:p>
+    <w:p>
+      <w:pPr>
+        <w:pStyle w:val="BodyText"/>
+      </w:pPr>
+      <w:r>
+        <w:t xml:space="preserve">A relação entre o envelope de uma onda, no domínio do tempo, e o formato de seus picos de frequência no domínio</w:t>
+      </w:r>
+      <w:r>
+        <w:t xml:space="preserve"> </w:t>
+      </w:r>
+      <w:r>
+        <w:t xml:space="preserve">da frequência, por outro lado, possibilitou a formulação do modelo fisicamente informado, e pode ser explorada futuramente de maneira mais profunda, potencialmente baseando um método mais acurado de identificação de envelopes em ondas sonoras.</w:t>
+      </w:r>
+    </w:p>
+    <w:p>
+      <w:pPr>
         <w:pStyle w:val="Heading1"/>
       </w:pPr>
-      <w:bookmarkStart w:id="109" w:name="conclusão"/>
+      <w:bookmarkStart w:id="110" w:name="conclusão"/>
       <w:r>
         <w:t xml:space="preserve">Conclusão</w:t>
       </w:r>
-      <w:bookmarkEnd w:id="109"/>
+      <w:bookmarkEnd w:id="110"/>
     </w:p>
     <w:p>
       <w:pPr>
@@ -25122,6 +25248,14 @@
         <w:pStyle w:val="BodyText"/>
       </w:pPr>
       <w:r>
+        <w:t xml:space="preserve">Uma outra vantagem frente aos modelos baseados em simulação física é que ele pode aprender características importantes do som que tem origem em partes do sistema difíceis de serem modeladas fisicamente, como a influência de ressonadores de geometria complexa.</w:t>
+      </w:r>
+    </w:p>
+    <w:p>
+      <w:pPr>
+        <w:pStyle w:val="BodyText"/>
+      </w:pPr>
+      <w:r>
         <w:t xml:space="preserve">Fica evidente ainda o potencial sinergético entre os desenvolvimentos na pesquisa sobre a acústica de intrumentos musicais e a utilização de redes neurais para basear modelos destinados à emulação desses instrumentos, ou famílias de instrumentos, específicos.</w:t>
       </w:r>
     </w:p>
@@ -25129,18 +25263,18 @@
       <w:pPr>
         <w:pStyle w:val="Heading2"/>
       </w:pPr>
-      <w:bookmarkStart w:id="110" w:name="desenvolvimentos-futuros"/>
+      <w:bookmarkStart w:id="111" w:name="desenvolvimentos-futuros"/>
       <w:r>
         <w:t xml:space="preserve">Desenvolvimentos Futuros</w:t>
       </w:r>
-      <w:bookmarkEnd w:id="110"/>
+      <w:bookmarkEnd w:id="111"/>
     </w:p>
     <w:p>
       <w:pPr>
         <w:pStyle w:val="FirstParagraph"/>
       </w:pPr>
       <w:r>
-        <w:t xml:space="preserve">As possibilidas desenvolvimentos futuros nesta área de intersecção são inúmeras, haja vista a escassez de investigações semelhantes: Seria interessante, por exemplo, utilizar as saídas de um modelo elaborado a partir do método das diferenças finitas, que pode ser formulado de forma a simular características como rigidez, ressonância e vários termos de perda de um dado sistema acústico, ao custo de uma alta demanda de recursos computacionais, para treinar um modelo baseado em digital waveguides que tenha uma rede neural no ponto onde as perdas e demais cálculos são efetuados.</w:t>
+        <w:t xml:space="preserve">As possibilidades de desenvolvimentos futuros nesta área de intersecção entre redes neurais e acústica são inúmeras, haja vista a escassez de investigações semelhantes: Seria interessante, por exemplo, utilizar as saídas de um modelo elaborado a partir do método das diferenças finitas, que pode ser formulado de forma a simular características como rigidez, ressonância e vários termos de perda de um dado sistema acústico, ao custo de uma alta demanda de recursos computacionais, para treinar um modelo baseado em digital waveguides que tenha uma rede neural no ponto onde as perdas e demais cálculos são efetuados.</w:t>
       </w:r>
     </w:p>
     <w:p>
@@ -25172,7 +25306,7 @@
         <w:pStyle w:val="BodyText"/>
       </w:pPr>
       <w:r>
-        <w:t xml:space="preserve">Além disso, uma implementação em uma linguagem de programação mais eficiente, como C ou C++, somada à uma interface visual e compatibilidade com controladores MIDI pode gerar uma linha de produtos comercialmente viável, a ser comercializado em formato standalone e/ou em formato de</w:t>
+        <w:t xml:space="preserve">Além disso, um algoritmo eficiente de extração de envelope permitiria retomar a abordagem baseada em</w:t>
       </w:r>
       <w:r>
         <w:t xml:space="preserve"> </w:t>
@@ -25181,6 +25315,29 @@
         <w:rPr>
           <w:i/>
         </w:rPr>
+        <w:t xml:space="preserve">autoencoders</w:t>
+      </w:r>
+      <w:r>
+        <w:t xml:space="preserve"> </w:t>
+      </w:r>
+      <w:r>
+        <w:t xml:space="preserve">que, alimentados com um senoide pura modelada pelo envelope da onda, teriam maior possibilidade de aprender a reconstruir a onda original de maneira verossímil, em uma abordagem inspirada nas técnicas de transferência de estilo utilizadas no campo da visão de computadores.</w:t>
+      </w:r>
+    </w:p>
+    <w:p>
+      <w:pPr>
+        <w:pStyle w:val="BodyText"/>
+      </w:pPr>
+      <w:r>
+        <w:t xml:space="preserve">Um outro desenvolvimento seria produzir uma implementação em uma linguagem de programação mais eficiente, como C ou C++, somada à uma interface visual e compatibilidade com controladores MIDI pode gerar uma linha de produtos comercialmente viável, a ser comercializado em formato standalone e/ou em formato de</w:t>
+      </w:r>
+      <w:r>
+        <w:t xml:space="preserve"> </w:t>
+      </w:r>
+      <w:r>
+        <w:rPr>
+          <w:i/>
+        </w:rPr>
         <w:t xml:space="preserve">plugin</w:t>
       </w:r>
       <w:r>
@@ -25194,14 +25351,14 @@
       <w:pPr>
         <w:pStyle w:val="Heading1"/>
       </w:pPr>
-      <w:bookmarkStart w:id="111" w:name="referências"/>
+      <w:bookmarkStart w:id="112" w:name="referências"/>
       <w:r>
         <w:t xml:space="preserve">Referências</w:t>
       </w:r>
-      <w:bookmarkEnd w:id="111"/>
-    </w:p>
-    <w:bookmarkStart w:id="207" w:name="refs"/>
-    <w:bookmarkStart w:id="112" w:name="ref-balle2016end"/>
+      <w:bookmarkEnd w:id="112"/>
+    </w:p>
+    <w:bookmarkStart w:id="208" w:name="refs"/>
+    <w:bookmarkStart w:id="113" w:name="ref-balle2016end"/>
     <w:p>
       <w:pPr>
         <w:pStyle w:val="Bibliography"/>
@@ -25222,8 +25379,8 @@
         <w:t xml:space="preserve">.</w:t>
       </w:r>
     </w:p>
-    <w:bookmarkEnd w:id="112"/>
-    <w:bookmarkStart w:id="113" w:name="ref-bensa2005computational"/>
+    <w:bookmarkEnd w:id="113"/>
+    <w:bookmarkStart w:id="114" w:name="ref-bensa2005computational"/>
     <w:p>
       <w:pPr>
         <w:pStyle w:val="Bibliography"/>
@@ -25247,8 +25404,8 @@
         <w:t xml:space="preserve">91 (2). S. Hirzel Verlag: 289–98.</w:t>
       </w:r>
     </w:p>
-    <w:bookmarkEnd w:id="113"/>
-    <w:bookmarkStart w:id="114" w:name="ref-bensa2003simulation"/>
+    <w:bookmarkEnd w:id="114"/>
+    <w:bookmarkStart w:id="115" w:name="ref-bensa2003simulation"/>
     <w:p>
       <w:pPr>
         <w:pStyle w:val="Bibliography"/>
@@ -25272,8 +25429,8 @@
         <w:t xml:space="preserve">114 (2). ASA: 1095–1107.</w:t>
       </w:r>
     </w:p>
-    <w:bookmarkEnd w:id="114"/>
-    <w:bookmarkStart w:id="115" w:name="ref-bishop06"/>
+    <w:bookmarkEnd w:id="115"/>
+    <w:bookmarkStart w:id="116" w:name="ref-bishop06"/>
     <w:p>
       <w:pPr>
         <w:pStyle w:val="Bibliography"/>
@@ -25294,8 +25451,8 @@
         <w:t xml:space="preserve">. springer.</w:t>
       </w:r>
     </w:p>
-    <w:bookmarkEnd w:id="115"/>
-    <w:bookmarkStart w:id="116" w:name="ref-boulanger2013high"/>
+    <w:bookmarkEnd w:id="116"/>
+    <w:bookmarkStart w:id="117" w:name="ref-boulanger2013high"/>
     <w:p>
       <w:pPr>
         <w:pStyle w:val="Bibliography"/>
@@ -25316,8 +25473,8 @@
         <w:t xml:space="preserve">, 3178–82. IEEE.</w:t>
       </w:r>
     </w:p>
-    <w:bookmarkEnd w:id="116"/>
-    <w:bookmarkStart w:id="117" w:name="ref-boulanger2014phone"/>
+    <w:bookmarkEnd w:id="117"/>
+    <w:bookmarkStart w:id="118" w:name="ref-boulanger2014phone"/>
     <w:p>
       <w:pPr>
         <w:pStyle w:val="Bibliography"/>
@@ -25338,8 +25495,8 @@
         <w:t xml:space="preserve">, 5417–21. IEEE.</w:t>
       </w:r>
     </w:p>
-    <w:bookmarkEnd w:id="117"/>
-    <w:bookmarkStart w:id="118" w:name="ref-bovermann2016musical"/>
+    <w:bookmarkEnd w:id="118"/>
+    <w:bookmarkStart w:id="119" w:name="ref-bovermann2016musical"/>
     <w:p>
       <w:pPr>
         <w:pStyle w:val="Bibliography"/>
@@ -25360,8 +25517,8 @@
         <w:t xml:space="preserve">. Springer.</w:t>
       </w:r>
     </w:p>
-    <w:bookmarkEnd w:id="118"/>
-    <w:bookmarkStart w:id="119" w:name="ref-bock2012polyphonic"/>
+    <w:bookmarkEnd w:id="119"/>
+    <w:bookmarkStart w:id="120" w:name="ref-bock2012polyphonic"/>
     <w:p>
       <w:pPr>
         <w:pStyle w:val="Bibliography"/>
@@ -25382,8 +25539,8 @@
         <w:t xml:space="preserve">, 121–24. IEEE.</w:t>
       </w:r>
     </w:p>
-    <w:bookmarkEnd w:id="119"/>
-    <w:bookmarkStart w:id="120" w:name="ref-choi2016automatic"/>
+    <w:bookmarkEnd w:id="120"/>
+    <w:bookmarkStart w:id="121" w:name="ref-choi2016automatic"/>
     <w:p>
       <w:pPr>
         <w:pStyle w:val="Bibliography"/>
@@ -25404,8 +25561,8 @@
         <w:t xml:space="preserve">.</w:t>
       </w:r>
     </w:p>
-    <w:bookmarkEnd w:id="120"/>
-    <w:bookmarkStart w:id="121" w:name="ref-choi2017convolutional"/>
+    <w:bookmarkEnd w:id="121"/>
+    <w:bookmarkStart w:id="122" w:name="ref-choi2017convolutional"/>
     <w:p>
       <w:pPr>
         <w:pStyle w:val="Bibliography"/>
@@ -25426,8 +25583,8 @@
         <w:t xml:space="preserve">, 2392–6. IEEE.</w:t>
       </w:r>
     </w:p>
-    <w:bookmarkEnd w:id="121"/>
-    <w:bookmarkStart w:id="122" w:name="ref-costa2017evaluation"/>
+    <w:bookmarkEnd w:id="122"/>
+    <w:bookmarkStart w:id="123" w:name="ref-costa2017evaluation"/>
     <w:p>
       <w:pPr>
         <w:pStyle w:val="Bibliography"/>
@@ -25451,8 +25608,8 @@
         <w:t xml:space="preserve">52. Elsevier: 28–38.</w:t>
       </w:r>
     </w:p>
-    <w:bookmarkEnd w:id="122"/>
-    <w:bookmarkStart w:id="123" w:name="ref-dalgleish2014blurring"/>
+    <w:bookmarkEnd w:id="123"/>
+    <w:bookmarkStart w:id="124" w:name="ref-dalgleish2014blurring"/>
     <w:p>
       <w:pPr>
         <w:pStyle w:val="Bibliography"/>
@@ -25461,8 +25618,8 @@
         <w:t xml:space="preserve">Dalgleish, Mathew, Steve Spencer, and Chris Foster. 2014. “BLURRING the Lines: AN Integrated Compositional Model for Digital Musical Instrument Design.” In. Proceedings of the 9th Conference on Interdisciplinary Musicology. CIM14. Berlin, Germany.</w:t>
       </w:r>
     </w:p>
-    <w:bookmarkEnd w:id="123"/>
-    <w:bookmarkStart w:id="124" w:name="ref-elman1990finding"/>
+    <w:bookmarkEnd w:id="124"/>
+    <w:bookmarkStart w:id="125" w:name="ref-elman1990finding"/>
     <w:p>
       <w:pPr>
         <w:pStyle w:val="Bibliography"/>
@@ -25486,8 +25643,8 @@
         <w:t xml:space="preserve">14 (2). Wiley Online Library: 179–211.</w:t>
       </w:r>
     </w:p>
-    <w:bookmarkEnd w:id="124"/>
-    <w:bookmarkStart w:id="125" w:name="ref-engel2017neural"/>
+    <w:bookmarkEnd w:id="125"/>
+    <w:bookmarkStart w:id="126" w:name="ref-engel2017neural"/>
     <w:p>
       <w:pPr>
         <w:pStyle w:val="Bibliography"/>
@@ -25508,8 +25665,8 @@
         <w:t xml:space="preserve">.</w:t>
       </w:r>
     </w:p>
-    <w:bookmarkEnd w:id="125"/>
-    <w:bookmarkStart w:id="126" w:name="ref-forgeard2008practicing"/>
+    <w:bookmarkEnd w:id="126"/>
+    <w:bookmarkStart w:id="127" w:name="ref-forgeard2008practicing"/>
     <w:p>
       <w:pPr>
         <w:pStyle w:val="Bibliography"/>
@@ -25533,8 +25690,8 @@
         <w:t xml:space="preserve">3 (10). Public Library of Science: e3566.</w:t>
       </w:r>
     </w:p>
-    <w:bookmarkEnd w:id="126"/>
-    <w:bookmarkStart w:id="127" w:name="ref-frans2017outline"/>
+    <w:bookmarkEnd w:id="127"/>
+    <w:bookmarkStart w:id="128" w:name="ref-frans2017outline"/>
     <w:p>
       <w:pPr>
         <w:pStyle w:val="Bibliography"/>
@@ -25555,8 +25712,8 @@
         <w:t xml:space="preserve">.</w:t>
       </w:r>
     </w:p>
-    <w:bookmarkEnd w:id="127"/>
-    <w:bookmarkStart w:id="128" w:name="ref-gatys2016image"/>
+    <w:bookmarkEnd w:id="128"/>
+    <w:bookmarkStart w:id="129" w:name="ref-gatys2016image"/>
     <w:p>
       <w:pPr>
         <w:pStyle w:val="Bibliography"/>
@@ -25577,8 +25734,8 @@
         <w:t xml:space="preserve">, 2414–23.</w:t>
       </w:r>
     </w:p>
-    <w:bookmarkEnd w:id="128"/>
-    <w:bookmarkStart w:id="129" w:name="ref-goldberg2016primer"/>
+    <w:bookmarkEnd w:id="129"/>
+    <w:bookmarkStart w:id="130" w:name="ref-goldberg2016primer"/>
     <w:p>
       <w:pPr>
         <w:pStyle w:val="Bibliography"/>
@@ -25602,8 +25759,8 @@
         <w:t xml:space="preserve">57: 345–420.</w:t>
       </w:r>
     </w:p>
-    <w:bookmarkEnd w:id="129"/>
-    <w:bookmarkStart w:id="131" w:name="ref-cnnmoney"/>
+    <w:bookmarkEnd w:id="130"/>
+    <w:bookmarkStart w:id="132" w:name="ref-cnnmoney"/>
     <w:p>
       <w:pPr>
         <w:pStyle w:val="Bibliography"/>
@@ -25626,7 +25783,7 @@
       <w:r>
         <w:t xml:space="preserve"> </w:t>
       </w:r>
-      <w:hyperlink r:id="rId130">
+      <w:hyperlink r:id="rId131">
         <w:r>
           <w:rPr>
             <w:rStyle w:val="Hyperlink"/>
@@ -25638,8 +25795,8 @@
         <w:t xml:space="preserve">.</w:t>
       </w:r>
     </w:p>
-    <w:bookmarkEnd w:id="131"/>
-    <w:bookmarkStart w:id="132" w:name="ref-gracia2016wave"/>
+    <w:bookmarkEnd w:id="132"/>
+    <w:bookmarkStart w:id="133" w:name="ref-gracia2016wave"/>
     <w:p>
       <w:pPr>
         <w:pStyle w:val="Bibliography"/>
@@ -25660,8 +25817,8 @@
         <w:t xml:space="preserve">.</w:t>
       </w:r>
     </w:p>
-    <w:bookmarkEnd w:id="132"/>
-    <w:bookmarkStart w:id="133" w:name="ref-graves2013speech"/>
+    <w:bookmarkEnd w:id="133"/>
+    <w:bookmarkStart w:id="134" w:name="ref-graves2013speech"/>
     <w:p>
       <w:pPr>
         <w:pStyle w:val="Bibliography"/>
@@ -25682,8 +25839,8 @@
         <w:t xml:space="preserve">, 6645–9. IEEE.</w:t>
       </w:r>
     </w:p>
-    <w:bookmarkEnd w:id="133"/>
-    <w:bookmarkStart w:id="134" w:name="ref-gregor2016towards"/>
+    <w:bookmarkEnd w:id="134"/>
+    <w:bookmarkStart w:id="135" w:name="ref-gregor2016towards"/>
     <w:p>
       <w:pPr>
         <w:pStyle w:val="Bibliography"/>
@@ -25704,8 +25861,8 @@
         <w:t xml:space="preserve">, 3549–57.</w:t>
       </w:r>
     </w:p>
-    <w:bookmarkEnd w:id="134"/>
-    <w:bookmarkStart w:id="135" w:name="ref-grinstein2017audio"/>
+    <w:bookmarkEnd w:id="135"/>
+    <w:bookmarkStart w:id="136" w:name="ref-grinstein2017audio"/>
     <w:p>
       <w:pPr>
         <w:pStyle w:val="Bibliography"/>
@@ -25726,8 +25883,8 @@
         <w:t xml:space="preserve">.</w:t>
       </w:r>
     </w:p>
-    <w:bookmarkEnd w:id="135"/>
-    <w:bookmarkStart w:id="136" w:name="ref-hagan1996neural"/>
+    <w:bookmarkEnd w:id="136"/>
+    <w:bookmarkStart w:id="137" w:name="ref-hagan1996neural"/>
     <w:p>
       <w:pPr>
         <w:pStyle w:val="Bibliography"/>
@@ -25748,8 +25905,8 @@
         <w:t xml:space="preserve">. Vol. 20. Pws Pub. Boston.</w:t>
       </w:r>
     </w:p>
-    <w:bookmarkEnd w:id="136"/>
-    <w:bookmarkStart w:id="137" w:name="ref-he2015multimodal"/>
+    <w:bookmarkEnd w:id="137"/>
+    <w:bookmarkStart w:id="138" w:name="ref-he2015multimodal"/>
     <w:p>
       <w:pPr>
         <w:pStyle w:val="Bibliography"/>
@@ -25770,8 +25927,8 @@
         <w:t xml:space="preserve">, 73–80. ACM.</w:t>
       </w:r>
     </w:p>
-    <w:bookmarkEnd w:id="137"/>
-    <w:bookmarkStart w:id="138" w:name="ref-hinton2012deep"/>
+    <w:bookmarkEnd w:id="138"/>
+    <w:bookmarkStart w:id="139" w:name="ref-hinton2012deep"/>
     <w:p>
       <w:pPr>
         <w:pStyle w:val="Bibliography"/>
@@ -25795,8 +25952,8 @@
         <w:t xml:space="preserve">29 (6). IEEE: 82–97.</w:t>
       </w:r>
     </w:p>
-    <w:bookmarkEnd w:id="138"/>
-    <w:bookmarkStart w:id="139" w:name="ref-hornik91"/>
+    <w:bookmarkEnd w:id="139"/>
+    <w:bookmarkStart w:id="140" w:name="ref-hornik91"/>
     <w:p>
       <w:pPr>
         <w:pStyle w:val="Bibliography"/>
@@ -25820,8 +25977,8 @@
         <w:t xml:space="preserve">4 (2). Elsevier: 251–57.</w:t>
       </w:r>
     </w:p>
-    <w:bookmarkEnd w:id="139"/>
-    <w:bookmarkStart w:id="140" w:name="ref-hornik89"/>
+    <w:bookmarkEnd w:id="140"/>
+    <w:bookmarkStart w:id="141" w:name="ref-hornik89"/>
     <w:p>
       <w:pPr>
         <w:pStyle w:val="Bibliography"/>
@@ -25845,8 +26002,8 @@
         <w:t xml:space="preserve">2 (5). Elsevier: 359–66.</w:t>
       </w:r>
     </w:p>
-    <w:bookmarkEnd w:id="140"/>
-    <w:bookmarkStart w:id="141" w:name="ref-hutchings2017talking"/>
+    <w:bookmarkEnd w:id="141"/>
+    <w:bookmarkStart w:id="142" w:name="ref-hutchings2017talking"/>
     <w:p>
       <w:pPr>
         <w:pStyle w:val="Bibliography"/>
@@ -25867,8 +26024,8 @@
         <w:t xml:space="preserve">.</w:t>
       </w:r>
     </w:p>
-    <w:bookmarkEnd w:id="141"/>
-    <w:bookmarkStart w:id="142" w:name="ref-hwangimage"/>
+    <w:bookmarkEnd w:id="142"/>
+    <w:bookmarkStart w:id="143" w:name="ref-hwangimage"/>
     <w:p>
       <w:pPr>
         <w:pStyle w:val="Bibliography"/>
@@ -25877,8 +26034,8 @@
         <w:t xml:space="preserve">Hwang, Jeff, and You Zhou. 2016. “Image Colorization with Deep Convolutional Neural Networks.”</w:t>
       </w:r>
     </w:p>
-    <w:bookmarkEnd w:id="142"/>
-    <w:bookmarkStart w:id="143" w:name="ref-iizuka2016let"/>
+    <w:bookmarkEnd w:id="143"/>
+    <w:bookmarkStart w:id="144" w:name="ref-iizuka2016let"/>
     <w:p>
       <w:pPr>
         <w:pStyle w:val="Bibliography"/>
@@ -25902,8 +26059,8 @@
         <w:t xml:space="preserve">35 (4). ACM: 110.</w:t>
       </w:r>
     </w:p>
-    <w:bookmarkEnd w:id="143"/>
-    <w:bookmarkStart w:id="144" w:name="ref-isola2016image"/>
+    <w:bookmarkEnd w:id="144"/>
+    <w:bookmarkStart w:id="145" w:name="ref-isola2016image"/>
     <w:p>
       <w:pPr>
         <w:pStyle w:val="Bibliography"/>
@@ -25924,8 +26081,8 @@
         <w:t xml:space="preserve">.</w:t>
       </w:r>
     </w:p>
-    <w:bookmarkEnd w:id="144"/>
-    <w:bookmarkStart w:id="145" w:name="ref-jiang1999image"/>
+    <w:bookmarkEnd w:id="145"/>
+    <w:bookmarkStart w:id="146" w:name="ref-jiang1999image"/>
     <w:p>
       <w:pPr>
         <w:pStyle w:val="Bibliography"/>
@@ -25949,8 +26106,8 @@
         <w:t xml:space="preserve">14 (9). Elsevier: 737–60.</w:t>
       </w:r>
     </w:p>
-    <w:bookmarkEnd w:id="145"/>
-    <w:bookmarkStart w:id="146" w:name="ref-johnston2017improved"/>
+    <w:bookmarkEnd w:id="146"/>
+    <w:bookmarkStart w:id="147" w:name="ref-johnston2017improved"/>
     <w:p>
       <w:pPr>
         <w:pStyle w:val="Bibliography"/>
@@ -25971,8 +26128,8 @@
         <w:t xml:space="preserve">.</w:t>
       </w:r>
     </w:p>
-    <w:bookmarkEnd w:id="146"/>
-    <w:bookmarkStart w:id="147" w:name="ref-karjalainen2004digital"/>
+    <w:bookmarkEnd w:id="147"/>
+    <w:bookmarkStart w:id="148" w:name="ref-karjalainen2004digital"/>
     <w:p>
       <w:pPr>
         <w:pStyle w:val="Bibliography"/>
@@ -25996,8 +26153,8 @@
         <w:t xml:space="preserve">2004. Hindawi Publishing Corp.: 978–89.</w:t>
       </w:r>
     </w:p>
-    <w:bookmarkEnd w:id="147"/>
-    <w:bookmarkStart w:id="148" w:name="ref-karpathy2014large"/>
+    <w:bookmarkEnd w:id="148"/>
+    <w:bookmarkStart w:id="149" w:name="ref-karpathy2014large"/>
     <w:p>
       <w:pPr>
         <w:pStyle w:val="Bibliography"/>
@@ -26018,8 +26175,8 @@
         <w:t xml:space="preserve">, 1725–32.</w:t>
       </w:r>
     </w:p>
-    <w:bookmarkEnd w:id="148"/>
-    <w:bookmarkStart w:id="149" w:name="ref-khorrami2016deep"/>
+    <w:bookmarkEnd w:id="149"/>
+    <w:bookmarkStart w:id="150" w:name="ref-khorrami2016deep"/>
     <w:p>
       <w:pPr>
         <w:pStyle w:val="Bibliography"/>
@@ -26040,8 +26197,8 @@
         <w:t xml:space="preserve">, 619–23. IEEE.</w:t>
       </w:r>
     </w:p>
-    <w:bookmarkEnd w:id="149"/>
-    <w:bookmarkStart w:id="150" w:name="ref-kulkarni2015deep"/>
+    <w:bookmarkEnd w:id="150"/>
+    <w:bookmarkStart w:id="151" w:name="ref-kulkarni2015deep"/>
     <w:p>
       <w:pPr>
         <w:pStyle w:val="Bibliography"/>
@@ -26062,8 +26219,8 @@
         <w:t xml:space="preserve">, 2539–47.</w:t>
       </w:r>
     </w:p>
-    <w:bookmarkEnd w:id="150"/>
-    <w:bookmarkStart w:id="151" w:name="ref-larsson2016learning"/>
+    <w:bookmarkEnd w:id="151"/>
+    <w:bookmarkStart w:id="152" w:name="ref-larsson2016learning"/>
     <w:p>
       <w:pPr>
         <w:pStyle w:val="Bibliography"/>
@@ -26084,8 +26241,8 @@
         <w:t xml:space="preserve">, 577–93. Springer.</w:t>
       </w:r>
     </w:p>
-    <w:bookmarkEnd w:id="151"/>
-    <w:bookmarkStart w:id="152" w:name="ref-lecun1998gradient"/>
+    <w:bookmarkEnd w:id="152"/>
+    <w:bookmarkStart w:id="153" w:name="ref-lecun1998gradient"/>
     <w:p>
       <w:pPr>
         <w:pStyle w:val="Bibliography"/>
@@ -26109,8 +26266,8 @@
         <w:t xml:space="preserve">86 (11). IEEE: 2278–2324.</w:t>
       </w:r>
     </w:p>
-    <w:bookmarkEnd w:id="152"/>
-    <w:bookmarkStart w:id="153" w:name="ref-leshno93"/>
+    <w:bookmarkEnd w:id="153"/>
+    <w:bookmarkStart w:id="154" w:name="ref-leshno93"/>
     <w:p>
       <w:pPr>
         <w:pStyle w:val="Bibliography"/>
@@ -26134,8 +26291,8 @@
         <w:t xml:space="preserve">6 (6). Elsevier: 861–67.</w:t>
       </w:r>
     </w:p>
-    <w:bookmarkEnd w:id="153"/>
-    <w:bookmarkStart w:id="154" w:name="ref-lyons2011understanding"/>
+    <w:bookmarkEnd w:id="154"/>
+    <w:bookmarkStart w:id="155" w:name="ref-lyons2011understanding"/>
     <w:p>
       <w:pPr>
         <w:pStyle w:val="Bibliography"/>
@@ -26156,8 +26313,8 @@
         <w:t xml:space="preserve">. Pearson Education India.</w:t>
       </w:r>
     </w:p>
-    <w:bookmarkEnd w:id="154"/>
-    <w:bookmarkStart w:id="155" w:name="ref-maas2013rectifier"/>
+    <w:bookmarkEnd w:id="155"/>
+    <w:bookmarkStart w:id="156" w:name="ref-maas2013rectifier"/>
     <w:p>
       <w:pPr>
         <w:pStyle w:val="Bibliography"/>
@@ -26178,8 +26335,8 @@
         <w:t xml:space="preserve">. Vol. 30. 1.</w:t>
       </w:r>
     </w:p>
-    <w:bookmarkEnd w:id="155"/>
-    <w:bookmarkStart w:id="156" w:name="ref-mcculloch1943logical"/>
+    <w:bookmarkEnd w:id="156"/>
+    <w:bookmarkStart w:id="157" w:name="ref-mcculloch1943logical"/>
     <w:p>
       <w:pPr>
         <w:pStyle w:val="Bibliography"/>
@@ -26203,8 +26360,8 @@
         <w:t xml:space="preserve">5 (4). Springer: 115–33.</w:t>
       </w:r>
     </w:p>
-    <w:bookmarkEnd w:id="156"/>
-    <w:bookmarkStart w:id="157" w:name="ref-minski1969perceptrons"/>
+    <w:bookmarkEnd w:id="157"/>
+    <w:bookmarkStart w:id="158" w:name="ref-minski1969perceptrons"/>
     <w:p>
       <w:pPr>
         <w:pStyle w:val="Bibliography"/>
@@ -26225,8 +26382,8 @@
         <w:t xml:space="preserve">.</w:t>
       </w:r>
     </w:p>
-    <w:bookmarkEnd w:id="157"/>
-    <w:bookmarkStart w:id="158" w:name="ref-mital2017time"/>
+    <w:bookmarkEnd w:id="158"/>
+    <w:bookmarkStart w:id="159" w:name="ref-mital2017time"/>
     <w:p>
       <w:pPr>
         <w:pStyle w:val="Bibliography"/>
@@ -26247,8 +26404,8 @@
         <w:t xml:space="preserve">.</w:t>
       </w:r>
     </w:p>
-    <w:bookmarkEnd w:id="158"/>
-    <w:bookmarkStart w:id="159" w:name="ref-mizutani2000derivation"/>
+    <w:bookmarkEnd w:id="159"/>
+    <w:bookmarkStart w:id="160" w:name="ref-mizutani2000derivation"/>
     <w:p>
       <w:pPr>
         <w:pStyle w:val="Bibliography"/>
@@ -26269,8 +26426,8 @@
         <w:t xml:space="preserve">, 2:167–72. IEEE.</w:t>
       </w:r>
     </w:p>
-    <w:bookmarkEnd w:id="159"/>
-    <w:bookmarkStart w:id="160" w:name="ref-oord2016pixel"/>
+    <w:bookmarkEnd w:id="160"/>
+    <w:bookmarkStart w:id="161" w:name="ref-oord2016pixel"/>
     <w:p>
       <w:pPr>
         <w:pStyle w:val="Bibliography"/>
@@ -26291,8 +26448,8 @@
         <w:t xml:space="preserve">.</w:t>
       </w:r>
     </w:p>
-    <w:bookmarkEnd w:id="160"/>
-    <w:bookmarkStart w:id="161" w:name="ref-van2016conditional"/>
+    <w:bookmarkEnd w:id="161"/>
+    <w:bookmarkStart w:id="162" w:name="ref-van2016conditional"/>
     <w:p>
       <w:pPr>
         <w:pStyle w:val="Bibliography"/>
@@ -26313,8 +26470,8 @@
         <w:t xml:space="preserve">, 4790–8.</w:t>
       </w:r>
     </w:p>
-    <w:bookmarkEnd w:id="161"/>
-    <w:bookmarkStart w:id="162" w:name="ref-pang2017convolution"/>
+    <w:bookmarkEnd w:id="162"/>
+    <w:bookmarkStart w:id="163" w:name="ref-pang2017convolution"/>
     <w:p>
       <w:pPr>
         <w:pStyle w:val="Bibliography"/>
@@ -26335,8 +26492,8 @@
         <w:t xml:space="preserve">. IEEE.</w:t>
       </w:r>
     </w:p>
-    <w:bookmarkEnd w:id="162"/>
-    <w:bookmarkStart w:id="163" w:name="ref-parker1985learning"/>
+    <w:bookmarkEnd w:id="163"/>
+    <w:bookmarkStart w:id="164" w:name="ref-parker1985learning"/>
     <w:p>
       <w:pPr>
         <w:pStyle w:val="Bibliography"/>
@@ -26345,8 +26502,8 @@
         <w:t xml:space="preserve">Parker, David B. 1985. “Learning Logic.”</w:t>
       </w:r>
     </w:p>
-    <w:bookmarkEnd w:id="163"/>
-    <w:bookmarkStart w:id="164" w:name="ref-pfalz2018generating"/>
+    <w:bookmarkEnd w:id="164"/>
+    <w:bookmarkStart w:id="165" w:name="ref-pfalz2018generating"/>
     <w:p>
       <w:pPr>
         <w:pStyle w:val="Bibliography"/>
@@ -26355,8 +26512,8 @@
         <w:t xml:space="preserve">Pfalz, Andrew. 2018. “Generating Audio Using Recurrent Neural Networks.”</w:t>
       </w:r>
     </w:p>
-    <w:bookmarkEnd w:id="164"/>
-    <w:bookmarkStart w:id="165" w:name="ref-rehman2014image"/>
+    <w:bookmarkEnd w:id="165"/>
+    <w:bookmarkStart w:id="166" w:name="ref-rehman2014image"/>
     <w:p>
       <w:pPr>
         <w:pStyle w:val="Bibliography"/>
@@ -26380,8 +26537,8 @@
         <w:t xml:space="preserve">7 (4). Maxwell Science Publishing: 656–72.</w:t>
       </w:r>
     </w:p>
-    <w:bookmarkEnd w:id="165"/>
-    <w:bookmarkStart w:id="166" w:name="ref-reiffenstein2006codification"/>
+    <w:bookmarkEnd w:id="166"/>
+    <w:bookmarkStart w:id="167" w:name="ref-reiffenstein2006codification"/>
     <w:p>
       <w:pPr>
         <w:pStyle w:val="Bibliography"/>
@@ -26405,8 +26562,8 @@
         <w:t xml:space="preserve">50 (3). Wiley Online Library: 298–318.</w:t>
       </w:r>
     </w:p>
-    <w:bookmarkEnd w:id="166"/>
-    <w:bookmarkStart w:id="167" w:name="ref-rigaud2013parametric"/>
+    <w:bookmarkEnd w:id="167"/>
+    <w:bookmarkStart w:id="168" w:name="ref-rigaud2013parametric"/>
     <w:p>
       <w:pPr>
         <w:pStyle w:val="Bibliography"/>
@@ -26430,8 +26587,8 @@
         <w:t xml:space="preserve">133 (5). ASA: 3107–18.</w:t>
       </w:r>
     </w:p>
-    <w:bookmarkEnd w:id="167"/>
-    <w:bookmarkStart w:id="168" w:name="ref-Rosenblatt57"/>
+    <w:bookmarkEnd w:id="168"/>
+    <w:bookmarkStart w:id="169" w:name="ref-Rosenblatt57"/>
     <w:p>
       <w:pPr>
         <w:pStyle w:val="Bibliography"/>
@@ -26452,8 +26609,8 @@
         <w:t xml:space="preserve">. Cornell Aeronautical Laboratory.</w:t>
       </w:r>
     </w:p>
-    <w:bookmarkEnd w:id="168"/>
-    <w:bookmarkStart w:id="169" w:name="ref-rosenblatt1958perceptron"/>
+    <w:bookmarkEnd w:id="169"/>
+    <w:bookmarkStart w:id="170" w:name="ref-rosenblatt1958perceptron"/>
     <w:p>
       <w:pPr>
         <w:pStyle w:val="Bibliography"/>
@@ -26477,8 +26634,8 @@
         <w:t xml:space="preserve">65 (6). American Psychological Association: 386.</w:t>
       </w:r>
     </w:p>
-    <w:bookmarkEnd w:id="169"/>
-    <w:bookmarkStart w:id="170" w:name="ref-rumelhart1985learning"/>
+    <w:bookmarkEnd w:id="170"/>
+    <w:bookmarkStart w:id="171" w:name="ref-rumelhart1985learning"/>
     <w:p>
       <w:pPr>
         <w:pStyle w:val="Bibliography"/>
@@ -26487,8 +26644,8 @@
         <w:t xml:space="preserve">Rumelhart, David E, Geoffrey E Hinton, and Ronald J Williams. 1985. “Learning Internal Representations by Error Propagation.” California Univ San Diego La Jolla Inst for Cognitive Science.</w:t>
       </w:r>
     </w:p>
-    <w:bookmarkEnd w:id="170"/>
-    <w:bookmarkStart w:id="171" w:name="ref-sainath2015deep"/>
+    <w:bookmarkEnd w:id="171"/>
+    <w:bookmarkStart w:id="172" w:name="ref-sainath2015deep"/>
     <w:p>
       <w:pPr>
         <w:pStyle w:val="Bibliography"/>
@@ -26512,8 +26669,8 @@
         <w:t xml:space="preserve">64. Elsevier: 39–48.</w:t>
       </w:r>
     </w:p>
-    <w:bookmarkEnd w:id="171"/>
-    <w:bookmarkStart w:id="172" w:name="ref-sak2015fast"/>
+    <w:bookmarkEnd w:id="172"/>
+    <w:bookmarkStart w:id="173" w:name="ref-sak2015fast"/>
     <w:p>
       <w:pPr>
         <w:pStyle w:val="Bibliography"/>
@@ -26534,8 +26691,8 @@
         <w:t xml:space="preserve">.</w:t>
       </w:r>
     </w:p>
-    <w:bookmarkEnd w:id="172"/>
-    <w:bookmarkStart w:id="173" w:name="ref-salsa2016partial"/>
+    <w:bookmarkEnd w:id="173"/>
+    <w:bookmarkStart w:id="174" w:name="ref-salsa2016partial"/>
     <w:p>
       <w:pPr>
         <w:pStyle w:val="Bibliography"/>
@@ -26556,8 +26713,8 @@
         <w:t xml:space="preserve">. Vol. 99. Springer.</w:t>
       </w:r>
     </w:p>
-    <w:bookmarkEnd w:id="173"/>
-    <w:bookmarkStart w:id="174" w:name="ref-sangkloy2016scribbler"/>
+    <w:bookmarkEnd w:id="174"/>
+    <w:bookmarkStart w:id="175" w:name="ref-sangkloy2016scribbler"/>
     <w:p>
       <w:pPr>
         <w:pStyle w:val="Bibliography"/>
@@ -26578,8 +26735,8 @@
         <w:t xml:space="preserve">.</w:t>
       </w:r>
     </w:p>
-    <w:bookmarkEnd w:id="174"/>
-    <w:bookmarkStart w:id="175" w:name="ref-santurkar2017generative"/>
+    <w:bookmarkEnd w:id="175"/>
+    <w:bookmarkStart w:id="176" w:name="ref-santurkar2017generative"/>
     <w:p>
       <w:pPr>
         <w:pStyle w:val="Bibliography"/>
@@ -26600,8 +26757,8 @@
         <w:t xml:space="preserve">.</w:t>
       </w:r>
     </w:p>
-    <w:bookmarkEnd w:id="175"/>
-    <w:bookmarkStart w:id="176" w:name="ref-sarroff2014musical"/>
+    <w:bookmarkEnd w:id="176"/>
+    <w:bookmarkStart w:id="177" w:name="ref-sarroff2014musical"/>
     <w:p>
       <w:pPr>
         <w:pStyle w:val="Bibliography"/>
@@ -26622,8 +26779,8 @@
         <w:t xml:space="preserve">.</w:t>
       </w:r>
     </w:p>
-    <w:bookmarkEnd w:id="176"/>
-    <w:bookmarkStart w:id="177" w:name="ref-serra2007state"/>
+    <w:bookmarkEnd w:id="177"/>
+    <w:bookmarkStart w:id="178" w:name="ref-serra2007state"/>
     <w:p>
       <w:pPr>
         <w:pStyle w:val="Bibliography"/>
@@ -26644,8 +26801,8 @@
         <w:t xml:space="preserve">, 9–12. IEEE.</w:t>
       </w:r>
     </w:p>
-    <w:bookmarkEnd w:id="177"/>
-    <w:bookmarkStart w:id="178" w:name="ref-sigtia2016end"/>
+    <w:bookmarkEnd w:id="178"/>
+    <w:bookmarkStart w:id="179" w:name="ref-sigtia2016end"/>
     <w:p>
       <w:pPr>
         <w:pStyle w:val="Bibliography"/>
@@ -26669,8 +26826,8 @@
         <w:t xml:space="preserve">24 (5). IEEE Press: 927–39.</w:t>
       </w:r>
     </w:p>
-    <w:bookmarkEnd w:id="178"/>
-    <w:bookmarkStart w:id="179" w:name="ref-smith2006basic"/>
+    <w:bookmarkEnd w:id="179"/>
+    <w:bookmarkStart w:id="180" w:name="ref-smith2006basic"/>
     <w:p>
       <w:pPr>
         <w:pStyle w:val="Bibliography"/>
@@ -26691,8 +26848,8 @@
         <w:t xml:space="preserve">.</w:t>
       </w:r>
     </w:p>
-    <w:bookmarkEnd w:id="179"/>
-    <w:bookmarkStart w:id="180" w:name="ref-smith1992physical"/>
+    <w:bookmarkEnd w:id="180"/>
+    <w:bookmarkStart w:id="181" w:name="ref-smith1992physical"/>
     <w:p>
       <w:pPr>
         <w:pStyle w:val="Bibliography"/>
@@ -26716,8 +26873,8 @@
         <w:t xml:space="preserve">16 (4). JSTOR: 74–91.</w:t>
       </w:r>
     </w:p>
-    <w:bookmarkEnd w:id="180"/>
-    <w:bookmarkStart w:id="181" w:name="ref-socher2014recursive"/>
+    <w:bookmarkEnd w:id="181"/>
+    <w:bookmarkStart w:id="182" w:name="ref-socher2014recursive"/>
     <w:p>
       <w:pPr>
         <w:pStyle w:val="Bibliography"/>
@@ -26726,8 +26883,8 @@
         <w:t xml:space="preserve">Socher, Richard. 2014. “Recursive Deep Learning for Natural Language Processing and Computer Vision.” Citeseer.</w:t>
       </w:r>
     </w:p>
-    <w:bookmarkEnd w:id="181"/>
-    <w:bookmarkStart w:id="182" w:name="ref-southall2016automatic"/>
+    <w:bookmarkEnd w:id="182"/>
+    <w:bookmarkStart w:id="183" w:name="ref-southall2016automatic"/>
     <w:p>
       <w:pPr>
         <w:pStyle w:val="Bibliography"/>
@@ -26748,8 +26905,8 @@
         <w:t xml:space="preserve">, 591–97.</w:t>
       </w:r>
     </w:p>
-    <w:bookmarkEnd w:id="182"/>
-    <w:bookmarkStart w:id="183" w:name="ref-stanley2007compositional"/>
+    <w:bookmarkEnd w:id="183"/>
+    <w:bookmarkStart w:id="184" w:name="ref-stanley2007compositional"/>
     <w:p>
       <w:pPr>
         <w:pStyle w:val="Bibliography"/>
@@ -26773,8 +26930,8 @@
         <w:t xml:space="preserve">8 (2). Springer: 131–62.</w:t>
       </w:r>
     </w:p>
-    <w:bookmarkEnd w:id="183"/>
-    <w:bookmarkStart w:id="184" w:name="ref-staudt2016development"/>
+    <w:bookmarkEnd w:id="184"/>
+    <w:bookmarkStart w:id="185" w:name="ref-staudt2016development"/>
     <w:p>
       <w:pPr>
         <w:pStyle w:val="Bibliography"/>
@@ -26783,8 +26940,8 @@
         <w:t xml:space="preserve">Staudt, Pascal. 2016. “Development of a Digital Musical Instrument with Embedded Sound Synthesis.”</w:t>
       </w:r>
     </w:p>
-    <w:bookmarkEnd w:id="184"/>
-    <w:bookmarkStart w:id="185" w:name="ref-theis2015generative"/>
+    <w:bookmarkEnd w:id="185"/>
+    <w:bookmarkStart w:id="186" w:name="ref-theis2015generative"/>
     <w:p>
       <w:pPr>
         <w:pStyle w:val="Bibliography"/>
@@ -26805,8 +26962,8 @@
         <w:t xml:space="preserve">, 1927–35.</w:t>
       </w:r>
     </w:p>
-    <w:bookmarkEnd w:id="185"/>
-    <w:bookmarkStart w:id="186" w:name="ref-theis2017lossy"/>
+    <w:bookmarkEnd w:id="186"/>
+    <w:bookmarkStart w:id="187" w:name="ref-theis2017lossy"/>
     <w:p>
       <w:pPr>
         <w:pStyle w:val="Bibliography"/>
@@ -26827,8 +26984,8 @@
         <w:t xml:space="preserve">.</w:t>
       </w:r>
     </w:p>
-    <w:bookmarkEnd w:id="186"/>
-    <w:bookmarkStart w:id="187" w:name="ref-toderici2015variable"/>
+    <w:bookmarkEnd w:id="187"/>
+    <w:bookmarkStart w:id="188" w:name="ref-toderici2015variable"/>
     <w:p>
       <w:pPr>
         <w:pStyle w:val="Bibliography"/>
@@ -26849,8 +27006,8 @@
         <w:t xml:space="preserve">.</w:t>
       </w:r>
     </w:p>
-    <w:bookmarkEnd w:id="187"/>
-    <w:bookmarkStart w:id="188" w:name="ref-toderici2016full"/>
+    <w:bookmarkEnd w:id="188"/>
+    <w:bookmarkStart w:id="189" w:name="ref-toderici2016full"/>
     <w:p>
       <w:pPr>
         <w:pStyle w:val="Bibliography"/>
@@ -26871,8 +27028,8 @@
         <w:t xml:space="preserve">.</w:t>
       </w:r>
     </w:p>
-    <w:bookmarkEnd w:id="188"/>
-    <w:bookmarkStart w:id="189" w:name="ref-tuohy2006evolved"/>
+    <w:bookmarkEnd w:id="189"/>
+    <w:bookmarkStart w:id="190" w:name="ref-tuohy2006evolved"/>
     <w:p>
       <w:pPr>
         <w:pStyle w:val="Bibliography"/>
@@ -26893,8 +27050,8 @@
         <w:t xml:space="preserve">.</w:t>
       </w:r>
     </w:p>
-    <w:bookmarkEnd w:id="189"/>
-    <w:bookmarkStart w:id="190" w:name="ref-van2016wavenet"/>
+    <w:bookmarkEnd w:id="190"/>
+    <w:bookmarkStart w:id="191" w:name="ref-van2016wavenet"/>
     <w:p>
       <w:pPr>
         <w:pStyle w:val="Bibliography"/>
@@ -26915,8 +27072,8 @@
         <w:t xml:space="preserve">.</w:t>
       </w:r>
     </w:p>
-    <w:bookmarkEnd w:id="190"/>
-    <w:bookmarkStart w:id="191" w:name="ref-vaughn2000music"/>
+    <w:bookmarkEnd w:id="191"/>
+    <w:bookmarkStart w:id="192" w:name="ref-vaughn2000music"/>
     <w:p>
       <w:pPr>
         <w:pStyle w:val="Bibliography"/>
@@ -26940,8 +27097,8 @@
         <w:t xml:space="preserve">34 (3/4). JSTOR: 149–66.</w:t>
       </w:r>
     </w:p>
-    <w:bookmarkEnd w:id="191"/>
-    <w:bookmarkStart w:id="192" w:name="ref-veit2016residual"/>
+    <w:bookmarkEnd w:id="192"/>
+    <w:bookmarkStart w:id="193" w:name="ref-veit2016residual"/>
     <w:p>
       <w:pPr>
         <w:pStyle w:val="Bibliography"/>
@@ -26962,8 +27119,8 @@
         <w:t xml:space="preserve">, 550–58.</w:t>
       </w:r>
     </w:p>
-    <w:bookmarkEnd w:id="192"/>
-    <w:bookmarkStart w:id="193" w:name="ref-wang2015image"/>
+    <w:bookmarkEnd w:id="193"/>
+    <w:bookmarkStart w:id="194" w:name="ref-wang2015image"/>
     <w:p>
       <w:pPr>
         <w:pStyle w:val="Bibliography"/>
@@ -26987,8 +27144,8 @@
         <w:t xml:space="preserve">13 (1): 137–45.</w:t>
       </w:r>
     </w:p>
-    <w:bookmarkEnd w:id="193"/>
-    <w:bookmarkStart w:id="194" w:name="ref-widrow1960adaptive"/>
+    <w:bookmarkEnd w:id="194"/>
+    <w:bookmarkStart w:id="195" w:name="ref-widrow1960adaptive"/>
     <w:p>
       <w:pPr>
         <w:pStyle w:val="Bibliography"/>
@@ -26997,8 +27154,8 @@
         <w:t xml:space="preserve">Widrow, Bernard, and Marcian E Hoff. 1960. “Adaptive Switching Circuits.” STANFORD UNIV CA STANFORD ELECTRONICS LABS.</w:t>
       </w:r>
     </w:p>
-    <w:bookmarkEnd w:id="194"/>
-    <w:bookmarkStart w:id="195" w:name="ref-widrow199030"/>
+    <w:bookmarkEnd w:id="195"/>
+    <w:bookmarkStart w:id="196" w:name="ref-widrow199030"/>
     <w:p>
       <w:pPr>
         <w:pStyle w:val="Bibliography"/>
@@ -27022,8 +27179,8 @@
         <w:t xml:space="preserve">78 (9). IEEE: 1415–42.</w:t>
       </w:r>
     </w:p>
-    <w:bookmarkEnd w:id="195"/>
-    <w:bookmarkStart w:id="196" w:name="ref-wu2016investigating"/>
+    <w:bookmarkEnd w:id="196"/>
+    <w:bookmarkStart w:id="197" w:name="ref-wu2016investigating"/>
     <w:p>
       <w:pPr>
         <w:pStyle w:val="Bibliography"/>
@@ -27044,8 +27201,8 @@
         <w:t xml:space="preserve">, 5140–4. IEEE.</w:t>
       </w:r>
     </w:p>
-    <w:bookmarkEnd w:id="196"/>
-    <w:bookmarkStart w:id="197" w:name="ref-xu2015ccg"/>
+    <w:bookmarkEnd w:id="197"/>
+    <w:bookmarkStart w:id="198" w:name="ref-xu2015ccg"/>
     <w:p>
       <w:pPr>
         <w:pStyle w:val="Bibliography"/>
@@ -27066,8 +27223,8 @@
         <w:t xml:space="preserve">, 250–55.</w:t>
       </w:r>
     </w:p>
-    <w:bookmarkEnd w:id="197"/>
-    <w:bookmarkStart w:id="198" w:name="ref-yadav2015introduction"/>
+    <w:bookmarkEnd w:id="198"/>
+    <w:bookmarkStart w:id="199" w:name="ref-yadav2015introduction"/>
     <w:p>
       <w:pPr>
         <w:pStyle w:val="Bibliography"/>
@@ -27088,8 +27245,8 @@
         <w:t xml:space="preserve">. Springer.</w:t>
       </w:r>
     </w:p>
-    <w:bookmarkEnd w:id="198"/>
-    <w:bookmarkStart w:id="200" w:name="ref-Yang2017"/>
+    <w:bookmarkEnd w:id="199"/>
+    <w:bookmarkStart w:id="201" w:name="ref-Yang2017"/>
     <w:p>
       <w:pPr>
         <w:pStyle w:val="Bibliography"/>
@@ -27100,7 +27257,7 @@
       <w:r>
         <w:t xml:space="preserve"> </w:t>
       </w:r>
-      <w:hyperlink r:id="rId199">
+      <w:hyperlink r:id="rId200">
         <w:r>
           <w:rPr>
             <w:rStyle w:val="Hyperlink"/>
@@ -27112,8 +27269,8 @@
         <w:t xml:space="preserve">.</w:t>
       </w:r>
     </w:p>
-    <w:bookmarkEnd w:id="200"/>
-    <w:bookmarkStart w:id="201" w:name="ref-zen2015unidirectional"/>
+    <w:bookmarkEnd w:id="201"/>
+    <w:bookmarkStart w:id="202" w:name="ref-zen2015unidirectional"/>
     <w:p>
       <w:pPr>
         <w:pStyle w:val="Bibliography"/>
@@ -27134,8 +27291,8 @@
         <w:t xml:space="preserve">, 4470–4. IEEE.</w:t>
       </w:r>
     </w:p>
-    <w:bookmarkEnd w:id="201"/>
-    <w:bookmarkStart w:id="202" w:name="ref-zhang2016colorful"/>
+    <w:bookmarkEnd w:id="202"/>
+    <w:bookmarkStart w:id="203" w:name="ref-zhang2016colorful"/>
     <w:p>
       <w:pPr>
         <w:pStyle w:val="Bibliography"/>
@@ -27156,8 +27313,8 @@
         <w:t xml:space="preserve">, 649–66. Springer.</w:t>
       </w:r>
     </w:p>
-    <w:bookmarkEnd w:id="202"/>
-    <w:bookmarkStart w:id="203" w:name="ref-zhang2017towards"/>
+    <w:bookmarkEnd w:id="203"/>
+    <w:bookmarkStart w:id="204" w:name="ref-zhang2017towards"/>
     <w:p>
       <w:pPr>
         <w:pStyle w:val="Bibliography"/>
@@ -27178,8 +27335,8 @@
         <w:t xml:space="preserve">.</w:t>
       </w:r>
     </w:p>
-    <w:bookmarkEnd w:id="203"/>
-    <w:bookmarkStart w:id="204" w:name="ref-zhang2017very"/>
+    <w:bookmarkEnd w:id="204"/>
+    <w:bookmarkStart w:id="205" w:name="ref-zhang2017very"/>
     <w:p>
       <w:pPr>
         <w:pStyle w:val="Bibliography"/>
@@ -27200,8 +27357,8 @@
         <w:t xml:space="preserve">, 4845–9. IEEE.</w:t>
       </w:r>
     </w:p>
-    <w:bookmarkEnd w:id="204"/>
-    <w:bookmarkStart w:id="205" w:name="ref-zhu2016generative"/>
+    <w:bookmarkEnd w:id="205"/>
+    <w:bookmarkStart w:id="206" w:name="ref-zhu2016generative"/>
     <w:p>
       <w:pPr>
         <w:pStyle w:val="Bibliography"/>
@@ -27222,8 +27379,8 @@
         <w:t xml:space="preserve">, 597–613. Springer.</w:t>
       </w:r>
     </w:p>
-    <w:bookmarkEnd w:id="205"/>
-    <w:bookmarkStart w:id="206" w:name="ref-zweig2017advances"/>
+    <w:bookmarkEnd w:id="206"/>
+    <w:bookmarkStart w:id="207" w:name="ref-zweig2017advances"/>
     <w:p>
       <w:pPr>
         <w:pStyle w:val="Bibliography"/>
@@ -27244,8 +27401,8 @@
         <w:t xml:space="preserve">, 4805–9. IEEE.</w:t>
       </w:r>
     </w:p>
-    <w:bookmarkEnd w:id="206"/>
     <w:bookmarkEnd w:id="207"/>
+    <w:bookmarkEnd w:id="208"/>
     <w:sectPr>
       <w:pgSz w:w="12240" w:h="15840"/>
       <w:pgMar w:top="1440" w:right="1440" w:bottom="1440" w:left="1440" w:header="720" w:footer="720" w:gutter="0"/>

</xml_diff>